<commit_message>
Tighten report wording for evaluator-facing submission
Remove empty template titles and instructional filler; keep only
professional approach, BUG-001, test cases, and summary.

Co-authored-by: Showravkarmakar <Showrav88@users.noreply.github.com>
</commit_message>
<xml_diff>
--- a/SQA_Intern_Assignment_Test_Report.docx
+++ b/SQA_Intern_Assignment_Test_Report.docx
@@ -416,7 +416,7 @@
           <w:color w:val="333333"/>
           <w:sz w:val="22"/>
         </w:rPr>
-        <w:t>Manual testing was performed on the Homepage modules: Background Remove and Batch Remover. Testing covered the complete user workflow, available options, and overall experience for both modules.</w:t>
+        <w:t>Manual testing was performed on the Homepage modules: Background Remove and Batch Remover. The full workflow, available options, and user experience of both modules were reviewed.</w:t>
       </w:r>
     </w:p>
     <w:p>
@@ -431,7 +431,7 @@
           <w:color w:val="333333"/>
           <w:sz w:val="22"/>
         </w:rPr>
-        <w:t>As the app uses a third-party API for background removal, AI cutout quality was not evaluated. Focus areas were functionality, workflow, stability, usability, performance, and overall product quality.</w:t>
+        <w:t>Because background removal uses a third-party API, cutout accuracy was not assessed. Evaluation focused on functionality, workflow, stability, usability, performance, and overall product quality.</w:t>
       </w:r>
     </w:p>
     <w:p>
@@ -496,7 +496,7 @@
           <w:i w:val="0"/>
           <w:sz w:val="20"/>
         </w:rPr>
-        <w:t>End-to-end path from entry to result (select → process → save/share) is complete and clear.</w:t>
+        <w:t>End-to-end path from entry to result is complete and clear.</w:t>
       </w:r>
     </w:p>
     <w:p>
@@ -546,7 +546,7 @@
           <w:i w:val="0"/>
           <w:sz w:val="20"/>
         </w:rPr>
-        <w:t>Labels, feedback, navigation, and error handling are clear and easy to use.</w:t>
+        <w:t>Labels, feedback, navigation, and errors are clear and easy to use.</w:t>
       </w:r>
     </w:p>
     <w:p>
@@ -769,7 +769,7 @@
                 <w:color w:val="FFFFFF"/>
                 <w:sz w:val="16"/>
               </w:rPr>
-              <w:t>Test Cases</w:t>
+              <w:t>Related Test Cases</w:t>
             </w:r>
           </w:p>
         </w:tc>
@@ -1500,7 +1500,7 @@
           <w:color w:val="333333"/>
           <w:sz w:val="22"/>
         </w:rPr>
-        <w:t>Severity levels used: Critical (crash / blocker / data loss), High (major feature broken), Medium (workaround exists), Low (minor / cosmetic).</w:t>
+        <w:t>Severity: Critical = crash/blocker/data loss; High = major feature broken; Medium = workaround exists; Low = minor/cosmetic.</w:t>
       </w:r>
     </w:p>
     <w:p>
@@ -2038,7 +2038,7 @@
           <w:color w:val="333333"/>
           <w:sz w:val="22"/>
         </w:rPr>
-        <w:t>After applying Shape, the image reverts to the original photo and the old background returns. Shape appears to use the original uploaded image instead of the background-removed result. If Shape is opened but no change is applied, the background-removed image remains (correct behavior). The issue occurs when a shape change is applied.</w:t>
+        <w:t>After applying Shape, the image reverts to the original photo and the old background returns. Shape appears to use the original uploaded image instead of the background-removed result. If Shape is opened but no change is applied, the background-removed image remains. The issue occurs when a shape change is applied.</w:t>
       </w:r>
     </w:p>
     <w:p>
@@ -2090,7 +2090,7 @@
                 <w:color w:val="808080"/>
                 <w:sz w:val="20"/>
               </w:rPr>
-              <w:t>[ Screenshot 1: After background removal ]</w:t>
+              <w:t>Screenshot 1: After background removal</w:t>
             </w:r>
           </w:p>
         </w:tc>
@@ -2131,7 +2131,7 @@
                 <w:color w:val="808080"/>
                 <w:sz w:val="20"/>
               </w:rPr>
-              <w:t>[ Screenshot 2: After applying Shape — background restored ]</w:t>
+              <w:t>Screenshot 2: After applying Shape — background restored</w:t>
             </w:r>
           </w:p>
         </w:tc>
@@ -2165,7 +2165,7 @@
           <w:color w:val="333333"/>
           <w:sz w:val="22"/>
         </w:rPr>
-        <w:t>Impact: Using Shape undoes a successful background removal, breaking the post-edit workflow. Likely cause: Shape loads the original source image rather than the processed background-removed image.</w:t>
+        <w:t>Impact: Using Shape undoes a successful background removal and breaks the post-edit workflow. Likely cause: Shape loads the original source image rather than the processed background-removed image.</w:t>
       </w:r>
     </w:p>
     <w:p>
@@ -2195,247 +2195,9 @@
           <w:color w:val="333333"/>
           <w:sz w:val="22"/>
         </w:rPr>
-        <w:t>Findings recorded during exploratory testing of the in-scope modules.</w:t>
+        <w:t>No strengths logged yet.</w:t>
       </w:r>
     </w:p>
-    <w:p>
-      <w:pPr>
-        <w:spacing w:before="200" w:after="120"/>
-      </w:pPr>
-      <w:r>
-        <w:rPr>
-          <w:rFonts w:ascii="Calibri" w:hAnsi="Calibri" w:eastAsia="Calibri"/>
-          <w:b/>
-          <w:i w:val="0"/>
-          <w:color w:val="2E75B6"/>
-          <w:sz w:val="26"/>
-        </w:rPr>
-        <w:t>STR-001: [Title]</w:t>
-      </w:r>
-    </w:p>
-    <w:tbl>
-      <w:tblPr>
-        <w:tblW w:type="auto" w:w="0"/>
-        <w:tblLook w:firstColumn="1" w:firstRow="1" w:lastColumn="0" w:lastRow="0" w:noHBand="0" w:noVBand="1" w:val="04A0"/>
-      </w:tblPr>
-      <w:tblGrid>
-        <w:gridCol w:w="4986"/>
-        <w:gridCol w:w="4986"/>
-      </w:tblGrid>
-      <w:tr>
-        <w:tc>
-          <w:tcPr>
-            <w:tcW w:type="dxa" w:w="4986"/>
-            <w:shd w:fill="E2EFDA" w:val="clear"/>
-            <w:tcBorders>
-              <w:top w:val="single" w:sz="4" w:color="BFBFBF"/>
-              <w:left w:val="single" w:sz="4" w:color="BFBFBF"/>
-              <w:bottom w:val="single" w:sz="4" w:color="BFBFBF"/>
-              <w:right w:val="single" w:sz="4" w:color="BFBFBF"/>
-            </w:tcBorders>
-          </w:tcPr>
-          <w:p>
-            <w:pPr>
-              <w:spacing w:before="40" w:after="40"/>
-            </w:pPr>
-            <w:r/>
-            <w:r>
-              <w:rPr>
-                <w:rFonts w:ascii="Calibri" w:hAnsi="Calibri" w:eastAsia="Calibri"/>
-                <w:b/>
-                <w:i w:val="0"/>
-                <w:color w:val="375E23"/>
-                <w:sz w:val="18"/>
-              </w:rPr>
-              <w:t>Module / Area</w:t>
-            </w:r>
-          </w:p>
-        </w:tc>
-        <w:tc>
-          <w:tcPr>
-            <w:tcW w:type="dxa" w:w="4986"/>
-            <w:shd w:fill="FFFFFF" w:val="clear"/>
-            <w:tcBorders>
-              <w:top w:val="single" w:sz="4" w:color="BFBFBF"/>
-              <w:left w:val="single" w:sz="4" w:color="BFBFBF"/>
-              <w:bottom w:val="single" w:sz="4" w:color="BFBFBF"/>
-              <w:right w:val="single" w:sz="4" w:color="BFBFBF"/>
-            </w:tcBorders>
-          </w:tcPr>
-          <w:p>
-            <w:pPr>
-              <w:spacing w:before="40" w:after="40"/>
-            </w:pPr>
-            <w:r/>
-            <w:r>
-              <w:rPr>
-                <w:rFonts w:ascii="Calibri" w:hAnsi="Calibri" w:eastAsia="Calibri"/>
-                <w:b w:val="0"/>
-                <w:i w:val="0"/>
-                <w:color w:val="333333"/>
-                <w:sz w:val="18"/>
-              </w:rPr>
-            </w:r>
-          </w:p>
-        </w:tc>
-      </w:tr>
-      <w:tr>
-        <w:tc>
-          <w:tcPr>
-            <w:tcW w:type="dxa" w:w="4986"/>
-            <w:shd w:fill="E2EFDA" w:val="clear"/>
-            <w:tcBorders>
-              <w:top w:val="single" w:sz="4" w:color="BFBFBF"/>
-              <w:left w:val="single" w:sz="4" w:color="BFBFBF"/>
-              <w:bottom w:val="single" w:sz="4" w:color="BFBFBF"/>
-              <w:right w:val="single" w:sz="4" w:color="BFBFBF"/>
-            </w:tcBorders>
-          </w:tcPr>
-          <w:p>
-            <w:pPr>
-              <w:spacing w:before="40" w:after="40"/>
-            </w:pPr>
-            <w:r/>
-            <w:r>
-              <w:rPr>
-                <w:rFonts w:ascii="Calibri" w:hAnsi="Calibri" w:eastAsia="Calibri"/>
-                <w:b/>
-                <w:i w:val="0"/>
-                <w:color w:val="375E23"/>
-                <w:sz w:val="18"/>
-              </w:rPr>
-              <w:t>Quality Area</w:t>
-            </w:r>
-          </w:p>
-        </w:tc>
-        <w:tc>
-          <w:tcPr>
-            <w:tcW w:type="dxa" w:w="4986"/>
-            <w:shd w:fill="FFFFFF" w:val="clear"/>
-            <w:tcBorders>
-              <w:top w:val="single" w:sz="4" w:color="BFBFBF"/>
-              <w:left w:val="single" w:sz="4" w:color="BFBFBF"/>
-              <w:bottom w:val="single" w:sz="4" w:color="BFBFBF"/>
-              <w:right w:val="single" w:sz="4" w:color="BFBFBF"/>
-            </w:tcBorders>
-          </w:tcPr>
-          <w:p>
-            <w:pPr>
-              <w:spacing w:before="40" w:after="40"/>
-            </w:pPr>
-            <w:r/>
-            <w:r>
-              <w:rPr>
-                <w:rFonts w:ascii="Calibri" w:hAnsi="Calibri" w:eastAsia="Calibri"/>
-                <w:b w:val="0"/>
-                <w:i w:val="0"/>
-                <w:color w:val="333333"/>
-                <w:sz w:val="18"/>
-              </w:rPr>
-            </w:r>
-          </w:p>
-        </w:tc>
-      </w:tr>
-      <w:tr>
-        <w:tc>
-          <w:tcPr>
-            <w:tcW w:type="dxa" w:w="4986"/>
-            <w:shd w:fill="E2EFDA" w:val="clear"/>
-            <w:tcBorders>
-              <w:top w:val="single" w:sz="4" w:color="BFBFBF"/>
-              <w:left w:val="single" w:sz="4" w:color="BFBFBF"/>
-              <w:bottom w:val="single" w:sz="4" w:color="BFBFBF"/>
-              <w:right w:val="single" w:sz="4" w:color="BFBFBF"/>
-            </w:tcBorders>
-          </w:tcPr>
-          <w:p>
-            <w:pPr>
-              <w:spacing w:before="40" w:after="40"/>
-            </w:pPr>
-            <w:r/>
-            <w:r>
-              <w:rPr>
-                <w:rFonts w:ascii="Calibri" w:hAnsi="Calibri" w:eastAsia="Calibri"/>
-                <w:b/>
-                <w:i w:val="0"/>
-                <w:color w:val="375E23"/>
-                <w:sz w:val="18"/>
-              </w:rPr>
-              <w:t>Observation</w:t>
-            </w:r>
-          </w:p>
-        </w:tc>
-        <w:tc>
-          <w:tcPr>
-            <w:tcW w:type="dxa" w:w="4986"/>
-            <w:shd w:fill="FFFFFF" w:val="clear"/>
-            <w:tcBorders>
-              <w:top w:val="single" w:sz="4" w:color="BFBFBF"/>
-              <w:left w:val="single" w:sz="4" w:color="BFBFBF"/>
-              <w:bottom w:val="single" w:sz="4" w:color="BFBFBF"/>
-              <w:right w:val="single" w:sz="4" w:color="BFBFBF"/>
-            </w:tcBorders>
-          </w:tcPr>
-          <w:p>
-            <w:pPr>
-              <w:spacing w:before="40" w:after="40"/>
-            </w:pPr>
-            <w:r/>
-            <w:r>
-              <w:rPr>
-                <w:rFonts w:ascii="Calibri" w:hAnsi="Calibri" w:eastAsia="Calibri"/>
-                <w:b w:val="0"/>
-                <w:i w:val="0"/>
-                <w:color w:val="333333"/>
-                <w:sz w:val="18"/>
-              </w:rPr>
-            </w:r>
-          </w:p>
-        </w:tc>
-      </w:tr>
-    </w:tbl>
-    <w:p/>
-    <w:tbl>
-      <w:tblPr>
-        <w:tblW w:type="auto" w:w="0"/>
-        <w:jc w:val="center"/>
-        <w:tblLook w:firstColumn="1" w:firstRow="1" w:lastColumn="0" w:lastRow="0" w:noHBand="0" w:noVBand="1" w:val="04A0"/>
-      </w:tblPr>
-      <w:tblGrid>
-        <w:gridCol w:w="9972"/>
-      </w:tblGrid>
-      <w:tr>
-        <w:tc>
-          <w:tcPr>
-            <w:tcW w:type="dxa" w:w="9972"/>
-            <w:shd w:fill="F5F5F5" w:val="clear"/>
-            <w:tcBorders>
-              <w:top w:val="single" w:sz="8" w:color="A6A6A6"/>
-              <w:left w:val="single" w:sz="8" w:color="A6A6A6"/>
-              <w:bottom w:val="single" w:sz="8" w:color="A6A6A6"/>
-              <w:right w:val="single" w:sz="8" w:color="A6A6A6"/>
-            </w:tcBorders>
-          </w:tcPr>
-          <w:p>
-            <w:pPr>
-              <w:spacing w:before="720" w:after="720"/>
-              <w:jc w:val="center"/>
-            </w:pPr>
-            <w:r>
-              <w:rPr>
-                <w:rFonts w:ascii="Calibri" w:hAnsi="Calibri" w:eastAsia="Calibri"/>
-                <w:b w:val="0"/>
-                <w:i/>
-                <w:color w:val="808080"/>
-                <w:sz w:val="20"/>
-              </w:rPr>
-              <w:t>[ Screenshot — optional ]</w:t>
-            </w:r>
-          </w:p>
-        </w:tc>
-      </w:tr>
-    </w:tbl>
-    <w:p/>
     <w:p>
       <w:pPr>
         <w:spacing w:before="280" w:after="120"/>
@@ -2463,362 +2225,9 @@
           <w:color w:val="333333"/>
           <w:sz w:val="22"/>
         </w:rPr>
-        <w:t>Findings recorded during exploratory testing of the in-scope modules.</w:t>
+        <w:t>No suggestions logged yet.</w:t>
       </w:r>
     </w:p>
-    <w:p>
-      <w:pPr>
-        <w:spacing w:before="200" w:after="120"/>
-      </w:pPr>
-      <w:r>
-        <w:rPr>
-          <w:rFonts w:ascii="Calibri" w:hAnsi="Calibri" w:eastAsia="Calibri"/>
-          <w:b/>
-          <w:i w:val="0"/>
-          <w:color w:val="2E75B6"/>
-          <w:sz w:val="26"/>
-        </w:rPr>
-        <w:t>SUG-001: [Title]</w:t>
-      </w:r>
-    </w:p>
-    <w:tbl>
-      <w:tblPr>
-        <w:tblW w:type="auto" w:w="0"/>
-        <w:tblLook w:firstColumn="1" w:firstRow="1" w:lastColumn="0" w:lastRow="0" w:noHBand="0" w:noVBand="1" w:val="04A0"/>
-      </w:tblPr>
-      <w:tblGrid>
-        <w:gridCol w:w="4986"/>
-        <w:gridCol w:w="4986"/>
-      </w:tblGrid>
-      <w:tr>
-        <w:tc>
-          <w:tcPr>
-            <w:tcW w:type="dxa" w:w="4986"/>
-            <w:shd w:fill="FFF2CC" w:val="clear"/>
-            <w:tcBorders>
-              <w:top w:val="single" w:sz="4" w:color="BFBFBF"/>
-              <w:left w:val="single" w:sz="4" w:color="BFBFBF"/>
-              <w:bottom w:val="single" w:sz="4" w:color="BFBFBF"/>
-              <w:right w:val="single" w:sz="4" w:color="BFBFBF"/>
-            </w:tcBorders>
-          </w:tcPr>
-          <w:p>
-            <w:pPr>
-              <w:spacing w:before="40" w:after="40"/>
-            </w:pPr>
-            <w:r/>
-            <w:r>
-              <w:rPr>
-                <w:rFonts w:ascii="Calibri" w:hAnsi="Calibri" w:eastAsia="Calibri"/>
-                <w:b/>
-                <w:i w:val="0"/>
-                <w:color w:val="7F6000"/>
-                <w:sz w:val="18"/>
-              </w:rPr>
-              <w:t>Module / Area</w:t>
-            </w:r>
-          </w:p>
-        </w:tc>
-        <w:tc>
-          <w:tcPr>
-            <w:tcW w:type="dxa" w:w="4986"/>
-            <w:shd w:fill="FFFFFF" w:val="clear"/>
-            <w:tcBorders>
-              <w:top w:val="single" w:sz="4" w:color="BFBFBF"/>
-              <w:left w:val="single" w:sz="4" w:color="BFBFBF"/>
-              <w:bottom w:val="single" w:sz="4" w:color="BFBFBF"/>
-              <w:right w:val="single" w:sz="4" w:color="BFBFBF"/>
-            </w:tcBorders>
-          </w:tcPr>
-          <w:p>
-            <w:pPr>
-              <w:spacing w:before="40" w:after="40"/>
-            </w:pPr>
-            <w:r/>
-            <w:r>
-              <w:rPr>
-                <w:rFonts w:ascii="Calibri" w:hAnsi="Calibri" w:eastAsia="Calibri"/>
-                <w:b w:val="0"/>
-                <w:i w:val="0"/>
-                <w:color w:val="333333"/>
-                <w:sz w:val="18"/>
-              </w:rPr>
-            </w:r>
-          </w:p>
-        </w:tc>
-      </w:tr>
-      <w:tr>
-        <w:tc>
-          <w:tcPr>
-            <w:tcW w:type="dxa" w:w="4986"/>
-            <w:shd w:fill="FFF2CC" w:val="clear"/>
-            <w:tcBorders>
-              <w:top w:val="single" w:sz="4" w:color="BFBFBF"/>
-              <w:left w:val="single" w:sz="4" w:color="BFBFBF"/>
-              <w:bottom w:val="single" w:sz="4" w:color="BFBFBF"/>
-              <w:right w:val="single" w:sz="4" w:color="BFBFBF"/>
-            </w:tcBorders>
-          </w:tcPr>
-          <w:p>
-            <w:pPr>
-              <w:spacing w:before="40" w:after="40"/>
-            </w:pPr>
-            <w:r/>
-            <w:r>
-              <w:rPr>
-                <w:rFonts w:ascii="Calibri" w:hAnsi="Calibri" w:eastAsia="Calibri"/>
-                <w:b/>
-                <w:i w:val="0"/>
-                <w:color w:val="7F6000"/>
-                <w:sz w:val="18"/>
-              </w:rPr>
-              <w:t>Quality Area</w:t>
-            </w:r>
-          </w:p>
-        </w:tc>
-        <w:tc>
-          <w:tcPr>
-            <w:tcW w:type="dxa" w:w="4986"/>
-            <w:shd w:fill="FFFFFF" w:val="clear"/>
-            <w:tcBorders>
-              <w:top w:val="single" w:sz="4" w:color="BFBFBF"/>
-              <w:left w:val="single" w:sz="4" w:color="BFBFBF"/>
-              <w:bottom w:val="single" w:sz="4" w:color="BFBFBF"/>
-              <w:right w:val="single" w:sz="4" w:color="BFBFBF"/>
-            </w:tcBorders>
-          </w:tcPr>
-          <w:p>
-            <w:pPr>
-              <w:spacing w:before="40" w:after="40"/>
-            </w:pPr>
-            <w:r/>
-            <w:r>
-              <w:rPr>
-                <w:rFonts w:ascii="Calibri" w:hAnsi="Calibri" w:eastAsia="Calibri"/>
-                <w:b w:val="0"/>
-                <w:i w:val="0"/>
-                <w:color w:val="333333"/>
-                <w:sz w:val="18"/>
-              </w:rPr>
-            </w:r>
-          </w:p>
-        </w:tc>
-      </w:tr>
-      <w:tr>
-        <w:tc>
-          <w:tcPr>
-            <w:tcW w:type="dxa" w:w="4986"/>
-            <w:shd w:fill="FFF2CC" w:val="clear"/>
-            <w:tcBorders>
-              <w:top w:val="single" w:sz="4" w:color="BFBFBF"/>
-              <w:left w:val="single" w:sz="4" w:color="BFBFBF"/>
-              <w:bottom w:val="single" w:sz="4" w:color="BFBFBF"/>
-              <w:right w:val="single" w:sz="4" w:color="BFBFBF"/>
-            </w:tcBorders>
-          </w:tcPr>
-          <w:p>
-            <w:pPr>
-              <w:spacing w:before="40" w:after="40"/>
-            </w:pPr>
-            <w:r/>
-            <w:r>
-              <w:rPr>
-                <w:rFonts w:ascii="Calibri" w:hAnsi="Calibri" w:eastAsia="Calibri"/>
-                <w:b/>
-                <w:i w:val="0"/>
-                <w:color w:val="7F6000"/>
-                <w:sz w:val="18"/>
-              </w:rPr>
-              <w:t>Priority</w:t>
-            </w:r>
-          </w:p>
-        </w:tc>
-        <w:tc>
-          <w:tcPr>
-            <w:tcW w:type="dxa" w:w="4986"/>
-            <w:shd w:fill="FFFFFF" w:val="clear"/>
-            <w:tcBorders>
-              <w:top w:val="single" w:sz="4" w:color="BFBFBF"/>
-              <w:left w:val="single" w:sz="4" w:color="BFBFBF"/>
-              <w:bottom w:val="single" w:sz="4" w:color="BFBFBF"/>
-              <w:right w:val="single" w:sz="4" w:color="BFBFBF"/>
-            </w:tcBorders>
-          </w:tcPr>
-          <w:p>
-            <w:pPr>
-              <w:spacing w:before="40" w:after="40"/>
-            </w:pPr>
-            <w:r/>
-            <w:r>
-              <w:rPr>
-                <w:rFonts w:ascii="Calibri" w:hAnsi="Calibri" w:eastAsia="Calibri"/>
-                <w:b w:val="0"/>
-                <w:i w:val="0"/>
-                <w:color w:val="333333"/>
-                <w:sz w:val="18"/>
-              </w:rPr>
-            </w:r>
-          </w:p>
-        </w:tc>
-      </w:tr>
-      <w:tr>
-        <w:tc>
-          <w:tcPr>
-            <w:tcW w:type="dxa" w:w="4986"/>
-            <w:shd w:fill="FFF2CC" w:val="clear"/>
-            <w:tcBorders>
-              <w:top w:val="single" w:sz="4" w:color="BFBFBF"/>
-              <w:left w:val="single" w:sz="4" w:color="BFBFBF"/>
-              <w:bottom w:val="single" w:sz="4" w:color="BFBFBF"/>
-              <w:right w:val="single" w:sz="4" w:color="BFBFBF"/>
-            </w:tcBorders>
-          </w:tcPr>
-          <w:p>
-            <w:pPr>
-              <w:spacing w:before="40" w:after="40"/>
-            </w:pPr>
-            <w:r/>
-            <w:r>
-              <w:rPr>
-                <w:rFonts w:ascii="Calibri" w:hAnsi="Calibri" w:eastAsia="Calibri"/>
-                <w:b/>
-                <w:i w:val="0"/>
-                <w:color w:val="7F6000"/>
-                <w:sz w:val="18"/>
-              </w:rPr>
-              <w:t>Current Behavior</w:t>
-            </w:r>
-          </w:p>
-        </w:tc>
-        <w:tc>
-          <w:tcPr>
-            <w:tcW w:type="dxa" w:w="4986"/>
-            <w:shd w:fill="FFFFFF" w:val="clear"/>
-            <w:tcBorders>
-              <w:top w:val="single" w:sz="4" w:color="BFBFBF"/>
-              <w:left w:val="single" w:sz="4" w:color="BFBFBF"/>
-              <w:bottom w:val="single" w:sz="4" w:color="BFBFBF"/>
-              <w:right w:val="single" w:sz="4" w:color="BFBFBF"/>
-            </w:tcBorders>
-          </w:tcPr>
-          <w:p>
-            <w:pPr>
-              <w:spacing w:before="40" w:after="40"/>
-            </w:pPr>
-            <w:r/>
-            <w:r>
-              <w:rPr>
-                <w:rFonts w:ascii="Calibri" w:hAnsi="Calibri" w:eastAsia="Calibri"/>
-                <w:b w:val="0"/>
-                <w:i w:val="0"/>
-                <w:color w:val="333333"/>
-                <w:sz w:val="18"/>
-              </w:rPr>
-            </w:r>
-          </w:p>
-        </w:tc>
-      </w:tr>
-    </w:tbl>
-    <w:p/>
-    <w:p>
-      <w:pPr>
-        <w:spacing w:before="200" w:after="120"/>
-      </w:pPr>
-      <w:r>
-        <w:rPr>
-          <w:rFonts w:ascii="Calibri" w:hAnsi="Calibri" w:eastAsia="Calibri"/>
-          <w:b/>
-          <w:i w:val="0"/>
-          <w:color w:val="404040"/>
-          <w:sz w:val="22"/>
-        </w:rPr>
-        <w:t>Proposed Improvement</w:t>
-      </w:r>
-    </w:p>
-    <w:p>
-      <w:pPr>
-        <w:spacing w:after="120"/>
-      </w:pPr>
-      <w:r>
-        <w:rPr>
-          <w:rFonts w:ascii="Calibri" w:hAnsi="Calibri" w:eastAsia="Calibri"/>
-          <w:b w:val="0"/>
-          <w:i w:val="0"/>
-          <w:color w:val="333333"/>
-          <w:sz w:val="22"/>
-        </w:rPr>
-      </w:r>
-    </w:p>
-    <w:p>
-      <w:pPr>
-        <w:spacing w:before="200" w:after="120"/>
-      </w:pPr>
-      <w:r>
-        <w:rPr>
-          <w:rFonts w:ascii="Calibri" w:hAnsi="Calibri" w:eastAsia="Calibri"/>
-          <w:b/>
-          <w:i w:val="0"/>
-          <w:color w:val="404040"/>
-          <w:sz w:val="22"/>
-        </w:rPr>
-        <w:t>User Benefit</w:t>
-      </w:r>
-    </w:p>
-    <w:p>
-      <w:pPr>
-        <w:spacing w:after="120"/>
-      </w:pPr>
-      <w:r>
-        <w:rPr>
-          <w:rFonts w:ascii="Calibri" w:hAnsi="Calibri" w:eastAsia="Calibri"/>
-          <w:b w:val="0"/>
-          <w:i w:val="0"/>
-          <w:color w:val="333333"/>
-          <w:sz w:val="22"/>
-        </w:rPr>
-      </w:r>
-    </w:p>
-    <w:tbl>
-      <w:tblPr>
-        <w:tblW w:type="auto" w:w="0"/>
-        <w:jc w:val="center"/>
-        <w:tblLook w:firstColumn="1" w:firstRow="1" w:lastColumn="0" w:lastRow="0" w:noHBand="0" w:noVBand="1" w:val="04A0"/>
-      </w:tblPr>
-      <w:tblGrid>
-        <w:gridCol w:w="9972"/>
-      </w:tblGrid>
-      <w:tr>
-        <w:tc>
-          <w:tcPr>
-            <w:tcW w:type="dxa" w:w="9972"/>
-            <w:shd w:fill="F5F5F5" w:val="clear"/>
-            <w:tcBorders>
-              <w:top w:val="single" w:sz="8" w:color="A6A6A6"/>
-              <w:left w:val="single" w:sz="8" w:color="A6A6A6"/>
-              <w:bottom w:val="single" w:sz="8" w:color="A6A6A6"/>
-              <w:right w:val="single" w:sz="8" w:color="A6A6A6"/>
-            </w:tcBorders>
-          </w:tcPr>
-          <w:p>
-            <w:pPr>
-              <w:spacing w:before="720" w:after="720"/>
-              <w:jc w:val="center"/>
-            </w:pPr>
-            <w:r>
-              <w:rPr>
-                <w:rFonts w:ascii="Calibri" w:hAnsi="Calibri" w:eastAsia="Calibri"/>
-                <w:b w:val="0"/>
-                <w:i/>
-                <w:color w:val="808080"/>
-                <w:sz w:val="20"/>
-              </w:rPr>
-              <w:t>[ Screenshot — optional ]</w:t>
-            </w:r>
-          </w:p>
-        </w:tc>
-      </w:tr>
-    </w:tbl>
-    <w:p/>
     <w:p>
       <w:pPr>
         <w:spacing w:before="280" w:after="120"/>
@@ -3256,7 +2665,7 @@
         <w:tc>
           <w:tcPr>
             <w:tcW w:type="dxa" w:w="1425"/>
-            <w:shd w:fill="E2EFDA" w:val="clear"/>
+            <w:shd w:fill="FFFFFF" w:val="clear"/>
             <w:tcBorders>
               <w:top w:val="single" w:sz="4" w:color="BFBFBF"/>
               <w:left w:val="single" w:sz="4" w:color="BFBFBF"/>
@@ -3454,7 +2863,7 @@
         <w:tc>
           <w:tcPr>
             <w:tcW w:type="dxa" w:w="1425"/>
-            <w:shd w:fill="E2EFDA" w:val="clear"/>
+            <w:shd w:fill="F2F2F2" w:val="clear"/>
             <w:tcBorders>
               <w:top w:val="single" w:sz="4" w:color="BFBFBF"/>
               <w:left w:val="single" w:sz="4" w:color="BFBFBF"/>
@@ -3985,7 +3394,7 @@
                 <w:color w:val="333333"/>
                 <w:sz w:val="16"/>
               </w:rPr>
-              <w:t>Tap process</w:t>
+              <w:t>Tap process / auto process</w:t>
             </w:r>
           </w:p>
         </w:tc>
@@ -4048,7 +3457,7 @@
         <w:tc>
           <w:tcPr>
             <w:tcW w:type="dxa" w:w="1425"/>
-            <w:shd w:fill="E2EFDA" w:val="clear"/>
+            <w:shd w:fill="FFFFFF" w:val="clear"/>
             <w:tcBorders>
               <w:top w:val="single" w:sz="4" w:color="BFBFBF"/>
               <w:left w:val="single" w:sz="4" w:color="BFBFBF"/>
@@ -9833,7 +9242,7 @@
                 <w:color w:val="333333"/>
                 <w:sz w:val="18"/>
               </w:rPr>
-              <w:t>0 (in progress)</w:t>
+              <w:t>0</w:t>
             </w:r>
           </w:p>
         </w:tc>
@@ -9891,7 +9300,7 @@
                 <w:color w:val="333333"/>
                 <w:sz w:val="18"/>
               </w:rPr>
-              <w:t>0 (in progress)</w:t>
+              <w:t>0</w:t>
             </w:r>
           </w:p>
         </w:tc>
@@ -10065,7 +9474,7 @@
                 <w:color w:val="333333"/>
                 <w:sz w:val="18"/>
               </w:rPr>
-              <w:t>Testing in progress. One High severity state-management defect found in Shape after background removal.</w:t>
+              <w:t>Testing in progress. One High severity defect found: Shape does not retain the background-removed image state.</w:t>
             </w:r>
           </w:p>
         </w:tc>

</xml_diff>

<commit_message>
Mark passed Background Remove cases from mobile testing
Update Result dropdowns for camera, cutout tools, undo/redo, close
alert, and secondary background tools; add camera capture case and
refresh summary counts.

Co-authored-by: Showravkarmakar <Showrav88@users.noreply.github.com>
</commit_message>
<xml_diff>
--- a/SQA_Intern_Assignment_Test_Report.docx
+++ b/SQA_Intern_Assignment_Test_Report.docx
@@ -2938,6 +2938,7 @@
         </w:tc>
         <w:tc>
           <w:tcPr>
+            <w:tcW w:w="1927" w:type="dxa"/>
             <w:shd w:fill="FFFFFF" w:val="clear"/>
             <w:tcBorders>
               <w:top w:val="single" w:sz="4" w:color="BFBFBF"/>
@@ -2945,7 +2946,6 @@
               <w:bottom w:val="single" w:sz="4" w:color="BFBFBF"/>
               <w:right w:val="single" w:sz="4" w:color="BFBFBF"/>
             </w:tcBorders>
-            <w:tcW w:w="1927" w:type="dxa"/>
           </w:tcPr>
           <w:p>
             <w:pPr>
@@ -2994,6 +2994,7 @@
         </w:tc>
         <w:tc>
           <w:tcPr>
+            <w:tcW w:w="2041" w:type="dxa"/>
             <w:shd w:fill="FFFFFF" w:val="clear"/>
             <w:tcBorders>
               <w:top w:val="single" w:sz="4" w:color="BFBFBF"/>
@@ -3001,7 +3002,6 @@
               <w:bottom w:val="single" w:sz="4" w:color="BFBFBF"/>
               <w:right w:val="single" w:sz="4" w:color="BFBFBF"/>
             </w:tcBorders>
-            <w:tcW w:w="2041" w:type="dxa"/>
           </w:tcPr>
           <w:p>
             <w:pPr>
@@ -3016,12 +3016,13 @@
                 <w:color w:val="333333"/>
                 <w:sz w:val="16"/>
               </w:rPr>
-              <w:t>Tap camera tile</w:t>
+              <w:t>Tap camera tile on Photos screen</w:t>
             </w:r>
           </w:p>
         </w:tc>
         <w:tc>
           <w:tcPr>
+            <w:tcW w:w="2041" w:type="dxa"/>
             <w:shd w:fill="FFFFFF" w:val="clear"/>
             <w:tcBorders>
               <w:top w:val="single" w:sz="4" w:color="BFBFBF"/>
@@ -3029,7 +3030,6 @@
               <w:bottom w:val="single" w:sz="4" w:color="BFBFBF"/>
               <w:right w:val="single" w:sz="4" w:color="BFBFBF"/>
             </w:tcBorders>
-            <w:tcW w:w="2041" w:type="dxa"/>
           </w:tcPr>
           <w:p>
             <w:pPr>
@@ -3050,20 +3050,20 @@
         </w:tc>
         <w:tc>
           <w:tcPr>
-            <w:shd w:fill="FFFFFF" w:val="clear"/>
+            <w:tcW w:w="1134" w:type="dxa"/>
+            <w:shd w:fill="E2EFDA" w:val="clear"/>
             <w:tcBorders>
               <w:top w:val="single" w:sz="4" w:color="BFBFBF"/>
               <w:left w:val="single" w:sz="4" w:color="BFBFBF"/>
               <w:bottom w:val="single" w:sz="4" w:color="BFBFBF"/>
               <w:right w:val="single" w:sz="4" w:color="BFBFBF"/>
             </w:tcBorders>
-            <w:tcW w:w="1134" w:type="dxa"/>
           </w:tcPr>
           <w:sdt>
             <w:sdtPr>
               <w:alias w:val="Result"/>
               <w:tag w:val="result_status"/>
-              <w:id w:val="1002"/>
+              <w:id w:val="5000"/>
               <w:dropDownList>
                 <w:listItem w:displayText="Not Executed" w:value="Not Executed"/>
                 <w:listItem w:displayText="Pass" w:value="Pass"/>
@@ -3079,10 +3079,9 @@
                 <w:r>
                   <w:rPr>
                     <w:sz w:val="16"/>
-                    <w:szCs w:val="16"/>
-                    <w:color w:val="666666"/>
+                    <w:color w:val="548235"/>
                   </w:rPr>
-                  <w:t>Not Executed</w:t>
+                  <w:t>Pass</w:t>
                 </w:r>
               </w:p>
             </w:sdtContent>
@@ -3090,14 +3089,224 @@
         </w:tc>
         <w:tc>
           <w:tcPr>
-            <w:shd w:fill="FFFFFF" w:val="clear"/>
+            <w:tcW w:w="907" w:type="dxa"/>
+            <w:shd w:fill="E2EFDA" w:val="clear"/>
             <w:tcBorders>
               <w:top w:val="single" w:sz="4" w:color="BFBFBF"/>
               <w:left w:val="single" w:sz="4" w:color="BFBFBF"/>
               <w:bottom w:val="single" w:sz="4" w:color="BFBFBF"/>
               <w:right w:val="single" w:sz="4" w:color="BFBFBF"/>
             </w:tcBorders>
+          </w:tcPr>
+          <w:p>
+            <w:pPr>
+              <w:spacing w:before="40" w:after="40"/>
+              <w:jc w:val="center"/>
+            </w:pPr>
+            <w:r/>
+            <w:r>
+              <w:rPr>
+                <w:rFonts w:ascii="Calibri" w:hAnsi="Calibri" w:eastAsia="Calibri"/>
+                <w:b w:val="0"/>
+                <w:i w:val="0"/>
+                <w:color w:val="333333"/>
+                <w:sz w:val="16"/>
+              </w:rPr>
+              <w:t>—</w:t>
+            </w:r>
+          </w:p>
+        </w:tc>
+      </w:tr>
+      <w:tr>
+        <w:tc>
+          <w:tcPr>
             <w:tcW w:w="907" w:type="dxa"/>
+            <w:shd w:fill="E2EFDA" w:val="clear"/>
+            <w:tcBorders>
+              <w:top w:val="single" w:sz="4" w:color="BFBFBF"/>
+              <w:left w:val="single" w:sz="4" w:color="BFBFBF"/>
+              <w:bottom w:val="single" w:sz="4" w:color="BFBFBF"/>
+              <w:right w:val="single" w:sz="4" w:color="BFBFBF"/>
+            </w:tcBorders>
+          </w:tcPr>
+          <w:p>
+            <w:pPr>
+              <w:spacing w:before="40" w:after="40"/>
+            </w:pPr>
+            <w:r/>
+            <w:r>
+              <w:rPr>
+                <w:rFonts w:ascii="Calibri" w:hAnsi="Calibri" w:eastAsia="Calibri"/>
+                <w:b w:val="0"/>
+                <w:i w:val="0"/>
+                <w:color w:val="333333"/>
+                <w:sz w:val="16"/>
+              </w:rPr>
+              <w:t>TC-BR-003A</w:t>
+            </w:r>
+          </w:p>
+        </w:tc>
+        <w:tc>
+          <w:tcPr>
+            <w:tcW w:w="1927" w:type="dxa"/>
+            <w:shd w:fill="E2EFDA" w:val="clear"/>
+            <w:tcBorders>
+              <w:top w:val="single" w:sz="4" w:color="BFBFBF"/>
+              <w:left w:val="single" w:sz="4" w:color="BFBFBF"/>
+              <w:bottom w:val="single" w:sz="4" w:color="BFBFBF"/>
+              <w:right w:val="single" w:sz="4" w:color="BFBFBF"/>
+            </w:tcBorders>
+          </w:tcPr>
+          <w:p>
+            <w:pPr>
+              <w:spacing w:before="40" w:after="40"/>
+            </w:pPr>
+            <w:r/>
+            <w:r>
+              <w:rPr>
+                <w:rFonts w:ascii="Calibri" w:hAnsi="Calibri" w:eastAsia="Calibri"/>
+                <w:b w:val="0"/>
+                <w:i w:val="0"/>
+                <w:color w:val="333333"/>
+                <w:sz w:val="16"/>
+              </w:rPr>
+              <w:t>Capture photo and auto clear background</w:t>
+            </w:r>
+          </w:p>
+        </w:tc>
+        <w:tc>
+          <w:tcPr>
+            <w:tcW w:w="1247" w:type="dxa"/>
+            <w:shd w:fill="E2EFDA" w:val="clear"/>
+            <w:tcBorders>
+              <w:top w:val="single" w:sz="4" w:color="BFBFBF"/>
+              <w:left w:val="single" w:sz="4" w:color="BFBFBF"/>
+              <w:bottom w:val="single" w:sz="4" w:color="BFBFBF"/>
+              <w:right w:val="single" w:sz="4" w:color="BFBFBF"/>
+            </w:tcBorders>
+          </w:tcPr>
+          <w:p>
+            <w:pPr>
+              <w:spacing w:before="40" w:after="40"/>
+            </w:pPr>
+            <w:r/>
+            <w:r>
+              <w:rPr>
+                <w:rFonts w:ascii="Calibri" w:hAnsi="Calibri" w:eastAsia="Calibri"/>
+                <w:b w:val="0"/>
+                <w:i w:val="0"/>
+                <w:color w:val="333333"/>
+                <w:sz w:val="16"/>
+              </w:rPr>
+              <w:t>Functionality, Workflow</w:t>
+            </w:r>
+          </w:p>
+        </w:tc>
+        <w:tc>
+          <w:tcPr>
+            <w:tcW w:w="2041" w:type="dxa"/>
+            <w:shd w:fill="E2EFDA" w:val="clear"/>
+            <w:tcBorders>
+              <w:top w:val="single" w:sz="4" w:color="BFBFBF"/>
+              <w:left w:val="single" w:sz="4" w:color="BFBFBF"/>
+              <w:bottom w:val="single" w:sz="4" w:color="BFBFBF"/>
+              <w:right w:val="single" w:sz="4" w:color="BFBFBF"/>
+            </w:tcBorders>
+          </w:tcPr>
+          <w:p>
+            <w:pPr>
+              <w:spacing w:before="40" w:after="40"/>
+            </w:pPr>
+            <w:r/>
+            <w:r>
+              <w:rPr>
+                <w:rFonts w:ascii="Calibri" w:hAnsi="Calibri" w:eastAsia="Calibri"/>
+                <w:b w:val="0"/>
+                <w:i w:val="0"/>
+                <w:color w:val="333333"/>
+                <w:sz w:val="16"/>
+              </w:rPr>
+              <w:t>Capture photo → tap checkmark / confirm</w:t>
+            </w:r>
+          </w:p>
+        </w:tc>
+        <w:tc>
+          <w:tcPr>
+            <w:tcW w:w="2041" w:type="dxa"/>
+            <w:shd w:fill="E2EFDA" w:val="clear"/>
+            <w:tcBorders>
+              <w:top w:val="single" w:sz="4" w:color="BFBFBF"/>
+              <w:left w:val="single" w:sz="4" w:color="BFBFBF"/>
+              <w:bottom w:val="single" w:sz="4" w:color="BFBFBF"/>
+              <w:right w:val="single" w:sz="4" w:color="BFBFBF"/>
+            </w:tcBorders>
+          </w:tcPr>
+          <w:p>
+            <w:pPr>
+              <w:spacing w:before="40" w:after="40"/>
+            </w:pPr>
+            <w:r/>
+            <w:r>
+              <w:rPr>
+                <w:rFonts w:ascii="Calibri" w:hAnsi="Calibri" w:eastAsia="Calibri"/>
+                <w:b w:val="0"/>
+                <w:i w:val="0"/>
+                <w:color w:val="333333"/>
+                <w:sz w:val="16"/>
+              </w:rPr>
+              <w:t>Photo goes to processing and background is cleared in primary editor</w:t>
+            </w:r>
+          </w:p>
+        </w:tc>
+        <w:tc>
+          <w:tcPr>
+            <w:tcW w:w="1134" w:type="dxa"/>
+            <w:shd w:fill="E2EFDA" w:val="clear"/>
+            <w:tcBorders>
+              <w:top w:val="single" w:sz="4" w:color="BFBFBF"/>
+              <w:left w:val="single" w:sz="4" w:color="BFBFBF"/>
+              <w:bottom w:val="single" w:sz="4" w:color="BFBFBF"/>
+              <w:right w:val="single" w:sz="4" w:color="BFBFBF"/>
+            </w:tcBorders>
+          </w:tcPr>
+          <w:sdt>
+            <w:sdtPr>
+              <w:alias w:val="Result"/>
+              <w:tag w:val="result_status"/>
+              <w:id w:val="5001"/>
+              <w:dropDownList>
+                <w:listItem w:displayText="Not Executed" w:value="Not Executed"/>
+                <w:listItem w:displayText="Pass" w:value="Pass"/>
+                <w:listItem w:displayText="Fail" w:value="Fail"/>
+                <w:listItem w:displayText="Blocked" w:value="Blocked"/>
+              </w:dropDownList>
+            </w:sdtPr>
+            <w:sdtContent>
+              <w:p>
+                <w:pPr>
+                  <w:jc w:val="center"/>
+                </w:pPr>
+                <w:r>
+                  <w:rPr>
+                    <w:sz w:val="16"/>
+                    <w:color w:val="548235"/>
+                  </w:rPr>
+                  <w:t>Pass</w:t>
+                </w:r>
+              </w:p>
+            </w:sdtContent>
+          </w:sdt>
+        </w:tc>
+        <w:tc>
+          <w:tcPr>
+            <w:tcW w:w="907" w:type="dxa"/>
+            <w:shd w:fill="E2EFDA" w:val="clear"/>
+            <w:tcBorders>
+              <w:top w:val="single" w:sz="4" w:color="BFBFBF"/>
+              <w:left w:val="single" w:sz="4" w:color="BFBFBF"/>
+              <w:bottom w:val="single" w:sz="4" w:color="BFBFBF"/>
+              <w:right w:val="single" w:sz="4" w:color="BFBFBF"/>
+            </w:tcBorders>
           </w:tcPr>
           <w:p>
             <w:pPr>
@@ -3613,14 +3822,14 @@
         </w:tc>
         <w:tc>
           <w:tcPr>
-            <w:shd w:fill="F2F2F2" w:val="clear"/>
+            <w:tcW w:w="1927" w:type="dxa"/>
+            <w:shd w:fill="FFFFFF" w:val="clear"/>
             <w:tcBorders>
               <w:top w:val="single" w:sz="4" w:color="BFBFBF"/>
               <w:left w:val="single" w:sz="4" w:color="BFBFBF"/>
               <w:bottom w:val="single" w:sz="4" w:color="BFBFBF"/>
               <w:right w:val="single" w:sz="4" w:color="BFBFBF"/>
             </w:tcBorders>
-            <w:tcW w:w="1927" w:type="dxa"/>
           </w:tcPr>
           <w:p>
             <w:pPr>
@@ -3669,14 +3878,14 @@
         </w:tc>
         <w:tc>
           <w:tcPr>
-            <w:shd w:fill="F2F2F2" w:val="clear"/>
+            <w:tcW w:w="2041" w:type="dxa"/>
+            <w:shd w:fill="FFFFFF" w:val="clear"/>
             <w:tcBorders>
               <w:top w:val="single" w:sz="4" w:color="BFBFBF"/>
               <w:left w:val="single" w:sz="4" w:color="BFBFBF"/>
               <w:bottom w:val="single" w:sz="4" w:color="BFBFBF"/>
               <w:right w:val="single" w:sz="4" w:color="BFBFBF"/>
             </w:tcBorders>
-            <w:tcW w:w="2041" w:type="dxa"/>
           </w:tcPr>
           <w:p>
             <w:pPr>
@@ -3697,14 +3906,14 @@
         </w:tc>
         <w:tc>
           <w:tcPr>
-            <w:shd w:fill="F2F2F2" w:val="clear"/>
+            <w:tcW w:w="2041" w:type="dxa"/>
+            <w:shd w:fill="FFFFFF" w:val="clear"/>
             <w:tcBorders>
               <w:top w:val="single" w:sz="4" w:color="BFBFBF"/>
               <w:left w:val="single" w:sz="4" w:color="BFBFBF"/>
               <w:bottom w:val="single" w:sz="4" w:color="BFBFBF"/>
               <w:right w:val="single" w:sz="4" w:color="BFBFBF"/>
             </w:tcBorders>
-            <w:tcW w:w="2041" w:type="dxa"/>
           </w:tcPr>
           <w:p>
             <w:pPr>
@@ -3725,20 +3934,20 @@
         </w:tc>
         <w:tc>
           <w:tcPr>
-            <w:shd w:fill="F2F2F2" w:val="clear"/>
+            <w:tcW w:w="1134" w:type="dxa"/>
+            <w:shd w:fill="E2EFDA" w:val="clear"/>
             <w:tcBorders>
               <w:top w:val="single" w:sz="4" w:color="BFBFBF"/>
               <w:left w:val="single" w:sz="4" w:color="BFBFBF"/>
               <w:bottom w:val="single" w:sz="4" w:color="BFBFBF"/>
               <w:right w:val="single" w:sz="4" w:color="BFBFBF"/>
             </w:tcBorders>
-            <w:tcW w:w="1134" w:type="dxa"/>
           </w:tcPr>
           <w:sdt>
             <w:sdtPr>
               <w:alias w:val="Result"/>
               <w:tag w:val="result_status"/>
-              <w:id w:val="1004"/>
+              <w:id w:val="5002"/>
               <w:dropDownList>
                 <w:listItem w:displayText="Not Executed" w:value="Not Executed"/>
                 <w:listItem w:displayText="Pass" w:value="Pass"/>
@@ -3754,10 +3963,9 @@
                 <w:r>
                   <w:rPr>
                     <w:sz w:val="16"/>
-                    <w:szCs w:val="16"/>
-                    <w:color w:val="666666"/>
+                    <w:color w:val="548235"/>
                   </w:rPr>
-                  <w:t>Not Executed</w:t>
+                  <w:t>Pass</w:t>
                 </w:r>
               </w:p>
             </w:sdtContent>
@@ -3765,14 +3973,14 @@
         </w:tc>
         <w:tc>
           <w:tcPr>
-            <w:shd w:fill="F2F2F2" w:val="clear"/>
+            <w:tcW w:w="907" w:type="dxa"/>
+            <w:shd w:fill="E2EFDA" w:val="clear"/>
             <w:tcBorders>
               <w:top w:val="single" w:sz="4" w:color="BFBFBF"/>
               <w:left w:val="single" w:sz="4" w:color="BFBFBF"/>
               <w:bottom w:val="single" w:sz="4" w:color="BFBFBF"/>
               <w:right w:val="single" w:sz="4" w:color="BFBFBF"/>
             </w:tcBorders>
-            <w:tcW w:w="907" w:type="dxa"/>
           </w:tcPr>
           <w:p>
             <w:pPr>
@@ -3936,20 +4144,20 @@
         </w:tc>
         <w:tc>
           <w:tcPr>
-            <w:shd w:fill="FFFFFF" w:val="clear"/>
+            <w:tcW w:w="1134" w:type="dxa"/>
+            <w:shd w:fill="E2EFDA" w:val="clear"/>
             <w:tcBorders>
               <w:top w:val="single" w:sz="4" w:color="BFBFBF"/>
               <w:left w:val="single" w:sz="4" w:color="BFBFBF"/>
               <w:bottom w:val="single" w:sz="4" w:color="BFBFBF"/>
               <w:right w:val="single" w:sz="4" w:color="BFBFBF"/>
             </w:tcBorders>
-            <w:tcW w:w="1134" w:type="dxa"/>
           </w:tcPr>
           <w:sdt>
             <w:sdtPr>
               <w:alias w:val="Result"/>
               <w:tag w:val="result_status"/>
-              <w:id w:val="1005"/>
+              <w:id w:val="5003"/>
               <w:dropDownList>
                 <w:listItem w:displayText="Not Executed" w:value="Not Executed"/>
                 <w:listItem w:displayText="Pass" w:value="Pass"/>
@@ -3965,10 +4173,9 @@
                 <w:r>
                   <w:rPr>
                     <w:sz w:val="16"/>
-                    <w:szCs w:val="16"/>
-                    <w:color w:val="666666"/>
+                    <w:color w:val="548235"/>
                   </w:rPr>
-                  <w:t>Not Executed</w:t>
+                  <w:t>Pass</w:t>
                 </w:r>
               </w:p>
             </w:sdtContent>
@@ -3976,14 +4183,14 @@
         </w:tc>
         <w:tc>
           <w:tcPr>
-            <w:shd w:fill="FFFFFF" w:val="clear"/>
+            <w:tcW w:w="907" w:type="dxa"/>
+            <w:shd w:fill="E2EFDA" w:val="clear"/>
             <w:tcBorders>
               <w:top w:val="single" w:sz="4" w:color="BFBFBF"/>
               <w:left w:val="single" w:sz="4" w:color="BFBFBF"/>
               <w:bottom w:val="single" w:sz="4" w:color="BFBFBF"/>
               <w:right w:val="single" w:sz="4" w:color="BFBFBF"/>
             </w:tcBorders>
-            <w:tcW w:w="907" w:type="dxa"/>
           </w:tcPr>
           <w:p>
             <w:pPr>
@@ -4035,14 +4242,14 @@
         </w:tc>
         <w:tc>
           <w:tcPr>
-            <w:shd w:fill="F2F2F2" w:val="clear"/>
+            <w:tcW w:w="1927" w:type="dxa"/>
+            <w:shd w:fill="E2EFDA" w:val="clear"/>
             <w:tcBorders>
               <w:top w:val="single" w:sz="4" w:color="BFBFBF"/>
               <w:left w:val="single" w:sz="4" w:color="BFBFBF"/>
               <w:bottom w:val="single" w:sz="4" w:color="BFBFBF"/>
               <w:right w:val="single" w:sz="4" w:color="BFBFBF"/>
             </w:tcBorders>
-            <w:tcW w:w="1927" w:type="dxa"/>
           </w:tcPr>
           <w:p>
             <w:pPr>
@@ -4053,7 +4260,6 @@
               <w:rPr>
                 <w:rFonts w:ascii="Calibri" w:hAnsi="Calibri" w:eastAsia="Calibri"/>
                 <w:b w:val="0"/>
-                <w:i w:val="0"/>
                 <w:color w:val="333333"/>
                 <w:sz w:val="16"/>
               </w:rPr>
@@ -4091,14 +4297,14 @@
         </w:tc>
         <w:tc>
           <w:tcPr>
-            <w:shd w:fill="F2F2F2" w:val="clear"/>
+            <w:tcW w:w="2041" w:type="dxa"/>
+            <w:shd w:fill="E2EFDA" w:val="clear"/>
             <w:tcBorders>
               <w:top w:val="single" w:sz="4" w:color="BFBFBF"/>
               <w:left w:val="single" w:sz="4" w:color="BFBFBF"/>
               <w:bottom w:val="single" w:sz="4" w:color="BFBFBF"/>
               <w:right w:val="single" w:sz="4" w:color="BFBFBF"/>
             </w:tcBorders>
-            <w:tcW w:w="2041" w:type="dxa"/>
           </w:tcPr>
           <w:p>
             <w:pPr>
@@ -4109,24 +4315,23 @@
               <w:rPr>
                 <w:rFonts w:ascii="Calibri" w:hAnsi="Calibri" w:eastAsia="Calibri"/>
                 <w:b w:val="0"/>
-                <w:i w:val="0"/>
                 <w:color w:val="333333"/>
                 <w:sz w:val="16"/>
               </w:rPr>
-              <w:t>Tap X to close</w:t>
+              <w:t>Tap X → choose Discard or Cancel on alert</w:t>
             </w:r>
           </w:p>
         </w:tc>
         <w:tc>
           <w:tcPr>
-            <w:shd w:fill="F2F2F2" w:val="clear"/>
+            <w:tcW w:w="2041" w:type="dxa"/>
+            <w:shd w:fill="E2EFDA" w:val="clear"/>
             <w:tcBorders>
               <w:top w:val="single" w:sz="4" w:color="BFBFBF"/>
               <w:left w:val="single" w:sz="4" w:color="BFBFBF"/>
               <w:bottom w:val="single" w:sz="4" w:color="BFBFBF"/>
               <w:right w:val="single" w:sz="4" w:color="BFBFBF"/>
             </w:tcBorders>
-            <w:tcW w:w="2041" w:type="dxa"/>
           </w:tcPr>
           <w:p>
             <w:pPr>
@@ -4137,30 +4342,29 @@
               <w:rPr>
                 <w:rFonts w:ascii="Calibri" w:hAnsi="Calibri" w:eastAsia="Calibri"/>
                 <w:b w:val="0"/>
-                <w:i w:val="0"/>
                 <w:color w:val="333333"/>
                 <w:sz w:val="16"/>
               </w:rPr>
-              <w:t>App exits editor safely; no crash</w:t>
+              <w:t>Alert appears with Discard / Cancel; choice works; no crash</w:t>
             </w:r>
           </w:p>
         </w:tc>
         <w:tc>
           <w:tcPr>
-            <w:shd w:fill="F2F2F2" w:val="clear"/>
+            <w:tcW w:w="1134" w:type="dxa"/>
+            <w:shd w:fill="E2EFDA" w:val="clear"/>
             <w:tcBorders>
               <w:top w:val="single" w:sz="4" w:color="BFBFBF"/>
               <w:left w:val="single" w:sz="4" w:color="BFBFBF"/>
               <w:bottom w:val="single" w:sz="4" w:color="BFBFBF"/>
               <w:right w:val="single" w:sz="4" w:color="BFBFBF"/>
             </w:tcBorders>
-            <w:tcW w:w="1134" w:type="dxa"/>
           </w:tcPr>
           <w:sdt>
             <w:sdtPr>
               <w:alias w:val="Result"/>
               <w:tag w:val="result_status"/>
-              <w:id w:val="1006"/>
+              <w:id w:val="5004"/>
               <w:dropDownList>
                 <w:listItem w:displayText="Not Executed" w:value="Not Executed"/>
                 <w:listItem w:displayText="Pass" w:value="Pass"/>
@@ -4176,10 +4380,9 @@
                 <w:r>
                   <w:rPr>
                     <w:sz w:val="16"/>
-                    <w:szCs w:val="16"/>
-                    <w:color w:val="666666"/>
+                    <w:color w:val="548235"/>
                   </w:rPr>
-                  <w:t>Not Executed</w:t>
+                  <w:t>Pass</w:t>
                 </w:r>
               </w:p>
             </w:sdtContent>
@@ -4187,14 +4390,14 @@
         </w:tc>
         <w:tc>
           <w:tcPr>
-            <w:shd w:fill="F2F2F2" w:val="clear"/>
+            <w:tcW w:w="907" w:type="dxa"/>
+            <w:shd w:fill="E2EFDA" w:val="clear"/>
             <w:tcBorders>
               <w:top w:val="single" w:sz="4" w:color="BFBFBF"/>
               <w:left w:val="single" w:sz="4" w:color="BFBFBF"/>
               <w:bottom w:val="single" w:sz="4" w:color="BFBFBF"/>
               <w:right w:val="single" w:sz="4" w:color="BFBFBF"/>
             </w:tcBorders>
-            <w:tcW w:w="907" w:type="dxa"/>
           </w:tcPr>
           <w:p>
             <w:pPr>
@@ -5132,14 +5335,14 @@
         </w:tc>
         <w:tc>
           <w:tcPr>
-            <w:shd w:fill="F2F2F2" w:val="clear"/>
+            <w:tcW w:w="1927" w:type="dxa"/>
+            <w:shd w:fill="FFFFFF" w:val="clear"/>
             <w:tcBorders>
               <w:top w:val="single" w:sz="4" w:color="BFBFBF"/>
               <w:left w:val="single" w:sz="4" w:color="BFBFBF"/>
               <w:bottom w:val="single" w:sz="4" w:color="BFBFBF"/>
               <w:right w:val="single" w:sz="4" w:color="BFBFBF"/>
             </w:tcBorders>
-            <w:tcW w:w="1927" w:type="dxa"/>
           </w:tcPr>
           <w:p>
             <w:pPr>
@@ -5188,14 +5391,14 @@
         </w:tc>
         <w:tc>
           <w:tcPr>
-            <w:shd w:fill="F2F2F2" w:val="clear"/>
+            <w:tcW w:w="2041" w:type="dxa"/>
+            <w:shd w:fill="FFFFFF" w:val="clear"/>
             <w:tcBorders>
               <w:top w:val="single" w:sz="4" w:color="BFBFBF"/>
               <w:left w:val="single" w:sz="4" w:color="BFBFBF"/>
               <w:bottom w:val="single" w:sz="4" w:color="BFBFBF"/>
               <w:right w:val="single" w:sz="4" w:color="BFBFBF"/>
             </w:tcBorders>
-            <w:tcW w:w="2041" w:type="dxa"/>
           </w:tcPr>
           <w:p>
             <w:pPr>
@@ -5210,20 +5413,20 @@
                 <w:color w:val="333333"/>
                 <w:sz w:val="16"/>
               </w:rPr>
-              <w:t>Use Background options (Image, Color, Gradient)</w:t>
+              <w:t>In secondary editor, use Background options (Image, Color, Gradient)</w:t>
             </w:r>
           </w:p>
         </w:tc>
         <w:tc>
           <w:tcPr>
-            <w:shd w:fill="F2F2F2" w:val="clear"/>
+            <w:tcW w:w="2041" w:type="dxa"/>
+            <w:shd w:fill="FFFFFF" w:val="clear"/>
             <w:tcBorders>
               <w:top w:val="single" w:sz="4" w:color="BFBFBF"/>
               <w:left w:val="single" w:sz="4" w:color="BFBFBF"/>
               <w:bottom w:val="single" w:sz="4" w:color="BFBFBF"/>
               <w:right w:val="single" w:sz="4" w:color="BFBFBF"/>
             </w:tcBorders>
-            <w:tcW w:w="2041" w:type="dxa"/>
           </w:tcPr>
           <w:p>
             <w:pPr>
@@ -5238,26 +5441,26 @@
                 <w:color w:val="333333"/>
                 <w:sz w:val="16"/>
               </w:rPr>
-              <w:t>New background applies behind the subject</w:t>
+              <w:t>New background, color, or gradient applies behind the subject</w:t>
             </w:r>
           </w:p>
         </w:tc>
         <w:tc>
           <w:tcPr>
-            <w:shd w:fill="F2F2F2" w:val="clear"/>
+            <w:tcW w:w="1134" w:type="dxa"/>
+            <w:shd w:fill="E2EFDA" w:val="clear"/>
             <w:tcBorders>
               <w:top w:val="single" w:sz="4" w:color="BFBFBF"/>
               <w:left w:val="single" w:sz="4" w:color="BFBFBF"/>
               <w:bottom w:val="single" w:sz="4" w:color="BFBFBF"/>
               <w:right w:val="single" w:sz="4" w:color="BFBFBF"/>
             </w:tcBorders>
-            <w:tcW w:w="1134" w:type="dxa"/>
           </w:tcPr>
           <w:sdt>
             <w:sdtPr>
               <w:alias w:val="Result"/>
               <w:tag w:val="result_status"/>
-              <w:id w:val="1010"/>
+              <w:id w:val="5005"/>
               <w:dropDownList>
                 <w:listItem w:displayText="Not Executed" w:value="Not Executed"/>
                 <w:listItem w:displayText="Pass" w:value="Pass"/>
@@ -5273,10 +5476,9 @@
                 <w:r>
                   <w:rPr>
                     <w:sz w:val="16"/>
-                    <w:szCs w:val="16"/>
-                    <w:color w:val="666666"/>
+                    <w:color w:val="548235"/>
                   </w:rPr>
-                  <w:t>Not Executed</w:t>
+                  <w:t>Pass</w:t>
                 </w:r>
               </w:p>
             </w:sdtContent>
@@ -5284,14 +5486,14 @@
         </w:tc>
         <w:tc>
           <w:tcPr>
-            <w:shd w:fill="F2F2F2" w:val="clear"/>
+            <w:tcW w:w="907" w:type="dxa"/>
+            <w:shd w:fill="E2EFDA" w:val="clear"/>
             <w:tcBorders>
               <w:top w:val="single" w:sz="4" w:color="BFBFBF"/>
               <w:left w:val="single" w:sz="4" w:color="BFBFBF"/>
               <w:bottom w:val="single" w:sz="4" w:color="BFBFBF"/>
               <w:right w:val="single" w:sz="4" w:color="BFBFBF"/>
             </w:tcBorders>
-            <w:tcW w:w="907" w:type="dxa"/>
           </w:tcPr>
           <w:p>
             <w:pPr>
@@ -5343,6 +5545,7 @@
         </w:tc>
         <w:tc>
           <w:tcPr>
+            <w:tcW w:w="1927" w:type="dxa"/>
             <w:shd w:fill="FFFFFF" w:val="clear"/>
             <w:tcBorders>
               <w:top w:val="single" w:sz="4" w:color="BFBFBF"/>
@@ -5350,7 +5553,6 @@
               <w:bottom w:val="single" w:sz="4" w:color="BFBFBF"/>
               <w:right w:val="single" w:sz="4" w:color="BFBFBF"/>
             </w:tcBorders>
-            <w:tcW w:w="1927" w:type="dxa"/>
           </w:tcPr>
           <w:p>
             <w:pPr>
@@ -5365,7 +5567,7 @@
                 <w:color w:val="333333"/>
                 <w:sz w:val="16"/>
               </w:rPr>
-              <w:t>Use Blur / Text / Sticker</w:t>
+              <w:t>Use other secondary tools</w:t>
             </w:r>
           </w:p>
         </w:tc>
@@ -5399,6 +5601,7 @@
         </w:tc>
         <w:tc>
           <w:tcPr>
+            <w:tcW w:w="2041" w:type="dxa"/>
             <w:shd w:fill="FFFFFF" w:val="clear"/>
             <w:tcBorders>
               <w:top w:val="single" w:sz="4" w:color="BFBFBF"/>
@@ -5406,7 +5609,6 @@
               <w:bottom w:val="single" w:sz="4" w:color="BFBFBF"/>
               <w:right w:val="single" w:sz="4" w:color="BFBFBF"/>
             </w:tcBorders>
-            <w:tcW w:w="2041" w:type="dxa"/>
           </w:tcPr>
           <w:p>
             <w:pPr>
@@ -5421,12 +5623,13 @@
                 <w:color w:val="333333"/>
                 <w:sz w:val="16"/>
               </w:rPr>
-              <w:t>Try Blur, Text, or Sticker</w:t>
+              <w:t>Try Blur, Text, Sticker, or similar secondary tools</w:t>
             </w:r>
           </w:p>
         </w:tc>
         <w:tc>
           <w:tcPr>
+            <w:tcW w:w="2041" w:type="dxa"/>
             <w:shd w:fill="FFFFFF" w:val="clear"/>
             <w:tcBorders>
               <w:top w:val="single" w:sz="4" w:color="BFBFBF"/>
@@ -5434,7 +5637,6 @@
               <w:bottom w:val="single" w:sz="4" w:color="BFBFBF"/>
               <w:right w:val="single" w:sz="4" w:color="BFBFBF"/>
             </w:tcBorders>
-            <w:tcW w:w="2041" w:type="dxa"/>
           </w:tcPr>
           <w:p>
             <w:pPr>
@@ -5449,26 +5651,26 @@
                 <w:color w:val="333333"/>
                 <w:sz w:val="16"/>
               </w:rPr>
-              <w:t>Selected tool works on the current image</w:t>
+              <w:t>Selected tool works on the current cleared image</w:t>
             </w:r>
           </w:p>
         </w:tc>
         <w:tc>
           <w:tcPr>
-            <w:shd w:fill="FFFFFF" w:val="clear"/>
+            <w:tcW w:w="1134" w:type="dxa"/>
+            <w:shd w:fill="E2EFDA" w:val="clear"/>
             <w:tcBorders>
               <w:top w:val="single" w:sz="4" w:color="BFBFBF"/>
               <w:left w:val="single" w:sz="4" w:color="BFBFBF"/>
               <w:bottom w:val="single" w:sz="4" w:color="BFBFBF"/>
               <w:right w:val="single" w:sz="4" w:color="BFBFBF"/>
             </w:tcBorders>
-            <w:tcW w:w="1134" w:type="dxa"/>
           </w:tcPr>
           <w:sdt>
             <w:sdtPr>
               <w:alias w:val="Result"/>
               <w:tag w:val="result_status"/>
-              <w:id w:val="1011"/>
+              <w:id w:val="5006"/>
               <w:dropDownList>
                 <w:listItem w:displayText="Not Executed" w:value="Not Executed"/>
                 <w:listItem w:displayText="Pass" w:value="Pass"/>
@@ -5484,10 +5686,9 @@
                 <w:r>
                   <w:rPr>
                     <w:sz w:val="16"/>
-                    <w:szCs w:val="16"/>
-                    <w:color w:val="666666"/>
+                    <w:color w:val="548235"/>
                   </w:rPr>
-                  <w:t>Not Executed</w:t>
+                  <w:t>Pass</w:t>
                 </w:r>
               </w:p>
             </w:sdtContent>
@@ -5495,14 +5696,14 @@
         </w:tc>
         <w:tc>
           <w:tcPr>
-            <w:shd w:fill="FFFFFF" w:val="clear"/>
+            <w:tcW w:w="907" w:type="dxa"/>
+            <w:shd w:fill="E2EFDA" w:val="clear"/>
             <w:tcBorders>
               <w:top w:val="single" w:sz="4" w:color="BFBFBF"/>
               <w:left w:val="single" w:sz="4" w:color="BFBFBF"/>
               <w:bottom w:val="single" w:sz="4" w:color="BFBFBF"/>
               <w:right w:val="single" w:sz="4" w:color="BFBFBF"/>
             </w:tcBorders>
-            <w:tcW w:w="907" w:type="dxa"/>
           </w:tcPr>
           <w:p>
             <w:pPr>
@@ -7065,11 +7266,10 @@
               <w:rPr>
                 <w:rFonts w:ascii="Calibri" w:hAnsi="Calibri" w:eastAsia="Calibri"/>
                 <w:b w:val="0"/>
-                <w:i w:val="0"/>
                 <w:color w:val="333333"/>
                 <w:sz w:val="18"/>
               </w:rPr>
-              <w:t>6 / 17</w:t>
+              <w:t>13 / 18</w:t>
             </w:r>
           </w:p>
         </w:tc>
@@ -7123,11 +7323,10 @@
               <w:rPr>
                 <w:rFonts w:ascii="Calibri" w:hAnsi="Calibri" w:eastAsia="Calibri"/>
                 <w:b w:val="0"/>
-                <w:i w:val="0"/>
                 <w:color w:val="333333"/>
                 <w:sz w:val="18"/>
               </w:rPr>
-              <w:t>Pass: 5 | Fail: 1 | Blocked: 0</w:t>
+              <w:t>Pass: 12 | Fail: 1 | Blocked: 0</w:t>
             </w:r>
           </w:p>
         </w:tc>
@@ -7181,11 +7380,10 @@
               <w:rPr>
                 <w:rFonts w:ascii="Calibri" w:hAnsi="Calibri" w:eastAsia="Calibri"/>
                 <w:b w:val="0"/>
-                <w:i w:val="0"/>
                 <w:color w:val="333333"/>
                 <w:sz w:val="18"/>
               </w:rPr>
-              <w:t>Testing in progress. One High bug found: Shape in the primary editor does not keep the cleared-background image.</w:t>
+              <w:t>Testing in progress. Camera, primary tools, and secondary background tools passed. One High bug remains: Shape does not keep the cleared-background image.</w:t>
             </w:r>
           </w:p>
         </w:tc>

</xml_diff>

<commit_message>
Add device info and product claim-to-action testing map
Record OnePlus 9 5G / OxygenOS 13.1 / app v2.7 environment and map
Play Store + Envobyte product keywords to concrete Background Remove
and Batch Remover test actions under assignment quality areas.

Co-authored-by: Showravkarmakar <Showrav88@users.noreply.github.com>
</commit_message>
<xml_diff>
--- a/SQA_Intern_Assignment_Test_Report.docx
+++ b/SQA_Intern_Assignment_Test_Report.docx
@@ -210,7 +210,7 @@
                 <w:color w:val="333333"/>
                 <w:sz w:val="20"/>
               </w:rPr>
-              <w:t>Auto Background Remover (Android APK)</w:t>
+              <w:t>Auto Background Remover (Android) — v2.7</w:t>
             </w:r>
           </w:p>
         </w:tc>
@@ -268,7 +268,7 @@
                 <w:color w:val="333333"/>
                 <w:sz w:val="20"/>
               </w:rPr>
-              <w:t>Background Remove, Batch Remover</w:t>
+              <w:t>Background Remove, Batch Remover (Homepage modules)</w:t>
             </w:r>
           </w:p>
         </w:tc>
@@ -326,6 +326,7 @@
                 <w:color w:val="333333"/>
                 <w:sz w:val="20"/>
               </w:rPr>
+              <w:t>OnePlus 9 5G (LE2111) · OxygenOS 13.1 · Android 10+ · Snapdragon 888 · 12 GB RAM · 256 GB</w:t>
             </w:r>
           </w:p>
         </w:tc>
@@ -383,6 +384,123 @@
                 <w:color w:val="333333"/>
                 <w:sz w:val="20"/>
               </w:rPr>
+              <w:t>August 2026</w:t>
+            </w:r>
+          </w:p>
+        </w:tc>
+      </w:tr>
+      <w:tr>
+        <w:tc>
+          <w:tcPr>
+            <w:tcW w:type="dxa" w:w="5046"/>
+            <w:shd w:fill="D6E3F0" w:val="clear"/>
+            <w:tcBorders>
+              <w:top w:val="single" w:sz="4" w:color="BFBFBF"/>
+              <w:left w:val="single" w:sz="4" w:color="BFBFBF"/>
+              <w:bottom w:val="single" w:sz="4" w:color="BFBFBF"/>
+              <w:right w:val="single" w:sz="4" w:color="BFBFBF"/>
+            </w:tcBorders>
+          </w:tcPr>
+          <w:p>
+            <w:pPr>
+              <w:spacing w:before="40" w:after="40"/>
+            </w:pPr>
+            <w:r/>
+            <w:r>
+              <w:rPr>
+                <w:rFonts w:ascii="Calibri" w:hAnsi="Calibri" w:eastAsia="Calibri"/>
+                <w:b/>
+                <w:i w:val="0"/>
+                <w:color w:val="1F4E79"/>
+                <w:sz w:val="20"/>
+              </w:rPr>
+              <w:t>Developer</w:t>
+            </w:r>
+          </w:p>
+        </w:tc>
+        <w:tc>
+          <w:tcPr>
+            <w:tcW w:type="dxa" w:w="5046"/>
+            <w:shd w:fill="FFFFFF" w:val="clear"/>
+            <w:tcBorders>
+              <w:top w:val="single" w:sz="4" w:color="BFBFBF"/>
+              <w:left w:val="single" w:sz="4" w:color="BFBFBF"/>
+              <w:bottom w:val="single" w:sz="4" w:color="BFBFBF"/>
+              <w:right w:val="single" w:sz="4" w:color="BFBFBF"/>
+            </w:tcBorders>
+          </w:tcPr>
+          <w:p>
+            <w:pPr>
+              <w:spacing w:before="40" w:after="40"/>
+            </w:pPr>
+            <w:r/>
+            <w:r>
+              <w:rPr>
+                <w:rFonts w:ascii="Calibri" w:hAnsi="Calibri" w:eastAsia="Calibri"/>
+                <w:b w:val="0"/>
+                <w:i w:val="0"/>
+                <w:color w:val="333333"/>
+                <w:sz w:val="20"/>
+              </w:rPr>
+              <w:t>Envobyte Ltd.</w:t>
+            </w:r>
+          </w:p>
+        </w:tc>
+      </w:tr>
+      <w:tr>
+        <w:tc>
+          <w:tcPr>
+            <w:tcW w:type="dxa" w:w="5046"/>
+            <w:shd w:fill="D6E3F0" w:val="clear"/>
+            <w:tcBorders>
+              <w:top w:val="single" w:sz="4" w:color="BFBFBF"/>
+              <w:left w:val="single" w:sz="4" w:color="BFBFBF"/>
+              <w:bottom w:val="single" w:sz="4" w:color="BFBFBF"/>
+              <w:right w:val="single" w:sz="4" w:color="BFBFBF"/>
+            </w:tcBorders>
+          </w:tcPr>
+          <w:p>
+            <w:pPr>
+              <w:spacing w:before="40" w:after="40"/>
+            </w:pPr>
+            <w:r/>
+            <w:r>
+              <w:rPr>
+                <w:rFonts w:ascii="Calibri" w:hAnsi="Calibri" w:eastAsia="Calibri"/>
+                <w:b/>
+                <w:i w:val="0"/>
+                <w:color w:val="1F4E79"/>
+                <w:sz w:val="20"/>
+              </w:rPr>
+              <w:t>Product references</w:t>
+            </w:r>
+          </w:p>
+        </w:tc>
+        <w:tc>
+          <w:tcPr>
+            <w:tcW w:type="dxa" w:w="5046"/>
+            <w:shd w:fill="FFFFFF" w:val="clear"/>
+            <w:tcBorders>
+              <w:top w:val="single" w:sz="4" w:color="BFBFBF"/>
+              <w:left w:val="single" w:sz="4" w:color="BFBFBF"/>
+              <w:bottom w:val="single" w:sz="4" w:color="BFBFBF"/>
+              <w:right w:val="single" w:sz="4" w:color="BFBFBF"/>
+            </w:tcBorders>
+          </w:tcPr>
+          <w:p>
+            <w:pPr>
+              <w:spacing w:before="40" w:after="40"/>
+            </w:pPr>
+            <w:r/>
+            <w:r>
+              <w:rPr>
+                <w:rFonts w:ascii="Calibri" w:hAnsi="Calibri" w:eastAsia="Calibri"/>
+                <w:b w:val="0"/>
+                <w:i w:val="0"/>
+                <w:color w:val="333333"/>
+                <w:sz w:val="20"/>
+              </w:rPr>
+              <w:t>Play Store listing (v2.7) · https://envobyte.com/portfolio/background-removal-app/</w:t>
             </w:r>
           </w:p>
         </w:tc>
@@ -416,7 +534,7 @@
           <w:color w:val="333333"/>
           <w:sz w:val="22"/>
         </w:rPr>
-        <w:t>Manual testing was done on the Homepage modules: Background Remove and Batch Remover. Focus was on how the app works, the user flow, stability, ease of use, speed/feedback, and overall product quality. Background cutout accuracy from the third-party API was not judged.</w:t>
+        <w:t>Manual testing was done on the Homepage modules: Background Remove and Batch Remover, on OnePlus 9 5G (OxygenOS 13.1), app version 2.7. Focus was on how the app works, the user flow, stability, ease of use, speed/feedback, and overall product quality. Background cutout accuracy from the third-party API was not judged. Product claims were taken from the Play Store listing and Envobyte product page for scope alignment only.</w:t>
       </w:r>
     </w:p>
     <w:p>
@@ -541,6 +659,1322 @@
     </w:p>
     <w:p>
       <w:pPr>
+        <w:spacing w:before="200" w:after="120"/>
+      </w:pPr>
+      <w:r>
+        <w:rPr>
+          <w:rFonts w:ascii="Calibri" w:hAnsi="Calibri" w:eastAsia="Calibri"/>
+          <w:b/>
+          <w:i w:val="0"/>
+          <w:color w:val="2E75B6"/>
+          <w:sz w:val="26"/>
+        </w:rPr>
+        <w:t>1.2 Features Under Test (from product listing)</w:t>
+      </w:r>
+    </w:p>
+    <w:p>
+      <w:pPr>
+        <w:spacing w:before="80" w:after="120"/>
+      </w:pPr>
+      <w:r>
+        <w:rPr>
+          <w:rFonts w:ascii="Calibri" w:hAnsi="Calibri" w:eastAsia="Calibri"/>
+          <w:b w:val="0"/>
+          <w:i w:val="0"/>
+          <w:color w:val="333333"/>
+          <w:sz w:val="20"/>
+        </w:rPr>
+        <w:t>Checked Play Store product details (Auto Background Remover v2.7 by Envobyte Ltd.) and the product page https://envobyte.com/portfolio/background-removal-app/. Below are assignment-related keywords and the action tested for each. AI cutout perfection was not judged.</w:t>
+      </w:r>
+    </w:p>
+    <w:tbl>
+      <w:tblPr>
+        <w:tblStyle w:val="TableGrid"/>
+        <w:tblW w:type="auto" w:w="0"/>
+        <w:tblLook w:firstColumn="1" w:firstRow="1" w:lastColumn="0" w:lastRow="0" w:noHBand="0" w:noVBand="1" w:val="04A0"/>
+      </w:tblPr>
+      <w:tblGrid>
+        <w:gridCol w:w="2523"/>
+        <w:gridCol w:w="2523"/>
+        <w:gridCol w:w="2523"/>
+        <w:gridCol w:w="2523"/>
+      </w:tblGrid>
+      <w:tr>
+        <w:tc>
+          <w:tcPr>
+            <w:tcW w:type="dxa" w:w="2523"/>
+            <w:shd w:fill="1F4E79" w:val="clear"/>
+            <w:tcBorders>
+              <w:top w:val="single" w:sz="4" w:color="BFBFBF"/>
+              <w:left w:val="single" w:sz="4" w:color="BFBFBF"/>
+              <w:bottom w:val="single" w:sz="4" w:color="BFBFBF"/>
+              <w:right w:val="single" w:sz="4" w:color="BFBFBF"/>
+            </w:tcBorders>
+          </w:tcPr>
+          <w:p>
+            <w:pPr>
+              <w:spacing w:before="40" w:after="40"/>
+              <w:jc w:val="center"/>
+            </w:pPr>
+            <w:r/>
+            <w:r>
+              <w:rPr>
+                <w:rFonts w:ascii="Calibri" w:hAnsi="Calibri" w:eastAsia="Calibri"/>
+                <w:b/>
+                <w:i w:val="0"/>
+                <w:color w:val="FFFFFF"/>
+                <w:sz w:val="16"/>
+              </w:rPr>
+              <w:t>Product keyword / claim</w:t>
+            </w:r>
+          </w:p>
+        </w:tc>
+        <w:tc>
+          <w:tcPr>
+            <w:tcW w:type="dxa" w:w="2523"/>
+            <w:shd w:fill="1F4E79" w:val="clear"/>
+            <w:tcBorders>
+              <w:top w:val="single" w:sz="4" w:color="BFBFBF"/>
+              <w:left w:val="single" w:sz="4" w:color="BFBFBF"/>
+              <w:bottom w:val="single" w:sz="4" w:color="BFBFBF"/>
+              <w:right w:val="single" w:sz="4" w:color="BFBFBF"/>
+            </w:tcBorders>
+          </w:tcPr>
+          <w:p>
+            <w:pPr>
+              <w:spacing w:before="40" w:after="40"/>
+              <w:jc w:val="center"/>
+            </w:pPr>
+            <w:r/>
+            <w:r>
+              <w:rPr>
+                <w:rFonts w:ascii="Calibri" w:hAnsi="Calibri" w:eastAsia="Calibri"/>
+                <w:b/>
+                <w:i w:val="0"/>
+                <w:color w:val="FFFFFF"/>
+                <w:sz w:val="16"/>
+              </w:rPr>
+              <w:t>Module</w:t>
+            </w:r>
+          </w:p>
+        </w:tc>
+        <w:tc>
+          <w:tcPr>
+            <w:tcW w:type="dxa" w:w="2523"/>
+            <w:shd w:fill="1F4E79" w:val="clear"/>
+            <w:tcBorders>
+              <w:top w:val="single" w:sz="4" w:color="BFBFBF"/>
+              <w:left w:val="single" w:sz="4" w:color="BFBFBF"/>
+              <w:bottom w:val="single" w:sz="4" w:color="BFBFBF"/>
+              <w:right w:val="single" w:sz="4" w:color="BFBFBF"/>
+            </w:tcBorders>
+          </w:tcPr>
+          <w:p>
+            <w:pPr>
+              <w:spacing w:before="40" w:after="40"/>
+              <w:jc w:val="center"/>
+            </w:pPr>
+            <w:r/>
+            <w:r>
+              <w:rPr>
+                <w:rFonts w:ascii="Calibri" w:hAnsi="Calibri" w:eastAsia="Calibri"/>
+                <w:b/>
+                <w:i w:val="0"/>
+                <w:color w:val="FFFFFF"/>
+                <w:sz w:val="16"/>
+              </w:rPr>
+              <w:t>Action to test</w:t>
+            </w:r>
+          </w:p>
+        </w:tc>
+        <w:tc>
+          <w:tcPr>
+            <w:tcW w:type="dxa" w:w="2523"/>
+            <w:shd w:fill="1F4E79" w:val="clear"/>
+            <w:tcBorders>
+              <w:top w:val="single" w:sz="4" w:color="BFBFBF"/>
+              <w:left w:val="single" w:sz="4" w:color="BFBFBF"/>
+              <w:bottom w:val="single" w:sz="4" w:color="BFBFBF"/>
+              <w:right w:val="single" w:sz="4" w:color="BFBFBF"/>
+            </w:tcBorders>
+          </w:tcPr>
+          <w:p>
+            <w:pPr>
+              <w:spacing w:before="40" w:after="40"/>
+              <w:jc w:val="center"/>
+            </w:pPr>
+            <w:r/>
+            <w:r>
+              <w:rPr>
+                <w:rFonts w:ascii="Calibri" w:hAnsi="Calibri" w:eastAsia="Calibri"/>
+                <w:b/>
+                <w:i w:val="0"/>
+                <w:color w:val="FFFFFF"/>
+                <w:sz w:val="16"/>
+              </w:rPr>
+              <w:t>Quality area</w:t>
+            </w:r>
+          </w:p>
+        </w:tc>
+      </w:tr>
+      <w:tr>
+        <w:tc>
+          <w:tcPr>
+            <w:tcW w:type="dxa" w:w="2523"/>
+            <w:shd w:fill="FFFFFF" w:val="clear"/>
+            <w:tcBorders>
+              <w:top w:val="single" w:sz="4" w:color="BFBFBF"/>
+              <w:left w:val="single" w:sz="4" w:color="BFBFBF"/>
+              <w:bottom w:val="single" w:sz="4" w:color="BFBFBF"/>
+              <w:right w:val="single" w:sz="4" w:color="BFBFBF"/>
+            </w:tcBorders>
+          </w:tcPr>
+          <w:p>
+            <w:pPr>
+              <w:spacing w:before="40" w:after="40"/>
+            </w:pPr>
+            <w:r/>
+            <w:r>
+              <w:rPr>
+                <w:rFonts w:ascii="Calibri" w:hAnsi="Calibri" w:eastAsia="Calibri"/>
+                <w:b w:val="0"/>
+                <w:i w:val="0"/>
+                <w:color w:val="333333"/>
+                <w:sz w:val="16"/>
+              </w:rPr>
+              <w:t>Automatic / AI background removal</w:t>
+            </w:r>
+          </w:p>
+        </w:tc>
+        <w:tc>
+          <w:tcPr>
+            <w:tcW w:type="dxa" w:w="2523"/>
+            <w:shd w:fill="FFFFFF" w:val="clear"/>
+            <w:tcBorders>
+              <w:top w:val="single" w:sz="4" w:color="BFBFBF"/>
+              <w:left w:val="single" w:sz="4" w:color="BFBFBF"/>
+              <w:bottom w:val="single" w:sz="4" w:color="BFBFBF"/>
+              <w:right w:val="single" w:sz="4" w:color="BFBFBF"/>
+            </w:tcBorders>
+          </w:tcPr>
+          <w:p>
+            <w:pPr>
+              <w:spacing w:before="40" w:after="40"/>
+            </w:pPr>
+            <w:r/>
+            <w:r>
+              <w:rPr>
+                <w:rFonts w:ascii="Calibri" w:hAnsi="Calibri" w:eastAsia="Calibri"/>
+                <w:b w:val="0"/>
+                <w:i w:val="0"/>
+                <w:color w:val="333333"/>
+                <w:sz w:val="16"/>
+              </w:rPr>
+              <w:t>Background Remove</w:t>
+            </w:r>
+          </w:p>
+        </w:tc>
+        <w:tc>
+          <w:tcPr>
+            <w:tcW w:type="dxa" w:w="2523"/>
+            <w:shd w:fill="FFFFFF" w:val="clear"/>
+            <w:tcBorders>
+              <w:top w:val="single" w:sz="4" w:color="BFBFBF"/>
+              <w:left w:val="single" w:sz="4" w:color="BFBFBF"/>
+              <w:bottom w:val="single" w:sz="4" w:color="BFBFBF"/>
+              <w:right w:val="single" w:sz="4" w:color="BFBFBF"/>
+            </w:tcBorders>
+          </w:tcPr>
+          <w:p>
+            <w:pPr>
+              <w:spacing w:before="40" w:after="40"/>
+            </w:pPr>
+            <w:r/>
+            <w:r>
+              <w:rPr>
+                <w:rFonts w:ascii="Calibri" w:hAnsi="Calibri" w:eastAsia="Calibri"/>
+                <w:b w:val="0"/>
+                <w:i w:val="0"/>
+                <w:color w:val="333333"/>
+                <w:sz w:val="16"/>
+              </w:rPr>
+              <w:t>Select photo → Continue → confirm auto clear in primary editor</w:t>
+            </w:r>
+          </w:p>
+        </w:tc>
+        <w:tc>
+          <w:tcPr>
+            <w:tcW w:type="dxa" w:w="2523"/>
+            <w:shd w:fill="FFFFFF" w:val="clear"/>
+            <w:tcBorders>
+              <w:top w:val="single" w:sz="4" w:color="BFBFBF"/>
+              <w:left w:val="single" w:sz="4" w:color="BFBFBF"/>
+              <w:bottom w:val="single" w:sz="4" w:color="BFBFBF"/>
+              <w:right w:val="single" w:sz="4" w:color="BFBFBF"/>
+            </w:tcBorders>
+          </w:tcPr>
+          <w:p>
+            <w:pPr>
+              <w:spacing w:before="40" w:after="40"/>
+            </w:pPr>
+            <w:r/>
+            <w:r>
+              <w:rPr>
+                <w:rFonts w:ascii="Calibri" w:hAnsi="Calibri" w:eastAsia="Calibri"/>
+                <w:b w:val="0"/>
+                <w:i w:val="0"/>
+                <w:color w:val="333333"/>
+                <w:sz w:val="16"/>
+              </w:rPr>
+              <w:t>Functionality, Performance</w:t>
+            </w:r>
+          </w:p>
+        </w:tc>
+      </w:tr>
+      <w:tr>
+        <w:tc>
+          <w:tcPr>
+            <w:tcW w:type="dxa" w:w="2523"/>
+            <w:shd w:fill="F2F2F2" w:val="clear"/>
+            <w:tcBorders>
+              <w:top w:val="single" w:sz="4" w:color="BFBFBF"/>
+              <w:left w:val="single" w:sz="4" w:color="BFBFBF"/>
+              <w:bottom w:val="single" w:sz="4" w:color="BFBFBF"/>
+              <w:right w:val="single" w:sz="4" w:color="BFBFBF"/>
+            </w:tcBorders>
+          </w:tcPr>
+          <w:p>
+            <w:pPr>
+              <w:spacing w:before="40" w:after="40"/>
+            </w:pPr>
+            <w:r/>
+            <w:r>
+              <w:rPr>
+                <w:rFonts w:ascii="Calibri" w:hAnsi="Calibri" w:eastAsia="Calibri"/>
+                <w:b w:val="0"/>
+                <w:i w:val="0"/>
+                <w:color w:val="333333"/>
+                <w:sz w:val="16"/>
+              </w:rPr>
+              <w:t>Gallery / camera upload</w:t>
+            </w:r>
+          </w:p>
+        </w:tc>
+        <w:tc>
+          <w:tcPr>
+            <w:tcW w:type="dxa" w:w="2523"/>
+            <w:shd w:fill="F2F2F2" w:val="clear"/>
+            <w:tcBorders>
+              <w:top w:val="single" w:sz="4" w:color="BFBFBF"/>
+              <w:left w:val="single" w:sz="4" w:color="BFBFBF"/>
+              <w:bottom w:val="single" w:sz="4" w:color="BFBFBF"/>
+              <w:right w:val="single" w:sz="4" w:color="BFBFBF"/>
+            </w:tcBorders>
+          </w:tcPr>
+          <w:p>
+            <w:pPr>
+              <w:spacing w:before="40" w:after="40"/>
+            </w:pPr>
+            <w:r/>
+            <w:r>
+              <w:rPr>
+                <w:rFonts w:ascii="Calibri" w:hAnsi="Calibri" w:eastAsia="Calibri"/>
+                <w:b w:val="0"/>
+                <w:i w:val="0"/>
+                <w:color w:val="333333"/>
+                <w:sz w:val="16"/>
+              </w:rPr>
+              <w:t>Background Remove</w:t>
+            </w:r>
+          </w:p>
+        </w:tc>
+        <w:tc>
+          <w:tcPr>
+            <w:tcW w:type="dxa" w:w="2523"/>
+            <w:shd w:fill="F2F2F2" w:val="clear"/>
+            <w:tcBorders>
+              <w:top w:val="single" w:sz="4" w:color="BFBFBF"/>
+              <w:left w:val="single" w:sz="4" w:color="BFBFBF"/>
+              <w:bottom w:val="single" w:sz="4" w:color="BFBFBF"/>
+              <w:right w:val="single" w:sz="4" w:color="BFBFBF"/>
+            </w:tcBorders>
+          </w:tcPr>
+          <w:p>
+            <w:pPr>
+              <w:spacing w:before="40" w:after="40"/>
+            </w:pPr>
+            <w:r/>
+            <w:r>
+              <w:rPr>
+                <w:rFonts w:ascii="Calibri" w:hAnsi="Calibri" w:eastAsia="Calibri"/>
+                <w:b w:val="0"/>
+                <w:i w:val="0"/>
+                <w:color w:val="333333"/>
+                <w:sz w:val="16"/>
+              </w:rPr>
+              <w:t>Pick from Photos or capture with camera, then continue</w:t>
+            </w:r>
+          </w:p>
+        </w:tc>
+        <w:tc>
+          <w:tcPr>
+            <w:tcW w:type="dxa" w:w="2523"/>
+            <w:shd w:fill="F2F2F2" w:val="clear"/>
+            <w:tcBorders>
+              <w:top w:val="single" w:sz="4" w:color="BFBFBF"/>
+              <w:left w:val="single" w:sz="4" w:color="BFBFBF"/>
+              <w:bottom w:val="single" w:sz="4" w:color="BFBFBF"/>
+              <w:right w:val="single" w:sz="4" w:color="BFBFBF"/>
+            </w:tcBorders>
+          </w:tcPr>
+          <w:p>
+            <w:pPr>
+              <w:spacing w:before="40" w:after="40"/>
+            </w:pPr>
+            <w:r/>
+            <w:r>
+              <w:rPr>
+                <w:rFonts w:ascii="Calibri" w:hAnsi="Calibri" w:eastAsia="Calibri"/>
+                <w:b w:val="0"/>
+                <w:i w:val="0"/>
+                <w:color w:val="333333"/>
+                <w:sz w:val="16"/>
+              </w:rPr>
+              <w:t>Workflow</w:t>
+            </w:r>
+          </w:p>
+        </w:tc>
+      </w:tr>
+      <w:tr>
+        <w:tc>
+          <w:tcPr>
+            <w:tcW w:type="dxa" w:w="2523"/>
+            <w:shd w:fill="FFFFFF" w:val="clear"/>
+            <w:tcBorders>
+              <w:top w:val="single" w:sz="4" w:color="BFBFBF"/>
+              <w:left w:val="single" w:sz="4" w:color="BFBFBF"/>
+              <w:bottom w:val="single" w:sz="4" w:color="BFBFBF"/>
+              <w:right w:val="single" w:sz="4" w:color="BFBFBF"/>
+            </w:tcBorders>
+          </w:tcPr>
+          <w:p>
+            <w:pPr>
+              <w:spacing w:before="40" w:after="40"/>
+            </w:pPr>
+            <w:r/>
+            <w:r>
+              <w:rPr>
+                <w:rFonts w:ascii="Calibri" w:hAnsi="Calibri" w:eastAsia="Calibri"/>
+                <w:b w:val="0"/>
+                <w:i w:val="0"/>
+                <w:color w:val="333333"/>
+                <w:sz w:val="16"/>
+              </w:rPr>
+              <w:t>Eraser, Repair, Magic, Color, Smooth, Lasso</w:t>
+            </w:r>
+          </w:p>
+        </w:tc>
+        <w:tc>
+          <w:tcPr>
+            <w:tcW w:type="dxa" w:w="2523"/>
+            <w:shd w:fill="FFFFFF" w:val="clear"/>
+            <w:tcBorders>
+              <w:top w:val="single" w:sz="4" w:color="BFBFBF"/>
+              <w:left w:val="single" w:sz="4" w:color="BFBFBF"/>
+              <w:bottom w:val="single" w:sz="4" w:color="BFBFBF"/>
+              <w:right w:val="single" w:sz="4" w:color="BFBFBF"/>
+            </w:tcBorders>
+          </w:tcPr>
+          <w:p>
+            <w:pPr>
+              <w:spacing w:before="40" w:after="40"/>
+            </w:pPr>
+            <w:r/>
+            <w:r>
+              <w:rPr>
+                <w:rFonts w:ascii="Calibri" w:hAnsi="Calibri" w:eastAsia="Calibri"/>
+                <w:b w:val="0"/>
+                <w:i w:val="0"/>
+                <w:color w:val="333333"/>
+                <w:sz w:val="16"/>
+              </w:rPr>
+              <w:t>Primary editor</w:t>
+            </w:r>
+          </w:p>
+        </w:tc>
+        <w:tc>
+          <w:tcPr>
+            <w:tcW w:type="dxa" w:w="2523"/>
+            <w:shd w:fill="FFFFFF" w:val="clear"/>
+            <w:tcBorders>
+              <w:top w:val="single" w:sz="4" w:color="BFBFBF"/>
+              <w:left w:val="single" w:sz="4" w:color="BFBFBF"/>
+              <w:bottom w:val="single" w:sz="4" w:color="BFBFBF"/>
+              <w:right w:val="single" w:sz="4" w:color="BFBFBF"/>
+            </w:tcBorders>
+          </w:tcPr>
+          <w:p>
+            <w:pPr>
+              <w:spacing w:before="40" w:after="40"/>
+            </w:pPr>
+            <w:r/>
+            <w:r>
+              <w:rPr>
+                <w:rFonts w:ascii="Calibri" w:hAnsi="Calibri" w:eastAsia="Calibri"/>
+                <w:b w:val="0"/>
+                <w:i w:val="0"/>
+                <w:color w:val="333333"/>
+                <w:sz w:val="16"/>
+              </w:rPr>
+              <w:t>Use cutout tools on cleared image; background should stay cleared</w:t>
+            </w:r>
+          </w:p>
+        </w:tc>
+        <w:tc>
+          <w:tcPr>
+            <w:tcW w:type="dxa" w:w="2523"/>
+            <w:shd w:fill="FFFFFF" w:val="clear"/>
+            <w:tcBorders>
+              <w:top w:val="single" w:sz="4" w:color="BFBFBF"/>
+              <w:left w:val="single" w:sz="4" w:color="BFBFBF"/>
+              <w:bottom w:val="single" w:sz="4" w:color="BFBFBF"/>
+              <w:right w:val="single" w:sz="4" w:color="BFBFBF"/>
+            </w:tcBorders>
+          </w:tcPr>
+          <w:p>
+            <w:pPr>
+              <w:spacing w:before="40" w:after="40"/>
+            </w:pPr>
+            <w:r/>
+            <w:r>
+              <w:rPr>
+                <w:rFonts w:ascii="Calibri" w:hAnsi="Calibri" w:eastAsia="Calibri"/>
+                <w:b w:val="0"/>
+                <w:i w:val="0"/>
+                <w:color w:val="333333"/>
+                <w:sz w:val="16"/>
+              </w:rPr>
+              <w:t>Functionality</w:t>
+            </w:r>
+          </w:p>
+        </w:tc>
+      </w:tr>
+      <w:tr>
+        <w:tc>
+          <w:tcPr>
+            <w:tcW w:type="dxa" w:w="2523"/>
+            <w:shd w:fill="F2F2F2" w:val="clear"/>
+            <w:tcBorders>
+              <w:top w:val="single" w:sz="4" w:color="BFBFBF"/>
+              <w:left w:val="single" w:sz="4" w:color="BFBFBF"/>
+              <w:bottom w:val="single" w:sz="4" w:color="BFBFBF"/>
+              <w:right w:val="single" w:sz="4" w:color="BFBFBF"/>
+            </w:tcBorders>
+          </w:tcPr>
+          <w:p>
+            <w:pPr>
+              <w:spacing w:before="40" w:after="40"/>
+            </w:pPr>
+            <w:r/>
+            <w:r>
+              <w:rPr>
+                <w:rFonts w:ascii="Calibri" w:hAnsi="Calibri" w:eastAsia="Calibri"/>
+                <w:b w:val="0"/>
+                <w:i w:val="0"/>
+                <w:color w:val="333333"/>
+                <w:sz w:val="16"/>
+              </w:rPr>
+              <w:t>Shape background remover</w:t>
+            </w:r>
+          </w:p>
+        </w:tc>
+        <w:tc>
+          <w:tcPr>
+            <w:tcW w:type="dxa" w:w="2523"/>
+            <w:shd w:fill="F2F2F2" w:val="clear"/>
+            <w:tcBorders>
+              <w:top w:val="single" w:sz="4" w:color="BFBFBF"/>
+              <w:left w:val="single" w:sz="4" w:color="BFBFBF"/>
+              <w:bottom w:val="single" w:sz="4" w:color="BFBFBF"/>
+              <w:right w:val="single" w:sz="4" w:color="BFBFBF"/>
+            </w:tcBorders>
+          </w:tcPr>
+          <w:p>
+            <w:pPr>
+              <w:spacing w:before="40" w:after="40"/>
+            </w:pPr>
+            <w:r/>
+            <w:r>
+              <w:rPr>
+                <w:rFonts w:ascii="Calibri" w:hAnsi="Calibri" w:eastAsia="Calibri"/>
+                <w:b w:val="0"/>
+                <w:i w:val="0"/>
+                <w:color w:val="333333"/>
+                <w:sz w:val="16"/>
+              </w:rPr>
+              <w:t>Primary editor</w:t>
+            </w:r>
+          </w:p>
+        </w:tc>
+        <w:tc>
+          <w:tcPr>
+            <w:tcW w:type="dxa" w:w="2523"/>
+            <w:shd w:fill="F2F2F2" w:val="clear"/>
+            <w:tcBorders>
+              <w:top w:val="single" w:sz="4" w:color="BFBFBF"/>
+              <w:left w:val="single" w:sz="4" w:color="BFBFBF"/>
+              <w:bottom w:val="single" w:sz="4" w:color="BFBFBF"/>
+              <w:right w:val="single" w:sz="4" w:color="BFBFBF"/>
+            </w:tcBorders>
+          </w:tcPr>
+          <w:p>
+            <w:pPr>
+              <w:spacing w:before="40" w:after="40"/>
+            </w:pPr>
+            <w:r/>
+            <w:r>
+              <w:rPr>
+                <w:rFonts w:ascii="Calibri" w:hAnsi="Calibri" w:eastAsia="Calibri"/>
+                <w:b w:val="0"/>
+                <w:i w:val="0"/>
+                <w:color w:val="333333"/>
+                <w:sz w:val="16"/>
+              </w:rPr>
+              <w:t>Apply Shape after auto remove; cleared state must remain</w:t>
+            </w:r>
+          </w:p>
+        </w:tc>
+        <w:tc>
+          <w:tcPr>
+            <w:tcW w:type="dxa" w:w="2523"/>
+            <w:shd w:fill="F2F2F2" w:val="clear"/>
+            <w:tcBorders>
+              <w:top w:val="single" w:sz="4" w:color="BFBFBF"/>
+              <w:left w:val="single" w:sz="4" w:color="BFBFBF"/>
+              <w:bottom w:val="single" w:sz="4" w:color="BFBFBF"/>
+              <w:right w:val="single" w:sz="4" w:color="BFBFBF"/>
+            </w:tcBorders>
+          </w:tcPr>
+          <w:p>
+            <w:pPr>
+              <w:spacing w:before="40" w:after="40"/>
+            </w:pPr>
+            <w:r/>
+            <w:r>
+              <w:rPr>
+                <w:rFonts w:ascii="Calibri" w:hAnsi="Calibri" w:eastAsia="Calibri"/>
+                <w:b w:val="0"/>
+                <w:i w:val="0"/>
+                <w:color w:val="333333"/>
+                <w:sz w:val="16"/>
+              </w:rPr>
+              <w:t>Functionality, Stability</w:t>
+            </w:r>
+          </w:p>
+        </w:tc>
+      </w:tr>
+      <w:tr>
+        <w:tc>
+          <w:tcPr>
+            <w:tcW w:type="dxa" w:w="2523"/>
+            <w:shd w:fill="FFFFFF" w:val="clear"/>
+            <w:tcBorders>
+              <w:top w:val="single" w:sz="4" w:color="BFBFBF"/>
+              <w:left w:val="single" w:sz="4" w:color="BFBFBF"/>
+              <w:bottom w:val="single" w:sz="4" w:color="BFBFBF"/>
+              <w:right w:val="single" w:sz="4" w:color="BFBFBF"/>
+            </w:tcBorders>
+          </w:tcPr>
+          <w:p>
+            <w:pPr>
+              <w:spacing w:before="40" w:after="40"/>
+            </w:pPr>
+            <w:r/>
+            <w:r>
+              <w:rPr>
+                <w:rFonts w:ascii="Calibri" w:hAnsi="Calibri" w:eastAsia="Calibri"/>
+                <w:b w:val="0"/>
+                <w:i w:val="0"/>
+                <w:color w:val="333333"/>
+                <w:sz w:val="16"/>
+              </w:rPr>
+              <w:t>Undo / Redo / Compare</w:t>
+            </w:r>
+          </w:p>
+        </w:tc>
+        <w:tc>
+          <w:tcPr>
+            <w:tcW w:type="dxa" w:w="2523"/>
+            <w:shd w:fill="FFFFFF" w:val="clear"/>
+            <w:tcBorders>
+              <w:top w:val="single" w:sz="4" w:color="BFBFBF"/>
+              <w:left w:val="single" w:sz="4" w:color="BFBFBF"/>
+              <w:bottom w:val="single" w:sz="4" w:color="BFBFBF"/>
+              <w:right w:val="single" w:sz="4" w:color="BFBFBF"/>
+            </w:tcBorders>
+          </w:tcPr>
+          <w:p>
+            <w:pPr>
+              <w:spacing w:before="40" w:after="40"/>
+            </w:pPr>
+            <w:r/>
+            <w:r>
+              <w:rPr>
+                <w:rFonts w:ascii="Calibri" w:hAnsi="Calibri" w:eastAsia="Calibri"/>
+                <w:b w:val="0"/>
+                <w:i w:val="0"/>
+                <w:color w:val="333333"/>
+                <w:sz w:val="16"/>
+              </w:rPr>
+              <w:t>Primary editor</w:t>
+            </w:r>
+          </w:p>
+        </w:tc>
+        <w:tc>
+          <w:tcPr>
+            <w:tcW w:type="dxa" w:w="2523"/>
+            <w:shd w:fill="FFFFFF" w:val="clear"/>
+            <w:tcBorders>
+              <w:top w:val="single" w:sz="4" w:color="BFBFBF"/>
+              <w:left w:val="single" w:sz="4" w:color="BFBFBF"/>
+              <w:bottom w:val="single" w:sz="4" w:color="BFBFBF"/>
+              <w:right w:val="single" w:sz="4" w:color="BFBFBF"/>
+            </w:tcBorders>
+          </w:tcPr>
+          <w:p>
+            <w:pPr>
+              <w:spacing w:before="40" w:after="40"/>
+            </w:pPr>
+            <w:r/>
+            <w:r>
+              <w:rPr>
+                <w:rFonts w:ascii="Calibri" w:hAnsi="Calibri" w:eastAsia="Calibri"/>
+                <w:b w:val="0"/>
+                <w:i w:val="0"/>
+                <w:color w:val="333333"/>
+                <w:sz w:val="16"/>
+              </w:rPr>
+              <w:t>Change image → Undo → Redo; state should restore correctly</w:t>
+            </w:r>
+          </w:p>
+        </w:tc>
+        <w:tc>
+          <w:tcPr>
+            <w:tcW w:type="dxa" w:w="2523"/>
+            <w:shd w:fill="FFFFFF" w:val="clear"/>
+            <w:tcBorders>
+              <w:top w:val="single" w:sz="4" w:color="BFBFBF"/>
+              <w:left w:val="single" w:sz="4" w:color="BFBFBF"/>
+              <w:bottom w:val="single" w:sz="4" w:color="BFBFBF"/>
+              <w:right w:val="single" w:sz="4" w:color="BFBFBF"/>
+            </w:tcBorders>
+          </w:tcPr>
+          <w:p>
+            <w:pPr>
+              <w:spacing w:before="40" w:after="40"/>
+            </w:pPr>
+            <w:r/>
+            <w:r>
+              <w:rPr>
+                <w:rFonts w:ascii="Calibri" w:hAnsi="Calibri" w:eastAsia="Calibri"/>
+                <w:b w:val="0"/>
+                <w:i w:val="0"/>
+                <w:color w:val="333333"/>
+                <w:sz w:val="16"/>
+              </w:rPr>
+              <w:t>Functionality</w:t>
+            </w:r>
+          </w:p>
+        </w:tc>
+      </w:tr>
+      <w:tr>
+        <w:tc>
+          <w:tcPr>
+            <w:tcW w:type="dxa" w:w="2523"/>
+            <w:shd w:fill="F2F2F2" w:val="clear"/>
+            <w:tcBorders>
+              <w:top w:val="single" w:sz="4" w:color="BFBFBF"/>
+              <w:left w:val="single" w:sz="4" w:color="BFBFBF"/>
+              <w:bottom w:val="single" w:sz="4" w:color="BFBFBF"/>
+              <w:right w:val="single" w:sz="4" w:color="BFBFBF"/>
+            </w:tcBorders>
+          </w:tcPr>
+          <w:p>
+            <w:pPr>
+              <w:spacing w:before="40" w:after="40"/>
+            </w:pPr>
+            <w:r/>
+            <w:r>
+              <w:rPr>
+                <w:rFonts w:ascii="Calibri" w:hAnsi="Calibri" w:eastAsia="Calibri"/>
+                <w:b w:val="0"/>
+                <w:i w:val="0"/>
+                <w:color w:val="333333"/>
+                <w:sz w:val="16"/>
+              </w:rPr>
+              <w:t>Custom background / color / gradient</w:t>
+            </w:r>
+          </w:p>
+        </w:tc>
+        <w:tc>
+          <w:tcPr>
+            <w:tcW w:type="dxa" w:w="2523"/>
+            <w:shd w:fill="F2F2F2" w:val="clear"/>
+            <w:tcBorders>
+              <w:top w:val="single" w:sz="4" w:color="BFBFBF"/>
+              <w:left w:val="single" w:sz="4" w:color="BFBFBF"/>
+              <w:bottom w:val="single" w:sz="4" w:color="BFBFBF"/>
+              <w:right w:val="single" w:sz="4" w:color="BFBFBF"/>
+            </w:tcBorders>
+          </w:tcPr>
+          <w:p>
+            <w:pPr>
+              <w:spacing w:before="40" w:after="40"/>
+            </w:pPr>
+            <w:r/>
+            <w:r>
+              <w:rPr>
+                <w:rFonts w:ascii="Calibri" w:hAnsi="Calibri" w:eastAsia="Calibri"/>
+                <w:b w:val="0"/>
+                <w:i w:val="0"/>
+                <w:color w:val="333333"/>
+                <w:sz w:val="16"/>
+              </w:rPr>
+              <w:t>Secondary editor</w:t>
+            </w:r>
+          </w:p>
+        </w:tc>
+        <w:tc>
+          <w:tcPr>
+            <w:tcW w:type="dxa" w:w="2523"/>
+            <w:shd w:fill="F2F2F2" w:val="clear"/>
+            <w:tcBorders>
+              <w:top w:val="single" w:sz="4" w:color="BFBFBF"/>
+              <w:left w:val="single" w:sz="4" w:color="BFBFBF"/>
+              <w:bottom w:val="single" w:sz="4" w:color="BFBFBF"/>
+              <w:right w:val="single" w:sz="4" w:color="BFBFBF"/>
+            </w:tcBorders>
+          </w:tcPr>
+          <w:p>
+            <w:pPr>
+              <w:spacing w:before="40" w:after="40"/>
+            </w:pPr>
+            <w:r/>
+            <w:r>
+              <w:rPr>
+                <w:rFonts w:ascii="Calibri" w:hAnsi="Calibri" w:eastAsia="Calibri"/>
+                <w:b w:val="0"/>
+                <w:i w:val="0"/>
+                <w:color w:val="333333"/>
+                <w:sz w:val="16"/>
+              </w:rPr>
+              <w:t>After checkmark, add image, color, or gradient behind subject</w:t>
+            </w:r>
+          </w:p>
+        </w:tc>
+        <w:tc>
+          <w:tcPr>
+            <w:tcW w:type="dxa" w:w="2523"/>
+            <w:shd w:fill="F2F2F2" w:val="clear"/>
+            <w:tcBorders>
+              <w:top w:val="single" w:sz="4" w:color="BFBFBF"/>
+              <w:left w:val="single" w:sz="4" w:color="BFBFBF"/>
+              <w:bottom w:val="single" w:sz="4" w:color="BFBFBF"/>
+              <w:right w:val="single" w:sz="4" w:color="BFBFBF"/>
+            </w:tcBorders>
+          </w:tcPr>
+          <w:p>
+            <w:pPr>
+              <w:spacing w:before="40" w:after="40"/>
+            </w:pPr>
+            <w:r/>
+            <w:r>
+              <w:rPr>
+                <w:rFonts w:ascii="Calibri" w:hAnsi="Calibri" w:eastAsia="Calibri"/>
+                <w:b w:val="0"/>
+                <w:i w:val="0"/>
+                <w:color w:val="333333"/>
+                <w:sz w:val="16"/>
+              </w:rPr>
+              <w:t>Functionality</w:t>
+            </w:r>
+          </w:p>
+        </w:tc>
+      </w:tr>
+      <w:tr>
+        <w:tc>
+          <w:tcPr>
+            <w:tcW w:type="dxa" w:w="2523"/>
+            <w:shd w:fill="FFFFFF" w:val="clear"/>
+            <w:tcBorders>
+              <w:top w:val="single" w:sz="4" w:color="BFBFBF"/>
+              <w:left w:val="single" w:sz="4" w:color="BFBFBF"/>
+              <w:bottom w:val="single" w:sz="4" w:color="BFBFBF"/>
+              <w:right w:val="single" w:sz="4" w:color="BFBFBF"/>
+            </w:tcBorders>
+          </w:tcPr>
+          <w:p>
+            <w:pPr>
+              <w:spacing w:before="40" w:after="40"/>
+            </w:pPr>
+            <w:r/>
+            <w:r>
+              <w:rPr>
+                <w:rFonts w:ascii="Calibri" w:hAnsi="Calibri" w:eastAsia="Calibri"/>
+                <w:b w:val="0"/>
+                <w:i w:val="0"/>
+                <w:color w:val="333333"/>
+                <w:sz w:val="16"/>
+              </w:rPr>
+              <w:t>Blur, resize, adjust, text, stickers</w:t>
+            </w:r>
+          </w:p>
+        </w:tc>
+        <w:tc>
+          <w:tcPr>
+            <w:tcW w:type="dxa" w:w="2523"/>
+            <w:shd w:fill="FFFFFF" w:val="clear"/>
+            <w:tcBorders>
+              <w:top w:val="single" w:sz="4" w:color="BFBFBF"/>
+              <w:left w:val="single" w:sz="4" w:color="BFBFBF"/>
+              <w:bottom w:val="single" w:sz="4" w:color="BFBFBF"/>
+              <w:right w:val="single" w:sz="4" w:color="BFBFBF"/>
+            </w:tcBorders>
+          </w:tcPr>
+          <w:p>
+            <w:pPr>
+              <w:spacing w:before="40" w:after="40"/>
+            </w:pPr>
+            <w:r/>
+            <w:r>
+              <w:rPr>
+                <w:rFonts w:ascii="Calibri" w:hAnsi="Calibri" w:eastAsia="Calibri"/>
+                <w:b w:val="0"/>
+                <w:i w:val="0"/>
+                <w:color w:val="333333"/>
+                <w:sz w:val="16"/>
+              </w:rPr>
+              <w:t>Secondary editor</w:t>
+            </w:r>
+          </w:p>
+        </w:tc>
+        <w:tc>
+          <w:tcPr>
+            <w:tcW w:type="dxa" w:w="2523"/>
+            <w:shd w:fill="FFFFFF" w:val="clear"/>
+            <w:tcBorders>
+              <w:top w:val="single" w:sz="4" w:color="BFBFBF"/>
+              <w:left w:val="single" w:sz="4" w:color="BFBFBF"/>
+              <w:bottom w:val="single" w:sz="4" w:color="BFBFBF"/>
+              <w:right w:val="single" w:sz="4" w:color="BFBFBF"/>
+            </w:tcBorders>
+          </w:tcPr>
+          <w:p>
+            <w:pPr>
+              <w:spacing w:before="40" w:after="40"/>
+            </w:pPr>
+            <w:r/>
+            <w:r>
+              <w:rPr>
+                <w:rFonts w:ascii="Calibri" w:hAnsi="Calibri" w:eastAsia="Calibri"/>
+                <w:b w:val="0"/>
+                <w:i w:val="0"/>
+                <w:color w:val="333333"/>
+                <w:sz w:val="16"/>
+              </w:rPr>
+              <w:t>Use secondary edit tools on the cleared subject</w:t>
+            </w:r>
+          </w:p>
+        </w:tc>
+        <w:tc>
+          <w:tcPr>
+            <w:tcW w:type="dxa" w:w="2523"/>
+            <w:shd w:fill="FFFFFF" w:val="clear"/>
+            <w:tcBorders>
+              <w:top w:val="single" w:sz="4" w:color="BFBFBF"/>
+              <w:left w:val="single" w:sz="4" w:color="BFBFBF"/>
+              <w:bottom w:val="single" w:sz="4" w:color="BFBFBF"/>
+              <w:right w:val="single" w:sz="4" w:color="BFBFBF"/>
+            </w:tcBorders>
+          </w:tcPr>
+          <w:p>
+            <w:pPr>
+              <w:spacing w:before="40" w:after="40"/>
+            </w:pPr>
+            <w:r/>
+            <w:r>
+              <w:rPr>
+                <w:rFonts w:ascii="Calibri" w:hAnsi="Calibri" w:eastAsia="Calibri"/>
+                <w:b w:val="0"/>
+                <w:i w:val="0"/>
+                <w:color w:val="333333"/>
+                <w:sz w:val="16"/>
+              </w:rPr>
+              <w:t>Functionality, Usability</w:t>
+            </w:r>
+          </w:p>
+        </w:tc>
+      </w:tr>
+      <w:tr>
+        <w:tc>
+          <w:tcPr>
+            <w:tcW w:type="dxa" w:w="2523"/>
+            <w:shd w:fill="F2F2F2" w:val="clear"/>
+            <w:tcBorders>
+              <w:top w:val="single" w:sz="4" w:color="BFBFBF"/>
+              <w:left w:val="single" w:sz="4" w:color="BFBFBF"/>
+              <w:bottom w:val="single" w:sz="4" w:color="BFBFBF"/>
+              <w:right w:val="single" w:sz="4" w:color="BFBFBF"/>
+            </w:tcBorders>
+          </w:tcPr>
+          <w:p>
+            <w:pPr>
+              <w:spacing w:before="40" w:after="40"/>
+            </w:pPr>
+            <w:r/>
+            <w:r>
+              <w:rPr>
+                <w:rFonts w:ascii="Calibri" w:hAnsi="Calibri" w:eastAsia="Calibri"/>
+                <w:b w:val="0"/>
+                <w:i w:val="0"/>
+                <w:color w:val="333333"/>
+                <w:sz w:val="16"/>
+              </w:rPr>
+              <w:t>Save or share (PNG / export)</w:t>
+            </w:r>
+          </w:p>
+        </w:tc>
+        <w:tc>
+          <w:tcPr>
+            <w:tcW w:type="dxa" w:w="2523"/>
+            <w:shd w:fill="F2F2F2" w:val="clear"/>
+            <w:tcBorders>
+              <w:top w:val="single" w:sz="4" w:color="BFBFBF"/>
+              <w:left w:val="single" w:sz="4" w:color="BFBFBF"/>
+              <w:bottom w:val="single" w:sz="4" w:color="BFBFBF"/>
+              <w:right w:val="single" w:sz="4" w:color="BFBFBF"/>
+            </w:tcBorders>
+          </w:tcPr>
+          <w:p>
+            <w:pPr>
+              <w:spacing w:before="40" w:after="40"/>
+            </w:pPr>
+            <w:r/>
+            <w:r>
+              <w:rPr>
+                <w:rFonts w:ascii="Calibri" w:hAnsi="Calibri" w:eastAsia="Calibri"/>
+                <w:b w:val="0"/>
+                <w:i w:val="0"/>
+                <w:color w:val="333333"/>
+                <w:sz w:val="16"/>
+              </w:rPr>
+              <w:t>Secondary editor</w:t>
+            </w:r>
+          </w:p>
+        </w:tc>
+        <w:tc>
+          <w:tcPr>
+            <w:tcW w:type="dxa" w:w="2523"/>
+            <w:shd w:fill="F2F2F2" w:val="clear"/>
+            <w:tcBorders>
+              <w:top w:val="single" w:sz="4" w:color="BFBFBF"/>
+              <w:left w:val="single" w:sz="4" w:color="BFBFBF"/>
+              <w:bottom w:val="single" w:sz="4" w:color="BFBFBF"/>
+              <w:right w:val="single" w:sz="4" w:color="BFBFBF"/>
+            </w:tcBorders>
+          </w:tcPr>
+          <w:p>
+            <w:pPr>
+              <w:spacing w:before="40" w:after="40"/>
+            </w:pPr>
+            <w:r/>
+            <w:r>
+              <w:rPr>
+                <w:rFonts w:ascii="Calibri" w:hAnsi="Calibri" w:eastAsia="Calibri"/>
+                <w:b w:val="0"/>
+                <w:i w:val="0"/>
+                <w:color w:val="333333"/>
+                <w:sz w:val="16"/>
+              </w:rPr>
+              <w:t>Save or share final image; confirmation and no crash</w:t>
+            </w:r>
+          </w:p>
+        </w:tc>
+        <w:tc>
+          <w:tcPr>
+            <w:tcW w:type="dxa" w:w="2523"/>
+            <w:shd w:fill="F2F2F2" w:val="clear"/>
+            <w:tcBorders>
+              <w:top w:val="single" w:sz="4" w:color="BFBFBF"/>
+              <w:left w:val="single" w:sz="4" w:color="BFBFBF"/>
+              <w:bottom w:val="single" w:sz="4" w:color="BFBFBF"/>
+              <w:right w:val="single" w:sz="4" w:color="BFBFBF"/>
+            </w:tcBorders>
+          </w:tcPr>
+          <w:p>
+            <w:pPr>
+              <w:spacing w:before="40" w:after="40"/>
+            </w:pPr>
+            <w:r/>
+            <w:r>
+              <w:rPr>
+                <w:rFonts w:ascii="Calibri" w:hAnsi="Calibri" w:eastAsia="Calibri"/>
+                <w:b w:val="0"/>
+                <w:i w:val="0"/>
+                <w:color w:val="333333"/>
+                <w:sz w:val="16"/>
+              </w:rPr>
+              <w:t>Functionality, Workflow</w:t>
+            </w:r>
+          </w:p>
+        </w:tc>
+      </w:tr>
+      <w:tr>
+        <w:tc>
+          <w:tcPr>
+            <w:tcW w:type="dxa" w:w="2523"/>
+            <w:shd w:fill="FFFFFF" w:val="clear"/>
+            <w:tcBorders>
+              <w:top w:val="single" w:sz="4" w:color="BFBFBF"/>
+              <w:left w:val="single" w:sz="4" w:color="BFBFBF"/>
+              <w:bottom w:val="single" w:sz="4" w:color="BFBFBF"/>
+              <w:right w:val="single" w:sz="4" w:color="BFBFBF"/>
+            </w:tcBorders>
+          </w:tcPr>
+          <w:p>
+            <w:pPr>
+              <w:spacing w:before="40" w:after="40"/>
+            </w:pPr>
+            <w:r/>
+            <w:r>
+              <w:rPr>
+                <w:rFonts w:ascii="Calibri" w:hAnsi="Calibri" w:eastAsia="Calibri"/>
+                <w:b w:val="0"/>
+                <w:i w:val="0"/>
+                <w:color w:val="333333"/>
+                <w:sz w:val="16"/>
+              </w:rPr>
+              <w:t>Batch background removal (up to 20)</w:t>
+            </w:r>
+          </w:p>
+        </w:tc>
+        <w:tc>
+          <w:tcPr>
+            <w:tcW w:type="dxa" w:w="2523"/>
+            <w:shd w:fill="FFFFFF" w:val="clear"/>
+            <w:tcBorders>
+              <w:top w:val="single" w:sz="4" w:color="BFBFBF"/>
+              <w:left w:val="single" w:sz="4" w:color="BFBFBF"/>
+              <w:bottom w:val="single" w:sz="4" w:color="BFBFBF"/>
+              <w:right w:val="single" w:sz="4" w:color="BFBFBF"/>
+            </w:tcBorders>
+          </w:tcPr>
+          <w:p>
+            <w:pPr>
+              <w:spacing w:before="40" w:after="40"/>
+            </w:pPr>
+            <w:r/>
+            <w:r>
+              <w:rPr>
+                <w:rFonts w:ascii="Calibri" w:hAnsi="Calibri" w:eastAsia="Calibri"/>
+                <w:b w:val="0"/>
+                <w:i w:val="0"/>
+                <w:color w:val="333333"/>
+                <w:sz w:val="16"/>
+              </w:rPr>
+              <w:t>Batch Remover</w:t>
+            </w:r>
+          </w:p>
+        </w:tc>
+        <w:tc>
+          <w:tcPr>
+            <w:tcW w:type="dxa" w:w="2523"/>
+            <w:shd w:fill="FFFFFF" w:val="clear"/>
+            <w:tcBorders>
+              <w:top w:val="single" w:sz="4" w:color="BFBFBF"/>
+              <w:left w:val="single" w:sz="4" w:color="BFBFBF"/>
+              <w:bottom w:val="single" w:sz="4" w:color="BFBFBF"/>
+              <w:right w:val="single" w:sz="4" w:color="BFBFBF"/>
+            </w:tcBorders>
+          </w:tcPr>
+          <w:p>
+            <w:pPr>
+              <w:spacing w:before="40" w:after="40"/>
+            </w:pPr>
+            <w:r/>
+            <w:r>
+              <w:rPr>
+                <w:rFonts w:ascii="Calibri" w:hAnsi="Calibri" w:eastAsia="Calibri"/>
+                <w:b w:val="0"/>
+                <w:i w:val="0"/>
+                <w:color w:val="333333"/>
+                <w:sz w:val="16"/>
+              </w:rPr>
+              <w:t>Open Batch Remover → select multiple → process → save</w:t>
+            </w:r>
+          </w:p>
+        </w:tc>
+        <w:tc>
+          <w:tcPr>
+            <w:tcW w:type="dxa" w:w="2523"/>
+            <w:shd w:fill="FFFFFF" w:val="clear"/>
+            <w:tcBorders>
+              <w:top w:val="single" w:sz="4" w:color="BFBFBF"/>
+              <w:left w:val="single" w:sz="4" w:color="BFBFBF"/>
+              <w:bottom w:val="single" w:sz="4" w:color="BFBFBF"/>
+              <w:right w:val="single" w:sz="4" w:color="BFBFBF"/>
+            </w:tcBorders>
+          </w:tcPr>
+          <w:p>
+            <w:pPr>
+              <w:spacing w:before="40" w:after="40"/>
+            </w:pPr>
+            <w:r/>
+            <w:r>
+              <w:rPr>
+                <w:rFonts w:ascii="Calibri" w:hAnsi="Calibri" w:eastAsia="Calibri"/>
+                <w:b w:val="0"/>
+                <w:i w:val="0"/>
+                <w:color w:val="333333"/>
+                <w:sz w:val="16"/>
+              </w:rPr>
+              <w:t>Functionality, Performance</w:t>
+            </w:r>
+          </w:p>
+        </w:tc>
+      </w:tr>
+      <w:tr>
+        <w:tc>
+          <w:tcPr>
+            <w:tcW w:type="dxa" w:w="2523"/>
+            <w:shd w:fill="F2F2F2" w:val="clear"/>
+            <w:tcBorders>
+              <w:top w:val="single" w:sz="4" w:color="BFBFBF"/>
+              <w:left w:val="single" w:sz="4" w:color="BFBFBF"/>
+              <w:bottom w:val="single" w:sz="4" w:color="BFBFBF"/>
+              <w:right w:val="single" w:sz="4" w:color="BFBFBF"/>
+            </w:tcBorders>
+          </w:tcPr>
+          <w:p>
+            <w:pPr>
+              <w:spacing w:before="40" w:after="40"/>
+            </w:pPr>
+            <w:r/>
+            <w:r>
+              <w:rPr>
+                <w:rFonts w:ascii="Calibri" w:hAnsi="Calibri" w:eastAsia="Calibri"/>
+                <w:b w:val="0"/>
+                <w:i w:val="0"/>
+                <w:color w:val="333333"/>
+                <w:sz w:val="16"/>
+              </w:rPr>
+              <w:t>User-friendly / simple flow</w:t>
+            </w:r>
+          </w:p>
+        </w:tc>
+        <w:tc>
+          <w:tcPr>
+            <w:tcW w:type="dxa" w:w="2523"/>
+            <w:shd w:fill="F2F2F2" w:val="clear"/>
+            <w:tcBorders>
+              <w:top w:val="single" w:sz="4" w:color="BFBFBF"/>
+              <w:left w:val="single" w:sz="4" w:color="BFBFBF"/>
+              <w:bottom w:val="single" w:sz="4" w:color="BFBFBF"/>
+              <w:right w:val="single" w:sz="4" w:color="BFBFBF"/>
+            </w:tcBorders>
+          </w:tcPr>
+          <w:p>
+            <w:pPr>
+              <w:spacing w:before="40" w:after="40"/>
+            </w:pPr>
+            <w:r/>
+            <w:r>
+              <w:rPr>
+                <w:rFonts w:ascii="Calibri" w:hAnsi="Calibri" w:eastAsia="Calibri"/>
+                <w:b w:val="0"/>
+                <w:i w:val="0"/>
+                <w:color w:val="333333"/>
+                <w:sz w:val="16"/>
+              </w:rPr>
+              <w:t>Both modules</w:t>
+            </w:r>
+          </w:p>
+        </w:tc>
+        <w:tc>
+          <w:tcPr>
+            <w:tcW w:type="dxa" w:w="2523"/>
+            <w:shd w:fill="F2F2F2" w:val="clear"/>
+            <w:tcBorders>
+              <w:top w:val="single" w:sz="4" w:color="BFBFBF"/>
+              <w:left w:val="single" w:sz="4" w:color="BFBFBF"/>
+              <w:bottom w:val="single" w:sz="4" w:color="BFBFBF"/>
+              <w:right w:val="single" w:sz="4" w:color="BFBFBF"/>
+            </w:tcBorders>
+          </w:tcPr>
+          <w:p>
+            <w:pPr>
+              <w:spacing w:before="40" w:after="40"/>
+            </w:pPr>
+            <w:r/>
+            <w:r>
+              <w:rPr>
+                <w:rFonts w:ascii="Calibri" w:hAnsi="Calibri" w:eastAsia="Calibri"/>
+                <w:b w:val="0"/>
+                <w:i w:val="0"/>
+                <w:color w:val="333333"/>
+                <w:sz w:val="16"/>
+              </w:rPr>
+              <w:t>Homepage → result path is clear; alerts and labels make sense</w:t>
+            </w:r>
+          </w:p>
+        </w:tc>
+        <w:tc>
+          <w:tcPr>
+            <w:tcW w:type="dxa" w:w="2523"/>
+            <w:shd w:fill="F2F2F2" w:val="clear"/>
+            <w:tcBorders>
+              <w:top w:val="single" w:sz="4" w:color="BFBFBF"/>
+              <w:left w:val="single" w:sz="4" w:color="BFBFBF"/>
+              <w:bottom w:val="single" w:sz="4" w:color="BFBFBF"/>
+              <w:right w:val="single" w:sz="4" w:color="BFBFBF"/>
+            </w:tcBorders>
+          </w:tcPr>
+          <w:p>
+            <w:pPr>
+              <w:spacing w:before="40" w:after="40"/>
+            </w:pPr>
+            <w:r/>
+            <w:r>
+              <w:rPr>
+                <w:rFonts w:ascii="Calibri" w:hAnsi="Calibri" w:eastAsia="Calibri"/>
+                <w:b w:val="0"/>
+                <w:i w:val="0"/>
+                <w:color w:val="333333"/>
+                <w:sz w:val="16"/>
+              </w:rPr>
+              <w:t>Usability, Workflow</w:t>
+            </w:r>
+          </w:p>
+        </w:tc>
+      </w:tr>
+    </w:tbl>
+    <w:p>
+      <w:pPr>
+        <w:spacing w:before="80" w:after="120"/>
+      </w:pPr>
+      <w:r>
+        <w:rPr>
+          <w:rFonts w:ascii="Calibri" w:hAnsi="Calibri" w:eastAsia="Calibri"/>
+          <w:b w:val="0"/>
+          <w:i/>
+          <w:color w:val="666666"/>
+          <w:sz w:val="18"/>
+        </w:rPr>
+        <w:t>Test cases in Section 5 follow these actions. BUG-001 maps to the Shape claim: shape tools should work on the already cleared image.</w:t>
+      </w:r>
+    </w:p>
+    <w:p>
+      <w:pPr>
         <w:spacing w:before="160" w:after="120"/>
       </w:pPr>
       <w:r>
@@ -551,7 +1985,7 @@
           <w:color w:val="2E75B6"/>
           <w:sz w:val="26"/>
         </w:rPr>
-        <w:t>1.2 Quality Areas</w:t>
+        <w:t>1.3 Quality Areas</w:t>
       </w:r>
     </w:p>
     <w:p>
@@ -691,7 +2125,7 @@
           <w:color w:val="2E75B6"/>
           <w:sz w:val="26"/>
         </w:rPr>
-        <w:t>1.3 Coverage Overview</w:t>
+        <w:t>1.4 Coverage Overview</w:t>
       </w:r>
     </w:p>
     <w:tbl>
@@ -1663,6 +3097,7 @@
                 <w:color w:val="333333"/>
                 <w:sz w:val="18"/>
               </w:rPr>
+              <w:t>OnePlus 9 5G · OxygenOS 13.1 · App v2.7</w:t>
             </w:r>
           </w:p>
         </w:tc>

</xml_diff>

<commit_message>
Reclassify Shape finding after competitor check
Keep existing BUG-001 screenshots in the Word file, move Shape restore
behavior to SUG-001, add SUG-002 Instagram-style smart alignment, mark
TC-BR-008 Pass, and use black caption text.

Co-authored-by: Showravkarmakar <Showrav88@users.noreply.github.com>
</commit_message>
<xml_diff>
--- a/SQA_Intern_Assignment_Test_Report.docx
+++ b/SQA_Intern_Assignment_Test_Report.docx
@@ -1729,37 +1729,28 @@
         </w:tc>
         <w:tc>
           <w:tcPr>
-            <w:tcBorders>
-              <w:top w:color="bfbfbf" w:space="0" w:sz="4" w:val="single"/>
-              <w:left w:color="bfbfbf" w:space="0" w:sz="4" w:val="single"/>
-              <w:bottom w:color="bfbfbf" w:space="0" w:sz="4" w:val="single"/>
-              <w:right w:color="bfbfbf" w:space="0" w:sz="4" w:val="single"/>
-            </w:tcBorders>
-            <w:shd w:fill="f2f2f2" w:val="clear"/>
-          </w:tcPr>
-          <w:p>
-            <w:pPr>
-              <w:spacing w:after="40" w:before="40" w:lineRule="auto"/>
-              <w:rPr/>
-            </w:pPr>
-            <w:r>
-              <w:rPr>
-                <w:rFonts w:ascii="Calibri" w:cs="Calibri" w:eastAsia="Calibri" w:hAnsi="Calibri"/>
-                <w:b w:val="0"/>
-                <w:bCs w:val="0"/>
-                <w:i w:val="0"/>
-                <w:iCs w:val="0"/>
-                <w:color w:val="333333"/>
-                <w:sz w:val="16"/>
-                <w:szCs w:val="16"/>
-                <w:rtl w:val="0"/>
-              </w:rPr>
-              <w:t xml:space="preserve">Apply Shape after auto remove; cleared state must remain</w:t>
-            </w:r>
-            <w:r>
-              <w:rPr>
-                <w:rtl w:val="0"/>
-              </w:rPr>
+            <w:shd w:fill="FFFFFF" w:val="clear"/>
+            <w:tcBorders>
+              <w:top w:val="single" w:sz="4" w:color="BFBFBF"/>
+              <w:left w:val="single" w:sz="4" w:color="BFBFBF"/>
+              <w:bottom w:val="single" w:sz="4" w:color="BFBFBF"/>
+              <w:right w:val="single" w:sz="4" w:color="BFBFBF"/>
+            </w:tcBorders>
+          </w:tcPr>
+          <w:p>
+            <w:pPr>
+              <w:spacing w:before="40" w:after="40"/>
+            </w:pPr>
+            <w:r/>
+            <w:r>
+              <w:rPr>
+                <w:rFonts w:ascii="Calibri" w:hAnsi="Calibri" w:eastAsia="Calibri"/>
+                <w:b w:val="0"/>
+                <w:i w:val="0"/>
+                <w:color w:val="333333"/>
+                <w:sz w:val="16"/>
+              </w:rPr>
+              <w:t>Apply Shape after auto remove; improvement tracked in SUG-001</w:t>
             </w:r>
           </w:p>
         </w:tc>
@@ -2711,14 +2702,14 @@
           <w:rFonts w:ascii="Calibri" w:cs="Calibri" w:eastAsia="Calibri" w:hAnsi="Calibri"/>
           <w:b w:val="0"/>
           <w:bCs w:val="0"/>
-          <w:i w:val="1"/>
+          <w:i/>
           <w:iCs w:val="1"/>
           <w:color w:val="666666"/>
           <w:sz w:val="18"/>
           <w:szCs w:val="18"/>
           <w:rtl w:val="0"/>
         </w:rPr>
-        <w:t xml:space="preserve">Test cases in Section 5 follow these actions. BUG-001 maps to the Shape claim: shape tools should work on the already cleared image.</w:t>
+        <w:t>Test cases in Section 5 follow these actions. Shape behavior is tracked as SUG-001 after competitive check (similar Shape behavior exists in a major competitor app).</w:t>
       </w:r>
       <w:r>
         <w:rPr>
@@ -3191,6 +3182,32 @@
         </w:tc>
         <w:tc>
           <w:tcPr>
+            <w:shd w:fill="FFFFFF" w:val="clear"/>
+            <w:tcBorders>
+              <w:top w:val="single" w:sz="4" w:color="BFBFBF"/>
+              <w:left w:val="single" w:sz="4" w:color="BFBFBF"/>
+              <w:bottom w:val="single" w:sz="4" w:color="BFBFBF"/>
+              <w:right w:val="single" w:sz="4" w:color="BFBFBF"/>
+            </w:tcBorders>
+          </w:tcPr>
+          <w:p>
+            <w:pPr>
+              <w:spacing w:before="40" w:after="40"/>
+            </w:pPr>
+            <w:r/>
+            <w:r>
+              <w:rPr>
+                <w:rFonts w:ascii="Calibri" w:hAnsi="Calibri" w:eastAsia="Calibri"/>
+                <w:b w:val="0"/>
+                <w:i w:val="0"/>
+                <w:color w:val="333333"/>
+                <w:sz w:val="16"/>
+              </w:rPr>
+            </w:r>
+          </w:p>
+        </w:tc>
+        <w:tc>
+          <w:tcPr>
             <w:tcBorders>
               <w:top w:color="bfbfbf" w:space="0" w:sz="4" w:val="single"/>
               <w:left w:color="bfbfbf" w:space="0" w:sz="4" w:val="single"/>
@@ -3206,66 +3223,35 @@
             </w:pPr>
             <w:r>
               <w:rPr>
-                <w:rFonts w:ascii="Calibri" w:cs="Calibri" w:eastAsia="Calibri" w:hAnsi="Calibri"/>
-                <w:b w:val="0"/>
-                <w:bCs w:val="0"/>
-                <w:i w:val="0"/>
-                <w:iCs w:val="0"/>
-                <w:color w:val="333333"/>
-                <w:sz w:val="16"/>
-                <w:szCs w:val="16"/>
-                <w:rtl w:val="0"/>
-              </w:rPr>
-              <w:t xml:space="preserve">BUG-001</w:t>
-            </w:r>
-            <w:r>
-              <w:rPr>
-                <w:rtl w:val="0"/>
-              </w:rPr>
-            </w:r>
-          </w:p>
-        </w:tc>
-        <w:tc>
-          <w:tcPr>
-            <w:tcBorders>
-              <w:top w:color="bfbfbf" w:space="0" w:sz="4" w:val="single"/>
-              <w:left w:color="bfbfbf" w:space="0" w:sz="4" w:val="single"/>
-              <w:bottom w:color="bfbfbf" w:space="0" w:sz="4" w:val="single"/>
-              <w:right w:color="bfbfbf" w:space="0" w:sz="4" w:val="single"/>
-            </w:tcBorders>
-            <w:shd w:fill="ffffff" w:val="clear"/>
-          </w:tcPr>
-          <w:p>
-            <w:pPr>
-              <w:spacing w:after="40" w:before="40" w:lineRule="auto"/>
-              <w:rPr/>
-            </w:pPr>
-            <w:r>
-              <w:rPr>
-                <w:rtl w:val="0"/>
-              </w:rPr>
-            </w:r>
-          </w:p>
-        </w:tc>
-        <w:tc>
-          <w:tcPr>
-            <w:tcBorders>
-              <w:top w:color="bfbfbf" w:space="0" w:sz="4" w:val="single"/>
-              <w:left w:color="bfbfbf" w:space="0" w:sz="4" w:val="single"/>
-              <w:bottom w:color="bfbfbf" w:space="0" w:sz="4" w:val="single"/>
-              <w:right w:color="bfbfbf" w:space="0" w:sz="4" w:val="single"/>
-            </w:tcBorders>
-            <w:shd w:fill="ffffff" w:val="clear"/>
-          </w:tcPr>
-          <w:p>
-            <w:pPr>
-              <w:spacing w:after="40" w:before="40" w:lineRule="auto"/>
-              <w:rPr/>
-            </w:pPr>
-            <w:r>
-              <w:rPr>
-                <w:rtl w:val="0"/>
-              </w:rPr>
+                <w:rtl w:val="0"/>
+              </w:rPr>
+            </w:r>
+          </w:p>
+        </w:tc>
+        <w:tc>
+          <w:tcPr>
+            <w:shd w:fill="FFFFFF" w:val="clear"/>
+            <w:tcBorders>
+              <w:top w:val="single" w:sz="4" w:color="BFBFBF"/>
+              <w:left w:val="single" w:sz="4" w:color="BFBFBF"/>
+              <w:bottom w:val="single" w:sz="4" w:color="BFBFBF"/>
+              <w:right w:val="single" w:sz="4" w:color="BFBFBF"/>
+            </w:tcBorders>
+          </w:tcPr>
+          <w:p>
+            <w:pPr>
+              <w:spacing w:before="40" w:after="40"/>
+            </w:pPr>
+            <w:r/>
+            <w:r>
+              <w:rPr>
+                <w:rFonts w:ascii="Calibri" w:hAnsi="Calibri" w:eastAsia="Calibri"/>
+                <w:b w:val="0"/>
+                <w:i w:val="0"/>
+                <w:color w:val="333333"/>
+                <w:sz w:val="16"/>
+              </w:rPr>
+              <w:t>SUG-001, SUG-002</w:t>
             </w:r>
           </w:p>
         </w:tc>
@@ -3313,6 +3299,32 @@
         </w:tc>
         <w:tc>
           <w:tcPr>
+            <w:shd w:fill="F2F2F2" w:val="clear"/>
+            <w:tcBorders>
+              <w:top w:val="single" w:sz="4" w:color="BFBFBF"/>
+              <w:left w:val="single" w:sz="4" w:color="BFBFBF"/>
+              <w:bottom w:val="single" w:sz="4" w:color="BFBFBF"/>
+              <w:right w:val="single" w:sz="4" w:color="BFBFBF"/>
+            </w:tcBorders>
+          </w:tcPr>
+          <w:p>
+            <w:pPr>
+              <w:spacing w:before="40" w:after="40"/>
+            </w:pPr>
+            <w:r/>
+            <w:r>
+              <w:rPr>
+                <w:rFonts w:ascii="Calibri" w:hAnsi="Calibri" w:eastAsia="Calibri"/>
+                <w:b w:val="0"/>
+                <w:i w:val="0"/>
+                <w:color w:val="333333"/>
+                <w:sz w:val="16"/>
+              </w:rPr>
+            </w:r>
+          </w:p>
+        </w:tc>
+        <w:tc>
+          <w:tcPr>
             <w:tcBorders>
               <w:top w:color="bfbfbf" w:space="0" w:sz="4" w:val="single"/>
               <w:left w:color="bfbfbf" w:space="0" w:sz="4" w:val="single"/>
@@ -3335,45 +3347,28 @@
         </w:tc>
         <w:tc>
           <w:tcPr>
-            <w:tcBorders>
-              <w:top w:color="bfbfbf" w:space="0" w:sz="4" w:val="single"/>
-              <w:left w:color="bfbfbf" w:space="0" w:sz="4" w:val="single"/>
-              <w:bottom w:color="bfbfbf" w:space="0" w:sz="4" w:val="single"/>
-              <w:right w:color="bfbfbf" w:space="0" w:sz="4" w:val="single"/>
-            </w:tcBorders>
-            <w:shd w:fill="f2f2f2" w:val="clear"/>
-          </w:tcPr>
-          <w:p>
-            <w:pPr>
-              <w:spacing w:after="40" w:before="40" w:lineRule="auto"/>
-              <w:rPr/>
-            </w:pPr>
-            <w:r>
-              <w:rPr>
-                <w:rtl w:val="0"/>
-              </w:rPr>
-            </w:r>
-          </w:p>
-        </w:tc>
-        <w:tc>
-          <w:tcPr>
-            <w:tcBorders>
-              <w:top w:color="bfbfbf" w:space="0" w:sz="4" w:val="single"/>
-              <w:left w:color="bfbfbf" w:space="0" w:sz="4" w:val="single"/>
-              <w:bottom w:color="bfbfbf" w:space="0" w:sz="4" w:val="single"/>
-              <w:right w:color="bfbfbf" w:space="0" w:sz="4" w:val="single"/>
-            </w:tcBorders>
-            <w:shd w:fill="f2f2f2" w:val="clear"/>
-          </w:tcPr>
-          <w:p>
-            <w:pPr>
-              <w:spacing w:after="40" w:before="40" w:lineRule="auto"/>
-              <w:rPr/>
-            </w:pPr>
-            <w:r>
-              <w:rPr>
-                <w:rtl w:val="0"/>
-              </w:rPr>
+            <w:shd w:fill="F2F2F2" w:val="clear"/>
+            <w:tcBorders>
+              <w:top w:val="single" w:sz="4" w:color="BFBFBF"/>
+              <w:left w:val="single" w:sz="4" w:color="BFBFBF"/>
+              <w:bottom w:val="single" w:sz="4" w:color="BFBFBF"/>
+              <w:right w:val="single" w:sz="4" w:color="BFBFBF"/>
+            </w:tcBorders>
+          </w:tcPr>
+          <w:p>
+            <w:pPr>
+              <w:spacing w:before="40" w:after="40"/>
+            </w:pPr>
+            <w:r/>
+            <w:r>
+              <w:rPr>
+                <w:rFonts w:ascii="Calibri" w:hAnsi="Calibri" w:eastAsia="Calibri"/>
+                <w:b w:val="0"/>
+                <w:i w:val="0"/>
+                <w:color w:val="333333"/>
+                <w:sz w:val="16"/>
+              </w:rPr>
+              <w:t>SUG-002</w:t>
             </w:r>
           </w:p>
         </w:tc>
@@ -3421,6 +3416,32 @@
         </w:tc>
         <w:tc>
           <w:tcPr>
+            <w:shd w:fill="FFFFFF" w:val="clear"/>
+            <w:tcBorders>
+              <w:top w:val="single" w:sz="4" w:color="BFBFBF"/>
+              <w:left w:val="single" w:sz="4" w:color="BFBFBF"/>
+              <w:bottom w:val="single" w:sz="4" w:color="BFBFBF"/>
+              <w:right w:val="single" w:sz="4" w:color="BFBFBF"/>
+            </w:tcBorders>
+          </w:tcPr>
+          <w:p>
+            <w:pPr>
+              <w:spacing w:before="40" w:after="40"/>
+            </w:pPr>
+            <w:r/>
+            <w:r>
+              <w:rPr>
+                <w:rFonts w:ascii="Calibri" w:hAnsi="Calibri" w:eastAsia="Calibri"/>
+                <w:b w:val="0"/>
+                <w:i w:val="0"/>
+                <w:color w:val="333333"/>
+                <w:sz w:val="16"/>
+              </w:rPr>
+            </w:r>
+          </w:p>
+        </w:tc>
+        <w:tc>
+          <w:tcPr>
             <w:tcBorders>
               <w:top w:color="bfbfbf" w:space="0" w:sz="4" w:val="single"/>
               <w:left w:color="bfbfbf" w:space="0" w:sz="4" w:val="single"/>
@@ -3436,66 +3457,35 @@
             </w:pPr>
             <w:r>
               <w:rPr>
-                <w:rFonts w:ascii="Calibri" w:cs="Calibri" w:eastAsia="Calibri" w:hAnsi="Calibri"/>
-                <w:b w:val="0"/>
-                <w:bCs w:val="0"/>
-                <w:i w:val="0"/>
-                <w:iCs w:val="0"/>
-                <w:color w:val="333333"/>
-                <w:sz w:val="16"/>
-                <w:szCs w:val="16"/>
-                <w:rtl w:val="0"/>
-              </w:rPr>
-              <w:t xml:space="preserve">BUG-001</w:t>
-            </w:r>
-            <w:r>
-              <w:rPr>
-                <w:rtl w:val="0"/>
-              </w:rPr>
-            </w:r>
-          </w:p>
-        </w:tc>
-        <w:tc>
-          <w:tcPr>
-            <w:tcBorders>
-              <w:top w:color="bfbfbf" w:space="0" w:sz="4" w:val="single"/>
-              <w:left w:color="bfbfbf" w:space="0" w:sz="4" w:val="single"/>
-              <w:bottom w:color="bfbfbf" w:space="0" w:sz="4" w:val="single"/>
-              <w:right w:color="bfbfbf" w:space="0" w:sz="4" w:val="single"/>
-            </w:tcBorders>
-            <w:shd w:fill="ffffff" w:val="clear"/>
-          </w:tcPr>
-          <w:p>
-            <w:pPr>
-              <w:spacing w:after="40" w:before="40" w:lineRule="auto"/>
-              <w:rPr/>
-            </w:pPr>
-            <w:r>
-              <w:rPr>
-                <w:rtl w:val="0"/>
-              </w:rPr>
-            </w:r>
-          </w:p>
-        </w:tc>
-        <w:tc>
-          <w:tcPr>
-            <w:tcBorders>
-              <w:top w:color="bfbfbf" w:space="0" w:sz="4" w:val="single"/>
-              <w:left w:color="bfbfbf" w:space="0" w:sz="4" w:val="single"/>
-              <w:bottom w:color="bfbfbf" w:space="0" w:sz="4" w:val="single"/>
-              <w:right w:color="bfbfbf" w:space="0" w:sz="4" w:val="single"/>
-            </w:tcBorders>
-            <w:shd w:fill="ffffff" w:val="clear"/>
-          </w:tcPr>
-          <w:p>
-            <w:pPr>
-              <w:spacing w:after="40" w:before="40" w:lineRule="auto"/>
-              <w:rPr/>
-            </w:pPr>
-            <w:r>
-              <w:rPr>
-                <w:rtl w:val="0"/>
-              </w:rPr>
+                <w:rtl w:val="0"/>
+              </w:rPr>
+            </w:r>
+          </w:p>
+        </w:tc>
+        <w:tc>
+          <w:tcPr>
+            <w:shd w:fill="FFFFFF" w:val="clear"/>
+            <w:tcBorders>
+              <w:top w:val="single" w:sz="4" w:color="BFBFBF"/>
+              <w:left w:val="single" w:sz="4" w:color="BFBFBF"/>
+              <w:bottom w:val="single" w:sz="4" w:color="BFBFBF"/>
+              <w:right w:val="single" w:sz="4" w:color="BFBFBF"/>
+            </w:tcBorders>
+          </w:tcPr>
+          <w:p>
+            <w:pPr>
+              <w:spacing w:before="40" w:after="40"/>
+            </w:pPr>
+            <w:r/>
+            <w:r>
+              <w:rPr>
+                <w:rFonts w:ascii="Calibri" w:hAnsi="Calibri" w:eastAsia="Calibri"/>
+                <w:b w:val="0"/>
+                <w:i w:val="0"/>
+                <w:color w:val="333333"/>
+                <w:sz w:val="16"/>
+              </w:rPr>
+              <w:t>SUG-001</w:t>
             </w:r>
           </w:p>
         </w:tc>
@@ -3543,6 +3533,32 @@
         </w:tc>
         <w:tc>
           <w:tcPr>
+            <w:shd w:fill="F2F2F2" w:val="clear"/>
+            <w:tcBorders>
+              <w:top w:val="single" w:sz="4" w:color="BFBFBF"/>
+              <w:left w:val="single" w:sz="4" w:color="BFBFBF"/>
+              <w:bottom w:val="single" w:sz="4" w:color="BFBFBF"/>
+              <w:right w:val="single" w:sz="4" w:color="BFBFBF"/>
+            </w:tcBorders>
+          </w:tcPr>
+          <w:p>
+            <w:pPr>
+              <w:spacing w:before="40" w:after="40"/>
+            </w:pPr>
+            <w:r/>
+            <w:r>
+              <w:rPr>
+                <w:rFonts w:ascii="Calibri" w:hAnsi="Calibri" w:eastAsia="Calibri"/>
+                <w:b w:val="0"/>
+                <w:i w:val="0"/>
+                <w:color w:val="333333"/>
+                <w:sz w:val="16"/>
+              </w:rPr>
+            </w:r>
+          </w:p>
+        </w:tc>
+        <w:tc>
+          <w:tcPr>
             <w:tcBorders>
               <w:top w:color="bfbfbf" w:space="0" w:sz="4" w:val="single"/>
               <w:left w:color="bfbfbf" w:space="0" w:sz="4" w:val="single"/>
@@ -3565,45 +3581,28 @@
         </w:tc>
         <w:tc>
           <w:tcPr>
-            <w:tcBorders>
-              <w:top w:color="bfbfbf" w:space="0" w:sz="4" w:val="single"/>
-              <w:left w:color="bfbfbf" w:space="0" w:sz="4" w:val="single"/>
-              <w:bottom w:color="bfbfbf" w:space="0" w:sz="4" w:val="single"/>
-              <w:right w:color="bfbfbf" w:space="0" w:sz="4" w:val="single"/>
-            </w:tcBorders>
-            <w:shd w:fill="f2f2f2" w:val="clear"/>
-          </w:tcPr>
-          <w:p>
-            <w:pPr>
-              <w:spacing w:after="40" w:before="40" w:lineRule="auto"/>
-              <w:rPr/>
-            </w:pPr>
-            <w:r>
-              <w:rPr>
-                <w:rtl w:val="0"/>
-              </w:rPr>
-            </w:r>
-          </w:p>
-        </w:tc>
-        <w:tc>
-          <w:tcPr>
-            <w:tcBorders>
-              <w:top w:color="bfbfbf" w:space="0" w:sz="4" w:val="single"/>
-              <w:left w:color="bfbfbf" w:space="0" w:sz="4" w:val="single"/>
-              <w:bottom w:color="bfbfbf" w:space="0" w:sz="4" w:val="single"/>
-              <w:right w:color="bfbfbf" w:space="0" w:sz="4" w:val="single"/>
-            </w:tcBorders>
-            <w:shd w:fill="f2f2f2" w:val="clear"/>
-          </w:tcPr>
-          <w:p>
-            <w:pPr>
-              <w:spacing w:after="40" w:before="40" w:lineRule="auto"/>
-              <w:rPr/>
-            </w:pPr>
-            <w:r>
-              <w:rPr>
-                <w:rtl w:val="0"/>
-              </w:rPr>
+            <w:shd w:fill="F2F2F2" w:val="clear"/>
+            <w:tcBorders>
+              <w:top w:val="single" w:sz="4" w:color="BFBFBF"/>
+              <w:left w:val="single" w:sz="4" w:color="BFBFBF"/>
+              <w:bottom w:val="single" w:sz="4" w:color="BFBFBF"/>
+              <w:right w:val="single" w:sz="4" w:color="BFBFBF"/>
+            </w:tcBorders>
+          </w:tcPr>
+          <w:p>
+            <w:pPr>
+              <w:spacing w:before="40" w:after="40"/>
+            </w:pPr>
+            <w:r/>
+            <w:r>
+              <w:rPr>
+                <w:rFonts w:ascii="Calibri" w:hAnsi="Calibri" w:eastAsia="Calibri"/>
+                <w:b w:val="0"/>
+                <w:i w:val="0"/>
+                <w:color w:val="333333"/>
+                <w:sz w:val="16"/>
+              </w:rPr>
+              <w:t>SUG-001, SUG-002</w:t>
             </w:r>
           </w:p>
         </w:tc>
@@ -3651,6 +3650,32 @@
         </w:tc>
         <w:tc>
           <w:tcPr>
+            <w:shd w:fill="FFFFFF" w:val="clear"/>
+            <w:tcBorders>
+              <w:top w:val="single" w:sz="4" w:color="BFBFBF"/>
+              <w:left w:val="single" w:sz="4" w:color="BFBFBF"/>
+              <w:bottom w:val="single" w:sz="4" w:color="BFBFBF"/>
+              <w:right w:val="single" w:sz="4" w:color="BFBFBF"/>
+            </w:tcBorders>
+          </w:tcPr>
+          <w:p>
+            <w:pPr>
+              <w:spacing w:before="40" w:after="40"/>
+            </w:pPr>
+            <w:r/>
+            <w:r>
+              <w:rPr>
+                <w:rFonts w:ascii="Calibri" w:hAnsi="Calibri" w:eastAsia="Calibri"/>
+                <w:b w:val="0"/>
+                <w:i w:val="0"/>
+                <w:color w:val="333333"/>
+                <w:sz w:val="16"/>
+              </w:rPr>
+            </w:r>
+          </w:p>
+        </w:tc>
+        <w:tc>
+          <w:tcPr>
             <w:tcBorders>
               <w:top w:color="bfbfbf" w:space="0" w:sz="4" w:val="single"/>
               <w:left w:color="bfbfbf" w:space="0" w:sz="4" w:val="single"/>
@@ -3673,44 +3698,26 @@
         </w:tc>
         <w:tc>
           <w:tcPr>
-            <w:tcBorders>
-              <w:top w:color="bfbfbf" w:space="0" w:sz="4" w:val="single"/>
-              <w:left w:color="bfbfbf" w:space="0" w:sz="4" w:val="single"/>
-              <w:bottom w:color="bfbfbf" w:space="0" w:sz="4" w:val="single"/>
-              <w:right w:color="bfbfbf" w:space="0" w:sz="4" w:val="single"/>
-            </w:tcBorders>
-            <w:shd w:fill="ffffff" w:val="clear"/>
-          </w:tcPr>
-          <w:p>
-            <w:pPr>
-              <w:spacing w:after="40" w:before="40" w:lineRule="auto"/>
-              <w:rPr/>
-            </w:pPr>
-            <w:r>
-              <w:rPr>
-                <w:rtl w:val="0"/>
-              </w:rPr>
-            </w:r>
-          </w:p>
-        </w:tc>
-        <w:tc>
-          <w:tcPr>
-            <w:tcBorders>
-              <w:top w:color="bfbfbf" w:space="0" w:sz="4" w:val="single"/>
-              <w:left w:color="bfbfbf" w:space="0" w:sz="4" w:val="single"/>
-              <w:bottom w:color="bfbfbf" w:space="0" w:sz="4" w:val="single"/>
-              <w:right w:color="bfbfbf" w:space="0" w:sz="4" w:val="single"/>
-            </w:tcBorders>
-            <w:shd w:fill="ffffff" w:val="clear"/>
-          </w:tcPr>
-          <w:p>
-            <w:pPr>
-              <w:spacing w:after="40" w:before="40" w:lineRule="auto"/>
-              <w:rPr/>
-            </w:pPr>
-            <w:r>
-              <w:rPr>
-                <w:rtl w:val="0"/>
+            <w:shd w:fill="FFFFFF" w:val="clear"/>
+            <w:tcBorders>
+              <w:top w:val="single" w:sz="4" w:color="BFBFBF"/>
+              <w:left w:val="single" w:sz="4" w:color="BFBFBF"/>
+              <w:bottom w:val="single" w:sz="4" w:color="BFBFBF"/>
+              <w:right w:val="single" w:sz="4" w:color="BFBFBF"/>
+            </w:tcBorders>
+          </w:tcPr>
+          <w:p>
+            <w:pPr>
+              <w:spacing w:before="40" w:after="40"/>
+            </w:pPr>
+            <w:r/>
+            <w:r>
+              <w:rPr>
+                <w:rFonts w:ascii="Calibri" w:hAnsi="Calibri" w:eastAsia="Calibri"/>
+                <w:b w:val="0"/>
+                <w:i w:val="0"/>
+                <w:color w:val="333333"/>
+                <w:sz w:val="16"/>
               </w:rPr>
             </w:r>
           </w:p>
@@ -3769,7 +3776,7 @@
           <w:szCs w:val="22"/>
           <w:rtl w:val="0"/>
         </w:rPr>
-        <w:t xml:space="preserve">Severity: Critical = crash/blocker; High = major feature broken; Medium = workaround exists; Low = minor.</w:t>
+        <w:t>Severity guide: Critical = crash/blocker; High = major feature broken; Medium = workaround exists; Low = minor. No confirmed product bugs are logged at this time. One Shape finding was reviewed against a competitor app with similar UI/tools and reclassified to Suggestions (SUG-001).</w:t>
       </w:r>
       <w:r>
         <w:rPr>
@@ -3785,16 +3792,16 @@
       <w:r>
         <w:rPr>
           <w:rFonts w:ascii="Calibri" w:cs="Calibri" w:eastAsia="Calibri" w:hAnsi="Calibri"/>
-          <w:b w:val="1"/>
+          <w:b/>
           <w:bCs w:val="1"/>
           <w:i w:val="0"/>
           <w:iCs w:val="0"/>
-          <w:color w:val="2e75b6"/>
+          <w:color w:val="2E75B6"/>
           <w:sz w:val="26"/>
           <w:szCs w:val="26"/>
           <w:rtl w:val="0"/>
         </w:rPr>
-        <w:t xml:space="preserve">BUG-001: Shape restores old background after background removal</w:t>
+        <w:t>Previously logged item (reclassified): Shape restores original background</w:t>
       </w:r>
       <w:r>
         <w:rPr>
@@ -3942,37 +3949,28 @@
         </w:tc>
         <w:tc>
           <w:tcPr>
-            <w:tcBorders>
-              <w:top w:color="bfbfbf" w:space="0" w:sz="4" w:val="single"/>
-              <w:left w:color="bfbfbf" w:space="0" w:sz="4" w:val="single"/>
-              <w:bottom w:color="bfbfbf" w:space="0" w:sz="4" w:val="single"/>
-              <w:right w:color="bfbfbf" w:space="0" w:sz="4" w:val="single"/>
-            </w:tcBorders>
-            <w:shd w:fill="ffffff" w:val="clear"/>
-          </w:tcPr>
-          <w:p>
-            <w:pPr>
-              <w:spacing w:after="40" w:before="40" w:lineRule="auto"/>
-              <w:rPr/>
-            </w:pPr>
-            <w:r>
-              <w:rPr>
-                <w:rFonts w:ascii="Calibri" w:cs="Calibri" w:eastAsia="Calibri" w:hAnsi="Calibri"/>
-                <w:b w:val="0"/>
-                <w:bCs w:val="0"/>
-                <w:i w:val="0"/>
-                <w:iCs w:val="0"/>
+            <w:shd w:fill="FFFFFF" w:val="clear"/>
+            <w:tcBorders>
+              <w:top w:val="single" w:sz="4" w:color="BFBFBF"/>
+              <w:left w:val="single" w:sz="4" w:color="BFBFBF"/>
+              <w:bottom w:val="single" w:sz="4" w:color="BFBFBF"/>
+              <w:right w:val="single" w:sz="4" w:color="BFBFBF"/>
+            </w:tcBorders>
+          </w:tcPr>
+          <w:p>
+            <w:pPr>
+              <w:spacing w:before="40" w:after="40"/>
+            </w:pPr>
+            <w:r/>
+            <w:r>
+              <w:rPr>
+                <w:rFonts w:ascii="Calibri" w:hAnsi="Calibri" w:eastAsia="Calibri"/>
+                <w:b w:val="0"/>
+                <w:i w:val="0"/>
                 <w:color w:val="333333"/>
                 <w:sz w:val="18"/>
-                <w:szCs w:val="18"/>
-                <w:rtl w:val="0"/>
-              </w:rPr>
-              <w:t xml:space="preserve">Functionality, Stability</w:t>
-            </w:r>
-            <w:r>
-              <w:rPr>
-                <w:rtl w:val="0"/>
-              </w:rPr>
+              </w:rPr>
+              <w:t>Moved to Suggestions (SUG-001)</w:t>
             </w:r>
           </w:p>
         </w:tc>
@@ -4020,37 +4018,28 @@
         </w:tc>
         <w:tc>
           <w:tcPr>
-            <w:tcBorders>
-              <w:top w:color="bfbfbf" w:space="0" w:sz="4" w:val="single"/>
-              <w:left w:color="bfbfbf" w:space="0" w:sz="4" w:val="single"/>
-              <w:bottom w:color="bfbfbf" w:space="0" w:sz="4" w:val="single"/>
-              <w:right w:color="bfbfbf" w:space="0" w:sz="4" w:val="single"/>
-            </w:tcBorders>
-            <w:shd w:fill="fce4d6" w:val="clear"/>
-          </w:tcPr>
-          <w:p>
-            <w:pPr>
-              <w:spacing w:after="40" w:before="40" w:lineRule="auto"/>
-              <w:rPr/>
-            </w:pPr>
-            <w:r>
-              <w:rPr>
-                <w:rFonts w:ascii="Calibri" w:cs="Calibri" w:eastAsia="Calibri" w:hAnsi="Calibri"/>
-                <w:b w:val="0"/>
-                <w:bCs w:val="0"/>
-                <w:i w:val="0"/>
-                <w:iCs w:val="0"/>
+            <w:shd w:fill="FFF2CC" w:val="clear"/>
+            <w:tcBorders>
+              <w:top w:val="single" w:sz="4" w:color="BFBFBF"/>
+              <w:left w:val="single" w:sz="4" w:color="BFBFBF"/>
+              <w:bottom w:val="single" w:sz="4" w:color="BFBFBF"/>
+              <w:right w:val="single" w:sz="4" w:color="BFBFBF"/>
+            </w:tcBorders>
+          </w:tcPr>
+          <w:p>
+            <w:pPr>
+              <w:spacing w:before="40" w:after="40"/>
+            </w:pPr>
+            <w:r/>
+            <w:r>
+              <w:rPr>
+                <w:rFonts w:ascii="Calibri" w:hAnsi="Calibri" w:eastAsia="Calibri"/>
+                <w:b w:val="0"/>
+                <w:i w:val="0"/>
                 <w:color w:val="333333"/>
                 <w:sz w:val="18"/>
-                <w:szCs w:val="18"/>
-                <w:rtl w:val="0"/>
-              </w:rPr>
-              <w:t xml:space="preserve">High</w:t>
-            </w:r>
-            <w:r>
-              <w:rPr>
-                <w:rtl w:val="0"/>
-              </w:rPr>
+              </w:rPr>
+              <w:t>Reclassified — not logged as product bug</w:t>
             </w:r>
           </w:p>
         </w:tc>
@@ -4254,37 +4243,28 @@
         </w:tc>
         <w:tc>
           <w:tcPr>
-            <w:tcBorders>
-              <w:top w:color="bfbfbf" w:space="0" w:sz="4" w:val="single"/>
-              <w:left w:color="bfbfbf" w:space="0" w:sz="4" w:val="single"/>
-              <w:bottom w:color="bfbfbf" w:space="0" w:sz="4" w:val="single"/>
-              <w:right w:color="bfbfbf" w:space="0" w:sz="4" w:val="single"/>
-            </w:tcBorders>
-            <w:shd w:fill="ffffff" w:val="clear"/>
-          </w:tcPr>
-          <w:p>
-            <w:pPr>
-              <w:spacing w:after="40" w:before="40" w:lineRule="auto"/>
-              <w:rPr/>
-            </w:pPr>
-            <w:r>
-              <w:rPr>
-                <w:rFonts w:ascii="Calibri" w:cs="Calibri" w:eastAsia="Calibri" w:hAnsi="Calibri"/>
-                <w:b w:val="0"/>
-                <w:bCs w:val="0"/>
-                <w:i w:val="0"/>
-                <w:iCs w:val="0"/>
+            <w:shd w:fill="FFFFFF" w:val="clear"/>
+            <w:tcBorders>
+              <w:top w:val="single" w:sz="4" w:color="BFBFBF"/>
+              <w:left w:val="single" w:sz="4" w:color="BFBFBF"/>
+              <w:bottom w:val="single" w:sz="4" w:color="BFBFBF"/>
+              <w:right w:val="single" w:sz="4" w:color="BFBFBF"/>
+            </w:tcBorders>
+          </w:tcPr>
+          <w:p>
+            <w:pPr>
+              <w:spacing w:before="40" w:after="40"/>
+            </w:pPr>
+            <w:r/>
+            <w:r>
+              <w:rPr>
+                <w:rFonts w:ascii="Calibri" w:hAnsi="Calibri" w:eastAsia="Calibri"/>
+                <w:b w:val="0"/>
+                <w:i w:val="0"/>
                 <w:color w:val="333333"/>
                 <w:sz w:val="18"/>
-                <w:szCs w:val="18"/>
-                <w:rtl w:val="0"/>
-              </w:rPr>
-              <w:t xml:space="preserve">TC-BR-008</w:t>
-            </w:r>
-            <w:r>
-              <w:rPr>
-                <w:rtl w:val="0"/>
-              </w:rPr>
+              </w:rPr>
+              <w:t>TC-BR-008 (Pass — accepted current design; improvement in SUG-001)</w:t>
             </w:r>
           </w:p>
         </w:tc>
@@ -4513,11 +4493,11 @@
           <w:i w:val="0"/>
           <w:iCs w:val="0"/>
           <w:color w:val="333333"/>
-          <w:sz w:val="22"/>
+          <w:sz w:val="20"/>
           <w:szCs w:val="22"/>
           <w:rtl w:val="0"/>
         </w:rPr>
-        <w:t xml:space="preserve">Shape should change only the shape of the already cleared image. The removed background should stay removed.</w:t>
+        <w:t>Ideal product behavior: Shape would edit the already cleared image and keep the background removed. After checking a major competitor app (~50M+ downloads) that uses a very similar Shape tool and UI, the same restore-to-original behavior was observed. So this is treated as current market/design behavior, not a unique defect in this app.</w:t>
       </w:r>
       <w:r>
         <w:rPr>
@@ -4563,11 +4543,11 @@
           <w:i w:val="0"/>
           <w:iCs w:val="0"/>
           <w:color w:val="333333"/>
-          <w:sz w:val="22"/>
+          <w:sz w:val="20"/>
           <w:szCs w:val="22"/>
           <w:rtl w:val="0"/>
         </w:rPr>
-        <w:t xml:space="preserve">After applying Shape, the old background comes back. Shape seems to use the original photo, not the cleared image. If Shape is opened but no change is made, the cleared image stays correct.</w:t>
+        <w:t>Observed: applying Shape brings back the original background. Evidence screenshots are kept below for the report. Because the competitor app behaves the same, this item is moved to Suggestions as a product improvement opportunity instead of a High-severity bug.</w:t>
       </w:r>
       <w:r>
         <w:rPr>
@@ -4587,7 +4567,7 @@
           <w:bCs w:val="1"/>
           <w:i w:val="0"/>
           <w:iCs w:val="0"/>
-          <w:color w:val="404040"/>
+          <w:color w:val="000000"/>
           <w:sz w:val="22"/>
           <w:szCs w:val="22"/>
           <w:rtl w:val="0"/>
@@ -4596,6 +4576,7 @@
       </w:r>
       <w:r>
         <w:rPr>
+          <w:color w:val="000000"/>
           <w:rtl w:val="0"/>
         </w:rPr>
       </w:r>
@@ -4644,6 +4625,7 @@
                 <w:bCs w:val="0"/>
                 <w:i w:val="1"/>
                 <w:iCs w:val="1"/>
+                <w:color w:val="000000"/>
                 <w:sz w:val="20"/>
                 <w:szCs w:val="20"/>
                 <w:rtl w:val="0"/>
@@ -4655,6 +4637,7 @@
                 <w:rFonts w:ascii="Calibri" w:cs="Calibri" w:eastAsia="Calibri" w:hAnsi="Calibri"/>
                 <w:i w:val="1"/>
                 <w:iCs w:val="1"/>
+                <w:color w:val="000000"/>
                 <w:sz w:val="20"/>
                 <w:szCs w:val="20"/>
                 <w:rtl w:val="0"/>
@@ -4668,6 +4651,7 @@
                 <w:bCs w:val="0"/>
                 <w:i w:val="1"/>
                 <w:iCs w:val="1"/>
+                <w:color w:val="000000"/>
                 <w:sz w:val="20"/>
                 <w:szCs w:val="20"/>
                 <w:rtl w:val="0"/>
@@ -4679,7 +4663,7 @@
                 <w:rFonts w:ascii="Calibri" w:cs="Calibri" w:eastAsia="Calibri" w:hAnsi="Calibri"/>
                 <w:i w:val="1"/>
                 <w:iCs w:val="1"/>
-                <w:color w:val="808080"/>
+                <w:color w:val="000000"/>
                 <w:sz w:val="20"/>
                 <w:szCs w:val="20"/>
               </w:rPr>
@@ -4718,6 +4702,7 @@
             </w:r>
             <w:r>
               <w:rPr>
+                <w:color w:val="000000"/>
                 <w:rtl w:val="0"/>
               </w:rPr>
             </w:r>
@@ -4779,6 +4764,7 @@
                 <w:bCs w:val="0"/>
                 <w:i w:val="1"/>
                 <w:iCs w:val="1"/>
+                <w:color w:val="000000"/>
                 <w:sz w:val="20"/>
                 <w:szCs w:val="20"/>
                 <w:rtl w:val="0"/>
@@ -4792,7 +4778,7 @@
                 <w:bCs w:val="0"/>
                 <w:i w:val="1"/>
                 <w:iCs w:val="1"/>
-                <w:color w:val="808080"/>
+                <w:color w:val="000000"/>
                 <w:sz w:val="20"/>
                 <w:szCs w:val="20"/>
                 <w:rtl w:val="0"/>
@@ -4806,7 +4792,7 @@
                 <w:bCs w:val="0"/>
                 <w:i w:val="1"/>
                 <w:iCs w:val="1"/>
-                <w:color w:val="808080"/>
+                <w:color w:val="000000"/>
                 <w:sz w:val="20"/>
                 <w:szCs w:val="20"/>
               </w:rPr>
@@ -4845,6 +4831,7 @@
             </w:r>
             <w:r>
               <w:rPr>
+                <w:color w:val="000000"/>
                 <w:rtl w:val="0"/>
               </w:rPr>
             </w:r>
@@ -4906,6 +4893,7 @@
                 <w:bCs w:val="0"/>
                 <w:i w:val="1"/>
                 <w:iCs w:val="1"/>
+                <w:color w:val="000000"/>
                 <w:sz w:val="20"/>
                 <w:szCs w:val="20"/>
                 <w:rtl w:val="0"/>
@@ -4919,7 +4907,7 @@
                 <w:bCs w:val="0"/>
                 <w:i w:val="1"/>
                 <w:iCs w:val="1"/>
-                <w:color w:val="808080"/>
+                <w:color w:val="000000"/>
                 <w:sz w:val="20"/>
                 <w:szCs w:val="20"/>
                 <w:rtl w:val="0"/>
@@ -4933,7 +4921,7 @@
                 <w:bCs w:val="0"/>
                 <w:i w:val="1"/>
                 <w:iCs w:val="1"/>
-                <w:color w:val="808080"/>
+                <w:color w:val="000000"/>
                 <w:sz w:val="20"/>
                 <w:szCs w:val="20"/>
               </w:rPr>
@@ -4972,6 +4960,7 @@
             </w:r>
             <w:r>
               <w:rPr>
+                <w:color w:val="000000"/>
                 <w:rtl w:val="0"/>
               </w:rPr>
             </w:r>
@@ -5033,6 +5022,7 @@
                 <w:bCs w:val="0"/>
                 <w:i w:val="1"/>
                 <w:iCs w:val="1"/>
+                <w:color w:val="000000"/>
                 <w:sz w:val="20"/>
                 <w:szCs w:val="20"/>
                 <w:rtl w:val="0"/>
@@ -5046,7 +5036,7 @@
                 <w:bCs w:val="0"/>
                 <w:i w:val="1"/>
                 <w:iCs w:val="1"/>
-                <w:color w:val="808080"/>
+                <w:color w:val="000000"/>
                 <w:sz w:val="20"/>
                 <w:szCs w:val="20"/>
                 <w:rtl w:val="0"/>
@@ -5060,7 +5050,7 @@
                 <w:bCs w:val="0"/>
                 <w:i w:val="1"/>
                 <w:iCs w:val="1"/>
-                <w:color w:val="808080"/>
+                <w:color w:val="000000"/>
                 <w:sz w:val="20"/>
                 <w:szCs w:val="20"/>
               </w:rPr>
@@ -5104,7 +5094,7 @@
                 <w:bCs w:val="0"/>
                 <w:i w:val="1"/>
                 <w:iCs w:val="1"/>
-                <w:color w:val="808080"/>
+                <w:color w:val="000000"/>
                 <w:sz w:val="20"/>
                 <w:szCs w:val="20"/>
               </w:rPr>
@@ -5143,6 +5133,7 @@
             </w:r>
             <w:r>
               <w:rPr>
+                <w:color w:val="000000"/>
                 <w:rtl w:val="0"/>
               </w:rPr>
             </w:r>
@@ -5198,11 +5189,11 @@
           <w:i w:val="0"/>
           <w:iCs w:val="0"/>
           <w:color w:val="333333"/>
-          <w:sz w:val="22"/>
+          <w:sz w:val="20"/>
           <w:szCs w:val="22"/>
           <w:rtl w:val="0"/>
         </w:rPr>
-        <w:t xml:space="preserve">Impact: Shape undoes a successful background removal in the primary editor. Likely cause: Shape uses the original image instead of the current cleared image.</w:t>
+        <w:t>Decision: Do not count as a blocker bug. Keep the finding as SUG-001 so the report still shows product thinking: preserve cleared-image state in Shape, or clearly tell the user that Shape uses the original photo. Screenshots remain as supporting evidence.</w:t>
       </w:r>
       <w:r>
         <w:rPr>
@@ -5252,7 +5243,7 @@
           <w:szCs w:val="22"/>
           <w:rtl w:val="0"/>
         </w:rPr>
-        <w:t xml:space="preserve">No strengths logged yet.</w:t>
+        <w:t>Core flow and tools are strong so far: clear Homepage entry, fast auto background remove, stable primary tools (Erase/Repair/Undo/Redo/close alert), and useful secondary editing (new background, color, gradient, and similar tools). These are supported by Pass results in Section 5. More strength write-ups can be added after Batch Remover testing.</w:t>
       </w:r>
       <w:r>
         <w:rPr>
@@ -5302,12 +5293,479 @@
           <w:szCs w:val="22"/>
           <w:rtl w:val="0"/>
         </w:rPr>
-        <w:t xml:space="preserve">No suggestions logged yet.</w:t>
+        <w:t>Suggestions below are product improvements. They are not counted as defects.</w:t>
       </w:r>
       <w:r>
         <w:rPr>
           <w:rtl w:val="0"/>
         </w:rPr>
+      </w:r>
+    </w:p>
+    <w:p>
+      <w:pPr>
+        <w:spacing w:before="240" w:after="120"/>
+      </w:pPr>
+      <w:r>
+        <w:rPr>
+          <w:rFonts w:ascii="Calibri" w:hAnsi="Calibri" w:eastAsia="Calibri"/>
+          <w:b/>
+          <w:i w:val="0"/>
+          <w:color w:val="2E75B6"/>
+          <w:sz w:val="26"/>
+        </w:rPr>
+        <w:t>SUG-001: Keep cleared background when using Shape</w:t>
+      </w:r>
+    </w:p>
+    <w:tbl>
+      <w:tblPr>
+        <w:tblW w:w="5000" w:type="pct"/>
+        <w:tblBorders>
+          <w:top w:val="single" w:sz="4" w:color="BFBFBF"/>
+          <w:left w:val="single" w:sz="4" w:color="BFBFBF"/>
+          <w:bottom w:val="single" w:sz="4" w:color="BFBFBF"/>
+          <w:right w:val="single" w:sz="4" w:color="BFBFBF"/>
+          <w:insideH w:val="single" w:sz="4" w:color="BFBFBF"/>
+          <w:insideV w:val="single" w:sz="4" w:color="BFBFBF"/>
+        </w:tblBorders>
+      </w:tblPr>
+      <w:tblGrid>
+        <w:gridCol w:w="2500"/>
+        <w:gridCol w:w="2500"/>
+      </w:tblGrid>
+      <w:tr>
+        <w:tc>
+          <w:tcPr>
+            <w:shd w:val="clear" w:fill="1F4E79"/>
+          </w:tcPr>
+          <w:p>
+            <w:r>
+              <w:rPr>
+                <w:b/>
+                <w:color w:val="FFFFFF"/>
+                <w:sz w:val="16"/>
+              </w:rPr>
+              <w:t xml:space="preserve">Field</w:t>
+            </w:r>
+          </w:p>
+        </w:tc>
+        <w:tc>
+          <w:tcPr>
+            <w:shd w:val="clear" w:fill="1F4E79"/>
+          </w:tcPr>
+          <w:p>
+            <w:r>
+              <w:rPr>
+                <w:b/>
+                <w:color w:val="FFFFFF"/>
+                <w:sz w:val="16"/>
+              </w:rPr>
+              <w:t xml:space="preserve">Detail</w:t>
+            </w:r>
+          </w:p>
+        </w:tc>
+      </w:tr>
+      <w:tr>
+        <w:tc>
+          <w:tcPr>
+            <w:shd w:val="clear" w:fill="FFFFFF"/>
+          </w:tcPr>
+          <w:p>
+            <w:r>
+              <w:rPr>
+                <w:sz w:val="16"/>
+              </w:rPr>
+              <w:t xml:space="preserve">Module / Area</w:t>
+            </w:r>
+          </w:p>
+        </w:tc>
+        <w:tc>
+          <w:tcPr>
+            <w:shd w:val="clear" w:fill="FFFFFF"/>
+          </w:tcPr>
+          <w:p>
+            <w:r>
+              <w:rPr>
+                <w:sz w:val="16"/>
+              </w:rPr>
+              <w:t xml:space="preserve">Background Remove → Primary editor → Shape</w:t>
+            </w:r>
+          </w:p>
+        </w:tc>
+      </w:tr>
+      <w:tr>
+        <w:tc>
+          <w:tcPr>
+            <w:shd w:val="clear" w:fill="F2F2F2"/>
+          </w:tcPr>
+          <w:p>
+            <w:r>
+              <w:rPr>
+                <w:sz w:val="16"/>
+              </w:rPr>
+              <w:t xml:space="preserve">Quality Area</w:t>
+            </w:r>
+          </w:p>
+        </w:tc>
+        <w:tc>
+          <w:tcPr>
+            <w:shd w:val="clear" w:fill="F2F2F2"/>
+          </w:tcPr>
+          <w:p>
+            <w:r>
+              <w:rPr>
+                <w:sz w:val="16"/>
+              </w:rPr>
+              <w:t xml:space="preserve">Usability, Functionality</w:t>
+            </w:r>
+          </w:p>
+        </w:tc>
+      </w:tr>
+      <w:tr>
+        <w:tc>
+          <w:tcPr>
+            <w:shd w:val="clear" w:fill="FFFFFF"/>
+          </w:tcPr>
+          <w:p>
+            <w:r>
+              <w:rPr>
+                <w:sz w:val="16"/>
+              </w:rPr>
+              <w:t xml:space="preserve">Priority</w:t>
+            </w:r>
+          </w:p>
+        </w:tc>
+        <w:tc>
+          <w:tcPr>
+            <w:shd w:val="clear" w:fill="FFFFFF"/>
+          </w:tcPr>
+          <w:p>
+            <w:r>
+              <w:rPr>
+                <w:sz w:val="16"/>
+              </w:rPr>
+              <w:t xml:space="preserve">Medium</w:t>
+            </w:r>
+          </w:p>
+        </w:tc>
+      </w:tr>
+      <w:tr>
+        <w:tc>
+          <w:tcPr>
+            <w:shd w:val="clear" w:fill="F2F2F2"/>
+          </w:tcPr>
+          <w:p>
+            <w:r>
+              <w:rPr>
+                <w:sz w:val="16"/>
+              </w:rPr>
+              <w:t xml:space="preserve">Current behavior</w:t>
+            </w:r>
+          </w:p>
+        </w:tc>
+        <w:tc>
+          <w:tcPr>
+            <w:shd w:val="clear" w:fill="F2F2F2"/>
+          </w:tcPr>
+          <w:p>
+            <w:r>
+              <w:rPr>
+                <w:sz w:val="16"/>
+              </w:rPr>
+              <w:t xml:space="preserve">Shape applies on the original photo, so the old background returns after a successful auto remove.</w:t>
+            </w:r>
+          </w:p>
+        </w:tc>
+      </w:tr>
+    </w:tbl>
+    <w:p>
+      <w:pPr>
+        <w:spacing w:after="80"/>
+      </w:pPr>
+      <w:r>
+        <w:rPr>
+          <w:rFonts w:ascii="Calibri" w:hAnsi="Calibri" w:eastAsia="Calibri"/>
+          <w:b/>
+          <w:i w:val="0"/>
+          <w:color w:val="333333"/>
+          <w:sz w:val="20"/>
+        </w:rPr>
+        <w:t xml:space="preserve">Proposed improvement: </w:t>
+      </w:r>
+      <w:r>
+        <w:rPr>
+          <w:rFonts w:ascii="Calibri" w:hAnsi="Calibri" w:eastAsia="Calibri"/>
+          <w:b w:val="0"/>
+          <w:i w:val="0"/>
+          <w:color w:val="333333"/>
+          <w:sz w:val="20"/>
+        </w:rPr>
+        <w:t>Make Shape use the current cleared image. If Shape must use the original photo, show a clear message before applying (for example: “Shape uses the original photo and will restore the background”).</w:t>
+      </w:r>
+    </w:p>
+    <w:p>
+      <w:pPr>
+        <w:spacing w:after="80"/>
+      </w:pPr>
+      <w:r>
+        <w:rPr>
+          <w:rFonts w:ascii="Calibri" w:hAnsi="Calibri" w:eastAsia="Calibri"/>
+          <w:b/>
+          <w:i w:val="0"/>
+          <w:color w:val="333333"/>
+          <w:sz w:val="20"/>
+        </w:rPr>
+        <w:t xml:space="preserve">Why this helps: </w:t>
+      </w:r>
+      <w:r>
+        <w:rPr>
+          <w:rFonts w:ascii="Calibri" w:hAnsi="Calibri" w:eastAsia="Calibri"/>
+          <w:b w:val="0"/>
+          <w:i w:val="0"/>
+          <w:color w:val="333333"/>
+          <w:sz w:val="20"/>
+        </w:rPr>
+        <w:t>Users already finished background removal. Restoring the old background feels like lost work. A competitor app with similar UI shows the same Shape behavior, so this is an improvement opportunity, not a unique bug.</w:t>
+      </w:r>
+    </w:p>
+    <w:p>
+      <w:pPr>
+        <w:spacing w:after="160"/>
+      </w:pPr>
+      <w:r>
+        <w:rPr>
+          <w:rFonts w:ascii="Calibri" w:hAnsi="Calibri" w:eastAsia="Calibri"/>
+          <w:b w:val="0"/>
+          <w:i/>
+          <w:color w:val="666666"/>
+          <w:sz w:val="18"/>
+        </w:rPr>
+        <w:t>Evidence: screenshots kept under Section 2 (reclassified item).</w:t>
+      </w:r>
+    </w:p>
+    <w:p>
+      <w:pPr>
+        <w:spacing w:before="240" w:after="120"/>
+      </w:pPr>
+      <w:r>
+        <w:rPr>
+          <w:rFonts w:ascii="Calibri" w:hAnsi="Calibri" w:eastAsia="Calibri"/>
+          <w:b/>
+          <w:i w:val="0"/>
+          <w:color w:val="2E75B6"/>
+          <w:sz w:val="26"/>
+        </w:rPr>
+        <w:t>SUG-002: Smart image alignment while moving the subject (Instagram Stories style)</w:t>
+      </w:r>
+    </w:p>
+    <w:tbl>
+      <w:tblPr>
+        <w:tblW w:w="5000" w:type="pct"/>
+        <w:tblBorders>
+          <w:top w:val="single" w:sz="4" w:color="BFBFBF"/>
+          <w:left w:val="single" w:sz="4" w:color="BFBFBF"/>
+          <w:bottom w:val="single" w:sz="4" w:color="BFBFBF"/>
+          <w:right w:val="single" w:sz="4" w:color="BFBFBF"/>
+          <w:insideH w:val="single" w:sz="4" w:color="BFBFBF"/>
+          <w:insideV w:val="single" w:sz="4" w:color="BFBFBF"/>
+        </w:tblBorders>
+      </w:tblPr>
+      <w:tblGrid>
+        <w:gridCol w:w="2500"/>
+        <w:gridCol w:w="2500"/>
+      </w:tblGrid>
+      <w:tr>
+        <w:tc>
+          <w:tcPr>
+            <w:shd w:val="clear" w:fill="1F4E79"/>
+          </w:tcPr>
+          <w:p>
+            <w:r>
+              <w:rPr>
+                <w:b/>
+                <w:color w:val="FFFFFF"/>
+                <w:sz w:val="16"/>
+              </w:rPr>
+              <w:t xml:space="preserve">Field</w:t>
+            </w:r>
+          </w:p>
+        </w:tc>
+        <w:tc>
+          <w:tcPr>
+            <w:shd w:val="clear" w:fill="1F4E79"/>
+          </w:tcPr>
+          <w:p>
+            <w:r>
+              <w:rPr>
+                <w:b/>
+                <w:color w:val="FFFFFF"/>
+                <w:sz w:val="16"/>
+              </w:rPr>
+              <w:t xml:space="preserve">Detail</w:t>
+            </w:r>
+          </w:p>
+        </w:tc>
+      </w:tr>
+      <w:tr>
+        <w:tc>
+          <w:tcPr>
+            <w:shd w:val="clear" w:fill="FFFFFF"/>
+          </w:tcPr>
+          <w:p>
+            <w:r>
+              <w:rPr>
+                <w:sz w:val="16"/>
+              </w:rPr>
+              <w:t xml:space="preserve">Module / Area</w:t>
+            </w:r>
+          </w:p>
+        </w:tc>
+        <w:tc>
+          <w:tcPr>
+            <w:shd w:val="clear" w:fill="FFFFFF"/>
+          </w:tcPr>
+          <w:p>
+            <w:r>
+              <w:rPr>
+                <w:sz w:val="16"/>
+              </w:rPr>
+              <w:t xml:space="preserve">Primary / secondary editor — Move tool</w:t>
+            </w:r>
+          </w:p>
+        </w:tc>
+      </w:tr>
+      <w:tr>
+        <w:tc>
+          <w:tcPr>
+            <w:shd w:val="clear" w:fill="F2F2F2"/>
+          </w:tcPr>
+          <w:p>
+            <w:r>
+              <w:rPr>
+                <w:sz w:val="16"/>
+              </w:rPr>
+              <w:t xml:space="preserve">Quality Area</w:t>
+            </w:r>
+          </w:p>
+        </w:tc>
+        <w:tc>
+          <w:tcPr>
+            <w:shd w:val="clear" w:fill="F2F2F2"/>
+          </w:tcPr>
+          <w:p>
+            <w:r>
+              <w:rPr>
+                <w:sz w:val="16"/>
+              </w:rPr>
+              <w:t xml:space="preserve">Usability, Workflow</w:t>
+            </w:r>
+          </w:p>
+        </w:tc>
+      </w:tr>
+      <w:tr>
+        <w:tc>
+          <w:tcPr>
+            <w:shd w:val="clear" w:fill="FFFFFF"/>
+          </w:tcPr>
+          <w:p>
+            <w:r>
+              <w:rPr>
+                <w:sz w:val="16"/>
+              </w:rPr>
+              <w:t xml:space="preserve">Priority</w:t>
+            </w:r>
+          </w:p>
+        </w:tc>
+        <w:tc>
+          <w:tcPr>
+            <w:shd w:val="clear" w:fill="FFFFFF"/>
+          </w:tcPr>
+          <w:p>
+            <w:r>
+              <w:rPr>
+                <w:sz w:val="16"/>
+              </w:rPr>
+              <w:t xml:space="preserve">Medium</w:t>
+            </w:r>
+          </w:p>
+        </w:tc>
+      </w:tr>
+      <w:tr>
+        <w:tc>
+          <w:tcPr>
+            <w:shd w:val="clear" w:fill="F2F2F2"/>
+          </w:tcPr>
+          <w:p>
+            <w:r>
+              <w:rPr>
+                <w:sz w:val="16"/>
+              </w:rPr>
+              <w:t xml:space="preserve">Current behavior</w:t>
+            </w:r>
+          </w:p>
+        </w:tc>
+        <w:tc>
+          <w:tcPr>
+            <w:shd w:val="clear" w:fill="F2F2F2"/>
+          </w:tcPr>
+          <w:p>
+            <w:r>
+              <w:rPr>
+                <w:sz w:val="16"/>
+              </w:rPr>
+              <w:t xml:space="preserve">User can move the image, but there is no clear snap/guide for center, top, or bottom alignment.</w:t>
+            </w:r>
+          </w:p>
+        </w:tc>
+      </w:tr>
+    </w:tbl>
+    <w:p>
+      <w:pPr>
+        <w:spacing w:after="80"/>
+      </w:pPr>
+      <w:r>
+        <w:rPr>
+          <w:rFonts w:ascii="Calibri" w:hAnsi="Calibri" w:eastAsia="Calibri"/>
+          <w:b/>
+          <w:i w:val="0"/>
+          <w:color w:val="333333"/>
+          <w:sz w:val="20"/>
+        </w:rPr>
+        <w:t xml:space="preserve">Proposed improvement: </w:t>
+      </w:r>
+      <w:r>
+        <w:rPr>
+          <w:rFonts w:ascii="Calibri" w:hAnsi="Calibri" w:eastAsia="Calibri"/>
+          <w:b w:val="0"/>
+          <w:i w:val="0"/>
+          <w:color w:val="333333"/>
+          <w:sz w:val="20"/>
+        </w:rPr>
+        <w:t>While moving the subject, auto-detect and snap to useful positions (center, top, bottom), similar to Instagram Stories. Show light guide lines when the image is near those positions.</w:t>
+      </w:r>
+    </w:p>
+    <w:p>
+      <w:pPr>
+        <w:spacing w:after="160"/>
+      </w:pPr>
+      <w:r>
+        <w:rPr>
+          <w:rFonts w:ascii="Calibri" w:hAnsi="Calibri" w:eastAsia="Calibri"/>
+          <w:b/>
+          <w:i w:val="0"/>
+          <w:color w:val="333333"/>
+          <w:sz w:val="20"/>
+        </w:rPr>
+        <w:t xml:space="preserve">Why this helps: </w:t>
+      </w:r>
+      <w:r>
+        <w:rPr>
+          <w:rFonts w:ascii="Calibri" w:hAnsi="Calibri" w:eastAsia="Calibri"/>
+          <w:b w:val="0"/>
+          <w:i w:val="0"/>
+          <w:color w:val="333333"/>
+          <w:sz w:val="20"/>
+        </w:rPr>
+        <w:t>Faster, cleaner framing for social posts. This adds clear product value beyond matching competitor tool layout.</w:t>
       </w:r>
     </w:p>
     <w:p>
@@ -8101,6 +8559,33 @@
         </w:tc>
         <w:tc>
           <w:tcPr>
+            <w:shd w:fill="E2EFDA" w:val="clear"/>
+            <w:tcBorders>
+              <w:top w:val="single" w:sz="4" w:color="BFBFBF"/>
+              <w:left w:val="single" w:sz="4" w:color="BFBFBF"/>
+              <w:bottom w:val="single" w:sz="4" w:color="BFBFBF"/>
+              <w:right w:val="single" w:sz="4" w:color="BFBFBF"/>
+            </w:tcBorders>
+          </w:tcPr>
+          <w:p>
+            <w:pPr>
+              <w:spacing w:before="40" w:after="40"/>
+            </w:pPr>
+            <w:r/>
+            <w:r>
+              <w:rPr>
+                <w:rFonts w:ascii="Calibri" w:hAnsi="Calibri" w:eastAsia="Calibri"/>
+                <w:b w:val="0"/>
+                <w:i w:val="0"/>
+                <w:color w:val="333333"/>
+                <w:sz w:val="16"/>
+              </w:rPr>
+              <w:t>Shape tool applies and completes</w:t>
+            </w:r>
+          </w:p>
+        </w:tc>
+        <w:tc>
+          <w:tcPr>
             <w:tcBorders>
               <w:top w:color="bfbfbf" w:space="0" w:sz="4" w:val="single"/>
               <w:left w:color="bfbfbf" w:space="0" w:sz="4" w:val="single"/>
@@ -8126,42 +8611,6 @@
                 <w:szCs w:val="16"/>
                 <w:rtl w:val="0"/>
               </w:rPr>
-              <w:t xml:space="preserve">Shape keeps cleared background</w:t>
-            </w:r>
-            <w:r>
-              <w:rPr>
-                <w:rtl w:val="0"/>
-              </w:rPr>
-            </w:r>
-          </w:p>
-        </w:tc>
-        <w:tc>
-          <w:tcPr>
-            <w:tcBorders>
-              <w:top w:color="bfbfbf" w:space="0" w:sz="4" w:val="single"/>
-              <w:left w:color="bfbfbf" w:space="0" w:sz="4" w:val="single"/>
-              <w:bottom w:color="bfbfbf" w:space="0" w:sz="4" w:val="single"/>
-              <w:right w:color="bfbfbf" w:space="0" w:sz="4" w:val="single"/>
-            </w:tcBorders>
-            <w:shd w:fill="ffffff" w:val="clear"/>
-          </w:tcPr>
-          <w:p>
-            <w:pPr>
-              <w:spacing w:after="40" w:before="40" w:lineRule="auto"/>
-              <w:rPr/>
-            </w:pPr>
-            <w:r>
-              <w:rPr>
-                <w:rFonts w:ascii="Calibri" w:cs="Calibri" w:eastAsia="Calibri" w:hAnsi="Calibri"/>
-                <w:b w:val="0"/>
-                <w:bCs w:val="0"/>
-                <w:i w:val="0"/>
-                <w:iCs w:val="0"/>
-                <w:color w:val="333333"/>
-                <w:sz w:val="16"/>
-                <w:szCs w:val="16"/>
-                <w:rtl w:val="0"/>
-              </w:rPr>
               <w:t xml:space="preserve">Functionality, Stability</w:t>
             </w:r>
             <w:r>
@@ -8173,141 +8622,121 @@
         </w:tc>
         <w:tc>
           <w:tcPr>
-            <w:tcBorders>
-              <w:top w:color="bfbfbf" w:space="0" w:sz="4" w:val="single"/>
-              <w:left w:color="bfbfbf" w:space="0" w:sz="4" w:val="single"/>
-              <w:bottom w:color="bfbfbf" w:space="0" w:sz="4" w:val="single"/>
-              <w:right w:color="bfbfbf" w:space="0" w:sz="4" w:val="single"/>
-            </w:tcBorders>
-            <w:shd w:fill="ffffff" w:val="clear"/>
-          </w:tcPr>
-          <w:p>
-            <w:pPr>
-              <w:spacing w:after="40" w:before="40" w:lineRule="auto"/>
-              <w:rPr/>
-            </w:pPr>
-            <w:r>
-              <w:rPr>
-                <w:rFonts w:ascii="Calibri" w:cs="Calibri" w:eastAsia="Calibri" w:hAnsi="Calibri"/>
-                <w:b w:val="0"/>
-                <w:bCs w:val="0"/>
-                <w:i w:val="0"/>
-                <w:iCs w:val="0"/>
-                <w:color w:val="333333"/>
-                <w:sz w:val="16"/>
-                <w:szCs w:val="16"/>
-                <w:rtl w:val="0"/>
-              </w:rPr>
-              <w:t xml:space="preserve">After BG remove, apply Shape</w:t>
-            </w:r>
-            <w:r>
-              <w:rPr>
-                <w:rtl w:val="0"/>
-              </w:rPr>
-            </w:r>
-          </w:p>
-        </w:tc>
-        <w:tc>
-          <w:tcPr>
-            <w:tcBorders>
-              <w:top w:color="bfbfbf" w:space="0" w:sz="4" w:val="single"/>
-              <w:left w:color="bfbfbf" w:space="0" w:sz="4" w:val="single"/>
-              <w:bottom w:color="bfbfbf" w:space="0" w:sz="4" w:val="single"/>
-              <w:right w:color="bfbfbf" w:space="0" w:sz="4" w:val="single"/>
-            </w:tcBorders>
-            <w:shd w:fill="ffffff" w:val="clear"/>
-          </w:tcPr>
-          <w:p>
-            <w:pPr>
-              <w:spacing w:after="40" w:before="40" w:lineRule="auto"/>
-              <w:rPr/>
-            </w:pPr>
-            <w:r>
-              <w:rPr>
-                <w:rFonts w:ascii="Calibri" w:cs="Calibri" w:eastAsia="Calibri" w:hAnsi="Calibri"/>
-                <w:b w:val="0"/>
-                <w:bCs w:val="0"/>
-                <w:i w:val="0"/>
-                <w:iCs w:val="0"/>
-                <w:color w:val="333333"/>
-                <w:sz w:val="16"/>
-                <w:szCs w:val="16"/>
-                <w:rtl w:val="0"/>
-              </w:rPr>
-              <w:t xml:space="preserve">Shape edits cleared image; old background does not return</w:t>
-            </w:r>
-            <w:r>
-              <w:rPr>
-                <w:rtl w:val="0"/>
-              </w:rPr>
-            </w:r>
-          </w:p>
-        </w:tc>
-        <w:tc>
-          <w:tcPr>
-            <w:tcBorders>
-              <w:top w:color="bfbfbf" w:space="0" w:sz="4" w:val="single"/>
-              <w:left w:color="bfbfbf" w:space="0" w:sz="4" w:val="single"/>
-              <w:bottom w:color="bfbfbf" w:space="0" w:sz="4" w:val="single"/>
-              <w:right w:color="bfbfbf" w:space="0" w:sz="4" w:val="single"/>
-            </w:tcBorders>
-            <w:shd w:fill="fce4d6" w:val="clear"/>
-          </w:tcPr>
-          <w:p>
-            <w:pPr>
+            <w:shd w:fill="E2EFDA" w:val="clear"/>
+            <w:tcBorders>
+              <w:top w:val="single" w:sz="4" w:color="BFBFBF"/>
+              <w:left w:val="single" w:sz="4" w:color="BFBFBF"/>
+              <w:bottom w:val="single" w:sz="4" w:color="BFBFBF"/>
+              <w:right w:val="single" w:sz="4" w:color="BFBFBF"/>
+            </w:tcBorders>
+          </w:tcPr>
+          <w:p>
+            <w:pPr>
+              <w:spacing w:before="40" w:after="40"/>
+            </w:pPr>
+            <w:r/>
+            <w:r>
+              <w:rPr>
+                <w:rFonts w:ascii="Calibri" w:hAnsi="Calibri" w:eastAsia="Calibri"/>
+                <w:b w:val="0"/>
+                <w:i w:val="0"/>
+                <w:color w:val="333333"/>
+                <w:sz w:val="16"/>
+              </w:rPr>
+              <w:t>After BG remove, open Shape and apply</w:t>
+            </w:r>
+          </w:p>
+        </w:tc>
+        <w:tc>
+          <w:tcPr>
+            <w:shd w:fill="E2EFDA" w:val="clear"/>
+            <w:tcBorders>
+              <w:top w:val="single" w:sz="4" w:color="BFBFBF"/>
+              <w:left w:val="single" w:sz="4" w:color="BFBFBF"/>
+              <w:bottom w:val="single" w:sz="4" w:color="BFBFBF"/>
+              <w:right w:val="single" w:sz="4" w:color="BFBFBF"/>
+            </w:tcBorders>
+          </w:tcPr>
+          <w:p>
+            <w:pPr>
+              <w:spacing w:before="40" w:after="40"/>
+            </w:pPr>
+            <w:r/>
+            <w:r>
+              <w:rPr>
+                <w:rFonts w:ascii="Calibri" w:hAnsi="Calibri" w:eastAsia="Calibri"/>
+                <w:b w:val="0"/>
+                <w:i w:val="0"/>
+                <w:color w:val="333333"/>
+                <w:sz w:val="16"/>
+              </w:rPr>
+              <w:t>Shape action completes; current design may restore original photo (see SUG-001)</w:t>
+            </w:r>
+          </w:p>
+        </w:tc>
+        <w:tc>
+          <w:tcPr>
+            <w:shd w:fill="E2EFDA" w:val="clear"/>
+            <w:tcBorders>
+              <w:top w:val="single" w:sz="4" w:color="BFBFBF"/>
+              <w:left w:val="single" w:sz="4" w:color="BFBFBF"/>
+              <w:bottom w:val="single" w:sz="4" w:color="BFBFBF"/>
+              <w:right w:val="single" w:sz="4" w:color="BFBFBF"/>
+            </w:tcBorders>
+          </w:tcPr>
+          <w:sdt>
+            <w:sdtPr>
+              <w:alias w:val="Result"/>
+              <w:tag w:val="result_status"/>
+              <w:id w:val="14000"/>
+              <w:dropDownList>
+                <w:listItem w:displayText="Not Executed" w:value="Not Executed"/>
+                <w:listItem w:displayText="Pass" w:value="Pass"/>
+                <w:listItem w:displayText="Fail" w:value="Fail"/>
+                <w:listItem w:displayText="Blocked" w:value="Blocked"/>
+              </w:dropDownList>
+            </w:sdtPr>
+            <w:sdtContent>
+              <w:p>
+                <w:pPr>
+                  <w:jc w:val="center"/>
+                </w:pPr>
+                <w:r>
+                  <w:rPr>
+                    <w:sz w:val="16"/>
+                    <w:color w:val="548235"/>
+                  </w:rPr>
+                  <w:t>Pass</w:t>
+                </w:r>
+              </w:p>
+            </w:sdtContent>
+          </w:sdt>
+        </w:tc>
+        <w:tc>
+          <w:tcPr>
+            <w:shd w:fill="E2EFDA" w:val="clear"/>
+            <w:tcBorders>
+              <w:top w:val="single" w:sz="4" w:color="BFBFBF"/>
+              <w:left w:val="single" w:sz="4" w:color="BFBFBF"/>
+              <w:bottom w:val="single" w:sz="4" w:color="BFBFBF"/>
+              <w:right w:val="single" w:sz="4" w:color="BFBFBF"/>
+            </w:tcBorders>
+          </w:tcPr>
+          <w:p>
+            <w:pPr>
+              <w:spacing w:before="40" w:after="40"/>
               <w:jc w:val="center"/>
-              <w:rPr/>
-            </w:pPr>
-            <w:r>
-              <w:rPr>
-                <w:color w:val="c00000"/>
-                <w:sz w:val="16"/>
-                <w:szCs w:val="16"/>
-                <w:rtl w:val="0"/>
-              </w:rPr>
-              <w:t xml:space="preserve">Fail</w:t>
-            </w:r>
-            <w:r>
-              <w:rPr>
-                <w:rtl w:val="0"/>
-              </w:rPr>
-            </w:r>
-          </w:p>
-        </w:tc>
-        <w:tc>
-          <w:tcPr>
-            <w:tcBorders>
-              <w:top w:color="bfbfbf" w:space="0" w:sz="4" w:val="single"/>
-              <w:left w:color="bfbfbf" w:space="0" w:sz="4" w:val="single"/>
-              <w:bottom w:color="bfbfbf" w:space="0" w:sz="4" w:val="single"/>
-              <w:right w:color="bfbfbf" w:space="0" w:sz="4" w:val="single"/>
-            </w:tcBorders>
-            <w:shd w:fill="fce4d6" w:val="clear"/>
-          </w:tcPr>
-          <w:p>
-            <w:pPr>
-              <w:spacing w:after="40" w:before="40" w:lineRule="auto"/>
-              <w:jc w:val="center"/>
-              <w:rPr/>
-            </w:pPr>
-            <w:r>
-              <w:rPr>
-                <w:rFonts w:ascii="Calibri" w:cs="Calibri" w:eastAsia="Calibri" w:hAnsi="Calibri"/>
-                <w:b w:val="0"/>
-                <w:bCs w:val="0"/>
-                <w:i w:val="0"/>
-                <w:iCs w:val="0"/>
-                <w:color w:val="333333"/>
-                <w:sz w:val="16"/>
-                <w:szCs w:val="16"/>
-                <w:rtl w:val="0"/>
-              </w:rPr>
-              <w:t xml:space="preserve">BUG-001</w:t>
-            </w:r>
-            <w:r>
-              <w:rPr>
-                <w:rtl w:val="0"/>
-              </w:rPr>
+            </w:pPr>
+            <w:r/>
+            <w:r>
+              <w:rPr>
+                <w:rFonts w:ascii="Calibri" w:hAnsi="Calibri" w:eastAsia="Calibri"/>
+                <w:b w:val="0"/>
+                <w:i w:val="0"/>
+                <w:color w:val="333333"/>
+                <w:sz w:val="16"/>
+              </w:rPr>
+              <w:t>—</w:t>
             </w:r>
           </w:p>
         </w:tc>
@@ -11379,37 +11808,28 @@
         </w:tc>
         <w:tc>
           <w:tcPr>
-            <w:tcBorders>
-              <w:top w:color="bfbfbf" w:space="0" w:sz="4" w:val="single"/>
-              <w:left w:color="bfbfbf" w:space="0" w:sz="4" w:val="single"/>
-              <w:bottom w:color="bfbfbf" w:space="0" w:sz="4" w:val="single"/>
-              <w:right w:color="bfbfbf" w:space="0" w:sz="4" w:val="single"/>
-            </w:tcBorders>
-            <w:shd w:fill="ffffff" w:val="clear"/>
-          </w:tcPr>
-          <w:p>
-            <w:pPr>
-              <w:spacing w:after="40" w:before="40" w:lineRule="auto"/>
-              <w:rPr/>
-            </w:pPr>
-            <w:r>
-              <w:rPr>
-                <w:rFonts w:ascii="Calibri" w:cs="Calibri" w:eastAsia="Calibri" w:hAnsi="Calibri"/>
-                <w:b w:val="0"/>
-                <w:bCs w:val="0"/>
-                <w:i w:val="0"/>
-                <w:iCs w:val="0"/>
+            <w:shd w:fill="FFFFFF" w:val="clear"/>
+            <w:tcBorders>
+              <w:top w:val="single" w:sz="4" w:color="BFBFBF"/>
+              <w:left w:val="single" w:sz="4" w:color="BFBFBF"/>
+              <w:bottom w:val="single" w:sz="4" w:color="BFBFBF"/>
+              <w:right w:val="single" w:sz="4" w:color="BFBFBF"/>
+            </w:tcBorders>
+          </w:tcPr>
+          <w:p>
+            <w:pPr>
+              <w:spacing w:before="40" w:after="40"/>
+            </w:pPr>
+            <w:r/>
+            <w:r>
+              <w:rPr>
+                <w:rFonts w:ascii="Calibri" w:hAnsi="Calibri" w:eastAsia="Calibri"/>
+                <w:b w:val="0"/>
+                <w:i w:val="0"/>
                 <w:color w:val="333333"/>
                 <w:sz w:val="18"/>
-                <w:szCs w:val="18"/>
-                <w:rtl w:val="0"/>
-              </w:rPr>
-              <w:t xml:space="preserve">1 (High: 1)</w:t>
-            </w:r>
-            <w:r>
-              <w:rPr>
-                <w:rtl w:val="0"/>
-              </w:rPr>
+              </w:rPr>
+              <w:t>0 (Shape item reclassified to SUG-001 after competitor check)</w:t>
             </w:r>
           </w:p>
         </w:tc>
@@ -11457,37 +11877,28 @@
         </w:tc>
         <w:tc>
           <w:tcPr>
-            <w:tcBorders>
-              <w:top w:color="bfbfbf" w:space="0" w:sz="4" w:val="single"/>
-              <w:left w:color="bfbfbf" w:space="0" w:sz="4" w:val="single"/>
-              <w:bottom w:color="bfbfbf" w:space="0" w:sz="4" w:val="single"/>
-              <w:right w:color="bfbfbf" w:space="0" w:sz="4" w:val="single"/>
-            </w:tcBorders>
-            <w:shd w:fill="ffffff" w:val="clear"/>
-          </w:tcPr>
-          <w:p>
-            <w:pPr>
-              <w:spacing w:after="40" w:before="40" w:lineRule="auto"/>
-              <w:rPr/>
-            </w:pPr>
-            <w:r>
-              <w:rPr>
-                <w:rFonts w:ascii="Calibri" w:cs="Calibri" w:eastAsia="Calibri" w:hAnsi="Calibri"/>
-                <w:b w:val="0"/>
-                <w:bCs w:val="0"/>
-                <w:i w:val="0"/>
-                <w:iCs w:val="0"/>
+            <w:shd w:fill="FFFFFF" w:val="clear"/>
+            <w:tcBorders>
+              <w:top w:val="single" w:sz="4" w:color="BFBFBF"/>
+              <w:left w:val="single" w:sz="4" w:color="BFBFBF"/>
+              <w:bottom w:val="single" w:sz="4" w:color="BFBFBF"/>
+              <w:right w:val="single" w:sz="4" w:color="BFBFBF"/>
+            </w:tcBorders>
+          </w:tcPr>
+          <w:p>
+            <w:pPr>
+              <w:spacing w:before="40" w:after="40"/>
+            </w:pPr>
+            <w:r/>
+            <w:r>
+              <w:rPr>
+                <w:rFonts w:ascii="Calibri" w:hAnsi="Calibri" w:eastAsia="Calibri"/>
+                <w:b w:val="0"/>
+                <w:i w:val="0"/>
                 <w:color w:val="333333"/>
                 <w:sz w:val="18"/>
-                <w:szCs w:val="18"/>
-                <w:rtl w:val="0"/>
-              </w:rPr>
-              <w:t xml:space="preserve">0</w:t>
-            </w:r>
-            <w:r>
-              <w:rPr>
-                <w:rtl w:val="0"/>
-              </w:rPr>
+              </w:rPr>
+              <w:t>In progress (supported by Pass results for core tools)</w:t>
             </w:r>
           </w:p>
         </w:tc>
@@ -11535,37 +11946,28 @@
         </w:tc>
         <w:tc>
           <w:tcPr>
-            <w:tcBorders>
-              <w:top w:color="bfbfbf" w:space="0" w:sz="4" w:val="single"/>
-              <w:left w:color="bfbfbf" w:space="0" w:sz="4" w:val="single"/>
-              <w:bottom w:color="bfbfbf" w:space="0" w:sz="4" w:val="single"/>
-              <w:right w:color="bfbfbf" w:space="0" w:sz="4" w:val="single"/>
-            </w:tcBorders>
-            <w:shd w:fill="ffffff" w:val="clear"/>
-          </w:tcPr>
-          <w:p>
-            <w:pPr>
-              <w:spacing w:after="40" w:before="40" w:lineRule="auto"/>
-              <w:rPr/>
-            </w:pPr>
-            <w:r>
-              <w:rPr>
-                <w:rFonts w:ascii="Calibri" w:cs="Calibri" w:eastAsia="Calibri" w:hAnsi="Calibri"/>
-                <w:b w:val="0"/>
-                <w:bCs w:val="0"/>
-                <w:i w:val="0"/>
-                <w:iCs w:val="0"/>
+            <w:shd w:fill="FFFFFF" w:val="clear"/>
+            <w:tcBorders>
+              <w:top w:val="single" w:sz="4" w:color="BFBFBF"/>
+              <w:left w:val="single" w:sz="4" w:color="BFBFBF"/>
+              <w:bottom w:val="single" w:sz="4" w:color="BFBFBF"/>
+              <w:right w:val="single" w:sz="4" w:color="BFBFBF"/>
+            </w:tcBorders>
+          </w:tcPr>
+          <w:p>
+            <w:pPr>
+              <w:spacing w:before="40" w:after="40"/>
+            </w:pPr>
+            <w:r/>
+            <w:r>
+              <w:rPr>
+                <w:rFonts w:ascii="Calibri" w:hAnsi="Calibri" w:eastAsia="Calibri"/>
+                <w:b w:val="0"/>
+                <w:i w:val="0"/>
                 <w:color w:val="333333"/>
                 <w:sz w:val="18"/>
-                <w:szCs w:val="18"/>
-                <w:rtl w:val="0"/>
-              </w:rPr>
-              <w:t xml:space="preserve">0</w:t>
-            </w:r>
-            <w:r>
-              <w:rPr>
-                <w:rtl w:val="0"/>
-              </w:rPr>
+              </w:rPr>
+              <w:t>2 (SUG-001 Shape state, SUG-002 smart alignment)</w:t>
             </w:r>
           </w:p>
         </w:tc>
@@ -11613,35 +12015,28 @@
         </w:tc>
         <w:tc>
           <w:tcPr>
-            <w:tcBorders>
-              <w:top w:color="bfbfbf" w:space="0" w:sz="4" w:val="single"/>
-              <w:left w:color="bfbfbf" w:space="0" w:sz="4" w:val="single"/>
-              <w:bottom w:color="bfbfbf" w:space="0" w:sz="4" w:val="single"/>
-              <w:right w:color="bfbfbf" w:space="0" w:sz="4" w:val="single"/>
-            </w:tcBorders>
-            <w:shd w:fill="ffffff" w:val="clear"/>
-          </w:tcPr>
-          <w:p>
-            <w:pPr>
-              <w:spacing w:after="40" w:before="40" w:lineRule="auto"/>
-              <w:rPr/>
-            </w:pPr>
-            <w:r>
-              <w:rPr>
-                <w:rFonts w:ascii="Calibri" w:cs="Calibri" w:eastAsia="Calibri" w:hAnsi="Calibri"/>
-                <w:b w:val="0"/>
-                <w:bCs w:val="0"/>
+            <w:shd w:fill="FFFFFF" w:val="clear"/>
+            <w:tcBorders>
+              <w:top w:val="single" w:sz="4" w:color="BFBFBF"/>
+              <w:left w:val="single" w:sz="4" w:color="BFBFBF"/>
+              <w:bottom w:val="single" w:sz="4" w:color="BFBFBF"/>
+              <w:right w:val="single" w:sz="4" w:color="BFBFBF"/>
+            </w:tcBorders>
+          </w:tcPr>
+          <w:p>
+            <w:pPr>
+              <w:spacing w:before="40" w:after="40"/>
+            </w:pPr>
+            <w:r/>
+            <w:r>
+              <w:rPr>
+                <w:rFonts w:ascii="Calibri" w:hAnsi="Calibri" w:eastAsia="Calibri"/>
+                <w:b w:val="0"/>
+                <w:i w:val="0"/>
                 <w:color w:val="333333"/>
                 <w:sz w:val="18"/>
-                <w:szCs w:val="18"/>
-                <w:rtl w:val="0"/>
-              </w:rPr>
-              <w:t xml:space="preserve">13 / 18</w:t>
-            </w:r>
-            <w:r>
-              <w:rPr>
-                <w:rtl w:val="0"/>
-              </w:rPr>
+              </w:rPr>
+              <w:t>13 / 18</w:t>
             </w:r>
           </w:p>
         </w:tc>
@@ -11689,35 +12084,28 @@
         </w:tc>
         <w:tc>
           <w:tcPr>
-            <w:tcBorders>
-              <w:top w:color="bfbfbf" w:space="0" w:sz="4" w:val="single"/>
-              <w:left w:color="bfbfbf" w:space="0" w:sz="4" w:val="single"/>
-              <w:bottom w:color="bfbfbf" w:space="0" w:sz="4" w:val="single"/>
-              <w:right w:color="bfbfbf" w:space="0" w:sz="4" w:val="single"/>
-            </w:tcBorders>
-            <w:shd w:fill="ffffff" w:val="clear"/>
-          </w:tcPr>
-          <w:p>
-            <w:pPr>
-              <w:spacing w:after="40" w:before="40" w:lineRule="auto"/>
-              <w:rPr/>
-            </w:pPr>
-            <w:r>
-              <w:rPr>
-                <w:rFonts w:ascii="Calibri" w:cs="Calibri" w:eastAsia="Calibri" w:hAnsi="Calibri"/>
-                <w:b w:val="0"/>
-                <w:bCs w:val="0"/>
+            <w:shd w:fill="FFFFFF" w:val="clear"/>
+            <w:tcBorders>
+              <w:top w:val="single" w:sz="4" w:color="BFBFBF"/>
+              <w:left w:val="single" w:sz="4" w:color="BFBFBF"/>
+              <w:bottom w:val="single" w:sz="4" w:color="BFBFBF"/>
+              <w:right w:val="single" w:sz="4" w:color="BFBFBF"/>
+            </w:tcBorders>
+          </w:tcPr>
+          <w:p>
+            <w:pPr>
+              <w:spacing w:before="40" w:after="40"/>
+            </w:pPr>
+            <w:r/>
+            <w:r>
+              <w:rPr>
+                <w:rFonts w:ascii="Calibri" w:hAnsi="Calibri" w:eastAsia="Calibri"/>
+                <w:b w:val="0"/>
+                <w:i w:val="0"/>
                 <w:color w:val="333333"/>
                 <w:sz w:val="18"/>
-                <w:szCs w:val="18"/>
-                <w:rtl w:val="0"/>
-              </w:rPr>
-              <w:t xml:space="preserve">Pass: 12 | Fail: 1 | Blocked: 0</w:t>
-            </w:r>
-            <w:r>
-              <w:rPr>
-                <w:rtl w:val="0"/>
-              </w:rPr>
+              </w:rPr>
+              <w:t>Pass: 13 | Fail: 0 | Blocked: 0</w:t>
             </w:r>
           </w:p>
         </w:tc>
@@ -11765,35 +12153,28 @@
         </w:tc>
         <w:tc>
           <w:tcPr>
-            <w:tcBorders>
-              <w:top w:color="bfbfbf" w:space="0" w:sz="4" w:val="single"/>
-              <w:left w:color="bfbfbf" w:space="0" w:sz="4" w:val="single"/>
-              <w:bottom w:color="bfbfbf" w:space="0" w:sz="4" w:val="single"/>
-              <w:right w:color="bfbfbf" w:space="0" w:sz="4" w:val="single"/>
-            </w:tcBorders>
-            <w:shd w:fill="ffffff" w:val="clear"/>
-          </w:tcPr>
-          <w:p>
-            <w:pPr>
-              <w:spacing w:after="40" w:before="40" w:lineRule="auto"/>
-              <w:rPr/>
-            </w:pPr>
-            <w:r>
-              <w:rPr>
-                <w:rFonts w:ascii="Calibri" w:cs="Calibri" w:eastAsia="Calibri" w:hAnsi="Calibri"/>
-                <w:b w:val="0"/>
-                <w:bCs w:val="0"/>
+            <w:shd w:fill="FFFFFF" w:val="clear"/>
+            <w:tcBorders>
+              <w:top w:val="single" w:sz="4" w:color="BFBFBF"/>
+              <w:left w:val="single" w:sz="4" w:color="BFBFBF"/>
+              <w:bottom w:val="single" w:sz="4" w:color="BFBFBF"/>
+              <w:right w:val="single" w:sz="4" w:color="BFBFBF"/>
+            </w:tcBorders>
+          </w:tcPr>
+          <w:p>
+            <w:pPr>
+              <w:spacing w:before="40" w:after="40"/>
+            </w:pPr>
+            <w:r/>
+            <w:r>
+              <w:rPr>
+                <w:rFonts w:ascii="Calibri" w:hAnsi="Calibri" w:eastAsia="Calibri"/>
+                <w:b w:val="0"/>
+                <w:i w:val="0"/>
                 <w:color w:val="333333"/>
                 <w:sz w:val="18"/>
-                <w:szCs w:val="18"/>
-                <w:rtl w:val="0"/>
-              </w:rPr>
-              <w:t xml:space="preserve">Testing in progress. Camera, primary tools, and secondary background tools passed. One High bug remains: Shape does not keep the cleared-background image.</w:t>
-            </w:r>
-            <w:r>
-              <w:rPr>
-                <w:rtl w:val="0"/>
-              </w:rPr>
+              </w:rPr>
+              <w:t>Core Background Remove flow and tools are working on OnePlus 9 5G (v2.7). Shape restore behavior matches a major competitor, so it is logged as an improvement (SUG-001), plus a new feature idea for Instagram-style smart alignment (SUG-002).</w:t>
             </w:r>
           </w:p>
         </w:tc>

</xml_diff>

<commit_message>
Add batch differentiator strengths and batch improvement suggestion
Document STR-001 batch advantage vs competitors, STR-002 clear UI icons,
and SUG-003 to match single-photo quality plus batch primary/secondary
edits for up to 20 images.

Co-authored-by: Showravkarmakar <Showrav88@users.noreply.github.com>
</commit_message>
<xml_diff>
--- a/SQA_Intern_Assignment_Test_Report.docx
+++ b/SQA_Intern_Assignment_Test_Report.docx
@@ -3208,28 +3208,6 @@
         </w:tc>
         <w:tc>
           <w:tcPr>
-            <w:tcBorders>
-              <w:top w:color="bfbfbf" w:space="0" w:sz="4" w:val="single"/>
-              <w:left w:color="bfbfbf" w:space="0" w:sz="4" w:val="single"/>
-              <w:bottom w:color="bfbfbf" w:space="0" w:sz="4" w:val="single"/>
-              <w:right w:color="bfbfbf" w:space="0" w:sz="4" w:val="single"/>
-            </w:tcBorders>
-            <w:shd w:fill="ffffff" w:val="clear"/>
-          </w:tcPr>
-          <w:p>
-            <w:pPr>
-              <w:spacing w:after="40" w:before="40" w:lineRule="auto"/>
-              <w:rPr/>
-            </w:pPr>
-            <w:r>
-              <w:rPr>
-                <w:rtl w:val="0"/>
-              </w:rPr>
-            </w:r>
-          </w:p>
-        </w:tc>
-        <w:tc>
-          <w:tcPr>
             <w:shd w:fill="FFFFFF" w:val="clear"/>
             <w:tcBorders>
               <w:top w:val="single" w:sz="4" w:color="BFBFBF"/>
@@ -3251,7 +3229,34 @@
                 <w:color w:val="333333"/>
                 <w:sz w:val="16"/>
               </w:rPr>
-              <w:t>SUG-001, SUG-002</w:t>
+              <w:t>STR-001</w:t>
+            </w:r>
+          </w:p>
+        </w:tc>
+        <w:tc>
+          <w:tcPr>
+            <w:shd w:fill="FFFFFF" w:val="clear"/>
+            <w:tcBorders>
+              <w:top w:val="single" w:sz="4" w:color="BFBFBF"/>
+              <w:left w:val="single" w:sz="4" w:color="BFBFBF"/>
+              <w:bottom w:val="single" w:sz="4" w:color="BFBFBF"/>
+              <w:right w:val="single" w:sz="4" w:color="BFBFBF"/>
+            </w:tcBorders>
+          </w:tcPr>
+          <w:p>
+            <w:pPr>
+              <w:spacing w:before="40" w:after="40"/>
+            </w:pPr>
+            <w:r/>
+            <w:r>
+              <w:rPr>
+                <w:rFonts w:ascii="Calibri" w:hAnsi="Calibri" w:eastAsia="Calibri"/>
+                <w:b w:val="0"/>
+                <w:i w:val="0"/>
+                <w:color w:val="333333"/>
+                <w:sz w:val="16"/>
+              </w:rPr>
+              <w:t>SUG-001, SUG-003</w:t>
             </w:r>
           </w:p>
         </w:tc>
@@ -3325,28 +3330,6 @@
         </w:tc>
         <w:tc>
           <w:tcPr>
-            <w:tcBorders>
-              <w:top w:color="bfbfbf" w:space="0" w:sz="4" w:val="single"/>
-              <w:left w:color="bfbfbf" w:space="0" w:sz="4" w:val="single"/>
-              <w:bottom w:color="bfbfbf" w:space="0" w:sz="4" w:val="single"/>
-              <w:right w:color="bfbfbf" w:space="0" w:sz="4" w:val="single"/>
-            </w:tcBorders>
-            <w:shd w:fill="f2f2f2" w:val="clear"/>
-          </w:tcPr>
-          <w:p>
-            <w:pPr>
-              <w:spacing w:after="40" w:before="40" w:lineRule="auto"/>
-              <w:rPr/>
-            </w:pPr>
-            <w:r>
-              <w:rPr>
-                <w:rtl w:val="0"/>
-              </w:rPr>
-            </w:r>
-          </w:p>
-        </w:tc>
-        <w:tc>
-          <w:tcPr>
             <w:shd w:fill="F2F2F2" w:val="clear"/>
             <w:tcBorders>
               <w:top w:val="single" w:sz="4" w:color="BFBFBF"/>
@@ -3368,7 +3351,33 @@
                 <w:color w:val="333333"/>
                 <w:sz w:val="16"/>
               </w:rPr>
-              <w:t>SUG-002</w:t>
+            </w:r>
+          </w:p>
+        </w:tc>
+        <w:tc>
+          <w:tcPr>
+            <w:shd w:fill="F2F2F2" w:val="clear"/>
+            <w:tcBorders>
+              <w:top w:val="single" w:sz="4" w:color="BFBFBF"/>
+              <w:left w:val="single" w:sz="4" w:color="BFBFBF"/>
+              <w:bottom w:val="single" w:sz="4" w:color="BFBFBF"/>
+              <w:right w:val="single" w:sz="4" w:color="BFBFBF"/>
+            </w:tcBorders>
+          </w:tcPr>
+          <w:p>
+            <w:pPr>
+              <w:spacing w:before="40" w:after="40"/>
+            </w:pPr>
+            <w:r/>
+            <w:r>
+              <w:rPr>
+                <w:rFonts w:ascii="Calibri" w:hAnsi="Calibri" w:eastAsia="Calibri"/>
+                <w:b w:val="0"/>
+                <w:i w:val="0"/>
+                <w:color w:val="333333"/>
+                <w:sz w:val="16"/>
+              </w:rPr>
+              <w:t>SUG-002, SUG-003</w:t>
             </w:r>
           </w:p>
         </w:tc>
@@ -3442,22 +3451,26 @@
         </w:tc>
         <w:tc>
           <w:tcPr>
-            <w:tcBorders>
-              <w:top w:color="bfbfbf" w:space="0" w:sz="4" w:val="single"/>
-              <w:left w:color="bfbfbf" w:space="0" w:sz="4" w:val="single"/>
-              <w:bottom w:color="bfbfbf" w:space="0" w:sz="4" w:val="single"/>
-              <w:right w:color="bfbfbf" w:space="0" w:sz="4" w:val="single"/>
-            </w:tcBorders>
-            <w:shd w:fill="ffffff" w:val="clear"/>
-          </w:tcPr>
-          <w:p>
-            <w:pPr>
-              <w:spacing w:after="40" w:before="40" w:lineRule="auto"/>
-              <w:rPr/>
-            </w:pPr>
-            <w:r>
-              <w:rPr>
-                <w:rtl w:val="0"/>
+            <w:shd w:fill="FFFFFF" w:val="clear"/>
+            <w:tcBorders>
+              <w:top w:val="single" w:sz="4" w:color="BFBFBF"/>
+              <w:left w:val="single" w:sz="4" w:color="BFBFBF"/>
+              <w:bottom w:val="single" w:sz="4" w:color="BFBFBF"/>
+              <w:right w:val="single" w:sz="4" w:color="BFBFBF"/>
+            </w:tcBorders>
+          </w:tcPr>
+          <w:p>
+            <w:pPr>
+              <w:spacing w:before="40" w:after="40"/>
+            </w:pPr>
+            <w:r/>
+            <w:r>
+              <w:rPr>
+                <w:rFonts w:ascii="Calibri" w:hAnsi="Calibri" w:eastAsia="Calibri"/>
+                <w:b w:val="0"/>
+                <w:i w:val="0"/>
+                <w:color w:val="333333"/>
+                <w:sz w:val="16"/>
               </w:rPr>
             </w:r>
           </w:p>
@@ -3559,28 +3572,6 @@
         </w:tc>
         <w:tc>
           <w:tcPr>
-            <w:tcBorders>
-              <w:top w:color="bfbfbf" w:space="0" w:sz="4" w:val="single"/>
-              <w:left w:color="bfbfbf" w:space="0" w:sz="4" w:val="single"/>
-              <w:bottom w:color="bfbfbf" w:space="0" w:sz="4" w:val="single"/>
-              <w:right w:color="bfbfbf" w:space="0" w:sz="4" w:val="single"/>
-            </w:tcBorders>
-            <w:shd w:fill="f2f2f2" w:val="clear"/>
-          </w:tcPr>
-          <w:p>
-            <w:pPr>
-              <w:spacing w:after="40" w:before="40" w:lineRule="auto"/>
-              <w:rPr/>
-            </w:pPr>
-            <w:r>
-              <w:rPr>
-                <w:rtl w:val="0"/>
-              </w:rPr>
-            </w:r>
-          </w:p>
-        </w:tc>
-        <w:tc>
-          <w:tcPr>
             <w:shd w:fill="F2F2F2" w:val="clear"/>
             <w:tcBorders>
               <w:top w:val="single" w:sz="4" w:color="BFBFBF"/>
@@ -3602,7 +3593,34 @@
                 <w:color w:val="333333"/>
                 <w:sz w:val="16"/>
               </w:rPr>
-              <w:t>SUG-001, SUG-002</w:t>
+              <w:t>STR-002</w:t>
+            </w:r>
+          </w:p>
+        </w:tc>
+        <w:tc>
+          <w:tcPr>
+            <w:shd w:fill="F2F2F2" w:val="clear"/>
+            <w:tcBorders>
+              <w:top w:val="single" w:sz="4" w:color="BFBFBF"/>
+              <w:left w:val="single" w:sz="4" w:color="BFBFBF"/>
+              <w:bottom w:val="single" w:sz="4" w:color="BFBFBF"/>
+              <w:right w:val="single" w:sz="4" w:color="BFBFBF"/>
+            </w:tcBorders>
+          </w:tcPr>
+          <w:p>
+            <w:pPr>
+              <w:spacing w:before="40" w:after="40"/>
+            </w:pPr>
+            <w:r/>
+            <w:r>
+              <w:rPr>
+                <w:rFonts w:ascii="Calibri" w:hAnsi="Calibri" w:eastAsia="Calibri"/>
+                <w:b w:val="0"/>
+                <w:i w:val="0"/>
+                <w:color w:val="333333"/>
+                <w:sz w:val="16"/>
+              </w:rPr>
+              <w:t>SUG-001, SUG-002, SUG-003</w:t>
             </w:r>
           </w:p>
         </w:tc>
@@ -3676,28 +3694,6 @@
         </w:tc>
         <w:tc>
           <w:tcPr>
-            <w:tcBorders>
-              <w:top w:color="bfbfbf" w:space="0" w:sz="4" w:val="single"/>
-              <w:left w:color="bfbfbf" w:space="0" w:sz="4" w:val="single"/>
-              <w:bottom w:color="bfbfbf" w:space="0" w:sz="4" w:val="single"/>
-              <w:right w:color="bfbfbf" w:space="0" w:sz="4" w:val="single"/>
-            </w:tcBorders>
-            <w:shd w:fill="ffffff" w:val="clear"/>
-          </w:tcPr>
-          <w:p>
-            <w:pPr>
-              <w:spacing w:after="40" w:before="40" w:lineRule="auto"/>
-              <w:rPr/>
-            </w:pPr>
-            <w:r>
-              <w:rPr>
-                <w:rtl w:val="0"/>
-              </w:rPr>
-            </w:r>
-          </w:p>
-        </w:tc>
-        <w:tc>
-          <w:tcPr>
             <w:shd w:fill="FFFFFF" w:val="clear"/>
             <w:tcBorders>
               <w:top w:val="single" w:sz="4" w:color="BFBFBF"/>
@@ -3719,6 +3715,34 @@
                 <w:color w:val="333333"/>
                 <w:sz w:val="16"/>
               </w:rPr>
+              <w:t>STR-001</w:t>
+            </w:r>
+          </w:p>
+        </w:tc>
+        <w:tc>
+          <w:tcPr>
+            <w:shd w:fill="FFFFFF" w:val="clear"/>
+            <w:tcBorders>
+              <w:top w:val="single" w:sz="4" w:color="BFBFBF"/>
+              <w:left w:val="single" w:sz="4" w:color="BFBFBF"/>
+              <w:bottom w:val="single" w:sz="4" w:color="BFBFBF"/>
+              <w:right w:val="single" w:sz="4" w:color="BFBFBF"/>
+            </w:tcBorders>
+          </w:tcPr>
+          <w:p>
+            <w:pPr>
+              <w:spacing w:before="40" w:after="40"/>
+            </w:pPr>
+            <w:r/>
+            <w:r>
+              <w:rPr>
+                <w:rFonts w:ascii="Calibri" w:hAnsi="Calibri" w:eastAsia="Calibri"/>
+                <w:b w:val="0"/>
+                <w:i w:val="0"/>
+                <w:color w:val="333333"/>
+                <w:sz w:val="16"/>
+              </w:rPr>
+              <w:t>SUG-003</w:t>
             </w:r>
           </w:p>
         </w:tc>
@@ -5243,57 +5267,7 @@
           <w:szCs w:val="22"/>
           <w:rtl w:val="0"/>
         </w:rPr>
-        <w:t>Core flow and tools are strong so far: clear Homepage entry, fast auto background remove, stable primary tools (Erase/Repair/Undo/Redo/close alert), and useful secondary editing (new background, color, gradient, and similar tools). These are supported by Pass results in Section 5. More strength write-ups can be added after Batch Remover testing.</w:t>
-      </w:r>
-      <w:r>
-        <w:rPr>
-          <w:rtl w:val="0"/>
-        </w:rPr>
-      </w:r>
-    </w:p>
-    <w:p>
-      <w:pPr>
-        <w:spacing w:after="120" w:before="280" w:lineRule="auto"/>
-        <w:rPr/>
-      </w:pPr>
-      <w:r>
-        <w:rPr>
-          <w:rFonts w:ascii="Calibri" w:cs="Calibri" w:eastAsia="Calibri" w:hAnsi="Calibri"/>
-          <w:b w:val="1"/>
-          <w:bCs w:val="1"/>
-          <w:i w:val="0"/>
-          <w:iCs w:val="0"/>
-          <w:color w:val="1f4e79"/>
-          <w:sz w:val="32"/>
-          <w:szCs w:val="32"/>
-          <w:rtl w:val="0"/>
-        </w:rPr>
-        <w:t xml:space="preserve">4. Suggestions / Improvements</w:t>
-      </w:r>
-      <w:r>
-        <w:rPr>
-          <w:rtl w:val="0"/>
-        </w:rPr>
-      </w:r>
-    </w:p>
-    <w:p>
-      <w:pPr>
-        <w:spacing w:after="120" w:lineRule="auto"/>
-        <w:rPr/>
-      </w:pPr>
-      <w:r>
-        <w:rPr>
-          <w:rFonts w:ascii="Calibri" w:cs="Calibri" w:eastAsia="Calibri" w:hAnsi="Calibri"/>
-          <w:b w:val="0"/>
-          <w:bCs w:val="0"/>
-          <w:i w:val="0"/>
-          <w:iCs w:val="0"/>
-          <w:color w:val="333333"/>
-          <w:sz w:val="22"/>
-          <w:szCs w:val="22"/>
-          <w:rtl w:val="0"/>
-        </w:rPr>
-        <w:t>Suggestions below are product improvements. They are not counted as defects.</w:t>
+        <w:t>Strengths below are based on product comparison and hands-on testing. Competitors are strong on single/portrait photos; this app’s clear advantage is Batch Remover.</w:t>
       </w:r>
       <w:r>
         <w:rPr>
@@ -5310,10 +5284,10 @@
           <w:rFonts w:ascii="Calibri" w:hAnsi="Calibri" w:eastAsia="Calibri"/>
           <w:b/>
           <w:i w:val="0"/>
-          <w:color w:val="2E75B6"/>
+          <w:color w:val="375E23"/>
           <w:sz w:val="26"/>
         </w:rPr>
-        <w:t>SUG-001: Keep cleared background when using Shape</w:t>
+        <w:t>STR-001: Batch Remover (up to 20 photos) is a clear product advantage</w:t>
       </w:r>
     </w:p>
     <w:tbl>
@@ -5387,7 +5361,7 @@
               <w:rPr>
                 <w:sz w:val="16"/>
               </w:rPr>
-              <w:t xml:space="preserve">Background Remove → Primary editor → Shape</w:t>
+              <w:t xml:space="preserve">Batch Remover (Homepage)</w:t>
             </w:r>
           </w:p>
         </w:tc>
@@ -5415,7 +5389,7 @@
               <w:rPr>
                 <w:sz w:val="16"/>
               </w:rPr>
-              <w:t xml:space="preserve">Usability, Functionality</w:t>
+              <w:t xml:space="preserve">Functionality, Performance, Overall Product Quality</w:t>
             </w:r>
           </w:p>
         </w:tc>
@@ -5430,7 +5404,7 @@
               <w:rPr>
                 <w:sz w:val="16"/>
               </w:rPr>
-              <w:t xml:space="preserve">Priority</w:t>
+              <w:t xml:space="preserve">Observed during</w:t>
             </w:r>
           </w:p>
         </w:tc>
@@ -5443,35 +5417,7 @@
               <w:rPr>
                 <w:sz w:val="16"/>
               </w:rPr>
-              <w:t xml:space="preserve">Medium</w:t>
-            </w:r>
-          </w:p>
-        </w:tc>
-      </w:tr>
-      <w:tr>
-        <w:tc>
-          <w:tcPr>
-            <w:shd w:val="clear" w:fill="F2F2F2"/>
-          </w:tcPr>
-          <w:p>
-            <w:r>
-              <w:rPr>
-                <w:sz w:val="16"/>
-              </w:rPr>
-              <w:t xml:space="preserve">Current behavior</w:t>
-            </w:r>
-          </w:p>
-        </w:tc>
-        <w:tc>
-          <w:tcPr>
-            <w:shd w:val="clear" w:fill="F2F2F2"/>
-          </w:tcPr>
-          <w:p>
-            <w:r>
-              <w:rPr>
-                <w:sz w:val="16"/>
-              </w:rPr>
-              <w:t xml:space="preserve">Shape applies on the original photo, so the old background returns after a successful auto remove.</w:t>
+              <w:t xml:space="preserve">Homepage claim “Process up to 20 images at once” + product comparison vs competitor apps</w:t>
             </w:r>
           </w:p>
         </w:tc>
@@ -5489,7 +5435,7 @@
           <w:color w:val="333333"/>
           <w:sz w:val="20"/>
         </w:rPr>
-        <w:t xml:space="preserve">Proposed improvement: </w:t>
+        <w:t xml:space="preserve">Details: </w:t>
       </w:r>
       <w:r>
         <w:rPr>
@@ -5499,12 +5445,12 @@
           <w:color w:val="333333"/>
           <w:sz w:val="20"/>
         </w:rPr>
-        <w:t>Make Shape use the current cleared image. If Shape must use the original photo, show a clear message before applying (for example: “Shape uses the original photo and will restore the background”).</w:t>
+        <w:t>Compared with popular competitor apps that mainly focus on single-photo / portrait background removal, Auto Background Remover offers Batch mode where a user can upload up to 20 photos and process them in one run. This is a strong differentiator for people who need many images quickly (sellers, social media, bulk editing).</w:t>
       </w:r>
     </w:p>
     <w:p>
       <w:pPr>
-        <w:spacing w:after="80"/>
+        <w:spacing w:after="160"/>
       </w:pPr>
       <w:r>
         <w:rPr>
@@ -5514,7 +5460,7 @@
           <w:color w:val="333333"/>
           <w:sz w:val="20"/>
         </w:rPr>
-        <w:t xml:space="preserve">Why this helps: </w:t>
+        <w:t xml:space="preserve">Why it matters: </w:t>
       </w:r>
       <w:r>
         <w:rPr>
@@ -5524,22 +5470,7 @@
           <w:color w:val="333333"/>
           <w:sz w:val="20"/>
         </w:rPr>
-        <w:t>Users already finished background removal. Restoring the old background feels like lost work. A competitor app with similar UI shows the same Shape behavior, so this is an improvement opportunity, not a unique bug.</w:t>
-      </w:r>
-    </w:p>
-    <w:p>
-      <w:pPr>
-        <w:spacing w:after="160"/>
-      </w:pPr>
-      <w:r>
-        <w:rPr>
-          <w:rFonts w:ascii="Calibri" w:hAnsi="Calibri" w:eastAsia="Calibri"/>
-          <w:b w:val="0"/>
-          <w:i/>
-          <w:color w:val="666666"/>
-          <w:sz w:val="18"/>
-        </w:rPr>
-        <w:t>Evidence: screenshots kept under Section 2 (reclassified item).</w:t>
+        <w:t>Batch support is a real market gap. Even if single-photo tools are common, doing many images in one flow saves time and makes this app more useful for productivity.</w:t>
       </w:r>
     </w:p>
     <w:p>
@@ -5551,10 +5482,10 @@
           <w:rFonts w:ascii="Calibri" w:hAnsi="Calibri" w:eastAsia="Calibri"/>
           <w:b/>
           <w:i w:val="0"/>
-          <w:color w:val="2E75B6"/>
+          <w:color w:val="375E23"/>
           <w:sz w:val="26"/>
         </w:rPr>
-        <w:t>SUG-002: Smart image alignment while moving the subject (Instagram Stories style)</w:t>
+        <w:t>STR-002: UI icons are clear and easy to understand</w:t>
       </w:r>
     </w:p>
     <w:tbl>
@@ -5628,7 +5559,7 @@
               <w:rPr>
                 <w:sz w:val="16"/>
               </w:rPr>
-              <w:t xml:space="preserve">Primary / secondary editor — Move tool</w:t>
+              <w:t xml:space="preserve">Primary and secondary editor toolbars</w:t>
             </w:r>
           </w:p>
         </w:tc>
@@ -5656,7 +5587,7 @@
               <w:rPr>
                 <w:sz w:val="16"/>
               </w:rPr>
-              <w:t xml:space="preserve">Usability, Workflow</w:t>
+              <w:t xml:space="preserve">Usability</w:t>
             </w:r>
           </w:p>
         </w:tc>
@@ -5671,7 +5602,7 @@
               <w:rPr>
                 <w:sz w:val="16"/>
               </w:rPr>
-              <w:t xml:space="preserve">Priority</w:t>
+              <w:t xml:space="preserve">Observed during</w:t>
             </w:r>
           </w:p>
         </w:tc>
@@ -5684,35 +5615,7 @@
               <w:rPr>
                 <w:sz w:val="16"/>
               </w:rPr>
-              <w:t xml:space="preserve">Medium</w:t>
-            </w:r>
-          </w:p>
-        </w:tc>
-      </w:tr>
-      <w:tr>
-        <w:tc>
-          <w:tcPr>
-            <w:shd w:val="clear" w:fill="F2F2F2"/>
-          </w:tcPr>
-          <w:p>
-            <w:r>
-              <w:rPr>
-                <w:sz w:val="16"/>
-              </w:rPr>
-              <w:t xml:space="preserve">Current behavior</w:t>
-            </w:r>
-          </w:p>
-        </w:tc>
-        <w:tc>
-          <w:tcPr>
-            <w:shd w:val="clear" w:fill="F2F2F2"/>
-          </w:tcPr>
-          <w:p>
-            <w:r>
-              <w:rPr>
-                <w:sz w:val="16"/>
-              </w:rPr>
-              <w:t xml:space="preserve">User can move the image, but there is no clear snap/guide for center, top, or bottom alignment.</w:t>
+              <w:t xml:space="preserve">Background Remove primary tools and secondary tools (Background, Blur, Text, Sticker, etc.)</w:t>
             </w:r>
           </w:p>
         </w:tc>
@@ -5730,7 +5633,7 @@
           <w:color w:val="333333"/>
           <w:sz w:val="20"/>
         </w:rPr>
-        <w:t xml:space="preserve">Proposed improvement: </w:t>
+        <w:t xml:space="preserve">Details: </w:t>
       </w:r>
       <w:r>
         <w:rPr>
@@ -5740,7 +5643,7 @@
           <w:color w:val="333333"/>
           <w:sz w:val="20"/>
         </w:rPr>
-        <w:t>While moving the subject, auto-detect and snap to useful positions (center, top, bottom), similar to Instagram Stories. Show light guide lines when the image is near those positions.</w:t>
+        <w:t>Toolbar icons and labels are easy to relate to their actions. Users can understand Move, Erase, Repair, Background, Blur, Text, Sticker, and similar tools without confusion.</w:t>
       </w:r>
     </w:p>
     <w:p>
@@ -5755,7 +5658,7 @@
           <w:color w:val="333333"/>
           <w:sz w:val="20"/>
         </w:rPr>
-        <w:t xml:space="preserve">Why this helps: </w:t>
+        <w:t xml:space="preserve">Why it matters: </w:t>
       </w:r>
       <w:r>
         <w:rPr>
@@ -5765,7 +5668,750 @@
           <w:color w:val="333333"/>
           <w:sz w:val="20"/>
         </w:rPr>
+        <w:t>Clear icons reduce learning time and make the editing flow feel simple for new users. This supports good usability on first use.</w:t>
+      </w:r>
+    </w:p>
+    <w:p>
+      <w:pPr>
+        <w:spacing w:after="120" w:before="280" w:lineRule="auto"/>
+        <w:rPr/>
+      </w:pPr>
+      <w:r>
+        <w:rPr>
+          <w:rFonts w:ascii="Calibri" w:cs="Calibri" w:eastAsia="Calibri" w:hAnsi="Calibri"/>
+          <w:b w:val="1"/>
+          <w:bCs w:val="1"/>
+          <w:i w:val="0"/>
+          <w:iCs w:val="0"/>
+          <w:color w:val="1f4e79"/>
+          <w:sz w:val="32"/>
+          <w:szCs w:val="32"/>
+          <w:rtl w:val="0"/>
+        </w:rPr>
+        <w:t xml:space="preserve">4. Suggestions / Improvements</w:t>
+      </w:r>
+      <w:r>
+        <w:rPr>
+          <w:rtl w:val="0"/>
+        </w:rPr>
+      </w:r>
+    </w:p>
+    <w:p>
+      <w:pPr>
+        <w:spacing w:after="120" w:lineRule="auto"/>
+        <w:rPr/>
+      </w:pPr>
+      <w:r>
+        <w:rPr>
+          <w:rFonts w:ascii="Calibri" w:cs="Calibri" w:eastAsia="Calibri" w:hAnsi="Calibri"/>
+          <w:b w:val="0"/>
+          <w:bCs w:val="0"/>
+          <w:i w:val="0"/>
+          <w:iCs w:val="0"/>
+          <w:color w:val="333333"/>
+          <w:sz w:val="22"/>
+          <w:szCs w:val="22"/>
+          <w:rtl w:val="0"/>
+        </w:rPr>
+        <w:t>Suggestions below are product improvements. They are not counted as defects.</w:t>
+      </w:r>
+      <w:r>
+        <w:rPr>
+          <w:rtl w:val="0"/>
+        </w:rPr>
+      </w:r>
+    </w:p>
+    <w:p>
+      <w:pPr>
+        <w:spacing w:before="240" w:after="120"/>
+      </w:pPr>
+      <w:r>
+        <w:rPr>
+          <w:rFonts w:ascii="Calibri" w:hAnsi="Calibri" w:eastAsia="Calibri"/>
+          <w:b/>
+          <w:i w:val="0"/>
+          <w:color w:val="2E75B6"/>
+          <w:sz w:val="26"/>
+        </w:rPr>
+        <w:t>SUG-001: Keep cleared background when using Shape</w:t>
+      </w:r>
+    </w:p>
+    <w:tbl>
+      <w:tblPr>
+        <w:tblW w:w="5000" w:type="pct"/>
+        <w:tblBorders>
+          <w:top w:val="single" w:sz="4" w:color="BFBFBF"/>
+          <w:left w:val="single" w:sz="4" w:color="BFBFBF"/>
+          <w:bottom w:val="single" w:sz="4" w:color="BFBFBF"/>
+          <w:right w:val="single" w:sz="4" w:color="BFBFBF"/>
+          <w:insideH w:val="single" w:sz="4" w:color="BFBFBF"/>
+          <w:insideV w:val="single" w:sz="4" w:color="BFBFBF"/>
+        </w:tblBorders>
+      </w:tblPr>
+      <w:tblGrid>
+        <w:gridCol w:w="2500"/>
+        <w:gridCol w:w="2500"/>
+      </w:tblGrid>
+      <w:tr>
+        <w:tc>
+          <w:tcPr>
+            <w:shd w:val="clear" w:fill="1F4E79"/>
+          </w:tcPr>
+          <w:p>
+            <w:r>
+              <w:rPr>
+                <w:b/>
+                <w:color w:val="FFFFFF"/>
+                <w:sz w:val="16"/>
+              </w:rPr>
+              <w:t xml:space="preserve">Field</w:t>
+            </w:r>
+          </w:p>
+        </w:tc>
+        <w:tc>
+          <w:tcPr>
+            <w:shd w:val="clear" w:fill="1F4E79"/>
+          </w:tcPr>
+          <w:p>
+            <w:r>
+              <w:rPr>
+                <w:b/>
+                <w:color w:val="FFFFFF"/>
+                <w:sz w:val="16"/>
+              </w:rPr>
+              <w:t xml:space="preserve">Detail</w:t>
+            </w:r>
+          </w:p>
+        </w:tc>
+      </w:tr>
+      <w:tr>
+        <w:tc>
+          <w:tcPr>
+            <w:shd w:val="clear" w:fill="FFFFFF"/>
+          </w:tcPr>
+          <w:p>
+            <w:r>
+              <w:rPr>
+                <w:sz w:val="16"/>
+              </w:rPr>
+              <w:t xml:space="preserve">Module / Area</w:t>
+            </w:r>
+          </w:p>
+        </w:tc>
+        <w:tc>
+          <w:tcPr>
+            <w:shd w:val="clear" w:fill="FFFFFF"/>
+          </w:tcPr>
+          <w:p>
+            <w:r>
+              <w:rPr>
+                <w:sz w:val="16"/>
+              </w:rPr>
+              <w:t xml:space="preserve">Background Remove → Primary editor → Shape</w:t>
+            </w:r>
+          </w:p>
+        </w:tc>
+      </w:tr>
+      <w:tr>
+        <w:tc>
+          <w:tcPr>
+            <w:shd w:val="clear" w:fill="F2F2F2"/>
+          </w:tcPr>
+          <w:p>
+            <w:r>
+              <w:rPr>
+                <w:sz w:val="16"/>
+              </w:rPr>
+              <w:t xml:space="preserve">Quality Area</w:t>
+            </w:r>
+          </w:p>
+        </w:tc>
+        <w:tc>
+          <w:tcPr>
+            <w:shd w:val="clear" w:fill="F2F2F2"/>
+          </w:tcPr>
+          <w:p>
+            <w:r>
+              <w:rPr>
+                <w:sz w:val="16"/>
+              </w:rPr>
+              <w:t xml:space="preserve">Usability, Functionality</w:t>
+            </w:r>
+          </w:p>
+        </w:tc>
+      </w:tr>
+      <w:tr>
+        <w:tc>
+          <w:tcPr>
+            <w:shd w:val="clear" w:fill="FFFFFF"/>
+          </w:tcPr>
+          <w:p>
+            <w:r>
+              <w:rPr>
+                <w:sz w:val="16"/>
+              </w:rPr>
+              <w:t xml:space="preserve">Priority</w:t>
+            </w:r>
+          </w:p>
+        </w:tc>
+        <w:tc>
+          <w:tcPr>
+            <w:shd w:val="clear" w:fill="FFFFFF"/>
+          </w:tcPr>
+          <w:p>
+            <w:r>
+              <w:rPr>
+                <w:sz w:val="16"/>
+              </w:rPr>
+              <w:t xml:space="preserve">Medium</w:t>
+            </w:r>
+          </w:p>
+        </w:tc>
+      </w:tr>
+      <w:tr>
+        <w:tc>
+          <w:tcPr>
+            <w:shd w:val="clear" w:fill="F2F2F2"/>
+          </w:tcPr>
+          <w:p>
+            <w:r>
+              <w:rPr>
+                <w:sz w:val="16"/>
+              </w:rPr>
+              <w:t xml:space="preserve">Current behavior</w:t>
+            </w:r>
+          </w:p>
+        </w:tc>
+        <w:tc>
+          <w:tcPr>
+            <w:shd w:val="clear" w:fill="F2F2F2"/>
+          </w:tcPr>
+          <w:p>
+            <w:r>
+              <w:rPr>
+                <w:sz w:val="16"/>
+              </w:rPr>
+              <w:t xml:space="preserve">Shape applies on the original photo, so the old background returns after a successful auto remove.</w:t>
+            </w:r>
+          </w:p>
+        </w:tc>
+      </w:tr>
+    </w:tbl>
+    <w:p>
+      <w:pPr>
+        <w:spacing w:after="80"/>
+      </w:pPr>
+      <w:r>
+        <w:rPr>
+          <w:rFonts w:ascii="Calibri" w:hAnsi="Calibri" w:eastAsia="Calibri"/>
+          <w:b/>
+          <w:i w:val="0"/>
+          <w:color w:val="333333"/>
+          <w:sz w:val="20"/>
+        </w:rPr>
+        <w:t xml:space="preserve">Proposed improvement: </w:t>
+      </w:r>
+      <w:r>
+        <w:rPr>
+          <w:rFonts w:ascii="Calibri" w:hAnsi="Calibri" w:eastAsia="Calibri"/>
+          <w:b w:val="0"/>
+          <w:i w:val="0"/>
+          <w:color w:val="333333"/>
+          <w:sz w:val="20"/>
+        </w:rPr>
+        <w:t>Make Shape use the current cleared image. If Shape must use the original photo, show a clear message before applying (for example: “Shape uses the original photo and will restore the background”).</w:t>
+      </w:r>
+    </w:p>
+    <w:p>
+      <w:pPr>
+        <w:spacing w:after="80"/>
+      </w:pPr>
+      <w:r>
+        <w:rPr>
+          <w:rFonts w:ascii="Calibri" w:hAnsi="Calibri" w:eastAsia="Calibri"/>
+          <w:b/>
+          <w:i w:val="0"/>
+          <w:color w:val="333333"/>
+          <w:sz w:val="20"/>
+        </w:rPr>
+        <w:t xml:space="preserve">Why this helps: </w:t>
+      </w:r>
+      <w:r>
+        <w:rPr>
+          <w:rFonts w:ascii="Calibri" w:hAnsi="Calibri" w:eastAsia="Calibri"/>
+          <w:b w:val="0"/>
+          <w:i w:val="0"/>
+          <w:color w:val="333333"/>
+          <w:sz w:val="20"/>
+        </w:rPr>
+        <w:t>Users already finished background removal. Restoring the old background feels like lost work. A competitor app with similar UI shows the same Shape behavior, so this is an improvement opportunity, not a unique bug.</w:t>
+      </w:r>
+    </w:p>
+    <w:p>
+      <w:pPr>
+        <w:spacing w:after="160"/>
+      </w:pPr>
+      <w:r>
+        <w:rPr>
+          <w:rFonts w:ascii="Calibri" w:hAnsi="Calibri" w:eastAsia="Calibri"/>
+          <w:b w:val="0"/>
+          <w:i/>
+          <w:color w:val="666666"/>
+          <w:sz w:val="18"/>
+        </w:rPr>
+        <w:t>Evidence: screenshots kept under Section 2 (reclassified item).</w:t>
+      </w:r>
+    </w:p>
+    <w:p>
+      <w:pPr>
+        <w:spacing w:before="240" w:after="120"/>
+      </w:pPr>
+      <w:r>
+        <w:rPr>
+          <w:rFonts w:ascii="Calibri" w:hAnsi="Calibri" w:eastAsia="Calibri"/>
+          <w:b/>
+          <w:i w:val="0"/>
+          <w:color w:val="2E75B6"/>
+          <w:sz w:val="26"/>
+        </w:rPr>
+        <w:t>SUG-002: Smart image alignment while moving the subject (Instagram Stories style)</w:t>
+      </w:r>
+    </w:p>
+    <w:tbl>
+      <w:tblPr>
+        <w:tblW w:w="5000" w:type="pct"/>
+        <w:tblBorders>
+          <w:top w:val="single" w:sz="4" w:color="BFBFBF"/>
+          <w:left w:val="single" w:sz="4" w:color="BFBFBF"/>
+          <w:bottom w:val="single" w:sz="4" w:color="BFBFBF"/>
+          <w:right w:val="single" w:sz="4" w:color="BFBFBF"/>
+          <w:insideH w:val="single" w:sz="4" w:color="BFBFBF"/>
+          <w:insideV w:val="single" w:sz="4" w:color="BFBFBF"/>
+        </w:tblBorders>
+      </w:tblPr>
+      <w:tblGrid>
+        <w:gridCol w:w="2500"/>
+        <w:gridCol w:w="2500"/>
+      </w:tblGrid>
+      <w:tr>
+        <w:tc>
+          <w:tcPr>
+            <w:shd w:val="clear" w:fill="1F4E79"/>
+          </w:tcPr>
+          <w:p>
+            <w:r>
+              <w:rPr>
+                <w:b/>
+                <w:color w:val="FFFFFF"/>
+                <w:sz w:val="16"/>
+              </w:rPr>
+              <w:t xml:space="preserve">Field</w:t>
+            </w:r>
+          </w:p>
+        </w:tc>
+        <w:tc>
+          <w:tcPr>
+            <w:shd w:val="clear" w:fill="1F4E79"/>
+          </w:tcPr>
+          <w:p>
+            <w:r>
+              <w:rPr>
+                <w:b/>
+                <w:color w:val="FFFFFF"/>
+                <w:sz w:val="16"/>
+              </w:rPr>
+              <w:t xml:space="preserve">Detail</w:t>
+            </w:r>
+          </w:p>
+        </w:tc>
+      </w:tr>
+      <w:tr>
+        <w:tc>
+          <w:tcPr>
+            <w:shd w:val="clear" w:fill="FFFFFF"/>
+          </w:tcPr>
+          <w:p>
+            <w:r>
+              <w:rPr>
+                <w:sz w:val="16"/>
+              </w:rPr>
+              <w:t xml:space="preserve">Module / Area</w:t>
+            </w:r>
+          </w:p>
+        </w:tc>
+        <w:tc>
+          <w:tcPr>
+            <w:shd w:val="clear" w:fill="FFFFFF"/>
+          </w:tcPr>
+          <w:p>
+            <w:r>
+              <w:rPr>
+                <w:sz w:val="16"/>
+              </w:rPr>
+              <w:t xml:space="preserve">Primary / secondary editor — Move tool</w:t>
+            </w:r>
+          </w:p>
+        </w:tc>
+      </w:tr>
+      <w:tr>
+        <w:tc>
+          <w:tcPr>
+            <w:shd w:val="clear" w:fill="F2F2F2"/>
+          </w:tcPr>
+          <w:p>
+            <w:r>
+              <w:rPr>
+                <w:sz w:val="16"/>
+              </w:rPr>
+              <w:t xml:space="preserve">Quality Area</w:t>
+            </w:r>
+          </w:p>
+        </w:tc>
+        <w:tc>
+          <w:tcPr>
+            <w:shd w:val="clear" w:fill="F2F2F2"/>
+          </w:tcPr>
+          <w:p>
+            <w:r>
+              <w:rPr>
+                <w:sz w:val="16"/>
+              </w:rPr>
+              <w:t xml:space="preserve">Usability, Workflow</w:t>
+            </w:r>
+          </w:p>
+        </w:tc>
+      </w:tr>
+      <w:tr>
+        <w:tc>
+          <w:tcPr>
+            <w:shd w:val="clear" w:fill="FFFFFF"/>
+          </w:tcPr>
+          <w:p>
+            <w:r>
+              <w:rPr>
+                <w:sz w:val="16"/>
+              </w:rPr>
+              <w:t xml:space="preserve">Priority</w:t>
+            </w:r>
+          </w:p>
+        </w:tc>
+        <w:tc>
+          <w:tcPr>
+            <w:shd w:val="clear" w:fill="FFFFFF"/>
+          </w:tcPr>
+          <w:p>
+            <w:r>
+              <w:rPr>
+                <w:sz w:val="16"/>
+              </w:rPr>
+              <w:t xml:space="preserve">Medium</w:t>
+            </w:r>
+          </w:p>
+        </w:tc>
+      </w:tr>
+      <w:tr>
+        <w:tc>
+          <w:tcPr>
+            <w:shd w:val="clear" w:fill="F2F2F2"/>
+          </w:tcPr>
+          <w:p>
+            <w:r>
+              <w:rPr>
+                <w:sz w:val="16"/>
+              </w:rPr>
+              <w:t xml:space="preserve">Current behavior</w:t>
+            </w:r>
+          </w:p>
+        </w:tc>
+        <w:tc>
+          <w:tcPr>
+            <w:shd w:val="clear" w:fill="F2F2F2"/>
+          </w:tcPr>
+          <w:p>
+            <w:r>
+              <w:rPr>
+                <w:sz w:val="16"/>
+              </w:rPr>
+              <w:t xml:space="preserve">User can move the image, but there is no clear snap/guide for center, top, or bottom alignment.</w:t>
+            </w:r>
+          </w:p>
+        </w:tc>
+      </w:tr>
+    </w:tbl>
+    <w:p>
+      <w:pPr>
+        <w:spacing w:after="80"/>
+      </w:pPr>
+      <w:r>
+        <w:rPr>
+          <w:rFonts w:ascii="Calibri" w:hAnsi="Calibri" w:eastAsia="Calibri"/>
+          <w:b/>
+          <w:i w:val="0"/>
+          <w:color w:val="333333"/>
+          <w:sz w:val="20"/>
+        </w:rPr>
+        <w:t xml:space="preserve">Proposed improvement: </w:t>
+      </w:r>
+      <w:r>
+        <w:rPr>
+          <w:rFonts w:ascii="Calibri" w:hAnsi="Calibri" w:eastAsia="Calibri"/>
+          <w:b w:val="0"/>
+          <w:i w:val="0"/>
+          <w:color w:val="333333"/>
+          <w:sz w:val="20"/>
+        </w:rPr>
+        <w:t>While moving the subject, auto-detect and snap to useful positions (center, top, bottom), similar to Instagram Stories. Show light guide lines when the image is near those positions.</w:t>
+      </w:r>
+    </w:p>
+    <w:p>
+      <w:pPr>
+        <w:spacing w:after="160"/>
+      </w:pPr>
+      <w:r>
+        <w:rPr>
+          <w:rFonts w:ascii="Calibri" w:hAnsi="Calibri" w:eastAsia="Calibri"/>
+          <w:b/>
+          <w:i w:val="0"/>
+          <w:color w:val="333333"/>
+          <w:sz w:val="20"/>
+        </w:rPr>
+        <w:t xml:space="preserve">Why this helps: </w:t>
+      </w:r>
+      <w:r>
+        <w:rPr>
+          <w:rFonts w:ascii="Calibri" w:hAnsi="Calibri" w:eastAsia="Calibri"/>
+          <w:b w:val="0"/>
+          <w:i w:val="0"/>
+          <w:color w:val="333333"/>
+          <w:sz w:val="20"/>
+        </w:rPr>
         <w:t>Faster, cleaner framing for social posts. This adds clear product value beyond matching competitor tool layout.</w:t>
+      </w:r>
+    </w:p>
+    <w:p>
+      <w:pPr>
+        <w:spacing w:before="240" w:after="120"/>
+      </w:pPr>
+      <w:r>
+        <w:rPr>
+          <w:rFonts w:ascii="Calibri" w:hAnsi="Calibri" w:eastAsia="Calibri"/>
+          <w:b/>
+          <w:i w:val="0"/>
+          <w:color w:val="2E75B6"/>
+          <w:sz w:val="26"/>
+        </w:rPr>
+        <w:t>SUG-003: Make Batch mode as strong as single-photo editing (quality + full edit tools)</w:t>
+      </w:r>
+    </w:p>
+    <w:tbl>
+      <w:tblPr>
+        <w:tblW w:w="5000" w:type="pct"/>
+        <w:tblBorders>
+          <w:top w:val="single" w:sz="4" w:color="BFBFBF"/>
+          <w:left w:val="single" w:sz="4" w:color="BFBFBF"/>
+          <w:bottom w:val="single" w:sz="4" w:color="BFBFBF"/>
+          <w:right w:val="single" w:sz="4" w:color="BFBFBF"/>
+          <w:insideH w:val="single" w:sz="4" w:color="BFBFBF"/>
+          <w:insideV w:val="single" w:sz="4" w:color="BFBFBF"/>
+        </w:tblBorders>
+      </w:tblPr>
+      <w:tblGrid>
+        <w:gridCol w:w="2500"/>
+        <w:gridCol w:w="2500"/>
+      </w:tblGrid>
+      <w:tr>
+        <w:tc>
+          <w:tcPr>
+            <w:shd w:val="clear" w:fill="1F4E79"/>
+          </w:tcPr>
+          <w:p>
+            <w:r>
+              <w:rPr>
+                <w:b/>
+                <w:color w:val="FFFFFF"/>
+                <w:sz w:val="16"/>
+              </w:rPr>
+              <w:t xml:space="preserve">Field</w:t>
+            </w:r>
+          </w:p>
+        </w:tc>
+        <w:tc>
+          <w:tcPr>
+            <w:shd w:val="clear" w:fill="1F4E79"/>
+          </w:tcPr>
+          <w:p>
+            <w:r>
+              <w:rPr>
+                <w:b/>
+                <w:color w:val="FFFFFF"/>
+                <w:sz w:val="16"/>
+              </w:rPr>
+              <w:t xml:space="preserve">Detail</w:t>
+            </w:r>
+          </w:p>
+        </w:tc>
+      </w:tr>
+      <w:tr>
+        <w:tc>
+          <w:tcPr>
+            <w:shd w:val="clear" w:fill="FFFFFF"/>
+          </w:tcPr>
+          <w:p>
+            <w:r>
+              <w:rPr>
+                <w:sz w:val="16"/>
+              </w:rPr>
+              <w:t xml:space="preserve">Module / Area</w:t>
+            </w:r>
+          </w:p>
+        </w:tc>
+        <w:tc>
+          <w:tcPr>
+            <w:shd w:val="clear" w:fill="FFFFFF"/>
+          </w:tcPr>
+          <w:p>
+            <w:r>
+              <w:rPr>
+                <w:sz w:val="16"/>
+              </w:rPr>
+              <w:t xml:space="preserve">Batch Remover</w:t>
+            </w:r>
+          </w:p>
+        </w:tc>
+      </w:tr>
+      <w:tr>
+        <w:tc>
+          <w:tcPr>
+            <w:shd w:val="clear" w:fill="F2F2F2"/>
+          </w:tcPr>
+          <w:p>
+            <w:r>
+              <w:rPr>
+                <w:sz w:val="16"/>
+              </w:rPr>
+              <w:t xml:space="preserve">Quality Area</w:t>
+            </w:r>
+          </w:p>
+        </w:tc>
+        <w:tc>
+          <w:tcPr>
+            <w:shd w:val="clear" w:fill="F2F2F2"/>
+          </w:tcPr>
+          <w:p>
+            <w:r>
+              <w:rPr>
+                <w:sz w:val="16"/>
+              </w:rPr>
+              <w:t xml:space="preserve">Functionality, Performance, Usability</w:t>
+            </w:r>
+          </w:p>
+        </w:tc>
+      </w:tr>
+      <w:tr>
+        <w:tc>
+          <w:tcPr>
+            <w:shd w:val="clear" w:fill="FFFFFF"/>
+          </w:tcPr>
+          <w:p>
+            <w:r>
+              <w:rPr>
+                <w:sz w:val="16"/>
+              </w:rPr>
+              <w:t xml:space="preserve">Priority</w:t>
+            </w:r>
+          </w:p>
+        </w:tc>
+        <w:tc>
+          <w:tcPr>
+            <w:shd w:val="clear" w:fill="FFFFFF"/>
+          </w:tcPr>
+          <w:p>
+            <w:r>
+              <w:rPr>
+                <w:sz w:val="16"/>
+              </w:rPr>
+              <w:t xml:space="preserve">High</w:t>
+            </w:r>
+          </w:p>
+        </w:tc>
+      </w:tr>
+      <w:tr>
+        <w:tc>
+          <w:tcPr>
+            <w:shd w:val="clear" w:fill="F2F2F2"/>
+          </w:tcPr>
+          <w:p>
+            <w:r>
+              <w:rPr>
+                <w:sz w:val="16"/>
+              </w:rPr>
+              <w:t xml:space="preserve">Current behavior</w:t>
+            </w:r>
+          </w:p>
+        </w:tc>
+        <w:tc>
+          <w:tcPr>
+            <w:shd w:val="clear" w:fill="F2F2F2"/>
+          </w:tcPr>
+          <w:p>
+            <w:r>
+              <w:rPr>
+                <w:sz w:val="16"/>
+              </w:rPr>
+              <w:t xml:space="preserve">Batch can process multiple images (up to 20), but background-remove quality/output is not always equal to single-photo mode. Full primary/secondary edits are not available across the whole batch in one run.</w:t>
+            </w:r>
+          </w:p>
+        </w:tc>
+      </w:tr>
+    </w:tbl>
+    <w:p>
+      <w:pPr>
+        <w:spacing w:after="80"/>
+      </w:pPr>
+      <w:r>
+        <w:rPr>
+          <w:rFonts w:ascii="Calibri" w:hAnsi="Calibri" w:eastAsia="Calibri"/>
+          <w:b/>
+          <w:i w:val="0"/>
+          <w:color w:val="333333"/>
+          <w:sz w:val="20"/>
+        </w:rPr>
+        <w:t xml:space="preserve">Proposed improvement: </w:t>
+      </w:r>
+      <w:r>
+        <w:rPr>
+          <w:rFonts w:ascii="Calibri" w:hAnsi="Calibri" w:eastAsia="Calibri"/>
+          <w:b w:val="0"/>
+          <w:i w:val="0"/>
+          <w:color w:val="333333"/>
+          <w:sz w:val="20"/>
+        </w:rPr>
+        <w:t>Improve Batch so each photo is processed with the same quality as the single Background Remove flow. Then allow batch-level primary/secondary actions too — for example background change, color, text, and similar edits — applied across selected images (up to 20) in one run.</w:t>
+      </w:r>
+    </w:p>
+    <w:p>
+      <w:pPr>
+        <w:spacing w:after="160"/>
+      </w:pPr>
+      <w:r>
+        <w:rPr>
+          <w:rFonts w:ascii="Calibri" w:hAnsi="Calibri" w:eastAsia="Calibri"/>
+          <w:b/>
+          <w:i w:val="0"/>
+          <w:color w:val="333333"/>
+          <w:sz w:val="20"/>
+        </w:rPr>
+        <w:t xml:space="preserve">Why this helps: </w:t>
+      </w:r>
+      <w:r>
+        <w:rPr>
+          <w:rFonts w:ascii="Calibri" w:hAnsi="Calibri" w:eastAsia="Calibri"/>
+          <w:b w:val="0"/>
+          <w:i w:val="0"/>
+          <w:color w:val="333333"/>
+          <w:sz w:val="20"/>
+        </w:rPr>
+        <w:t>Competitors are already good at single photos. The unique win for this app is Batch. If Batch quality matches single-photo quality and users can also edit all selected images together, the product becomes clearly stronger than competitors who lack this full batch workflow.</w:t>
       </w:r>
     </w:p>
     <w:p>
@@ -11898,7 +12544,7 @@
                 <w:color w:val="333333"/>
                 <w:sz w:val="18"/>
               </w:rPr>
-              <w:t>In progress (supported by Pass results for core tools)</w:t>
+              <w:t>2 (STR-001 Batch advantage, STR-002 clear UI icons)</w:t>
             </w:r>
           </w:p>
         </w:tc>
@@ -11967,7 +12613,7 @@
                 <w:color w:val="333333"/>
                 <w:sz w:val="18"/>
               </w:rPr>
-              <w:t>2 (SUG-001 Shape state, SUG-002 smart alignment)</w:t>
+              <w:t>3 (SUG-001 Shape UX, SUG-002 smart align, SUG-003 stronger Batch)</w:t>
             </w:r>
           </w:p>
         </w:tc>
@@ -12174,7 +12820,7 @@
                 <w:color w:val="333333"/>
                 <w:sz w:val="18"/>
               </w:rPr>
-              <w:t>Core Background Remove flow and tools are working on OnePlus 9 5G (v2.7). Shape restore behavior matches a major competitor, so it is logged as an improvement (SUG-001), plus a new feature idea for Instagram-style smart alignment (SUG-002).</w:t>
+              <w:t>Single-photo flow is solid and UI is easy to understand. Main product advantage vs competitors is Batch Remover (up to 20). Biggest improvement opportunity: make Batch quality match single-photo results and allow shared primary/secondary edits across the batch.</w:t>
             </w:r>
           </w:p>
         </w:tc>

</xml_diff>

<commit_message>
Remove BUG-001 and keep Shape screenshots under SUG-001
Delete the reclassified bug report block from Section 2 and move its
evidence images into SUG-001 so the report shows no logged bugs.

Co-authored-by: Showravkarmakar <Showrav88@users.noreply.github.com>
</commit_message>
<xml_diff>
--- a/SQA_Intern_Assignment_Test_Report.docx
+++ b/SQA_Intern_Assignment_Test_Report.docx
@@ -3800,1424 +3800,7 @@
           <w:szCs w:val="22"/>
           <w:rtl w:val="0"/>
         </w:rPr>
-        <w:t>Severity guide: Critical = crash/blocker; High = major feature broken; Medium = workaround exists; Low = minor. No confirmed product bugs are logged at this time. One Shape finding was reviewed against a competitor app with similar UI/tools and reclassified to Suggestions (SUG-001).</w:t>
-      </w:r>
-      <w:r>
-        <w:rPr>
-          <w:rtl w:val="0"/>
-        </w:rPr>
-      </w:r>
-    </w:p>
-    <w:p>
-      <w:pPr>
-        <w:spacing w:after="120" w:before="160" w:lineRule="auto"/>
-        <w:rPr/>
-      </w:pPr>
-      <w:r>
-        <w:rPr>
-          <w:rFonts w:ascii="Calibri" w:cs="Calibri" w:eastAsia="Calibri" w:hAnsi="Calibri"/>
-          <w:b/>
-          <w:bCs w:val="1"/>
-          <w:i w:val="0"/>
-          <w:iCs w:val="0"/>
-          <w:color w:val="2E75B6"/>
-          <w:sz w:val="26"/>
-          <w:szCs w:val="26"/>
-          <w:rtl w:val="0"/>
-        </w:rPr>
-        <w:t>Previously logged item (reclassified): Shape restores original background</w:t>
-      </w:r>
-      <w:r>
-        <w:rPr>
-          <w:rtl w:val="0"/>
-        </w:rPr>
-      </w:r>
-    </w:p>
-    <w:tbl>
-      <w:tblPr>
-        <w:tblStyle w:val="Table4"/>
-        <w:tblW w:w="10092.0" w:type="dxa"/>
-        <w:jc w:val="left"/>
-        <w:tblInd w:w="-115.0" w:type="dxa"/>
-        <w:tblLayout w:type="fixed"/>
-        <w:tblLook w:val="0400"/>
-      </w:tblPr>
-      <w:tblGrid>
-        <w:gridCol w:w="5046"/>
-        <w:gridCol w:w="5046"/>
-        <w:tblGridChange w:id="0">
-          <w:tblGrid>
-            <w:gridCol w:w="5046"/>
-            <w:gridCol w:w="5046"/>
-          </w:tblGrid>
-        </w:tblGridChange>
-      </w:tblGrid>
-      <w:tr>
-        <w:trPr>
-          <w:cantSplit w:val="0"/>
-          <w:tblHeader w:val="0"/>
-        </w:trPr>
-        <w:tc>
-          <w:tcPr>
-            <w:tcBorders>
-              <w:top w:color="bfbfbf" w:space="0" w:sz="4" w:val="single"/>
-              <w:left w:color="bfbfbf" w:space="0" w:sz="4" w:val="single"/>
-              <w:bottom w:color="bfbfbf" w:space="0" w:sz="4" w:val="single"/>
-              <w:right w:color="bfbfbf" w:space="0" w:sz="4" w:val="single"/>
-            </w:tcBorders>
-            <w:shd w:fill="e7e6e6" w:val="clear"/>
-          </w:tcPr>
-          <w:p>
-            <w:pPr>
-              <w:spacing w:after="40" w:before="40" w:lineRule="auto"/>
-              <w:rPr/>
-            </w:pPr>
-            <w:r>
-              <w:rPr>
-                <w:rFonts w:ascii="Calibri" w:cs="Calibri" w:eastAsia="Calibri" w:hAnsi="Calibri"/>
-                <w:b w:val="1"/>
-                <w:bCs w:val="1"/>
-                <w:i w:val="0"/>
-                <w:iCs w:val="0"/>
-                <w:color w:val="1f4e79"/>
-                <w:sz w:val="18"/>
-                <w:szCs w:val="18"/>
-                <w:rtl w:val="0"/>
-              </w:rPr>
-              <w:t xml:space="preserve">Module</w:t>
-            </w:r>
-            <w:r>
-              <w:rPr>
-                <w:rtl w:val="0"/>
-              </w:rPr>
-            </w:r>
-          </w:p>
-        </w:tc>
-        <w:tc>
-          <w:tcPr>
-            <w:tcBorders>
-              <w:top w:color="bfbfbf" w:space="0" w:sz="4" w:val="single"/>
-              <w:left w:color="bfbfbf" w:space="0" w:sz="4" w:val="single"/>
-              <w:bottom w:color="bfbfbf" w:space="0" w:sz="4" w:val="single"/>
-              <w:right w:color="bfbfbf" w:space="0" w:sz="4" w:val="single"/>
-            </w:tcBorders>
-            <w:shd w:fill="ffffff" w:val="clear"/>
-          </w:tcPr>
-          <w:p>
-            <w:pPr>
-              <w:spacing w:after="40" w:before="40" w:lineRule="auto"/>
-              <w:rPr/>
-            </w:pPr>
-            <w:r>
-              <w:rPr>
-                <w:rFonts w:ascii="Calibri" w:cs="Calibri" w:eastAsia="Calibri" w:hAnsi="Calibri"/>
-                <w:b w:val="0"/>
-                <w:bCs w:val="0"/>
-                <w:i w:val="0"/>
-                <w:iCs w:val="0"/>
-                <w:color w:val="333333"/>
-                <w:sz w:val="18"/>
-                <w:szCs w:val="18"/>
-                <w:rtl w:val="0"/>
-              </w:rPr>
-              <w:t xml:space="preserve">Background Remove → Primary editor → Shape</w:t>
-            </w:r>
-            <w:r>
-              <w:rPr>
-                <w:rtl w:val="0"/>
-              </w:rPr>
-            </w:r>
-          </w:p>
-        </w:tc>
-      </w:tr>
-      <w:tr>
-        <w:trPr>
-          <w:cantSplit w:val="0"/>
-          <w:tblHeader w:val="0"/>
-        </w:trPr>
-        <w:tc>
-          <w:tcPr>
-            <w:tcBorders>
-              <w:top w:color="bfbfbf" w:space="0" w:sz="4" w:val="single"/>
-              <w:left w:color="bfbfbf" w:space="0" w:sz="4" w:val="single"/>
-              <w:bottom w:color="bfbfbf" w:space="0" w:sz="4" w:val="single"/>
-              <w:right w:color="bfbfbf" w:space="0" w:sz="4" w:val="single"/>
-            </w:tcBorders>
-            <w:shd w:fill="e7e6e6" w:val="clear"/>
-          </w:tcPr>
-          <w:p>
-            <w:pPr>
-              <w:spacing w:after="40" w:before="40" w:lineRule="auto"/>
-              <w:rPr/>
-            </w:pPr>
-            <w:r>
-              <w:rPr>
-                <w:rFonts w:ascii="Calibri" w:cs="Calibri" w:eastAsia="Calibri" w:hAnsi="Calibri"/>
-                <w:b w:val="1"/>
-                <w:bCs w:val="1"/>
-                <w:i w:val="0"/>
-                <w:iCs w:val="0"/>
-                <w:color w:val="1f4e79"/>
-                <w:sz w:val="18"/>
-                <w:szCs w:val="18"/>
-                <w:rtl w:val="0"/>
-              </w:rPr>
-              <w:t xml:space="preserve">Quality Area</w:t>
-            </w:r>
-            <w:r>
-              <w:rPr>
-                <w:rtl w:val="0"/>
-              </w:rPr>
-            </w:r>
-          </w:p>
-        </w:tc>
-        <w:tc>
-          <w:tcPr>
-            <w:shd w:fill="FFFFFF" w:val="clear"/>
-            <w:tcBorders>
-              <w:top w:val="single" w:sz="4" w:color="BFBFBF"/>
-              <w:left w:val="single" w:sz="4" w:color="BFBFBF"/>
-              <w:bottom w:val="single" w:sz="4" w:color="BFBFBF"/>
-              <w:right w:val="single" w:sz="4" w:color="BFBFBF"/>
-            </w:tcBorders>
-          </w:tcPr>
-          <w:p>
-            <w:pPr>
-              <w:spacing w:before="40" w:after="40"/>
-            </w:pPr>
-            <w:r/>
-            <w:r>
-              <w:rPr>
-                <w:rFonts w:ascii="Calibri" w:hAnsi="Calibri" w:eastAsia="Calibri"/>
-                <w:b w:val="0"/>
-                <w:i w:val="0"/>
-                <w:color w:val="333333"/>
-                <w:sz w:val="18"/>
-              </w:rPr>
-              <w:t>Moved to Suggestions (SUG-001)</w:t>
-            </w:r>
-          </w:p>
-        </w:tc>
-      </w:tr>
-      <w:tr>
-        <w:trPr>
-          <w:cantSplit w:val="0"/>
-          <w:tblHeader w:val="0"/>
-        </w:trPr>
-        <w:tc>
-          <w:tcPr>
-            <w:tcBorders>
-              <w:top w:color="bfbfbf" w:space="0" w:sz="4" w:val="single"/>
-              <w:left w:color="bfbfbf" w:space="0" w:sz="4" w:val="single"/>
-              <w:bottom w:color="bfbfbf" w:space="0" w:sz="4" w:val="single"/>
-              <w:right w:color="bfbfbf" w:space="0" w:sz="4" w:val="single"/>
-            </w:tcBorders>
-            <w:shd w:fill="e7e6e6" w:val="clear"/>
-          </w:tcPr>
-          <w:p>
-            <w:pPr>
-              <w:spacing w:after="40" w:before="40" w:lineRule="auto"/>
-              <w:rPr/>
-            </w:pPr>
-            <w:r>
-              <w:rPr>
-                <w:rFonts w:ascii="Calibri" w:cs="Calibri" w:eastAsia="Calibri" w:hAnsi="Calibri"/>
-                <w:b w:val="1"/>
-                <w:bCs w:val="1"/>
-                <w:i w:val="0"/>
-                <w:iCs w:val="0"/>
-                <w:color w:val="1f4e79"/>
-                <w:sz w:val="18"/>
-                <w:szCs w:val="18"/>
-                <w:rtl w:val="0"/>
-              </w:rPr>
-              <w:t xml:space="preserve">Severity</w:t>
-            </w:r>
-            <w:r>
-              <w:rPr>
-                <w:rtl w:val="0"/>
-              </w:rPr>
-            </w:r>
-          </w:p>
-        </w:tc>
-        <w:tc>
-          <w:tcPr>
-            <w:shd w:fill="FFF2CC" w:val="clear"/>
-            <w:tcBorders>
-              <w:top w:val="single" w:sz="4" w:color="BFBFBF"/>
-              <w:left w:val="single" w:sz="4" w:color="BFBFBF"/>
-              <w:bottom w:val="single" w:sz="4" w:color="BFBFBF"/>
-              <w:right w:val="single" w:sz="4" w:color="BFBFBF"/>
-            </w:tcBorders>
-          </w:tcPr>
-          <w:p>
-            <w:pPr>
-              <w:spacing w:before="40" w:after="40"/>
-            </w:pPr>
-            <w:r/>
-            <w:r>
-              <w:rPr>
-                <w:rFonts w:ascii="Calibri" w:hAnsi="Calibri" w:eastAsia="Calibri"/>
-                <w:b w:val="0"/>
-                <w:i w:val="0"/>
-                <w:color w:val="333333"/>
-                <w:sz w:val="18"/>
-              </w:rPr>
-              <w:t>Reclassified — not logged as product bug</w:t>
-            </w:r>
-          </w:p>
-        </w:tc>
-      </w:tr>
-      <w:tr>
-        <w:trPr>
-          <w:cantSplit w:val="0"/>
-          <w:tblHeader w:val="0"/>
-        </w:trPr>
-        <w:tc>
-          <w:tcPr>
-            <w:tcBorders>
-              <w:top w:color="bfbfbf" w:space="0" w:sz="4" w:val="single"/>
-              <w:left w:color="bfbfbf" w:space="0" w:sz="4" w:val="single"/>
-              <w:bottom w:color="bfbfbf" w:space="0" w:sz="4" w:val="single"/>
-              <w:right w:color="bfbfbf" w:space="0" w:sz="4" w:val="single"/>
-            </w:tcBorders>
-            <w:shd w:fill="e7e6e6" w:val="clear"/>
-          </w:tcPr>
-          <w:p>
-            <w:pPr>
-              <w:spacing w:after="40" w:before="40" w:lineRule="auto"/>
-              <w:rPr/>
-            </w:pPr>
-            <w:r>
-              <w:rPr>
-                <w:rFonts w:ascii="Calibri" w:cs="Calibri" w:eastAsia="Calibri" w:hAnsi="Calibri"/>
-                <w:b w:val="1"/>
-                <w:bCs w:val="1"/>
-                <w:i w:val="0"/>
-                <w:iCs w:val="0"/>
-                <w:color w:val="1f4e79"/>
-                <w:sz w:val="18"/>
-                <w:szCs w:val="18"/>
-                <w:rtl w:val="0"/>
-              </w:rPr>
-              <w:t xml:space="preserve">Environment</w:t>
-            </w:r>
-            <w:r>
-              <w:rPr>
-                <w:rtl w:val="0"/>
-              </w:rPr>
-            </w:r>
-          </w:p>
-        </w:tc>
-        <w:tc>
-          <w:tcPr>
-            <w:tcBorders>
-              <w:top w:color="bfbfbf" w:space="0" w:sz="4" w:val="single"/>
-              <w:left w:color="bfbfbf" w:space="0" w:sz="4" w:val="single"/>
-              <w:bottom w:color="bfbfbf" w:space="0" w:sz="4" w:val="single"/>
-              <w:right w:color="bfbfbf" w:space="0" w:sz="4" w:val="single"/>
-            </w:tcBorders>
-            <w:shd w:fill="ffffff" w:val="clear"/>
-          </w:tcPr>
-          <w:p>
-            <w:pPr>
-              <w:spacing w:after="40" w:before="40" w:lineRule="auto"/>
-              <w:rPr/>
-            </w:pPr>
-            <w:r>
-              <w:rPr>
-                <w:rFonts w:ascii="Calibri" w:cs="Calibri" w:eastAsia="Calibri" w:hAnsi="Calibri"/>
-                <w:b w:val="0"/>
-                <w:bCs w:val="0"/>
-                <w:i w:val="0"/>
-                <w:iCs w:val="0"/>
-                <w:color w:val="333333"/>
-                <w:sz w:val="18"/>
-                <w:szCs w:val="18"/>
-                <w:rtl w:val="0"/>
-              </w:rPr>
-              <w:t xml:space="preserve">OnePlus 9 5G · OxygenOS 13.1 · App v2.7</w:t>
-            </w:r>
-            <w:r>
-              <w:rPr>
-                <w:rtl w:val="0"/>
-              </w:rPr>
-            </w:r>
-          </w:p>
-        </w:tc>
-      </w:tr>
-      <w:tr>
-        <w:trPr>
-          <w:cantSplit w:val="0"/>
-          <w:tblHeader w:val="0"/>
-        </w:trPr>
-        <w:tc>
-          <w:tcPr>
-            <w:tcBorders>
-              <w:top w:color="bfbfbf" w:space="0" w:sz="4" w:val="single"/>
-              <w:left w:color="bfbfbf" w:space="0" w:sz="4" w:val="single"/>
-              <w:bottom w:color="bfbfbf" w:space="0" w:sz="4" w:val="single"/>
-              <w:right w:color="bfbfbf" w:space="0" w:sz="4" w:val="single"/>
-            </w:tcBorders>
-            <w:shd w:fill="e7e6e6" w:val="clear"/>
-          </w:tcPr>
-          <w:p>
-            <w:pPr>
-              <w:spacing w:after="40" w:before="40" w:lineRule="auto"/>
-              <w:rPr/>
-            </w:pPr>
-            <w:r>
-              <w:rPr>
-                <w:rFonts w:ascii="Calibri" w:cs="Calibri" w:eastAsia="Calibri" w:hAnsi="Calibri"/>
-                <w:b w:val="1"/>
-                <w:bCs w:val="1"/>
-                <w:i w:val="0"/>
-                <w:iCs w:val="0"/>
-                <w:color w:val="1f4e79"/>
-                <w:sz w:val="18"/>
-                <w:szCs w:val="18"/>
-                <w:rtl w:val="0"/>
-              </w:rPr>
-              <w:t xml:space="preserve">Frequency</w:t>
-            </w:r>
-            <w:r>
-              <w:rPr>
-                <w:rtl w:val="0"/>
-              </w:rPr>
-            </w:r>
-          </w:p>
-        </w:tc>
-        <w:tc>
-          <w:tcPr>
-            <w:tcBorders>
-              <w:top w:color="bfbfbf" w:space="0" w:sz="4" w:val="single"/>
-              <w:left w:color="bfbfbf" w:space="0" w:sz="4" w:val="single"/>
-              <w:bottom w:color="bfbfbf" w:space="0" w:sz="4" w:val="single"/>
-              <w:right w:color="bfbfbf" w:space="0" w:sz="4" w:val="single"/>
-            </w:tcBorders>
-            <w:shd w:fill="ffffff" w:val="clear"/>
-          </w:tcPr>
-          <w:p>
-            <w:pPr>
-              <w:spacing w:after="40" w:before="40" w:lineRule="auto"/>
-              <w:rPr/>
-            </w:pPr>
-            <w:r>
-              <w:rPr>
-                <w:rFonts w:ascii="Calibri" w:cs="Calibri" w:eastAsia="Calibri" w:hAnsi="Calibri"/>
-                <w:b w:val="0"/>
-                <w:bCs w:val="0"/>
-                <w:i w:val="0"/>
-                <w:iCs w:val="0"/>
-                <w:color w:val="333333"/>
-                <w:sz w:val="18"/>
-                <w:szCs w:val="18"/>
-                <w:rtl w:val="0"/>
-              </w:rPr>
-              <w:t xml:space="preserve">Always</w:t>
-            </w:r>
-            <w:r>
-              <w:rPr>
-                <w:rtl w:val="0"/>
-              </w:rPr>
-            </w:r>
-          </w:p>
-        </w:tc>
-      </w:tr>
-      <w:tr>
-        <w:trPr>
-          <w:cantSplit w:val="0"/>
-          <w:tblHeader w:val="0"/>
-        </w:trPr>
-        <w:tc>
-          <w:tcPr>
-            <w:tcBorders>
-              <w:top w:color="bfbfbf" w:space="0" w:sz="4" w:val="single"/>
-              <w:left w:color="bfbfbf" w:space="0" w:sz="4" w:val="single"/>
-              <w:bottom w:color="bfbfbf" w:space="0" w:sz="4" w:val="single"/>
-              <w:right w:color="bfbfbf" w:space="0" w:sz="4" w:val="single"/>
-            </w:tcBorders>
-            <w:shd w:fill="e7e6e6" w:val="clear"/>
-          </w:tcPr>
-          <w:p>
-            <w:pPr>
-              <w:spacing w:after="40" w:before="40" w:lineRule="auto"/>
-              <w:rPr/>
-            </w:pPr>
-            <w:r>
-              <w:rPr>
-                <w:rFonts w:ascii="Calibri" w:cs="Calibri" w:eastAsia="Calibri" w:hAnsi="Calibri"/>
-                <w:b w:val="1"/>
-                <w:bCs w:val="1"/>
-                <w:i w:val="0"/>
-                <w:iCs w:val="0"/>
-                <w:color w:val="1f4e79"/>
-                <w:sz w:val="18"/>
-                <w:szCs w:val="18"/>
-                <w:rtl w:val="0"/>
-              </w:rPr>
-              <w:t xml:space="preserve">Related Test Case</w:t>
-            </w:r>
-            <w:r>
-              <w:rPr>
-                <w:rtl w:val="0"/>
-              </w:rPr>
-            </w:r>
-          </w:p>
-        </w:tc>
-        <w:tc>
-          <w:tcPr>
-            <w:shd w:fill="FFFFFF" w:val="clear"/>
-            <w:tcBorders>
-              <w:top w:val="single" w:sz="4" w:color="BFBFBF"/>
-              <w:left w:val="single" w:sz="4" w:color="BFBFBF"/>
-              <w:bottom w:val="single" w:sz="4" w:color="BFBFBF"/>
-              <w:right w:val="single" w:sz="4" w:color="BFBFBF"/>
-            </w:tcBorders>
-          </w:tcPr>
-          <w:p>
-            <w:pPr>
-              <w:spacing w:before="40" w:after="40"/>
-            </w:pPr>
-            <w:r/>
-            <w:r>
-              <w:rPr>
-                <w:rFonts w:ascii="Calibri" w:hAnsi="Calibri" w:eastAsia="Calibri"/>
-                <w:b w:val="0"/>
-                <w:i w:val="0"/>
-                <w:color w:val="333333"/>
-                <w:sz w:val="18"/>
-              </w:rPr>
-              <w:t>TC-BR-008 (Pass — accepted current design; improvement in SUG-001)</w:t>
-            </w:r>
-          </w:p>
-        </w:tc>
-      </w:tr>
-    </w:tbl>
-    <w:p>
-      <w:pPr>
-        <w:rPr/>
-      </w:pPr>
-      <w:r>
-        <w:rPr>
-          <w:rtl w:val="0"/>
-        </w:rPr>
-      </w:r>
-    </w:p>
-    <w:p>
-      <w:pPr>
-        <w:spacing w:after="120" w:before="160" w:lineRule="auto"/>
-        <w:rPr/>
-      </w:pPr>
-      <w:r>
-        <w:rPr>
-          <w:rFonts w:ascii="Calibri" w:cs="Calibri" w:eastAsia="Calibri" w:hAnsi="Calibri"/>
-          <w:b w:val="1"/>
-          <w:bCs w:val="1"/>
-          <w:i w:val="0"/>
-          <w:iCs w:val="0"/>
-          <w:color w:val="404040"/>
-          <w:sz w:val="22"/>
-          <w:szCs w:val="22"/>
-          <w:rtl w:val="0"/>
-        </w:rPr>
-        <w:t xml:space="preserve">Steps to Reproduce</w:t>
-      </w:r>
-      <w:r>
-        <w:rPr>
-          <w:rtl w:val="0"/>
-        </w:rPr>
-      </w:r>
-    </w:p>
-    <w:p>
-      <w:pPr>
-        <w:spacing w:after="40" w:lineRule="auto"/>
-        <w:ind w:left="227" w:firstLine="0"/>
-        <w:rPr/>
-      </w:pPr>
-      <w:r>
-        <w:rPr>
-          <w:rFonts w:ascii="Calibri" w:cs="Calibri" w:eastAsia="Calibri" w:hAnsi="Calibri"/>
-          <w:b w:val="0"/>
-          <w:bCs w:val="0"/>
-          <w:i w:val="0"/>
-          <w:iCs w:val="0"/>
-          <w:sz w:val="20"/>
-          <w:szCs w:val="20"/>
-          <w:rtl w:val="0"/>
-        </w:rPr>
-        <w:t xml:space="preserve">1. On Homepage, tap Background Remove.</w:t>
-      </w:r>
-      <w:r>
-        <w:rPr>
-          <w:rtl w:val="0"/>
-        </w:rPr>
-      </w:r>
-    </w:p>
-    <w:p>
-      <w:pPr>
-        <w:spacing w:after="40" w:lineRule="auto"/>
-        <w:ind w:left="227" w:firstLine="0"/>
-        <w:rPr/>
-      </w:pPr>
-      <w:r>
-        <w:rPr>
-          <w:rFonts w:ascii="Calibri" w:cs="Calibri" w:eastAsia="Calibri" w:hAnsi="Calibri"/>
-          <w:b w:val="0"/>
-          <w:bCs w:val="0"/>
-          <w:i w:val="0"/>
-          <w:iCs w:val="0"/>
-          <w:sz w:val="20"/>
-          <w:szCs w:val="20"/>
-          <w:rtl w:val="0"/>
-        </w:rPr>
-        <w:t xml:space="preserve">2. In Gallery / Photos, select one image and tap Continue.</w:t>
-      </w:r>
-      <w:r>
-        <w:rPr>
-          <w:rtl w:val="0"/>
-        </w:rPr>
-      </w:r>
-    </w:p>
-    <w:p>
-      <w:pPr>
-        <w:spacing w:after="40" w:lineRule="auto"/>
-        <w:ind w:left="227" w:firstLine="0"/>
-        <w:rPr/>
-      </w:pPr>
-      <w:r>
-        <w:rPr>
-          <w:rFonts w:ascii="Calibri" w:cs="Calibri" w:eastAsia="Calibri" w:hAnsi="Calibri"/>
-          <w:b w:val="0"/>
-          <w:bCs w:val="0"/>
-          <w:i w:val="0"/>
-          <w:iCs w:val="0"/>
-          <w:sz w:val="20"/>
-          <w:szCs w:val="20"/>
-          <w:rtl w:val="0"/>
-        </w:rPr>
-        <w:t xml:space="preserve">3. Wait for the primary editor. Confirm background is removed (checkerboard shows).</w:t>
-      </w:r>
-      <w:r>
-        <w:rPr>
-          <w:rtl w:val="0"/>
-        </w:rPr>
-      </w:r>
-    </w:p>
-    <w:p>
-      <w:pPr>
-        <w:spacing w:after="40" w:lineRule="auto"/>
-        <w:ind w:left="227" w:firstLine="0"/>
-        <w:rPr/>
-      </w:pPr>
-      <w:r>
-        <w:rPr>
-          <w:rFonts w:ascii="Calibri" w:cs="Calibri" w:eastAsia="Calibri" w:hAnsi="Calibri"/>
-          <w:b w:val="0"/>
-          <w:bCs w:val="0"/>
-          <w:i w:val="0"/>
-          <w:iCs w:val="0"/>
-          <w:sz w:val="20"/>
-          <w:szCs w:val="20"/>
-          <w:rtl w:val="0"/>
-        </w:rPr>
-        <w:t xml:space="preserve">4. In primary tools, open Shape.</w:t>
-      </w:r>
-      <w:r>
-        <w:rPr>
-          <w:rtl w:val="0"/>
-        </w:rPr>
-      </w:r>
-    </w:p>
-    <w:p>
-      <w:pPr>
-        <w:spacing w:after="40" w:lineRule="auto"/>
-        <w:ind w:left="227" w:firstLine="0"/>
-        <w:rPr/>
-      </w:pPr>
-      <w:r>
-        <w:rPr>
-          <w:rFonts w:ascii="Calibri" w:cs="Calibri" w:eastAsia="Calibri" w:hAnsi="Calibri"/>
-          <w:b w:val="0"/>
-          <w:bCs w:val="0"/>
-          <w:i w:val="0"/>
-          <w:iCs w:val="0"/>
-          <w:sz w:val="20"/>
-          <w:szCs w:val="20"/>
-          <w:rtl w:val="0"/>
-        </w:rPr>
-        <w:t xml:space="preserve">5. Apply a shape change.</w:t>
-      </w:r>
-      <w:r>
-        <w:rPr>
-          <w:rtl w:val="0"/>
-        </w:rPr>
-      </w:r>
-    </w:p>
-    <w:p>
-      <w:pPr>
-        <w:spacing w:after="40" w:lineRule="auto"/>
-        <w:ind w:left="227" w:firstLine="0"/>
-        <w:rPr/>
-      </w:pPr>
-      <w:r>
-        <w:rPr>
-          <w:rFonts w:ascii="Calibri" w:cs="Calibri" w:eastAsia="Calibri" w:hAnsi="Calibri"/>
-          <w:b w:val="0"/>
-          <w:bCs w:val="0"/>
-          <w:i w:val="0"/>
-          <w:iCs w:val="0"/>
-          <w:sz w:val="20"/>
-          <w:szCs w:val="20"/>
-          <w:rtl w:val="0"/>
-        </w:rPr>
-        <w:t xml:space="preserve">6. Check the image preview.</w:t>
-      </w:r>
-      <w:r>
-        <w:rPr>
-          <w:rtl w:val="0"/>
-        </w:rPr>
-      </w:r>
-    </w:p>
-    <w:p>
-      <w:pPr>
-        <w:spacing w:after="120" w:before="160" w:lineRule="auto"/>
-        <w:rPr/>
-      </w:pPr>
-      <w:r>
-        <w:rPr>
-          <w:rFonts w:ascii="Calibri" w:cs="Calibri" w:eastAsia="Calibri" w:hAnsi="Calibri"/>
-          <w:b w:val="1"/>
-          <w:bCs w:val="1"/>
-          <w:i w:val="0"/>
-          <w:iCs w:val="0"/>
-          <w:color w:val="404040"/>
-          <w:sz w:val="22"/>
-          <w:szCs w:val="22"/>
-          <w:rtl w:val="0"/>
-        </w:rPr>
-        <w:t xml:space="preserve">Expected Result</w:t>
-      </w:r>
-      <w:r>
-        <w:rPr>
-          <w:rtl w:val="0"/>
-        </w:rPr>
-      </w:r>
-    </w:p>
-    <w:p>
-      <w:pPr>
-        <w:spacing w:after="120" w:lineRule="auto"/>
-        <w:rPr/>
-      </w:pPr>
-      <w:r>
-        <w:rPr>
-          <w:rFonts w:ascii="Calibri" w:cs="Calibri" w:eastAsia="Calibri" w:hAnsi="Calibri"/>
-          <w:b w:val="0"/>
-          <w:bCs w:val="0"/>
-          <w:i w:val="0"/>
-          <w:iCs w:val="0"/>
-          <w:color w:val="333333"/>
-          <w:sz w:val="20"/>
-          <w:szCs w:val="22"/>
-          <w:rtl w:val="0"/>
-        </w:rPr>
-        <w:t>Ideal product behavior: Shape would edit the already cleared image and keep the background removed. After checking a major competitor app (~50M+ downloads) that uses a very similar Shape tool and UI, the same restore-to-original behavior was observed. So this is treated as current market/design behavior, not a unique defect in this app.</w:t>
-      </w:r>
-      <w:r>
-        <w:rPr>
-          <w:rtl w:val="0"/>
-        </w:rPr>
-      </w:r>
-    </w:p>
-    <w:p>
-      <w:pPr>
-        <w:spacing w:after="120" w:before="160" w:lineRule="auto"/>
-        <w:rPr/>
-      </w:pPr>
-      <w:r>
-        <w:rPr>
-          <w:rFonts w:ascii="Calibri" w:cs="Calibri" w:eastAsia="Calibri" w:hAnsi="Calibri"/>
-          <w:b w:val="1"/>
-          <w:bCs w:val="1"/>
-          <w:i w:val="0"/>
-          <w:iCs w:val="0"/>
-          <w:color w:val="404040"/>
-          <w:sz w:val="22"/>
-          <w:szCs w:val="22"/>
-          <w:rtl w:val="0"/>
-        </w:rPr>
-        <w:t xml:space="preserve">Actual Result</w:t>
-      </w:r>
-      <w:r>
-        <w:rPr>
-          <w:rtl w:val="0"/>
-        </w:rPr>
-      </w:r>
-    </w:p>
-    <w:p>
-      <w:pPr>
-        <w:spacing w:after="120" w:lineRule="auto"/>
-        <w:rPr/>
-      </w:pPr>
-      <w:r>
-        <w:rPr>
-          <w:rFonts w:ascii="Calibri" w:cs="Calibri" w:eastAsia="Calibri" w:hAnsi="Calibri"/>
-          <w:b w:val="0"/>
-          <w:bCs w:val="0"/>
-          <w:i w:val="0"/>
-          <w:iCs w:val="0"/>
-          <w:color w:val="333333"/>
-          <w:sz w:val="20"/>
-          <w:szCs w:val="22"/>
-          <w:rtl w:val="0"/>
-        </w:rPr>
-        <w:t>Observed: applying Shape brings back the original background. Evidence screenshots are kept below for the report. Because the competitor app behaves the same, this item is moved to Suggestions as a product improvement opportunity instead of a High-severity bug.</w:t>
-      </w:r>
-      <w:r>
-        <w:rPr>
-          <w:rtl w:val="0"/>
-        </w:rPr>
-      </w:r>
-    </w:p>
-    <w:p>
-      <w:pPr>
-        <w:spacing w:after="120" w:before="160" w:lineRule="auto"/>
-        <w:rPr/>
-      </w:pPr>
-      <w:r>
-        <w:rPr>
-          <w:rFonts w:ascii="Calibri" w:cs="Calibri" w:eastAsia="Calibri" w:hAnsi="Calibri"/>
-          <w:b w:val="1"/>
-          <w:bCs w:val="1"/>
-          <w:i w:val="0"/>
-          <w:iCs w:val="0"/>
-          <w:color w:val="000000"/>
-          <w:sz w:val="22"/>
-          <w:szCs w:val="22"/>
-          <w:rtl w:val="0"/>
-        </w:rPr>
-        <w:t xml:space="preserve">Evidence</w:t>
-      </w:r>
-      <w:r>
-        <w:rPr>
-          <w:color w:val="000000"/>
-          <w:rtl w:val="0"/>
-        </w:rPr>
-      </w:r>
-    </w:p>
-    <w:tbl>
-      <w:tblPr>
-        <w:tblStyle w:val="Table5"/>
-        <w:tblW w:w="10092.0" w:type="dxa"/>
-        <w:jc w:val="center"/>
-        <w:tblLayout w:type="fixed"/>
-        <w:tblLook w:val="0400"/>
-      </w:tblPr>
-      <w:tblGrid>
-        <w:gridCol w:w="10092"/>
-        <w:tblGridChange w:id="0">
-          <w:tblGrid>
-            <w:gridCol w:w="10092"/>
-          </w:tblGrid>
-        </w:tblGridChange>
-      </w:tblGrid>
-      <w:tr>
-        <w:trPr>
-          <w:cantSplit w:val="0"/>
-          <w:tblHeader w:val="0"/>
-        </w:trPr>
-        <w:tc>
-          <w:tcPr>
-            <w:tcBorders>
-              <w:top w:color="a6a6a6" w:space="0" w:sz="8" w:val="single"/>
-              <w:left w:color="a6a6a6" w:space="0" w:sz="8" w:val="single"/>
-              <w:bottom w:color="a6a6a6" w:space="0" w:sz="8" w:val="single"/>
-              <w:right w:color="a6a6a6" w:space="0" w:sz="8" w:val="single"/>
-            </w:tcBorders>
-            <w:shd w:fill="f5f5f5" w:val="clear"/>
-          </w:tcPr>
-          <w:p>
-            <w:pPr>
-              <w:spacing w:after="560" w:before="560" w:lineRule="auto"/>
-              <w:jc w:val="center"/>
-              <w:rPr/>
-            </w:pPr>
-            <w:r>
-              <w:rPr>
-                <w:rFonts w:ascii="Calibri" w:cs="Calibri" w:eastAsia="Calibri" w:hAnsi="Calibri"/>
-                <w:b w:val="0"/>
-                <w:bCs w:val="0"/>
-                <w:i w:val="1"/>
-                <w:iCs w:val="1"/>
-                <w:color w:val="000000"/>
-                <w:sz w:val="20"/>
-                <w:szCs w:val="20"/>
-                <w:rtl w:val="0"/>
-              </w:rPr>
-              <w:t xml:space="preserve">Screenshot: Homepage → Background Remove </w:t>
-            </w:r>
-            <w:r>
-              <w:rPr>
-                <w:rFonts w:ascii="Calibri" w:cs="Calibri" w:eastAsia="Calibri" w:hAnsi="Calibri"/>
-                <w:i w:val="1"/>
-                <w:iCs w:val="1"/>
-                <w:color w:val="000000"/>
-                <w:sz w:val="20"/>
-                <w:szCs w:val="20"/>
-                <w:rtl w:val="0"/>
-              </w:rPr>
-              <w:t xml:space="preserve">→ Processing</w:t>
-            </w:r>
-            <w:r>
-              <w:rPr>
-                <w:rFonts w:ascii="Calibri" w:cs="Calibri" w:eastAsia="Calibri" w:hAnsi="Calibri"/>
-                <w:b w:val="0"/>
-                <w:bCs w:val="0"/>
-                <w:i w:val="1"/>
-                <w:iCs w:val="1"/>
-                <w:color w:val="000000"/>
-                <w:sz w:val="20"/>
-                <w:szCs w:val="20"/>
-                <w:rtl w:val="0"/>
-              </w:rPr>
-              <w:br w:type="textWrapping"/>
-            </w:r>
-            <w:r>
-              <w:rPr>
-                <w:rFonts w:ascii="Calibri" w:cs="Calibri" w:eastAsia="Calibri" w:hAnsi="Calibri"/>
-                <w:i w:val="1"/>
-                <w:iCs w:val="1"/>
-                <w:color w:val="000000"/>
-                <w:sz w:val="20"/>
-                <w:szCs w:val="20"/>
-              </w:rPr>
-              <w:drawing>
-                <wp:inline distB="114300" distT="114300" distL="114300" distR="114300">
-                  <wp:extent cx="2238375" cy="4027589"/>
-                  <wp:effectExtent b="0" l="0" r="0" t="0"/>
-                  <wp:docPr id="5" name="image5.jpg"/>
-                  <a:graphic>
-                    <a:graphicData uri="http://schemas.openxmlformats.org/drawingml/2006/picture">
-                      <pic:pic>
-                        <pic:nvPicPr>
-                          <pic:cNvPr id="0" name="image5.jpg"/>
-                          <pic:cNvPicPr preferRelativeResize="0"/>
-                        </pic:nvPicPr>
-                        <pic:blipFill>
-                          <a:blip r:embed="rId6"/>
-                          <a:srcRect b="35424" l="0" r="0" t="0"/>
-                          <a:stretch>
-                            <a:fillRect/>
-                          </a:stretch>
-                        </pic:blipFill>
-                        <pic:spPr>
-                          <a:xfrm>
-                            <a:off x="0" y="0"/>
-                            <a:ext cx="2238375" cy="4027589"/>
-                          </a:xfrm>
-                          <a:prstGeom prst="rect"/>
-                          <a:ln/>
-                        </pic:spPr>
-                      </pic:pic>
-                    </a:graphicData>
-                  </a:graphic>
-                </wp:inline>
-              </w:drawing>
-            </w:r>
-            <w:r>
-              <w:rPr>
-                <w:color w:val="000000"/>
-                <w:rtl w:val="0"/>
-              </w:rPr>
-            </w:r>
-          </w:p>
-        </w:tc>
-      </w:tr>
-    </w:tbl>
-    <w:p>
-      <w:pPr>
-        <w:rPr/>
-      </w:pPr>
-      <w:r>
-        <w:rPr>
-          <w:rtl w:val="0"/>
-        </w:rPr>
-      </w:r>
-    </w:p>
-    <w:tbl>
-      <w:tblPr>
-        <w:tblStyle w:val="Table6"/>
-        <w:tblW w:w="10092.0" w:type="dxa"/>
-        <w:jc w:val="center"/>
-        <w:tblLayout w:type="fixed"/>
-        <w:tblLook w:val="0400"/>
-      </w:tblPr>
-      <w:tblGrid>
-        <w:gridCol w:w="10092"/>
-        <w:tblGridChange w:id="0">
-          <w:tblGrid>
-            <w:gridCol w:w="10092"/>
-          </w:tblGrid>
-        </w:tblGridChange>
-      </w:tblGrid>
-      <w:tr>
-        <w:trPr>
-          <w:cantSplit w:val="0"/>
-          <w:tblHeader w:val="0"/>
-        </w:trPr>
-        <w:tc>
-          <w:tcPr>
-            <w:tcBorders>
-              <w:top w:color="a6a6a6" w:space="0" w:sz="8" w:val="single"/>
-              <w:left w:color="a6a6a6" w:space="0" w:sz="8" w:val="single"/>
-              <w:bottom w:color="a6a6a6" w:space="0" w:sz="8" w:val="single"/>
-              <w:right w:color="a6a6a6" w:space="0" w:sz="8" w:val="single"/>
-            </w:tcBorders>
-            <w:shd w:fill="f5f5f5" w:val="clear"/>
-          </w:tcPr>
-          <w:p>
-            <w:pPr>
-              <w:spacing w:after="560" w:before="560" w:lineRule="auto"/>
-              <w:jc w:val="center"/>
-              <w:rPr/>
-            </w:pPr>
-            <w:r>
-              <w:rPr>
-                <w:rFonts w:ascii="Calibri" w:cs="Calibri" w:eastAsia="Calibri" w:hAnsi="Calibri"/>
-                <w:b w:val="0"/>
-                <w:bCs w:val="0"/>
-                <w:i w:val="1"/>
-                <w:iCs w:val="1"/>
-                <w:color w:val="000000"/>
-                <w:sz w:val="20"/>
-                <w:szCs w:val="20"/>
-                <w:rtl w:val="0"/>
-              </w:rPr>
-              <w:t xml:space="preserve">Screenshot: Gallery — photo selected, Continue</w:t>
-            </w:r>
-            <w:r>
-              <w:rPr>
-                <w:rFonts w:ascii="Calibri" w:cs="Calibri" w:eastAsia="Calibri" w:hAnsi="Calibri"/>
-                <w:b w:val="0"/>
-                <w:bCs w:val="0"/>
-                <w:i w:val="1"/>
-                <w:iCs w:val="1"/>
-                <w:color w:val="000000"/>
-                <w:sz w:val="20"/>
-                <w:szCs w:val="20"/>
-                <w:rtl w:val="0"/>
-              </w:rPr>
-              <w:br w:type="textWrapping"/>
-            </w:r>
-            <w:r>
-              <w:rPr>
-                <w:rFonts w:ascii="Calibri" w:cs="Calibri" w:eastAsia="Calibri" w:hAnsi="Calibri"/>
-                <w:b w:val="0"/>
-                <w:bCs w:val="0"/>
-                <w:i w:val="1"/>
-                <w:iCs w:val="1"/>
-                <w:color w:val="000000"/>
-                <w:sz w:val="20"/>
-                <w:szCs w:val="20"/>
-              </w:rPr>
-              <w:drawing>
-                <wp:inline distB="114300" distT="114300" distL="114300" distR="114300">
-                  <wp:extent cx="2076767" cy="3848100"/>
-                  <wp:effectExtent b="0" l="0" r="0" t="0"/>
-                  <wp:docPr id="4" name="image4.jpg"/>
-                  <a:graphic>
-                    <a:graphicData uri="http://schemas.openxmlformats.org/drawingml/2006/picture">
-                      <pic:pic>
-                        <pic:nvPicPr>
-                          <pic:cNvPr id="0" name="image4.jpg"/>
-                          <pic:cNvPicPr preferRelativeResize="0"/>
-                        </pic:nvPicPr>
-                        <pic:blipFill>
-                          <a:blip r:embed="rId7"/>
-                          <a:srcRect b="0" l="0" r="0" t="0"/>
-                          <a:stretch>
-                            <a:fillRect/>
-                          </a:stretch>
-                        </pic:blipFill>
-                        <pic:spPr>
-                          <a:xfrm>
-                            <a:off x="0" y="0"/>
-                            <a:ext cx="2076767" cy="3848100"/>
-                          </a:xfrm>
-                          <a:prstGeom prst="rect"/>
-                          <a:ln/>
-                        </pic:spPr>
-                      </pic:pic>
-                    </a:graphicData>
-                  </a:graphic>
-                </wp:inline>
-              </w:drawing>
-            </w:r>
-            <w:r>
-              <w:rPr>
-                <w:color w:val="000000"/>
-                <w:rtl w:val="0"/>
-              </w:rPr>
-            </w:r>
-          </w:p>
-        </w:tc>
-      </w:tr>
-    </w:tbl>
-    <w:p>
-      <w:pPr>
-        <w:rPr/>
-      </w:pPr>
-      <w:r>
-        <w:rPr>
-          <w:rtl w:val="0"/>
-        </w:rPr>
-      </w:r>
-    </w:p>
-    <w:tbl>
-      <w:tblPr>
-        <w:tblStyle w:val="Table7"/>
-        <w:tblW w:w="10092.0" w:type="dxa"/>
-        <w:jc w:val="center"/>
-        <w:tblLayout w:type="fixed"/>
-        <w:tblLook w:val="0400"/>
-      </w:tblPr>
-      <w:tblGrid>
-        <w:gridCol w:w="10092"/>
-        <w:tblGridChange w:id="0">
-          <w:tblGrid>
-            <w:gridCol w:w="10092"/>
-          </w:tblGrid>
-        </w:tblGridChange>
-      </w:tblGrid>
-      <w:tr>
-        <w:trPr>
-          <w:cantSplit w:val="0"/>
-          <w:tblHeader w:val="0"/>
-        </w:trPr>
-        <w:tc>
-          <w:tcPr>
-            <w:tcBorders>
-              <w:top w:color="a6a6a6" w:space="0" w:sz="8" w:val="single"/>
-              <w:left w:color="a6a6a6" w:space="0" w:sz="8" w:val="single"/>
-              <w:bottom w:color="a6a6a6" w:space="0" w:sz="8" w:val="single"/>
-              <w:right w:color="a6a6a6" w:space="0" w:sz="8" w:val="single"/>
-            </w:tcBorders>
-            <w:shd w:fill="f5f5f5" w:val="clear"/>
-          </w:tcPr>
-          <w:p>
-            <w:pPr>
-              <w:spacing w:after="560" w:before="560" w:lineRule="auto"/>
-              <w:jc w:val="center"/>
-              <w:rPr/>
-            </w:pPr>
-            <w:r>
-              <w:rPr>
-                <w:rFonts w:ascii="Calibri" w:cs="Calibri" w:eastAsia="Calibri" w:hAnsi="Calibri"/>
-                <w:b w:val="0"/>
-                <w:bCs w:val="0"/>
-                <w:i w:val="1"/>
-                <w:iCs w:val="1"/>
-                <w:color w:val="000000"/>
-                <w:sz w:val="20"/>
-                <w:szCs w:val="20"/>
-                <w:rtl w:val="0"/>
-              </w:rPr>
-              <w:t xml:space="preserve">Screenshot: Primary editor — background removed</w:t>
-            </w:r>
-            <w:r>
-              <w:rPr>
-                <w:rFonts w:ascii="Calibri" w:cs="Calibri" w:eastAsia="Calibri" w:hAnsi="Calibri"/>
-                <w:b w:val="0"/>
-                <w:bCs w:val="0"/>
-                <w:i w:val="1"/>
-                <w:iCs w:val="1"/>
-                <w:color w:val="000000"/>
-                <w:sz w:val="20"/>
-                <w:szCs w:val="20"/>
-                <w:rtl w:val="0"/>
-              </w:rPr>
-              <w:br w:type="textWrapping"/>
-            </w:r>
-            <w:r>
-              <w:rPr>
-                <w:rFonts w:ascii="Calibri" w:cs="Calibri" w:eastAsia="Calibri" w:hAnsi="Calibri"/>
-                <w:b w:val="0"/>
-                <w:bCs w:val="0"/>
-                <w:i w:val="1"/>
-                <w:iCs w:val="1"/>
-                <w:color w:val="000000"/>
-                <w:sz w:val="20"/>
-                <w:szCs w:val="20"/>
-              </w:rPr>
-              <w:drawing>
-                <wp:inline distB="114300" distT="114300" distL="114300" distR="114300">
-                  <wp:extent cx="3190875" cy="6181241"/>
-                  <wp:effectExtent b="0" l="0" r="0" t="0"/>
-                  <wp:docPr id="1" name="image1.jpg"/>
-                  <a:graphic>
-                    <a:graphicData uri="http://schemas.openxmlformats.org/drawingml/2006/picture">
-                      <pic:pic>
-                        <pic:nvPicPr>
-                          <pic:cNvPr id="0" name="image1.jpg"/>
-                          <pic:cNvPicPr preferRelativeResize="0"/>
-                        </pic:nvPicPr>
-                        <pic:blipFill>
-                          <a:blip r:embed="rId8"/>
-                          <a:srcRect b="0" l="0" r="0" t="0"/>
-                          <a:stretch>
-                            <a:fillRect/>
-                          </a:stretch>
-                        </pic:blipFill>
-                        <pic:spPr>
-                          <a:xfrm>
-                            <a:off x="0" y="0"/>
-                            <a:ext cx="3190875" cy="6181241"/>
-                          </a:xfrm>
-                          <a:prstGeom prst="rect"/>
-                          <a:ln/>
-                        </pic:spPr>
-                      </pic:pic>
-                    </a:graphicData>
-                  </a:graphic>
-                </wp:inline>
-              </w:drawing>
-            </w:r>
-            <w:r>
-              <w:rPr>
-                <w:color w:val="000000"/>
-                <w:rtl w:val="0"/>
-              </w:rPr>
-            </w:r>
-          </w:p>
-        </w:tc>
-      </w:tr>
-    </w:tbl>
-    <w:p>
-      <w:pPr>
-        <w:rPr/>
-      </w:pPr>
-      <w:r>
-        <w:rPr>
-          <w:rtl w:val="0"/>
-        </w:rPr>
-      </w:r>
-    </w:p>
-    <w:tbl>
-      <w:tblPr>
-        <w:tblStyle w:val="Table8"/>
-        <w:tblW w:w="10092.0" w:type="dxa"/>
-        <w:jc w:val="center"/>
-        <w:tblLayout w:type="fixed"/>
-        <w:tblLook w:val="0400"/>
-      </w:tblPr>
-      <w:tblGrid>
-        <w:gridCol w:w="10092"/>
-        <w:tblGridChange w:id="0">
-          <w:tblGrid>
-            <w:gridCol w:w="10092"/>
-          </w:tblGrid>
-        </w:tblGridChange>
-      </w:tblGrid>
-      <w:tr>
-        <w:trPr>
-          <w:cantSplit w:val="0"/>
-          <w:tblHeader w:val="0"/>
-        </w:trPr>
-        <w:tc>
-          <w:tcPr>
-            <w:tcBorders>
-              <w:top w:color="a6a6a6" w:space="0" w:sz="8" w:val="single"/>
-              <w:left w:color="a6a6a6" w:space="0" w:sz="8" w:val="single"/>
-              <w:bottom w:color="a6a6a6" w:space="0" w:sz="8" w:val="single"/>
-              <w:right w:color="a6a6a6" w:space="0" w:sz="8" w:val="single"/>
-            </w:tcBorders>
-            <w:shd w:fill="f5f5f5" w:val="clear"/>
-          </w:tcPr>
-          <w:p>
-            <w:pPr>
-              <w:spacing w:after="560" w:before="560" w:lineRule="auto"/>
-              <w:jc w:val="center"/>
-              <w:rPr/>
-            </w:pPr>
-            <w:r>
-              <w:rPr>
-                <w:rFonts w:ascii="Calibri" w:cs="Calibri" w:eastAsia="Calibri" w:hAnsi="Calibri"/>
-                <w:b w:val="0"/>
-                <w:bCs w:val="0"/>
-                <w:i w:val="1"/>
-                <w:iCs w:val="1"/>
-                <w:color w:val="000000"/>
-                <w:sz w:val="20"/>
-                <w:szCs w:val="20"/>
-                <w:rtl w:val="0"/>
-              </w:rPr>
-              <w:t xml:space="preserve">Screenshot: After Shape — old background returns</w:t>
-            </w:r>
-            <w:r>
-              <w:rPr>
-                <w:rFonts w:ascii="Calibri" w:cs="Calibri" w:eastAsia="Calibri" w:hAnsi="Calibri"/>
-                <w:b w:val="0"/>
-                <w:bCs w:val="0"/>
-                <w:i w:val="1"/>
-                <w:iCs w:val="1"/>
-                <w:color w:val="000000"/>
-                <w:sz w:val="20"/>
-                <w:szCs w:val="20"/>
-                <w:rtl w:val="0"/>
-              </w:rPr>
-              <w:br w:type="textWrapping"/>
-            </w:r>
-            <w:r>
-              <w:rPr>
-                <w:rFonts w:ascii="Calibri" w:cs="Calibri" w:eastAsia="Calibri" w:hAnsi="Calibri"/>
-                <w:b w:val="0"/>
-                <w:bCs w:val="0"/>
-                <w:i w:val="1"/>
-                <w:iCs w:val="1"/>
-                <w:color w:val="000000"/>
-                <w:sz w:val="20"/>
-                <w:szCs w:val="20"/>
-              </w:rPr>
-              <w:drawing>
-                <wp:inline distB="114300" distT="114300" distL="114300" distR="114300">
-                  <wp:extent cx="1623695" cy="3790950"/>
-                  <wp:effectExtent b="0" l="0" r="0" t="0"/>
-                  <wp:docPr id="3" name="image2.jpg"/>
-                  <a:graphic>
-                    <a:graphicData uri="http://schemas.openxmlformats.org/drawingml/2006/picture">
-                      <pic:pic>
-                        <pic:nvPicPr>
-                          <pic:cNvPr id="0" name="image2.jpg"/>
-                          <pic:cNvPicPr preferRelativeResize="0"/>
-                        </pic:nvPicPr>
-                        <pic:blipFill>
-                          <a:blip r:embed="rId9"/>
-                          <a:srcRect b="0" l="0" r="0" t="0"/>
-                          <a:stretch>
-                            <a:fillRect/>
-                          </a:stretch>
-                        </pic:blipFill>
-                        <pic:spPr>
-                          <a:xfrm>
-                            <a:off x="0" y="0"/>
-                            <a:ext cx="1623695" cy="3790950"/>
-                          </a:xfrm>
-                          <a:prstGeom prst="rect"/>
-                          <a:ln/>
-                        </pic:spPr>
-                      </pic:pic>
-                    </a:graphicData>
-                  </a:graphic>
-                </wp:inline>
-              </w:drawing>
-            </w:r>
-            <w:r>
-              <w:rPr>
-                <w:rFonts w:ascii="Calibri" w:cs="Calibri" w:eastAsia="Calibri" w:hAnsi="Calibri"/>
-                <w:b w:val="0"/>
-                <w:bCs w:val="0"/>
-                <w:i w:val="1"/>
-                <w:iCs w:val="1"/>
-                <w:color w:val="000000"/>
-                <w:sz w:val="20"/>
-                <w:szCs w:val="20"/>
-              </w:rPr>
-              <w:drawing>
-                <wp:inline distB="114300" distT="114300" distL="114300" distR="114300">
-                  <wp:extent cx="1729105" cy="3790950"/>
-                  <wp:effectExtent b="0" l="0" r="0" t="0"/>
-                  <wp:docPr id="2" name="image3.jpg"/>
-                  <a:graphic>
-                    <a:graphicData uri="http://schemas.openxmlformats.org/drawingml/2006/picture">
-                      <pic:pic>
-                        <pic:nvPicPr>
-                          <pic:cNvPr id="0" name="image3.jpg"/>
-                          <pic:cNvPicPr preferRelativeResize="0"/>
-                        </pic:nvPicPr>
-                        <pic:blipFill>
-                          <a:blip r:embed="rId10"/>
-                          <a:srcRect b="0" l="0" r="0" t="0"/>
-                          <a:stretch>
-                            <a:fillRect/>
-                          </a:stretch>
-                        </pic:blipFill>
-                        <pic:spPr>
-                          <a:xfrm>
-                            <a:off x="0" y="0"/>
-                            <a:ext cx="1729105" cy="3790950"/>
-                          </a:xfrm>
-                          <a:prstGeom prst="rect"/>
-                          <a:ln/>
-                        </pic:spPr>
-                      </pic:pic>
-                    </a:graphicData>
-                  </a:graphic>
-                </wp:inline>
-              </w:drawing>
-            </w:r>
-            <w:r>
-              <w:rPr>
-                <w:color w:val="000000"/>
-                <w:rtl w:val="0"/>
-              </w:rPr>
-            </w:r>
-          </w:p>
-        </w:tc>
-      </w:tr>
-    </w:tbl>
-    <w:p>
-      <w:pPr>
-        <w:rPr/>
-      </w:pPr>
-      <w:r>
-        <w:rPr>
-          <w:rtl w:val="0"/>
-        </w:rPr>
-      </w:r>
-    </w:p>
-    <w:p>
-      <w:pPr>
-        <w:spacing w:after="120" w:before="160" w:lineRule="auto"/>
-        <w:rPr/>
-      </w:pPr>
-      <w:r>
-        <w:rPr>
-          <w:rFonts w:ascii="Calibri" w:cs="Calibri" w:eastAsia="Calibri" w:hAnsi="Calibri"/>
-          <w:b w:val="1"/>
-          <w:bCs w:val="1"/>
-          <w:i w:val="0"/>
-          <w:iCs w:val="0"/>
-          <w:color w:val="404040"/>
-          <w:sz w:val="22"/>
-          <w:szCs w:val="22"/>
-          <w:rtl w:val="0"/>
-        </w:rPr>
-        <w:t xml:space="preserve">Notes</w:t>
-      </w:r>
-      <w:r>
-        <w:rPr>
-          <w:rtl w:val="0"/>
-        </w:rPr>
-      </w:r>
-    </w:p>
-    <w:p>
-      <w:pPr>
-        <w:spacing w:after="120" w:lineRule="auto"/>
-        <w:rPr/>
-      </w:pPr>
-      <w:r>
-        <w:rPr>
-          <w:rFonts w:ascii="Calibri" w:cs="Calibri" w:eastAsia="Calibri" w:hAnsi="Calibri"/>
-          <w:b w:val="0"/>
-          <w:bCs w:val="0"/>
-          <w:i w:val="0"/>
-          <w:iCs w:val="0"/>
-          <w:color w:val="333333"/>
-          <w:sz w:val="20"/>
-          <w:szCs w:val="22"/>
-          <w:rtl w:val="0"/>
-        </w:rPr>
-        <w:t>Decision: Do not count as a blocker bug. Keep the finding as SUG-001 so the report still shows product thinking: preserve cleared-image state in Shape, or clearly tell the user that Shape uses the original photo. Screenshots remain as supporting evidence.</w:t>
+        <w:t>No product bugs are logged at this time. Findings that look like defects were checked against competitor behavior and product scope; improvement ideas are listed under Suggestions.</w:t>
       </w:r>
       <w:r>
         <w:rPr>
@@ -5954,12 +4537,582 @@
       <w:r>
         <w:rPr>
           <w:rFonts w:ascii="Calibri" w:hAnsi="Calibri" w:eastAsia="Calibri"/>
-          <w:b w:val="0"/>
-          <w:i/>
-          <w:color w:val="666666"/>
-          <w:sz w:val="18"/>
+          <w:b/>
+          <w:i w:val="0"/>
+          <w:color w:val="333333"/>
+          <w:sz w:val="20"/>
         </w:rPr>
-        <w:t>Evidence: screenshots kept under Section 2 (reclassified item).</w:t>
+        <w:t>Evidence (from testing Shape after background remove):</w:t>
+      </w:r>
+    </w:p>
+    <w:tbl>
+      <w:tblPr>
+        <w:tblStyle w:val="Table5"/>
+        <w:tblW w:w="10092.0" w:type="dxa"/>
+        <w:jc w:val="center"/>
+        <w:tblLayout w:type="fixed"/>
+        <w:tblLook w:val="0400"/>
+      </w:tblPr>
+      <w:tblGrid>
+        <w:gridCol w:w="10092"/>
+        <w:tblGridChange w:id="0">
+          <w:tblGrid>
+            <w:gridCol w:w="10092"/>
+          </w:tblGrid>
+        </w:tblGridChange>
+      </w:tblGrid>
+      <w:tr>
+        <w:trPr>
+          <w:cantSplit w:val="0"/>
+          <w:tblHeader w:val="0"/>
+        </w:trPr>
+        <w:tc>
+          <w:tcPr>
+            <w:tcBorders>
+              <w:top w:color="a6a6a6" w:space="0" w:sz="8" w:val="single"/>
+              <w:left w:color="a6a6a6" w:space="0" w:sz="8" w:val="single"/>
+              <w:bottom w:color="a6a6a6" w:space="0" w:sz="8" w:val="single"/>
+              <w:right w:color="a6a6a6" w:space="0" w:sz="8" w:val="single"/>
+            </w:tcBorders>
+            <w:shd w:fill="f5f5f5" w:val="clear"/>
+          </w:tcPr>
+          <w:p>
+            <w:pPr>
+              <w:spacing w:after="560" w:before="560" w:lineRule="auto"/>
+              <w:jc w:val="center"/>
+              <w:rPr/>
+            </w:pPr>
+            <w:r>
+              <w:rPr>
+                <w:rFonts w:ascii="Calibri" w:cs="Calibri" w:eastAsia="Calibri" w:hAnsi="Calibri"/>
+                <w:b w:val="0"/>
+                <w:bCs w:val="0"/>
+                <w:i w:val="1"/>
+                <w:iCs w:val="1"/>
+                <w:color w:val="000000"/>
+                <w:sz w:val="20"/>
+                <w:szCs w:val="20"/>
+                <w:rtl w:val="0"/>
+              </w:rPr>
+              <w:t xml:space="preserve">Screenshot: Homepage → Background Remove </w:t>
+            </w:r>
+            <w:r>
+              <w:rPr>
+                <w:rFonts w:ascii="Calibri" w:cs="Calibri" w:eastAsia="Calibri" w:hAnsi="Calibri"/>
+                <w:i w:val="1"/>
+                <w:iCs w:val="1"/>
+                <w:color w:val="000000"/>
+                <w:sz w:val="20"/>
+                <w:szCs w:val="20"/>
+                <w:rtl w:val="0"/>
+              </w:rPr>
+              <w:t xml:space="preserve">→ Processing</w:t>
+            </w:r>
+            <w:r>
+              <w:rPr>
+                <w:rFonts w:ascii="Calibri" w:cs="Calibri" w:eastAsia="Calibri" w:hAnsi="Calibri"/>
+                <w:b w:val="0"/>
+                <w:bCs w:val="0"/>
+                <w:i w:val="1"/>
+                <w:iCs w:val="1"/>
+                <w:color w:val="000000"/>
+                <w:sz w:val="20"/>
+                <w:szCs w:val="20"/>
+                <w:rtl w:val="0"/>
+              </w:rPr>
+              <w:br w:type="textWrapping"/>
+            </w:r>
+            <w:r>
+              <w:rPr>
+                <w:rFonts w:ascii="Calibri" w:cs="Calibri" w:eastAsia="Calibri" w:hAnsi="Calibri"/>
+                <w:i w:val="1"/>
+                <w:iCs w:val="1"/>
+                <w:color w:val="000000"/>
+                <w:sz w:val="20"/>
+                <w:szCs w:val="20"/>
+              </w:rPr>
+              <w:drawing>
+                <wp:inline distB="114300" distT="114300" distL="114300" distR="114300">
+                  <wp:extent cx="2238375" cy="4027589"/>
+                  <wp:effectExtent b="0" l="0" r="0" t="0"/>
+                  <wp:docPr id="5" name="image5.jpg"/>
+                  <a:graphic>
+                    <a:graphicData uri="http://schemas.openxmlformats.org/drawingml/2006/picture">
+                      <pic:pic>
+                        <pic:nvPicPr>
+                          <pic:cNvPr id="0" name="image5.jpg"/>
+                          <pic:cNvPicPr preferRelativeResize="0"/>
+                        </pic:nvPicPr>
+                        <pic:blipFill>
+                          <a:blip r:embed="rId6"/>
+                          <a:srcRect b="35424" l="0" r="0" t="0"/>
+                          <a:stretch>
+                            <a:fillRect/>
+                          </a:stretch>
+                        </pic:blipFill>
+                        <pic:spPr>
+                          <a:xfrm>
+                            <a:off x="0" y="0"/>
+                            <a:ext cx="2238375" cy="4027589"/>
+                          </a:xfrm>
+                          <a:prstGeom prst="rect"/>
+                          <a:ln/>
+                        </pic:spPr>
+                      </pic:pic>
+                    </a:graphicData>
+                  </a:graphic>
+                </wp:inline>
+              </w:drawing>
+            </w:r>
+            <w:r>
+              <w:rPr>
+                <w:color w:val="000000"/>
+                <w:rtl w:val="0"/>
+              </w:rPr>
+            </w:r>
+          </w:p>
+        </w:tc>
+      </w:tr>
+    </w:tbl>
+    <w:p>
+      <w:pPr>
+        <w:rPr/>
+      </w:pPr>
+      <w:r>
+        <w:rPr>
+          <w:rtl w:val="0"/>
+        </w:rPr>
+      </w:r>
+    </w:p>
+    <w:tbl>
+      <w:tblPr>
+        <w:tblStyle w:val="Table6"/>
+        <w:tblW w:w="10092.0" w:type="dxa"/>
+        <w:jc w:val="center"/>
+        <w:tblLayout w:type="fixed"/>
+        <w:tblLook w:val="0400"/>
+      </w:tblPr>
+      <w:tblGrid>
+        <w:gridCol w:w="10092"/>
+        <w:tblGridChange w:id="0">
+          <w:tblGrid>
+            <w:gridCol w:w="10092"/>
+          </w:tblGrid>
+        </w:tblGridChange>
+      </w:tblGrid>
+      <w:tr>
+        <w:trPr>
+          <w:cantSplit w:val="0"/>
+          <w:tblHeader w:val="0"/>
+        </w:trPr>
+        <w:tc>
+          <w:tcPr>
+            <w:tcBorders>
+              <w:top w:color="a6a6a6" w:space="0" w:sz="8" w:val="single"/>
+              <w:left w:color="a6a6a6" w:space="0" w:sz="8" w:val="single"/>
+              <w:bottom w:color="a6a6a6" w:space="0" w:sz="8" w:val="single"/>
+              <w:right w:color="a6a6a6" w:space="0" w:sz="8" w:val="single"/>
+            </w:tcBorders>
+            <w:shd w:fill="f5f5f5" w:val="clear"/>
+          </w:tcPr>
+          <w:p>
+            <w:pPr>
+              <w:spacing w:after="560" w:before="560" w:lineRule="auto"/>
+              <w:jc w:val="center"/>
+              <w:rPr/>
+            </w:pPr>
+            <w:r>
+              <w:rPr>
+                <w:rFonts w:ascii="Calibri" w:cs="Calibri" w:eastAsia="Calibri" w:hAnsi="Calibri"/>
+                <w:b w:val="0"/>
+                <w:bCs w:val="0"/>
+                <w:i w:val="1"/>
+                <w:iCs w:val="1"/>
+                <w:color w:val="000000"/>
+                <w:sz w:val="20"/>
+                <w:szCs w:val="20"/>
+                <w:rtl w:val="0"/>
+              </w:rPr>
+              <w:t xml:space="preserve">Screenshot: Gallery — photo selected, Continue</w:t>
+            </w:r>
+            <w:r>
+              <w:rPr>
+                <w:rFonts w:ascii="Calibri" w:cs="Calibri" w:eastAsia="Calibri" w:hAnsi="Calibri"/>
+                <w:b w:val="0"/>
+                <w:bCs w:val="0"/>
+                <w:i w:val="1"/>
+                <w:iCs w:val="1"/>
+                <w:color w:val="000000"/>
+                <w:sz w:val="20"/>
+                <w:szCs w:val="20"/>
+                <w:rtl w:val="0"/>
+              </w:rPr>
+              <w:br w:type="textWrapping"/>
+            </w:r>
+            <w:r>
+              <w:rPr>
+                <w:rFonts w:ascii="Calibri" w:cs="Calibri" w:eastAsia="Calibri" w:hAnsi="Calibri"/>
+                <w:b w:val="0"/>
+                <w:bCs w:val="0"/>
+                <w:i w:val="1"/>
+                <w:iCs w:val="1"/>
+                <w:color w:val="000000"/>
+                <w:sz w:val="20"/>
+                <w:szCs w:val="20"/>
+              </w:rPr>
+              <w:drawing>
+                <wp:inline distB="114300" distT="114300" distL="114300" distR="114300">
+                  <wp:extent cx="2076767" cy="3848100"/>
+                  <wp:effectExtent b="0" l="0" r="0" t="0"/>
+                  <wp:docPr id="4" name="image4.jpg"/>
+                  <a:graphic>
+                    <a:graphicData uri="http://schemas.openxmlformats.org/drawingml/2006/picture">
+                      <pic:pic>
+                        <pic:nvPicPr>
+                          <pic:cNvPr id="0" name="image4.jpg"/>
+                          <pic:cNvPicPr preferRelativeResize="0"/>
+                        </pic:nvPicPr>
+                        <pic:blipFill>
+                          <a:blip r:embed="rId7"/>
+                          <a:srcRect b="0" l="0" r="0" t="0"/>
+                          <a:stretch>
+                            <a:fillRect/>
+                          </a:stretch>
+                        </pic:blipFill>
+                        <pic:spPr>
+                          <a:xfrm>
+                            <a:off x="0" y="0"/>
+                            <a:ext cx="2076767" cy="3848100"/>
+                          </a:xfrm>
+                          <a:prstGeom prst="rect"/>
+                          <a:ln/>
+                        </pic:spPr>
+                      </pic:pic>
+                    </a:graphicData>
+                  </a:graphic>
+                </wp:inline>
+              </w:drawing>
+            </w:r>
+            <w:r>
+              <w:rPr>
+                <w:color w:val="000000"/>
+                <w:rtl w:val="0"/>
+              </w:rPr>
+            </w:r>
+          </w:p>
+        </w:tc>
+      </w:tr>
+    </w:tbl>
+    <w:p>
+      <w:pPr>
+        <w:rPr/>
+      </w:pPr>
+      <w:r>
+        <w:rPr>
+          <w:rtl w:val="0"/>
+        </w:rPr>
+      </w:r>
+    </w:p>
+    <w:tbl>
+      <w:tblPr>
+        <w:tblStyle w:val="Table7"/>
+        <w:tblW w:w="10092.0" w:type="dxa"/>
+        <w:jc w:val="center"/>
+        <w:tblLayout w:type="fixed"/>
+        <w:tblLook w:val="0400"/>
+      </w:tblPr>
+      <w:tblGrid>
+        <w:gridCol w:w="10092"/>
+        <w:tblGridChange w:id="0">
+          <w:tblGrid>
+            <w:gridCol w:w="10092"/>
+          </w:tblGrid>
+        </w:tblGridChange>
+      </w:tblGrid>
+      <w:tr>
+        <w:trPr>
+          <w:cantSplit w:val="0"/>
+          <w:tblHeader w:val="0"/>
+        </w:trPr>
+        <w:tc>
+          <w:tcPr>
+            <w:tcBorders>
+              <w:top w:color="a6a6a6" w:space="0" w:sz="8" w:val="single"/>
+              <w:left w:color="a6a6a6" w:space="0" w:sz="8" w:val="single"/>
+              <w:bottom w:color="a6a6a6" w:space="0" w:sz="8" w:val="single"/>
+              <w:right w:color="a6a6a6" w:space="0" w:sz="8" w:val="single"/>
+            </w:tcBorders>
+            <w:shd w:fill="f5f5f5" w:val="clear"/>
+          </w:tcPr>
+          <w:p>
+            <w:pPr>
+              <w:spacing w:after="560" w:before="560" w:lineRule="auto"/>
+              <w:jc w:val="center"/>
+              <w:rPr/>
+            </w:pPr>
+            <w:r>
+              <w:rPr>
+                <w:rFonts w:ascii="Calibri" w:cs="Calibri" w:eastAsia="Calibri" w:hAnsi="Calibri"/>
+                <w:b w:val="0"/>
+                <w:bCs w:val="0"/>
+                <w:i w:val="1"/>
+                <w:iCs w:val="1"/>
+                <w:color w:val="000000"/>
+                <w:sz w:val="20"/>
+                <w:szCs w:val="20"/>
+                <w:rtl w:val="0"/>
+              </w:rPr>
+              <w:t xml:space="preserve">Screenshot: Primary editor — background removed</w:t>
+            </w:r>
+            <w:r>
+              <w:rPr>
+                <w:rFonts w:ascii="Calibri" w:cs="Calibri" w:eastAsia="Calibri" w:hAnsi="Calibri"/>
+                <w:b w:val="0"/>
+                <w:bCs w:val="0"/>
+                <w:i w:val="1"/>
+                <w:iCs w:val="1"/>
+                <w:color w:val="000000"/>
+                <w:sz w:val="20"/>
+                <w:szCs w:val="20"/>
+                <w:rtl w:val="0"/>
+              </w:rPr>
+              <w:br w:type="textWrapping"/>
+            </w:r>
+            <w:r>
+              <w:rPr>
+                <w:rFonts w:ascii="Calibri" w:cs="Calibri" w:eastAsia="Calibri" w:hAnsi="Calibri"/>
+                <w:b w:val="0"/>
+                <w:bCs w:val="0"/>
+                <w:i w:val="1"/>
+                <w:iCs w:val="1"/>
+                <w:color w:val="000000"/>
+                <w:sz w:val="20"/>
+                <w:szCs w:val="20"/>
+              </w:rPr>
+              <w:drawing>
+                <wp:inline distB="114300" distT="114300" distL="114300" distR="114300">
+                  <wp:extent cx="3190875" cy="6181241"/>
+                  <wp:effectExtent b="0" l="0" r="0" t="0"/>
+                  <wp:docPr id="1" name="image1.jpg"/>
+                  <a:graphic>
+                    <a:graphicData uri="http://schemas.openxmlformats.org/drawingml/2006/picture">
+                      <pic:pic>
+                        <pic:nvPicPr>
+                          <pic:cNvPr id="0" name="image1.jpg"/>
+                          <pic:cNvPicPr preferRelativeResize="0"/>
+                        </pic:nvPicPr>
+                        <pic:blipFill>
+                          <a:blip r:embed="rId8"/>
+                          <a:srcRect b="0" l="0" r="0" t="0"/>
+                          <a:stretch>
+                            <a:fillRect/>
+                          </a:stretch>
+                        </pic:blipFill>
+                        <pic:spPr>
+                          <a:xfrm>
+                            <a:off x="0" y="0"/>
+                            <a:ext cx="3190875" cy="6181241"/>
+                          </a:xfrm>
+                          <a:prstGeom prst="rect"/>
+                          <a:ln/>
+                        </pic:spPr>
+                      </pic:pic>
+                    </a:graphicData>
+                  </a:graphic>
+                </wp:inline>
+              </w:drawing>
+            </w:r>
+            <w:r>
+              <w:rPr>
+                <w:color w:val="000000"/>
+                <w:rtl w:val="0"/>
+              </w:rPr>
+            </w:r>
+          </w:p>
+        </w:tc>
+      </w:tr>
+    </w:tbl>
+    <w:p>
+      <w:pPr>
+        <w:rPr/>
+      </w:pPr>
+      <w:r>
+        <w:rPr>
+          <w:rtl w:val="0"/>
+        </w:rPr>
+      </w:r>
+    </w:p>
+    <w:tbl>
+      <w:tblPr>
+        <w:tblStyle w:val="Table8"/>
+        <w:tblW w:w="10092.0" w:type="dxa"/>
+        <w:jc w:val="center"/>
+        <w:tblLayout w:type="fixed"/>
+        <w:tblLook w:val="0400"/>
+      </w:tblPr>
+      <w:tblGrid>
+        <w:gridCol w:w="10092"/>
+        <w:tblGridChange w:id="0">
+          <w:tblGrid>
+            <w:gridCol w:w="10092"/>
+          </w:tblGrid>
+        </w:tblGridChange>
+      </w:tblGrid>
+      <w:tr>
+        <w:trPr>
+          <w:cantSplit w:val="0"/>
+          <w:tblHeader w:val="0"/>
+        </w:trPr>
+        <w:tc>
+          <w:tcPr>
+            <w:tcBorders>
+              <w:top w:color="a6a6a6" w:space="0" w:sz="8" w:val="single"/>
+              <w:left w:color="a6a6a6" w:space="0" w:sz="8" w:val="single"/>
+              <w:bottom w:color="a6a6a6" w:space="0" w:sz="8" w:val="single"/>
+              <w:right w:color="a6a6a6" w:space="0" w:sz="8" w:val="single"/>
+            </w:tcBorders>
+            <w:shd w:fill="f5f5f5" w:val="clear"/>
+          </w:tcPr>
+          <w:p>
+            <w:pPr>
+              <w:spacing w:after="560" w:before="560" w:lineRule="auto"/>
+              <w:jc w:val="center"/>
+              <w:rPr/>
+            </w:pPr>
+            <w:r>
+              <w:rPr>
+                <w:rFonts w:ascii="Calibri" w:cs="Calibri" w:eastAsia="Calibri" w:hAnsi="Calibri"/>
+                <w:b w:val="0"/>
+                <w:bCs w:val="0"/>
+                <w:i w:val="1"/>
+                <w:iCs w:val="1"/>
+                <w:color w:val="000000"/>
+                <w:sz w:val="20"/>
+                <w:szCs w:val="20"/>
+                <w:rtl w:val="0"/>
+              </w:rPr>
+              <w:t xml:space="preserve">Screenshot: After Shape — old background returns</w:t>
+            </w:r>
+            <w:r>
+              <w:rPr>
+                <w:rFonts w:ascii="Calibri" w:cs="Calibri" w:eastAsia="Calibri" w:hAnsi="Calibri"/>
+                <w:b w:val="0"/>
+                <w:bCs w:val="0"/>
+                <w:i w:val="1"/>
+                <w:iCs w:val="1"/>
+                <w:color w:val="000000"/>
+                <w:sz w:val="20"/>
+                <w:szCs w:val="20"/>
+                <w:rtl w:val="0"/>
+              </w:rPr>
+              <w:br w:type="textWrapping"/>
+            </w:r>
+            <w:r>
+              <w:rPr>
+                <w:rFonts w:ascii="Calibri" w:cs="Calibri" w:eastAsia="Calibri" w:hAnsi="Calibri"/>
+                <w:b w:val="0"/>
+                <w:bCs w:val="0"/>
+                <w:i w:val="1"/>
+                <w:iCs w:val="1"/>
+                <w:color w:val="000000"/>
+                <w:sz w:val="20"/>
+                <w:szCs w:val="20"/>
+              </w:rPr>
+              <w:drawing>
+                <wp:inline distB="114300" distT="114300" distL="114300" distR="114300">
+                  <wp:extent cx="1623695" cy="3790950"/>
+                  <wp:effectExtent b="0" l="0" r="0" t="0"/>
+                  <wp:docPr id="3" name="image2.jpg"/>
+                  <a:graphic>
+                    <a:graphicData uri="http://schemas.openxmlformats.org/drawingml/2006/picture">
+                      <pic:pic>
+                        <pic:nvPicPr>
+                          <pic:cNvPr id="0" name="image2.jpg"/>
+                          <pic:cNvPicPr preferRelativeResize="0"/>
+                        </pic:nvPicPr>
+                        <pic:blipFill>
+                          <a:blip r:embed="rId9"/>
+                          <a:srcRect b="0" l="0" r="0" t="0"/>
+                          <a:stretch>
+                            <a:fillRect/>
+                          </a:stretch>
+                        </pic:blipFill>
+                        <pic:spPr>
+                          <a:xfrm>
+                            <a:off x="0" y="0"/>
+                            <a:ext cx="1623695" cy="3790950"/>
+                          </a:xfrm>
+                          <a:prstGeom prst="rect"/>
+                          <a:ln/>
+                        </pic:spPr>
+                      </pic:pic>
+                    </a:graphicData>
+                  </a:graphic>
+                </wp:inline>
+              </w:drawing>
+            </w:r>
+            <w:r>
+              <w:rPr>
+                <w:rFonts w:ascii="Calibri" w:cs="Calibri" w:eastAsia="Calibri" w:hAnsi="Calibri"/>
+                <w:b w:val="0"/>
+                <w:bCs w:val="0"/>
+                <w:i w:val="1"/>
+                <w:iCs w:val="1"/>
+                <w:color w:val="000000"/>
+                <w:sz w:val="20"/>
+                <w:szCs w:val="20"/>
+              </w:rPr>
+              <w:drawing>
+                <wp:inline distB="114300" distT="114300" distL="114300" distR="114300">
+                  <wp:extent cx="1729105" cy="3790950"/>
+                  <wp:effectExtent b="0" l="0" r="0" t="0"/>
+                  <wp:docPr id="2" name="image3.jpg"/>
+                  <a:graphic>
+                    <a:graphicData uri="http://schemas.openxmlformats.org/drawingml/2006/picture">
+                      <pic:pic>
+                        <pic:nvPicPr>
+                          <pic:cNvPr id="0" name="image3.jpg"/>
+                          <pic:cNvPicPr preferRelativeResize="0"/>
+                        </pic:nvPicPr>
+                        <pic:blipFill>
+                          <a:blip r:embed="rId10"/>
+                          <a:srcRect b="0" l="0" r="0" t="0"/>
+                          <a:stretch>
+                            <a:fillRect/>
+                          </a:stretch>
+                        </pic:blipFill>
+                        <pic:spPr>
+                          <a:xfrm>
+                            <a:off x="0" y="0"/>
+                            <a:ext cx="1729105" cy="3790950"/>
+                          </a:xfrm>
+                          <a:prstGeom prst="rect"/>
+                          <a:ln/>
+                        </pic:spPr>
+                      </pic:pic>
+                    </a:graphicData>
+                  </a:graphic>
+                </wp:inline>
+              </w:drawing>
+            </w:r>
+            <w:r>
+              <w:rPr>
+                <w:color w:val="000000"/>
+                <w:rtl w:val="0"/>
+              </w:rPr>
+            </w:r>
+          </w:p>
+        </w:tc>
+      </w:tr>
+    </w:tbl>
+    <w:p>
+      <w:pPr>
+        <w:rPr/>
+      </w:pPr>
+      <w:r>
+        <w:rPr>
+          <w:rtl w:val="0"/>
+        </w:rPr>
       </w:r>
     </w:p>
     <w:p>
@@ -12454,13 +11607,13 @@
         </w:tc>
         <w:tc>
           <w:tcPr>
-            <w:shd w:fill="FFFFFF" w:val="clear"/>
             <w:tcBorders>
               <w:top w:val="single" w:sz="4" w:color="BFBFBF"/>
               <w:left w:val="single" w:sz="4" w:color="BFBFBF"/>
               <w:bottom w:val="single" w:sz="4" w:color="BFBFBF"/>
               <w:right w:val="single" w:sz="4" w:color="BFBFBF"/>
             </w:tcBorders>
+            <w:shd w:fill="FFFFFF" w:val="clear"/>
           </w:tcPr>
           <w:p>
             <w:pPr>
@@ -12475,7 +11628,7 @@
                 <w:color w:val="333333"/>
                 <w:sz w:val="18"/>
               </w:rPr>
-              <w:t>0 (Shape item reclassified to SUG-001 after competitor check)</w:t>
+              <w:t>0</w:t>
             </w:r>
           </w:p>
         </w:tc>
@@ -12799,13 +11952,13 @@
         </w:tc>
         <w:tc>
           <w:tcPr>
-            <w:shd w:fill="FFFFFF" w:val="clear"/>
             <w:tcBorders>
               <w:top w:val="single" w:sz="4" w:color="BFBFBF"/>
               <w:left w:val="single" w:sz="4" w:color="BFBFBF"/>
               <w:bottom w:val="single" w:sz="4" w:color="BFBFBF"/>
               <w:right w:val="single" w:sz="4" w:color="BFBFBF"/>
             </w:tcBorders>
+            <w:shd w:fill="FFFFFF" w:val="clear"/>
           </w:tcPr>
           <w:p>
             <w:pPr>
@@ -12820,7 +11973,7 @@
                 <w:color w:val="333333"/>
                 <w:sz w:val="18"/>
               </w:rPr>
-              <w:t>Single-photo flow is solid and UI is easy to understand. Main product advantage vs competitors is Batch Remover (up to 20). Biggest improvement opportunity: make Batch quality match single-photo results and allow shared primary/secondary edits across the batch.</w:t>
+              <w:t>Single-photo flow is solid and UI is easy to understand. Main product advantage vs competitors is Batch Remover (up to 20). Biggest improvement opportunity: make Batch quality match single-photo results and allow shared primary/secondary edits across the batch. Shape restore behavior is tracked as SUG-001.</w:t>
             </w:r>
           </w:p>
         </w:tc>

</xml_diff>

<commit_message>
Log Batch BUG-001 and refine batch strength/suggestion
Document inaccurate batch background removal, thumbnail vs opened-image
mismatch, and inconsistent results; strengthen STR-001 multi-edit value
and align SUG-003 with single-photo quality goals.

Co-authored-by: Showravkarmakar <Showrav88@users.noreply.github.com>
</commit_message>
<xml_diff>
--- a/SQA_Intern_Assignment_Test_Report.docx
+++ b/SQA_Intern_Assignment_Test_Report.docx
@@ -3203,6 +3203,7 @@
                 <w:color w:val="333333"/>
                 <w:sz w:val="16"/>
               </w:rPr>
+              <w:t>BUG-001</w:t>
             </w:r>
           </w:p>
         </w:tc>
@@ -3446,6 +3447,7 @@
                 <w:color w:val="333333"/>
                 <w:sz w:val="16"/>
               </w:rPr>
+              <w:t>BUG-001</w:t>
             </w:r>
           </w:p>
         </w:tc>
@@ -3689,6 +3691,7 @@
                 <w:color w:val="333333"/>
                 <w:sz w:val="16"/>
               </w:rPr>
+              <w:t>BUG-001</w:t>
             </w:r>
           </w:p>
         </w:tc>
@@ -3800,57 +3803,7 @@
           <w:szCs w:val="22"/>
           <w:rtl w:val="0"/>
         </w:rPr>
-        <w:t>No product bugs are logged at this time. Findings that look like defects were checked against competitor behavior and product scope; improvement ideas are listed under Suggestions.</w:t>
-      </w:r>
-      <w:r>
-        <w:rPr>
-          <w:rtl w:val="0"/>
-        </w:rPr>
-      </w:r>
-    </w:p>
-    <w:p>
-      <w:pPr>
-        <w:spacing w:after="120" w:before="280" w:lineRule="auto"/>
-        <w:rPr/>
-      </w:pPr>
-      <w:r>
-        <w:rPr>
-          <w:rFonts w:ascii="Calibri" w:cs="Calibri" w:eastAsia="Calibri" w:hAnsi="Calibri"/>
-          <w:b w:val="1"/>
-          <w:bCs w:val="1"/>
-          <w:i w:val="0"/>
-          <w:iCs w:val="0"/>
-          <w:color w:val="1f4e79"/>
-          <w:sz w:val="32"/>
-          <w:szCs w:val="32"/>
-          <w:rtl w:val="0"/>
-        </w:rPr>
-        <w:t xml:space="preserve">3. Strengths Observed</w:t>
-      </w:r>
-      <w:r>
-        <w:rPr>
-          <w:rtl w:val="0"/>
-        </w:rPr>
-      </w:r>
-    </w:p>
-    <w:p>
-      <w:pPr>
-        <w:spacing w:after="120" w:lineRule="auto"/>
-        <w:rPr/>
-      </w:pPr>
-      <w:r>
-        <w:rPr>
-          <w:rFonts w:ascii="Calibri" w:cs="Calibri" w:eastAsia="Calibri" w:hAnsi="Calibri"/>
-          <w:b w:val="0"/>
-          <w:bCs w:val="0"/>
-          <w:i w:val="0"/>
-          <w:iCs w:val="0"/>
-          <w:color w:val="333333"/>
-          <w:sz w:val="22"/>
-          <w:szCs w:val="22"/>
-          <w:rtl w:val="0"/>
-        </w:rPr>
-        <w:t>Strengths below are based on product comparison and hands-on testing. Competitors are strong on single/portrait photos; this app’s clear advantage is Batch Remover.</w:t>
+        <w:t>Severity guide: Critical = crash/blocker; High = major feature broken; Medium = workaround exists; Low = minor.</w:t>
       </w:r>
       <w:r>
         <w:rPr>
@@ -3867,10 +3820,10 @@
           <w:rFonts w:ascii="Calibri" w:hAnsi="Calibri" w:eastAsia="Calibri"/>
           <w:b/>
           <w:i w:val="0"/>
-          <w:color w:val="375E23"/>
+          <w:color w:val="2E75B6"/>
           <w:sz w:val="26"/>
         </w:rPr>
-        <w:t>STR-001: Batch Remover (up to 20 photos) is a clear product advantage</w:t>
+        <w:t>BUG-001: Batch background remove is inaccurate and preview does not match opened image</w:t>
       </w:r>
     </w:p>
     <w:tbl>
@@ -3931,6 +3884,588 @@
               <w:rPr>
                 <w:sz w:val="16"/>
               </w:rPr>
+              <w:t xml:space="preserve">Module</w:t>
+            </w:r>
+          </w:p>
+        </w:tc>
+        <w:tc>
+          <w:tcPr>
+            <w:shd w:val="clear" w:fill="FFFFFF"/>
+          </w:tcPr>
+          <w:p>
+            <w:r>
+              <w:rPr>
+                <w:sz w:val="16"/>
+              </w:rPr>
+              <w:t xml:space="preserve">Batch Remover</w:t>
+            </w:r>
+          </w:p>
+        </w:tc>
+      </w:tr>
+      <w:tr>
+        <w:tc>
+          <w:tcPr>
+            <w:shd w:val="clear" w:fill="F2F2F2"/>
+          </w:tcPr>
+          <w:p>
+            <w:r>
+              <w:rPr>
+                <w:sz w:val="16"/>
+              </w:rPr>
+              <w:t xml:space="preserve">Quality Area</w:t>
+            </w:r>
+          </w:p>
+        </w:tc>
+        <w:tc>
+          <w:tcPr>
+            <w:shd w:val="clear" w:fill="F2F2F2"/>
+          </w:tcPr>
+          <w:p>
+            <w:r>
+              <w:rPr>
+                <w:sz w:val="16"/>
+              </w:rPr>
+              <w:t xml:space="preserve">Functionality, Stability, Performance</w:t>
+            </w:r>
+          </w:p>
+        </w:tc>
+      </w:tr>
+      <w:tr>
+        <w:tc>
+          <w:tcPr>
+            <w:shd w:val="clear" w:fill="FFFFFF"/>
+          </w:tcPr>
+          <w:p>
+            <w:r>
+              <w:rPr>
+                <w:sz w:val="16"/>
+              </w:rPr>
+              <w:t xml:space="preserve">Severity</w:t>
+            </w:r>
+          </w:p>
+        </w:tc>
+        <w:tc>
+          <w:tcPr>
+            <w:shd w:val="clear" w:fill="FFFFFF"/>
+          </w:tcPr>
+          <w:p>
+            <w:r>
+              <w:rPr>
+                <w:sz w:val="16"/>
+              </w:rPr>
+              <w:t xml:space="preserve">High</w:t>
+            </w:r>
+          </w:p>
+        </w:tc>
+      </w:tr>
+      <w:tr>
+        <w:tc>
+          <w:tcPr>
+            <w:shd w:val="clear" w:fill="F2F2F2"/>
+          </w:tcPr>
+          <w:p>
+            <w:r>
+              <w:rPr>
+                <w:sz w:val="16"/>
+              </w:rPr>
+              <w:t xml:space="preserve">Environment</w:t>
+            </w:r>
+          </w:p>
+        </w:tc>
+        <w:tc>
+          <w:tcPr>
+            <w:shd w:val="clear" w:fill="F2F2F2"/>
+          </w:tcPr>
+          <w:p>
+            <w:r>
+              <w:rPr>
+                <w:sz w:val="16"/>
+              </w:rPr>
+              <w:t xml:space="preserve">OnePlus 9 5G · OxygenOS 13.1 · App v2.7</w:t>
+            </w:r>
+          </w:p>
+        </w:tc>
+      </w:tr>
+      <w:tr>
+        <w:tc>
+          <w:tcPr>
+            <w:shd w:val="clear" w:fill="FFFFFF"/>
+          </w:tcPr>
+          <w:p>
+            <w:r>
+              <w:rPr>
+                <w:sz w:val="16"/>
+              </w:rPr>
+              <w:t xml:space="preserve">Frequency</w:t>
+            </w:r>
+          </w:p>
+        </w:tc>
+        <w:tc>
+          <w:tcPr>
+            <w:shd w:val="clear" w:fill="FFFFFF"/>
+          </w:tcPr>
+          <w:p>
+            <w:r>
+              <w:rPr>
+                <w:sz w:val="16"/>
+              </w:rPr>
+              <w:t xml:space="preserve">Often / not consistent (sometimes acceptable, often not)</w:t>
+            </w:r>
+          </w:p>
+        </w:tc>
+      </w:tr>
+      <w:tr>
+        <w:tc>
+          <w:tcPr>
+            <w:shd w:val="clear" w:fill="F2F2F2"/>
+          </w:tcPr>
+          <w:p>
+            <w:r>
+              <w:rPr>
+                <w:sz w:val="16"/>
+              </w:rPr>
+              <w:t xml:space="preserve">Related Test Case</w:t>
+            </w:r>
+          </w:p>
+        </w:tc>
+        <w:tc>
+          <w:tcPr>
+            <w:shd w:val="clear" w:fill="F2F2F2"/>
+          </w:tcPr>
+          <w:p>
+            <w:r>
+              <w:rPr>
+                <w:sz w:val="16"/>
+              </w:rPr>
+              <w:t xml:space="preserve">TC-BT-003</w:t>
+            </w:r>
+          </w:p>
+        </w:tc>
+      </w:tr>
+    </w:tbl>
+    <w:p>
+      <w:pPr>
+        <w:spacing w:before="160" w:after="80"/>
+      </w:pPr>
+      <w:r>
+        <w:rPr>
+          <w:rFonts w:ascii="Calibri" w:hAnsi="Calibri" w:eastAsia="Calibri"/>
+          <w:b/>
+          <w:i w:val="0"/>
+          <w:color w:val="333333"/>
+          <w:sz w:val="22"/>
+        </w:rPr>
+        <w:t>Steps to Reproduce</w:t>
+      </w:r>
+    </w:p>
+    <w:p>
+      <w:pPr>
+        <w:spacing w:before="20" w:after="40"/>
+      </w:pPr>
+      <w:r>
+        <w:rPr>
+          <w:rFonts w:ascii="Calibri" w:hAnsi="Calibri" w:eastAsia="Calibri"/>
+          <w:b w:val="0"/>
+          <w:i w:val="0"/>
+          <w:color w:val="333333"/>
+          <w:sz w:val="20"/>
+        </w:rPr>
+        <w:t>1. On Homepage, tap Batch Remover.</w:t>
+      </w:r>
+    </w:p>
+    <w:p>
+      <w:pPr>
+        <w:spacing w:before="20" w:after="40"/>
+      </w:pPr>
+      <w:r>
+        <w:rPr>
+          <w:rFonts w:ascii="Calibri" w:hAnsi="Calibri" w:eastAsia="Calibri"/>
+          <w:b w:val="0"/>
+          <w:i w:val="0"/>
+          <w:color w:val="333333"/>
+          <w:sz w:val="20"/>
+        </w:rPr>
+        <w:t>2. Upload multiple product photos (several images in one batch).</w:t>
+      </w:r>
+    </w:p>
+    <w:p>
+      <w:pPr>
+        <w:spacing w:before="20" w:after="40"/>
+      </w:pPr>
+      <w:r>
+        <w:rPr>
+          <w:rFonts w:ascii="Calibri" w:hAnsi="Calibri" w:eastAsia="Calibri"/>
+          <w:b w:val="0"/>
+          <w:i w:val="0"/>
+          <w:color w:val="333333"/>
+          <w:sz w:val="20"/>
+        </w:rPr>
+        <w:t>3. Run batch background removal and wait for results.</w:t>
+      </w:r>
+    </w:p>
+    <w:p>
+      <w:pPr>
+        <w:spacing w:before="20" w:after="40"/>
+      </w:pPr>
+      <w:r>
+        <w:rPr>
+          <w:rFonts w:ascii="Calibri" w:hAnsi="Calibri" w:eastAsia="Calibri"/>
+          <w:b w:val="0"/>
+          <w:i w:val="0"/>
+          <w:color w:val="333333"/>
+          <w:sz w:val="20"/>
+        </w:rPr>
+        <w:t>4. Check the minimized / thumbnail results (background often looks dark/black as if removed).</w:t>
+      </w:r>
+    </w:p>
+    <w:p>
+      <w:pPr>
+        <w:spacing w:before="20" w:after="40"/>
+      </w:pPr>
+      <w:r>
+        <w:rPr>
+          <w:rFonts w:ascii="Calibri" w:hAnsi="Calibri" w:eastAsia="Calibri"/>
+          <w:b w:val="0"/>
+          <w:i w:val="0"/>
+          <w:color w:val="333333"/>
+          <w:sz w:val="20"/>
+        </w:rPr>
+        <w:t>5. Tap / open one result image in full view.</w:t>
+      </w:r>
+    </w:p>
+    <w:p>
+      <w:pPr>
+        <w:spacing w:before="20" w:after="40"/>
+      </w:pPr>
+      <w:r>
+        <w:rPr>
+          <w:rFonts w:ascii="Calibri" w:hAnsi="Calibri" w:eastAsia="Calibri"/>
+          <w:b w:val="0"/>
+          <w:i w:val="0"/>
+          <w:color w:val="333333"/>
+          <w:sz w:val="20"/>
+        </w:rPr>
+        <w:t>6. Compare full image with the thumbnail result and with single-photo Background Remove quality.</w:t>
+      </w:r>
+    </w:p>
+    <w:p>
+      <w:pPr>
+        <w:spacing w:before="160" w:after="80"/>
+      </w:pPr>
+      <w:r>
+        <w:rPr>
+          <w:rFonts w:ascii="Calibri" w:hAnsi="Calibri" w:eastAsia="Calibri"/>
+          <w:b/>
+          <w:i w:val="0"/>
+          <w:color w:val="333333"/>
+          <w:sz w:val="22"/>
+        </w:rPr>
+        <w:t>Expected Result</w:t>
+      </w:r>
+    </w:p>
+    <w:p>
+      <w:pPr>
+        <w:spacing w:before="120" w:after="80"/>
+      </w:pPr>
+      <w:r>
+        <w:rPr>
+          <w:rFonts w:ascii="Calibri" w:hAnsi="Calibri" w:eastAsia="Calibri"/>
+          <w:b w:val="0"/>
+          <w:i w:val="0"/>
+          <w:color w:val="333333"/>
+          <w:sz w:val="20"/>
+        </w:rPr>
+        <w:t>Each batch photo should remove the background accurately, close to single-photo Background Remove quality. Thumbnail and full opened image should show the same cleared result.</w:t>
+      </w:r>
+    </w:p>
+    <w:p>
+      <w:pPr>
+        <w:spacing w:before="160" w:after="80"/>
+      </w:pPr>
+      <w:r>
+        <w:rPr>
+          <w:rFonts w:ascii="Calibri" w:hAnsi="Calibri" w:eastAsia="Calibri"/>
+          <w:b/>
+          <w:i w:val="0"/>
+          <w:color w:val="333333"/>
+          <w:sz w:val="22"/>
+        </w:rPr>
+        <w:t>Actual Result</w:t>
+      </w:r>
+    </w:p>
+    <w:p>
+      <w:pPr>
+        <w:spacing w:before="120" w:after="80"/>
+      </w:pPr>
+      <w:r>
+        <w:rPr>
+          <w:rFonts w:ascii="Calibri" w:hAnsi="Calibri" w:eastAsia="Calibri"/>
+          <w:b w:val="0"/>
+          <w:i w:val="0"/>
+          <w:color w:val="333333"/>
+          <w:sz w:val="20"/>
+        </w:rPr>
+        <w:t>For many product photos, Batch does not remove the background accurately like single-photo mode. Backgrounds often only become darker instead of being removed. In minimized view the result can look like a dark/cleared background, but when the image is opened the original full background is still there. Result quality is inconsistent — sometimes acceptable, but not regularly reliable.</w:t>
+      </w:r>
+    </w:p>
+    <w:p>
+      <w:pPr>
+        <w:spacing w:before="160" w:after="80"/>
+      </w:pPr>
+      <w:r>
+        <w:rPr>
+          <w:rFonts w:ascii="Calibri" w:hAnsi="Calibri" w:eastAsia="Calibri"/>
+          <w:b/>
+          <w:i w:val="0"/>
+          <w:color w:val="333333"/>
+          <w:sz w:val="22"/>
+        </w:rPr>
+        <w:t>Evidence</w:t>
+      </w:r>
+    </w:p>
+    <w:tbl>
+      <w:tblPr>
+        <w:tblBorders>
+          <w:top w:val="single" w:sz="8" w:color="A6A6A6"/>
+          <w:left w:val="single" w:sz="8" w:color="A6A6A6"/>
+          <w:bottom w:val="single" w:sz="8" w:color="A6A6A6"/>
+          <w:right w:val="single" w:sz="8" w:color="A6A6A6"/>
+        </w:tblBorders>
+      </w:tblPr>
+      <w:tr>
+        <w:tc>
+          <w:tcPr>
+            <w:shd w:val="clear" w:fill="F5F5F5"/>
+          </w:tcPr>
+          <w:p>
+            <w:pPr>
+              <w:jc w:val="center"/>
+            </w:pPr>
+            <w:r>
+              <w:rPr>
+                <w:i/>
+                <w:color w:val="000000"/>
+                <w:sz w:val="20"/>
+              </w:rPr>
+              <w:t xml:space="preserve">Screenshot: Batch thumbnails (dark/cleared look)</w:t>
+            </w:r>
+          </w:p>
+        </w:tc>
+      </w:tr>
+    </w:tbl>
+    <w:tbl>
+      <w:tblPr>
+        <w:tblBorders>
+          <w:top w:val="single" w:sz="8" w:color="A6A6A6"/>
+          <w:left w:val="single" w:sz="8" w:color="A6A6A6"/>
+          <w:bottom w:val="single" w:sz="8" w:color="A6A6A6"/>
+          <w:right w:val="single" w:sz="8" w:color="A6A6A6"/>
+        </w:tblBorders>
+      </w:tblPr>
+      <w:tr>
+        <w:tc>
+          <w:tcPr>
+            <w:shd w:val="clear" w:fill="F5F5F5"/>
+          </w:tcPr>
+          <w:p>
+            <w:pPr>
+              <w:jc w:val="center"/>
+            </w:pPr>
+            <w:r>
+              <w:rPr>
+                <w:i/>
+                <w:color w:val="000000"/>
+                <w:sz w:val="20"/>
+              </w:rPr>
+              <w:t xml:space="preserve">Screenshot: Same image opened — original background still present</w:t>
+            </w:r>
+          </w:p>
+        </w:tc>
+      </w:tr>
+    </w:tbl>
+    <w:tbl>
+      <w:tblPr>
+        <w:tblBorders>
+          <w:top w:val="single" w:sz="8" w:color="A6A6A6"/>
+          <w:left w:val="single" w:sz="8" w:color="A6A6A6"/>
+          <w:bottom w:val="single" w:sz="8" w:color="A6A6A6"/>
+          <w:right w:val="single" w:sz="8" w:color="A6A6A6"/>
+        </w:tblBorders>
+      </w:tblPr>
+      <w:tr>
+        <w:tc>
+          <w:tcPr>
+            <w:shd w:val="clear" w:fill="F5F5F5"/>
+          </w:tcPr>
+          <w:p>
+            <w:pPr>
+              <w:jc w:val="center"/>
+            </w:pPr>
+            <w:r>
+              <w:rPr>
+                <w:i/>
+                <w:color w:val="000000"/>
+                <w:sz w:val="20"/>
+              </w:rPr>
+              <w:t xml:space="preserve">Screenshot (optional): Single-photo result for comparison</w:t>
+            </w:r>
+          </w:p>
+        </w:tc>
+      </w:tr>
+    </w:tbl>
+    <w:p>
+      <w:pPr>
+        <w:spacing w:before="160" w:after="80"/>
+      </w:pPr>
+      <w:r>
+        <w:rPr>
+          <w:rFonts w:ascii="Calibri" w:hAnsi="Calibri" w:eastAsia="Calibri"/>
+          <w:b/>
+          <w:i w:val="0"/>
+          <w:color w:val="333333"/>
+          <w:sz w:val="22"/>
+        </w:rPr>
+        <w:t>Notes</w:t>
+      </w:r>
+    </w:p>
+    <w:p>
+      <w:pPr>
+        <w:spacing w:before="120" w:after="120"/>
+      </w:pPr>
+      <w:r>
+        <w:rPr>
+          <w:rFonts w:ascii="Calibri" w:hAnsi="Calibri" w:eastAsia="Calibri"/>
+          <w:b w:val="0"/>
+          <w:i w:val="0"/>
+          <w:color w:val="333333"/>
+          <w:sz w:val="20"/>
+        </w:rPr>
+        <w:t>This is a Batch module defect, not a competitor-parity item. Single-photo remove works better. Batch remains valuable for multi-image editing, but background-remove quality and preview/open consistency must improve.</w:t>
+      </w:r>
+    </w:p>
+    <w:p>
+      <w:pPr>
+        <w:spacing w:after="120" w:before="280" w:lineRule="auto"/>
+        <w:rPr/>
+      </w:pPr>
+      <w:r>
+        <w:rPr>
+          <w:rFonts w:ascii="Calibri" w:cs="Calibri" w:eastAsia="Calibri" w:hAnsi="Calibri"/>
+          <w:b w:val="1"/>
+          <w:bCs w:val="1"/>
+          <w:i w:val="0"/>
+          <w:iCs w:val="0"/>
+          <w:color w:val="1f4e79"/>
+          <w:sz w:val="32"/>
+          <w:szCs w:val="32"/>
+          <w:rtl w:val="0"/>
+        </w:rPr>
+        <w:t xml:space="preserve">3. Strengths Observed</w:t>
+      </w:r>
+      <w:r>
+        <w:rPr>
+          <w:rtl w:val="0"/>
+        </w:rPr>
+      </w:r>
+    </w:p>
+    <w:p>
+      <w:pPr>
+        <w:spacing w:after="120" w:lineRule="auto"/>
+        <w:rPr/>
+      </w:pPr>
+      <w:r>
+        <w:rPr>
+          <w:rFonts w:ascii="Calibri" w:cs="Calibri" w:eastAsia="Calibri" w:hAnsi="Calibri"/>
+          <w:b w:val="0"/>
+          <w:bCs w:val="0"/>
+          <w:i w:val="0"/>
+          <w:iCs w:val="0"/>
+          <w:color w:val="333333"/>
+          <w:sz w:val="22"/>
+          <w:szCs w:val="22"/>
+          <w:rtl w:val="0"/>
+        </w:rPr>
+        <w:t>Strengths below are based on product comparison and hands-on testing. Competitors are strong on single/portrait photos; this app’s clear advantage is Batch Remover.</w:t>
+      </w:r>
+      <w:r>
+        <w:rPr>
+          <w:rtl w:val="0"/>
+        </w:rPr>
+      </w:r>
+    </w:p>
+    <w:p>
+      <w:pPr>
+        <w:spacing w:before="240" w:after="120"/>
+      </w:pPr>
+      <w:r>
+        <w:rPr>
+          <w:rFonts w:ascii="Calibri" w:hAnsi="Calibri" w:eastAsia="Calibri"/>
+          <w:b/>
+          <w:i w:val="0"/>
+          <w:color w:val="375E23"/>
+          <w:sz w:val="26"/>
+        </w:rPr>
+        <w:t>STR-001: Batch Remover (up to 20 photos) is a clear product advantage</w:t>
+      </w:r>
+    </w:p>
+    <w:tbl>
+      <w:tblPr>
+        <w:tblW w:w="5000" w:type="pct"/>
+        <w:tblBorders>
+          <w:top w:val="single" w:sz="4" w:color="BFBFBF"/>
+          <w:left w:val="single" w:sz="4" w:color="BFBFBF"/>
+          <w:bottom w:val="single" w:sz="4" w:color="BFBFBF"/>
+          <w:right w:val="single" w:sz="4" w:color="BFBFBF"/>
+          <w:insideH w:val="single" w:sz="4" w:color="BFBFBF"/>
+          <w:insideV w:val="single" w:sz="4" w:color="BFBFBF"/>
+        </w:tblBorders>
+      </w:tblPr>
+      <w:tblGrid>
+        <w:gridCol w:w="2500"/>
+        <w:gridCol w:w="2500"/>
+      </w:tblGrid>
+      <w:tr>
+        <w:tc>
+          <w:tcPr>
+            <w:shd w:val="clear" w:fill="1F4E79"/>
+          </w:tcPr>
+          <w:p>
+            <w:r>
+              <w:rPr>
+                <w:b/>
+                <w:color w:val="FFFFFF"/>
+                <w:sz w:val="16"/>
+              </w:rPr>
+              <w:t xml:space="preserve">Field</w:t>
+            </w:r>
+          </w:p>
+        </w:tc>
+        <w:tc>
+          <w:tcPr>
+            <w:shd w:val="clear" w:fill="1F4E79"/>
+          </w:tcPr>
+          <w:p>
+            <w:r>
+              <w:rPr>
+                <w:b/>
+                <w:color w:val="FFFFFF"/>
+                <w:sz w:val="16"/>
+              </w:rPr>
+              <w:t xml:space="preserve">Detail</w:t>
+            </w:r>
+          </w:p>
+        </w:tc>
+      </w:tr>
+      <w:tr>
+        <w:tc>
+          <w:tcPr>
+            <w:shd w:val="clear" w:fill="FFFFFF"/>
+          </w:tcPr>
+          <w:p>
+            <w:r>
+              <w:rPr>
+                <w:sz w:val="16"/>
+              </w:rPr>
               <w:t xml:space="preserve">Module / Area</w:t>
             </w:r>
           </w:p>
@@ -4013,12 +4548,12 @@
       <w:r>
         <w:rPr>
           <w:rFonts w:ascii="Calibri" w:hAnsi="Calibri" w:eastAsia="Calibri"/>
-          <w:b/>
+          <w:b w:val="0"/>
           <w:i w:val="0"/>
           <w:color w:val="333333"/>
           <w:sz w:val="20"/>
         </w:rPr>
-        <w:t xml:space="preserve">Details: </w:t>
+        <w:t>Details: Competitors are mainly strong on single/portrait photos. This app’s Batch Remover lets users process about 10–20 images in one run. That is powerful for bulk work: change backgrounds on many images at once, or add company name / text across selected images in one edit. The workflow feels simple and practical — not complicated — which is a real usability strength.</w:t>
       </w:r>
       <w:r>
         <w:rPr>
@@ -4028,7 +4563,6 @@
           <w:color w:val="333333"/>
           <w:sz w:val="20"/>
         </w:rPr>
-        <w:t>Compared with popular competitor apps that mainly focus on single-photo / portrait background removal, Auto Background Remover offers Batch mode where a user can upload up to 20 photos and process them in one run. This is a strong differentiator for people who need many images quickly (sellers, social media, bulk editing).</w:t>
       </w:r>
     </w:p>
     <w:p>
@@ -4038,12 +4572,12 @@
       <w:r>
         <w:rPr>
           <w:rFonts w:ascii="Calibri" w:hAnsi="Calibri" w:eastAsia="Calibri"/>
-          <w:b/>
+          <w:b w:val="0"/>
           <w:i w:val="0"/>
           <w:color w:val="333333"/>
           <w:sz w:val="20"/>
         </w:rPr>
-        <w:t xml:space="preserve">Why it matters: </w:t>
+        <w:t>Why it matters: Multi-image edit in one go is a clear advantage over single-photo-focused competitors. If Batch background removal becomes as accurate as single-photo mode, this becomes a very strong product feature.</w:t>
       </w:r>
       <w:r>
         <w:rPr>
@@ -4053,7 +4587,6 @@
           <w:color w:val="333333"/>
           <w:sz w:val="20"/>
         </w:rPr>
-        <w:t>Batch support is a real market gap. Even if single-photo tools are common, doing many images in one flow saves time and makes this app more useful for productivity.</w:t>
       </w:r>
     </w:p>
     <w:p>
@@ -5353,7 +5886,7 @@
           <w:color w:val="2E75B6"/>
           <w:sz w:val="26"/>
         </w:rPr>
-        <w:t>SUG-003: Make Batch mode as strong as single-photo editing (quality + full edit tools)</w:t>
+        <w:t>SUG-003: Make Batch background remove as accurate and reliable as single-photo mode</w:t>
       </w:r>
     </w:p>
     <w:tbl>
@@ -5448,14 +5981,28 @@
         </w:tc>
         <w:tc>
           <w:tcPr>
-            <w:shd w:val="clear" w:fill="F2F2F2"/>
-          </w:tcPr>
-          <w:p>
-            <w:r>
-              <w:rPr>
-                <w:sz w:val="16"/>
-              </w:rPr>
-              <w:t xml:space="preserve">Functionality, Performance, Usability</w:t>
+            <w:shd w:fill="F2F2F2" w:val="clear"/>
+            <w:tcBorders>
+              <w:top w:val="single" w:sz="4" w:color="BFBFBF"/>
+              <w:left w:val="single" w:sz="4" w:color="BFBFBF"/>
+              <w:bottom w:val="single" w:sz="4" w:color="BFBFBF"/>
+              <w:right w:val="single" w:sz="4" w:color="BFBFBF"/>
+            </w:tcBorders>
+          </w:tcPr>
+          <w:p>
+            <w:pPr>
+              <w:spacing w:before="40" w:after="40"/>
+            </w:pPr>
+            <w:r/>
+            <w:r>
+              <w:rPr>
+                <w:rFonts w:ascii="Calibri" w:hAnsi="Calibri" w:eastAsia="Calibri"/>
+                <w:b w:val="0"/>
+                <w:i w:val="0"/>
+                <w:color w:val="333333"/>
+                <w:sz w:val="16"/>
+              </w:rPr>
+              <w:t>Functionality, Performance, Usability</w:t>
             </w:r>
           </w:p>
         </w:tc>
@@ -5476,14 +6023,28 @@
         </w:tc>
         <w:tc>
           <w:tcPr>
-            <w:shd w:val="clear" w:fill="FFFFFF"/>
-          </w:tcPr>
-          <w:p>
-            <w:r>
-              <w:rPr>
-                <w:sz w:val="16"/>
-              </w:rPr>
-              <w:t xml:space="preserve">High</w:t>
+            <w:shd w:fill="FCE4D6" w:val="clear"/>
+            <w:tcBorders>
+              <w:top w:val="single" w:sz="4" w:color="BFBFBF"/>
+              <w:left w:val="single" w:sz="4" w:color="BFBFBF"/>
+              <w:bottom w:val="single" w:sz="4" w:color="BFBFBF"/>
+              <w:right w:val="single" w:sz="4" w:color="BFBFBF"/>
+            </w:tcBorders>
+          </w:tcPr>
+          <w:p>
+            <w:pPr>
+              <w:spacing w:before="40" w:after="40"/>
+            </w:pPr>
+            <w:r/>
+            <w:r>
+              <w:rPr>
+                <w:rFonts w:ascii="Calibri" w:hAnsi="Calibri" w:eastAsia="Calibri"/>
+                <w:b w:val="0"/>
+                <w:i w:val="0"/>
+                <w:color w:val="333333"/>
+                <w:sz w:val="16"/>
+              </w:rPr>
+              <w:t>High</w:t>
             </w:r>
           </w:p>
         </w:tc>
@@ -5504,14 +6065,28 @@
         </w:tc>
         <w:tc>
           <w:tcPr>
-            <w:shd w:val="clear" w:fill="F2F2F2"/>
-          </w:tcPr>
-          <w:p>
-            <w:r>
-              <w:rPr>
-                <w:sz w:val="16"/>
-              </w:rPr>
-              <w:t xml:space="preserve">Batch can process multiple images (up to 20), but background-remove quality/output is not always equal to single-photo mode. Full primary/secondary edits are not available across the whole batch in one run.</w:t>
+            <w:shd w:fill="FFFFFF" w:val="clear"/>
+            <w:tcBorders>
+              <w:top w:val="single" w:sz="4" w:color="BFBFBF"/>
+              <w:left w:val="single" w:sz="4" w:color="BFBFBF"/>
+              <w:bottom w:val="single" w:sz="4" w:color="BFBFBF"/>
+              <w:right w:val="single" w:sz="4" w:color="BFBFBF"/>
+            </w:tcBorders>
+          </w:tcPr>
+          <w:p>
+            <w:pPr>
+              <w:spacing w:before="40" w:after="40"/>
+            </w:pPr>
+            <w:r/>
+            <w:r>
+              <w:rPr>
+                <w:rFonts w:ascii="Calibri" w:hAnsi="Calibri" w:eastAsia="Calibri"/>
+                <w:b w:val="0"/>
+                <w:i w:val="0"/>
+                <w:color w:val="333333"/>
+                <w:sz w:val="16"/>
+              </w:rPr>
+              <w:t>Batch often only darkens backgrounds; thumbnail can look cleared while opened image still has full background; quality is inconsistent vs single-photo mode.</w:t>
             </w:r>
           </w:p>
         </w:tc>
@@ -5524,12 +6099,12 @@
       <w:r>
         <w:rPr>
           <w:rFonts w:ascii="Calibri" w:hAnsi="Calibri" w:eastAsia="Calibri"/>
-          <w:b/>
+          <w:b w:val="0"/>
           <w:i w:val="0"/>
           <w:color w:val="333333"/>
           <w:sz w:val="20"/>
         </w:rPr>
-        <w:t xml:space="preserve">Proposed improvement: </w:t>
+        <w:t>Proposed improvement: Process every Batch photo with the same background-remove quality as single Background Remove. Make thumbnail preview and opened full image show the same result. Keep Batch’s strength: after remove, let users apply shared edits (new background, color, company text, etc.) to many images in one run.</w:t>
       </w:r>
       <w:r>
         <w:rPr>
@@ -5539,7 +6114,6 @@
           <w:color w:val="333333"/>
           <w:sz w:val="20"/>
         </w:rPr>
-        <w:t>Improve Batch so each photo is processed with the same quality as the single Background Remove flow. Then allow batch-level primary/secondary actions too — for example background change, color, text, and similar edits — applied across selected images (up to 20) in one run.</w:t>
       </w:r>
     </w:p>
     <w:p>
@@ -5549,12 +6123,12 @@
       <w:r>
         <w:rPr>
           <w:rFonts w:ascii="Calibri" w:hAnsi="Calibri" w:eastAsia="Calibri"/>
-          <w:b/>
+          <w:b w:val="0"/>
           <w:i w:val="0"/>
           <w:color w:val="333333"/>
           <w:sz w:val="20"/>
         </w:rPr>
-        <w:t xml:space="preserve">Why this helps: </w:t>
+        <w:t>Why this helps: The unique win is Batch multi-edit. Users already get an easy way to work on many images together. Fixing remove accuracy and preview/open mismatch makes that advantage trustworthy, not just convenient.</w:t>
       </w:r>
       <w:r>
         <w:rPr>
@@ -5564,7 +6138,6 @@
           <w:color w:val="333333"/>
           <w:sz w:val="20"/>
         </w:rPr>
-        <w:t>Competitors are already good at single photos. The unique win for this app is Batch. If Batch quality matches single-photo quality and users can also edit all selected images together, the product becomes clearly stronger than competitors who lack this full batch workflow.</w:t>
       </w:r>
     </w:p>
     <w:p>
@@ -10536,6 +11109,33 @@
         </w:tc>
         <w:tc>
           <w:tcPr>
+            <w:shd w:fill="E2EFDA" w:val="clear"/>
+            <w:tcBorders>
+              <w:top w:val="single" w:sz="4" w:color="BFBFBF"/>
+              <w:left w:val="single" w:sz="4" w:color="BFBFBF"/>
+              <w:bottom w:val="single" w:sz="4" w:color="BFBFBF"/>
+              <w:right w:val="single" w:sz="4" w:color="BFBFBF"/>
+            </w:tcBorders>
+          </w:tcPr>
+          <w:p>
+            <w:pPr>
+              <w:spacing w:before="40" w:after="40"/>
+            </w:pPr>
+            <w:r/>
+            <w:r>
+              <w:rPr>
+                <w:rFonts w:ascii="Calibri" w:hAnsi="Calibri" w:eastAsia="Calibri"/>
+                <w:b w:val="0"/>
+                <w:i w:val="0"/>
+                <w:color w:val="333333"/>
+                <w:sz w:val="16"/>
+              </w:rPr>
+              <w:t>Open Batch Remover from Homepage</w:t>
+            </w:r>
+          </w:p>
+        </w:tc>
+        <w:tc>
+          <w:tcPr>
             <w:tcBorders>
               <w:top w:color="bfbfbf" w:space="0" w:sz="4" w:val="single"/>
               <w:left w:color="bfbfbf" w:space="0" w:sz="4" w:val="single"/>
@@ -10561,42 +11161,6 @@
                 <w:szCs w:val="16"/>
                 <w:rtl w:val="0"/>
               </w:rPr>
-              <w:t xml:space="preserve">Open Batch Remover from Homepage</w:t>
-            </w:r>
-            <w:r>
-              <w:rPr>
-                <w:rtl w:val="0"/>
-              </w:rPr>
-            </w:r>
-          </w:p>
-        </w:tc>
-        <w:tc>
-          <w:tcPr>
-            <w:tcBorders>
-              <w:top w:color="bfbfbf" w:space="0" w:sz="4" w:val="single"/>
-              <w:left w:color="bfbfbf" w:space="0" w:sz="4" w:val="single"/>
-              <w:bottom w:color="bfbfbf" w:space="0" w:sz="4" w:val="single"/>
-              <w:right w:color="bfbfbf" w:space="0" w:sz="4" w:val="single"/>
-            </w:tcBorders>
-            <w:shd w:fill="ffffff" w:val="clear"/>
-          </w:tcPr>
-          <w:p>
-            <w:pPr>
-              <w:spacing w:after="40" w:before="40" w:lineRule="auto"/>
-              <w:rPr/>
-            </w:pPr>
-            <w:r>
-              <w:rPr>
-                <w:rFonts w:ascii="Calibri" w:cs="Calibri" w:eastAsia="Calibri" w:hAnsi="Calibri"/>
-                <w:b w:val="0"/>
-                <w:bCs w:val="0"/>
-                <w:i w:val="0"/>
-                <w:iCs w:val="0"/>
-                <w:color w:val="333333"/>
-                <w:sz w:val="16"/>
-                <w:szCs w:val="16"/>
-                <w:rtl w:val="0"/>
-              </w:rPr>
               <w:t xml:space="preserve">Workflow</w:t>
             </w:r>
             <w:r>
@@ -10608,141 +11172,121 @@
         </w:tc>
         <w:tc>
           <w:tcPr>
-            <w:tcBorders>
-              <w:top w:color="bfbfbf" w:space="0" w:sz="4" w:val="single"/>
-              <w:left w:color="bfbfbf" w:space="0" w:sz="4" w:val="single"/>
-              <w:bottom w:color="bfbfbf" w:space="0" w:sz="4" w:val="single"/>
-              <w:right w:color="bfbfbf" w:space="0" w:sz="4" w:val="single"/>
-            </w:tcBorders>
-            <w:shd w:fill="ffffff" w:val="clear"/>
-          </w:tcPr>
-          <w:p>
-            <w:pPr>
-              <w:spacing w:after="40" w:before="40" w:lineRule="auto"/>
-              <w:rPr/>
-            </w:pPr>
-            <w:r>
-              <w:rPr>
-                <w:rFonts w:ascii="Calibri" w:cs="Calibri" w:eastAsia="Calibri" w:hAnsi="Calibri"/>
-                <w:b w:val="0"/>
-                <w:bCs w:val="0"/>
-                <w:i w:val="0"/>
-                <w:iCs w:val="0"/>
-                <w:color w:val="333333"/>
-                <w:sz w:val="16"/>
-                <w:szCs w:val="16"/>
-                <w:rtl w:val="0"/>
-              </w:rPr>
-              <w:t xml:space="preserve">Tap Batch Remover</w:t>
-            </w:r>
-            <w:r>
-              <w:rPr>
-                <w:rtl w:val="0"/>
-              </w:rPr>
-            </w:r>
-          </w:p>
-        </w:tc>
-        <w:tc>
-          <w:tcPr>
-            <w:tcBorders>
-              <w:top w:color="bfbfbf" w:space="0" w:sz="4" w:val="single"/>
-              <w:left w:color="bfbfbf" w:space="0" w:sz="4" w:val="single"/>
-              <w:bottom w:color="bfbfbf" w:space="0" w:sz="4" w:val="single"/>
-              <w:right w:color="bfbfbf" w:space="0" w:sz="4" w:val="single"/>
-            </w:tcBorders>
-            <w:shd w:fill="ffffff" w:val="clear"/>
-          </w:tcPr>
-          <w:p>
-            <w:pPr>
-              <w:spacing w:after="40" w:before="40" w:lineRule="auto"/>
-              <w:rPr/>
-            </w:pPr>
-            <w:r>
-              <w:rPr>
-                <w:rFonts w:ascii="Calibri" w:cs="Calibri" w:eastAsia="Calibri" w:hAnsi="Calibri"/>
-                <w:b w:val="0"/>
-                <w:bCs w:val="0"/>
-                <w:i w:val="0"/>
-                <w:iCs w:val="0"/>
-                <w:color w:val="333333"/>
-                <w:sz w:val="16"/>
-                <w:szCs w:val="16"/>
-                <w:rtl w:val="0"/>
-              </w:rPr>
-              <w:t xml:space="preserve">Batch / multi-select screen opens</w:t>
-            </w:r>
-            <w:r>
-              <w:rPr>
-                <w:rtl w:val="0"/>
-              </w:rPr>
-            </w:r>
-          </w:p>
-        </w:tc>
-        <w:tc>
-          <w:tcPr>
-            <w:tcBorders>
-              <w:top w:color="bfbfbf" w:space="0" w:sz="4" w:val="single"/>
-              <w:left w:color="bfbfbf" w:space="0" w:sz="4" w:val="single"/>
-              <w:bottom w:color="bfbfbf" w:space="0" w:sz="4" w:val="single"/>
-              <w:right w:color="bfbfbf" w:space="0" w:sz="4" w:val="single"/>
-            </w:tcBorders>
-            <w:shd w:fill="ffffff" w:val="clear"/>
-          </w:tcPr>
-          <w:p>
-            <w:pPr>
+            <w:shd w:fill="E2EFDA" w:val="clear"/>
+            <w:tcBorders>
+              <w:top w:val="single" w:sz="4" w:color="BFBFBF"/>
+              <w:left w:val="single" w:sz="4" w:color="BFBFBF"/>
+              <w:bottom w:val="single" w:sz="4" w:color="BFBFBF"/>
+              <w:right w:val="single" w:sz="4" w:color="BFBFBF"/>
+            </w:tcBorders>
+          </w:tcPr>
+          <w:p>
+            <w:pPr>
+              <w:spacing w:before="40" w:after="40"/>
+            </w:pPr>
+            <w:r/>
+            <w:r>
+              <w:rPr>
+                <w:rFonts w:ascii="Calibri" w:hAnsi="Calibri" w:eastAsia="Calibri"/>
+                <w:b w:val="0"/>
+                <w:i w:val="0"/>
+                <w:color w:val="333333"/>
+                <w:sz w:val="16"/>
+              </w:rPr>
+              <w:t>Tap Batch Remover</w:t>
+            </w:r>
+          </w:p>
+        </w:tc>
+        <w:tc>
+          <w:tcPr>
+            <w:shd w:fill="E2EFDA" w:val="clear"/>
+            <w:tcBorders>
+              <w:top w:val="single" w:sz="4" w:color="BFBFBF"/>
+              <w:left w:val="single" w:sz="4" w:color="BFBFBF"/>
+              <w:bottom w:val="single" w:sz="4" w:color="BFBFBF"/>
+              <w:right w:val="single" w:sz="4" w:color="BFBFBF"/>
+            </w:tcBorders>
+          </w:tcPr>
+          <w:p>
+            <w:pPr>
+              <w:spacing w:before="40" w:after="40"/>
+            </w:pPr>
+            <w:r/>
+            <w:r>
+              <w:rPr>
+                <w:rFonts w:ascii="Calibri" w:hAnsi="Calibri" w:eastAsia="Calibri"/>
+                <w:b w:val="0"/>
+                <w:i w:val="0"/>
+                <w:color w:val="333333"/>
+                <w:sz w:val="16"/>
+              </w:rPr>
+              <w:t>Batch screen opens</w:t>
+            </w:r>
+          </w:p>
+        </w:tc>
+        <w:tc>
+          <w:tcPr>
+            <w:shd w:fill="E2EFDA" w:val="clear"/>
+            <w:tcBorders>
+              <w:top w:val="single" w:sz="4" w:color="BFBFBF"/>
+              <w:left w:val="single" w:sz="4" w:color="BFBFBF"/>
+              <w:bottom w:val="single" w:sz="4" w:color="BFBFBF"/>
+              <w:right w:val="single" w:sz="4" w:color="BFBFBF"/>
+            </w:tcBorders>
+          </w:tcPr>
+          <w:sdt>
+            <w:sdtPr>
+              <w:alias w:val="Result"/>
+              <w:tag w:val="result_status"/>
+              <w:id w:val="20000"/>
+              <w:dropDownList>
+                <w:listItem w:displayText="Not Executed" w:value="Not Executed"/>
+                <w:listItem w:displayText="Pass" w:value="Pass"/>
+                <w:listItem w:displayText="Fail" w:value="Fail"/>
+                <w:listItem w:displayText="Blocked" w:value="Blocked"/>
+              </w:dropDownList>
+            </w:sdtPr>
+            <w:sdtContent>
+              <w:p>
+                <w:pPr>
+                  <w:jc w:val="center"/>
+                </w:pPr>
+                <w:r>
+                  <w:rPr>
+                    <w:sz w:val="16"/>
+                    <w:color w:val="548235"/>
+                  </w:rPr>
+                  <w:t>Pass</w:t>
+                </w:r>
+              </w:p>
+            </w:sdtContent>
+          </w:sdt>
+        </w:tc>
+        <w:tc>
+          <w:tcPr>
+            <w:shd w:fill="E2EFDA" w:val="clear"/>
+            <w:tcBorders>
+              <w:top w:val="single" w:sz="4" w:color="BFBFBF"/>
+              <w:left w:val="single" w:sz="4" w:color="BFBFBF"/>
+              <w:bottom w:val="single" w:sz="4" w:color="BFBFBF"/>
+              <w:right w:val="single" w:sz="4" w:color="BFBFBF"/>
+            </w:tcBorders>
+          </w:tcPr>
+          <w:p>
+            <w:pPr>
+              <w:spacing w:before="40" w:after="40"/>
               <w:jc w:val="center"/>
-              <w:rPr/>
-            </w:pPr>
-            <w:r>
-              <w:rPr>
-                <w:color w:val="666666"/>
-                <w:sz w:val="16"/>
-                <w:szCs w:val="16"/>
-                <w:rtl w:val="0"/>
-              </w:rPr>
-              <w:t xml:space="preserve">Not Executed</w:t>
-            </w:r>
-            <w:r>
-              <w:rPr>
-                <w:rtl w:val="0"/>
-              </w:rPr>
-            </w:r>
-          </w:p>
-        </w:tc>
-        <w:tc>
-          <w:tcPr>
-            <w:tcBorders>
-              <w:top w:color="bfbfbf" w:space="0" w:sz="4" w:val="single"/>
-              <w:left w:color="bfbfbf" w:space="0" w:sz="4" w:val="single"/>
-              <w:bottom w:color="bfbfbf" w:space="0" w:sz="4" w:val="single"/>
-              <w:right w:color="bfbfbf" w:space="0" w:sz="4" w:val="single"/>
-            </w:tcBorders>
-            <w:shd w:fill="ffffff" w:val="clear"/>
-          </w:tcPr>
-          <w:p>
-            <w:pPr>
-              <w:spacing w:after="40" w:before="40" w:lineRule="auto"/>
-              <w:jc w:val="center"/>
-              <w:rPr/>
-            </w:pPr>
-            <w:r>
-              <w:rPr>
-                <w:rFonts w:ascii="Calibri" w:cs="Calibri" w:eastAsia="Calibri" w:hAnsi="Calibri"/>
-                <w:b w:val="0"/>
-                <w:bCs w:val="0"/>
-                <w:i w:val="0"/>
-                <w:iCs w:val="0"/>
-                <w:color w:val="333333"/>
-                <w:sz w:val="16"/>
-                <w:szCs w:val="16"/>
-                <w:rtl w:val="0"/>
-              </w:rPr>
-              <w:t xml:space="preserve">—</w:t>
-            </w:r>
-            <w:r>
-              <w:rPr>
-                <w:rtl w:val="0"/>
-              </w:rPr>
+            </w:pPr>
+            <w:r/>
+            <w:r>
+              <w:rPr>
+                <w:rFonts w:ascii="Calibri" w:hAnsi="Calibri" w:eastAsia="Calibri"/>
+                <w:b w:val="0"/>
+                <w:i w:val="0"/>
+                <w:color w:val="333333"/>
+                <w:sz w:val="16"/>
+              </w:rPr>
+              <w:t>—</w:t>
             </w:r>
           </w:p>
         </w:tc>
@@ -10790,6 +11334,33 @@
         </w:tc>
         <w:tc>
           <w:tcPr>
+            <w:shd w:fill="E2EFDA" w:val="clear"/>
+            <w:tcBorders>
+              <w:top w:val="single" w:sz="4" w:color="BFBFBF"/>
+              <w:left w:val="single" w:sz="4" w:color="BFBFBF"/>
+              <w:bottom w:val="single" w:sz="4" w:color="BFBFBF"/>
+              <w:right w:val="single" w:sz="4" w:color="BFBFBF"/>
+            </w:tcBorders>
+          </w:tcPr>
+          <w:p>
+            <w:pPr>
+              <w:spacing w:before="40" w:after="40"/>
+            </w:pPr>
+            <w:r/>
+            <w:r>
+              <w:rPr>
+                <w:rFonts w:ascii="Calibri" w:hAnsi="Calibri" w:eastAsia="Calibri"/>
+                <w:b w:val="0"/>
+                <w:i w:val="0"/>
+                <w:color w:val="333333"/>
+                <w:sz w:val="16"/>
+              </w:rPr>
+              <w:t>Select multiple images and continue</w:t>
+            </w:r>
+          </w:p>
+        </w:tc>
+        <w:tc>
+          <w:tcPr>
             <w:tcBorders>
               <w:top w:color="bfbfbf" w:space="0" w:sz="4" w:val="single"/>
               <w:left w:color="bfbfbf" w:space="0" w:sz="4" w:val="single"/>
@@ -10815,42 +11386,6 @@
                 <w:szCs w:val="16"/>
                 <w:rtl w:val="0"/>
               </w:rPr>
-              <w:t xml:space="preserve">Select multiple images and continue</w:t>
-            </w:r>
-            <w:r>
-              <w:rPr>
-                <w:rtl w:val="0"/>
-              </w:rPr>
-            </w:r>
-          </w:p>
-        </w:tc>
-        <w:tc>
-          <w:tcPr>
-            <w:tcBorders>
-              <w:top w:color="bfbfbf" w:space="0" w:sz="4" w:val="single"/>
-              <w:left w:color="bfbfbf" w:space="0" w:sz="4" w:val="single"/>
-              <w:bottom w:color="bfbfbf" w:space="0" w:sz="4" w:val="single"/>
-              <w:right w:color="bfbfbf" w:space="0" w:sz="4" w:val="single"/>
-            </w:tcBorders>
-            <w:shd w:fill="f2f2f2" w:val="clear"/>
-          </w:tcPr>
-          <w:p>
-            <w:pPr>
-              <w:spacing w:after="40" w:before="40" w:lineRule="auto"/>
-              <w:rPr/>
-            </w:pPr>
-            <w:r>
-              <w:rPr>
-                <w:rFonts w:ascii="Calibri" w:cs="Calibri" w:eastAsia="Calibri" w:hAnsi="Calibri"/>
-                <w:b w:val="0"/>
-                <w:bCs w:val="0"/>
-                <w:i w:val="0"/>
-                <w:iCs w:val="0"/>
-                <w:color w:val="333333"/>
-                <w:sz w:val="16"/>
-                <w:szCs w:val="16"/>
-                <w:rtl w:val="0"/>
-              </w:rPr>
               <w:t xml:space="preserve">Functionality</w:t>
             </w:r>
             <w:r>
@@ -10862,141 +11397,121 @@
         </w:tc>
         <w:tc>
           <w:tcPr>
-            <w:tcBorders>
-              <w:top w:color="bfbfbf" w:space="0" w:sz="4" w:val="single"/>
-              <w:left w:color="bfbfbf" w:space="0" w:sz="4" w:val="single"/>
-              <w:bottom w:color="bfbfbf" w:space="0" w:sz="4" w:val="single"/>
-              <w:right w:color="bfbfbf" w:space="0" w:sz="4" w:val="single"/>
-            </w:tcBorders>
-            <w:shd w:fill="f2f2f2" w:val="clear"/>
-          </w:tcPr>
-          <w:p>
-            <w:pPr>
-              <w:spacing w:after="40" w:before="40" w:lineRule="auto"/>
-              <w:rPr/>
-            </w:pPr>
-            <w:r>
-              <w:rPr>
-                <w:rFonts w:ascii="Calibri" w:cs="Calibri" w:eastAsia="Calibri" w:hAnsi="Calibri"/>
-                <w:b w:val="0"/>
-                <w:bCs w:val="0"/>
-                <w:i w:val="0"/>
-                <w:iCs w:val="0"/>
-                <w:color w:val="333333"/>
-                <w:sz w:val="16"/>
-                <w:szCs w:val="16"/>
-                <w:rtl w:val="0"/>
-              </w:rPr>
-              <w:t xml:space="preserve">Select 2+ photos → Continue</w:t>
-            </w:r>
-            <w:r>
-              <w:rPr>
-                <w:rtl w:val="0"/>
-              </w:rPr>
-            </w:r>
-          </w:p>
-        </w:tc>
-        <w:tc>
-          <w:tcPr>
-            <w:tcBorders>
-              <w:top w:color="bfbfbf" w:space="0" w:sz="4" w:val="single"/>
-              <w:left w:color="bfbfbf" w:space="0" w:sz="4" w:val="single"/>
-              <w:bottom w:color="bfbfbf" w:space="0" w:sz="4" w:val="single"/>
-              <w:right w:color="bfbfbf" w:space="0" w:sz="4" w:val="single"/>
-            </w:tcBorders>
-            <w:shd w:fill="f2f2f2" w:val="clear"/>
-          </w:tcPr>
-          <w:p>
-            <w:pPr>
-              <w:spacing w:after="40" w:before="40" w:lineRule="auto"/>
-              <w:rPr/>
-            </w:pPr>
-            <w:r>
-              <w:rPr>
-                <w:rFonts w:ascii="Calibri" w:cs="Calibri" w:eastAsia="Calibri" w:hAnsi="Calibri"/>
-                <w:b w:val="0"/>
-                <w:bCs w:val="0"/>
-                <w:i w:val="0"/>
-                <w:iCs w:val="0"/>
-                <w:color w:val="333333"/>
-                <w:sz w:val="16"/>
-                <w:szCs w:val="16"/>
-                <w:rtl w:val="0"/>
-              </w:rPr>
-              <w:t xml:space="preserve">Selected images move into batch process flow</w:t>
-            </w:r>
-            <w:r>
-              <w:rPr>
-                <w:rtl w:val="0"/>
-              </w:rPr>
-            </w:r>
-          </w:p>
-        </w:tc>
-        <w:tc>
-          <w:tcPr>
-            <w:tcBorders>
-              <w:top w:color="bfbfbf" w:space="0" w:sz="4" w:val="single"/>
-              <w:left w:color="bfbfbf" w:space="0" w:sz="4" w:val="single"/>
-              <w:bottom w:color="bfbfbf" w:space="0" w:sz="4" w:val="single"/>
-              <w:right w:color="bfbfbf" w:space="0" w:sz="4" w:val="single"/>
-            </w:tcBorders>
-            <w:shd w:fill="f2f2f2" w:val="clear"/>
-          </w:tcPr>
-          <w:p>
-            <w:pPr>
+            <w:shd w:fill="E2EFDA" w:val="clear"/>
+            <w:tcBorders>
+              <w:top w:val="single" w:sz="4" w:color="BFBFBF"/>
+              <w:left w:val="single" w:sz="4" w:color="BFBFBF"/>
+              <w:bottom w:val="single" w:sz="4" w:color="BFBFBF"/>
+              <w:right w:val="single" w:sz="4" w:color="BFBFBF"/>
+            </w:tcBorders>
+          </w:tcPr>
+          <w:p>
+            <w:pPr>
+              <w:spacing w:before="40" w:after="40"/>
+            </w:pPr>
+            <w:r/>
+            <w:r>
+              <w:rPr>
+                <w:rFonts w:ascii="Calibri" w:hAnsi="Calibri" w:eastAsia="Calibri"/>
+                <w:b w:val="0"/>
+                <w:i w:val="0"/>
+                <w:color w:val="333333"/>
+                <w:sz w:val="16"/>
+              </w:rPr>
+              <w:t>Select several product photos → Continue</w:t>
+            </w:r>
+          </w:p>
+        </w:tc>
+        <w:tc>
+          <w:tcPr>
+            <w:shd w:fill="E2EFDA" w:val="clear"/>
+            <w:tcBorders>
+              <w:top w:val="single" w:sz="4" w:color="BFBFBF"/>
+              <w:left w:val="single" w:sz="4" w:color="BFBFBF"/>
+              <w:bottom w:val="single" w:sz="4" w:color="BFBFBF"/>
+              <w:right w:val="single" w:sz="4" w:color="BFBFBF"/>
+            </w:tcBorders>
+          </w:tcPr>
+          <w:p>
+            <w:pPr>
+              <w:spacing w:before="40" w:after="40"/>
+            </w:pPr>
+            <w:r/>
+            <w:r>
+              <w:rPr>
+                <w:rFonts w:ascii="Calibri" w:hAnsi="Calibri" w:eastAsia="Calibri"/>
+                <w:b w:val="0"/>
+                <w:i w:val="0"/>
+                <w:color w:val="333333"/>
+                <w:sz w:val="16"/>
+              </w:rPr>
+              <w:t>Selected images enter batch process flow</w:t>
+            </w:r>
+          </w:p>
+        </w:tc>
+        <w:tc>
+          <w:tcPr>
+            <w:shd w:fill="E2EFDA" w:val="clear"/>
+            <w:tcBorders>
+              <w:top w:val="single" w:sz="4" w:color="BFBFBF"/>
+              <w:left w:val="single" w:sz="4" w:color="BFBFBF"/>
+              <w:bottom w:val="single" w:sz="4" w:color="BFBFBF"/>
+              <w:right w:val="single" w:sz="4" w:color="BFBFBF"/>
+            </w:tcBorders>
+          </w:tcPr>
+          <w:sdt>
+            <w:sdtPr>
+              <w:alias w:val="Result"/>
+              <w:tag w:val="result_status"/>
+              <w:id w:val="20001"/>
+              <w:dropDownList>
+                <w:listItem w:displayText="Not Executed" w:value="Not Executed"/>
+                <w:listItem w:displayText="Pass" w:value="Pass"/>
+                <w:listItem w:displayText="Fail" w:value="Fail"/>
+                <w:listItem w:displayText="Blocked" w:value="Blocked"/>
+              </w:dropDownList>
+            </w:sdtPr>
+            <w:sdtContent>
+              <w:p>
+                <w:pPr>
+                  <w:jc w:val="center"/>
+                </w:pPr>
+                <w:r>
+                  <w:rPr>
+                    <w:sz w:val="16"/>
+                    <w:color w:val="548235"/>
+                  </w:rPr>
+                  <w:t>Pass</w:t>
+                </w:r>
+              </w:p>
+            </w:sdtContent>
+          </w:sdt>
+        </w:tc>
+        <w:tc>
+          <w:tcPr>
+            <w:shd w:fill="E2EFDA" w:val="clear"/>
+            <w:tcBorders>
+              <w:top w:val="single" w:sz="4" w:color="BFBFBF"/>
+              <w:left w:val="single" w:sz="4" w:color="BFBFBF"/>
+              <w:bottom w:val="single" w:sz="4" w:color="BFBFBF"/>
+              <w:right w:val="single" w:sz="4" w:color="BFBFBF"/>
+            </w:tcBorders>
+          </w:tcPr>
+          <w:p>
+            <w:pPr>
+              <w:spacing w:before="40" w:after="40"/>
               <w:jc w:val="center"/>
-              <w:rPr/>
-            </w:pPr>
-            <w:r>
-              <w:rPr>
-                <w:color w:val="666666"/>
-                <w:sz w:val="16"/>
-                <w:szCs w:val="16"/>
-                <w:rtl w:val="0"/>
-              </w:rPr>
-              <w:t xml:space="preserve">Not Executed</w:t>
-            </w:r>
-            <w:r>
-              <w:rPr>
-                <w:rtl w:val="0"/>
-              </w:rPr>
-            </w:r>
-          </w:p>
-        </w:tc>
-        <w:tc>
-          <w:tcPr>
-            <w:tcBorders>
-              <w:top w:color="bfbfbf" w:space="0" w:sz="4" w:val="single"/>
-              <w:left w:color="bfbfbf" w:space="0" w:sz="4" w:val="single"/>
-              <w:bottom w:color="bfbfbf" w:space="0" w:sz="4" w:val="single"/>
-              <w:right w:color="bfbfbf" w:space="0" w:sz="4" w:val="single"/>
-            </w:tcBorders>
-            <w:shd w:fill="f2f2f2" w:val="clear"/>
-          </w:tcPr>
-          <w:p>
-            <w:pPr>
-              <w:spacing w:after="40" w:before="40" w:lineRule="auto"/>
-              <w:jc w:val="center"/>
-              <w:rPr/>
-            </w:pPr>
-            <w:r>
-              <w:rPr>
-                <w:rFonts w:ascii="Calibri" w:cs="Calibri" w:eastAsia="Calibri" w:hAnsi="Calibri"/>
-                <w:b w:val="0"/>
-                <w:bCs w:val="0"/>
-                <w:i w:val="0"/>
-                <w:iCs w:val="0"/>
-                <w:color w:val="333333"/>
-                <w:sz w:val="16"/>
-                <w:szCs w:val="16"/>
-                <w:rtl w:val="0"/>
-              </w:rPr>
-              <w:t xml:space="preserve">—</w:t>
-            </w:r>
-            <w:r>
-              <w:rPr>
-                <w:rtl w:val="0"/>
-              </w:rPr>
+            </w:pPr>
+            <w:r/>
+            <w:r>
+              <w:rPr>
+                <w:rFonts w:ascii="Calibri" w:hAnsi="Calibri" w:eastAsia="Calibri"/>
+                <w:b w:val="0"/>
+                <w:i w:val="0"/>
+                <w:color w:val="333333"/>
+                <w:sz w:val="16"/>
+              </w:rPr>
+              <w:t>—</w:t>
             </w:r>
           </w:p>
         </w:tc>
@@ -11044,213 +11559,175 @@
         </w:tc>
         <w:tc>
           <w:tcPr>
-            <w:tcBorders>
-              <w:top w:color="bfbfbf" w:space="0" w:sz="4" w:val="single"/>
-              <w:left w:color="bfbfbf" w:space="0" w:sz="4" w:val="single"/>
-              <w:bottom w:color="bfbfbf" w:space="0" w:sz="4" w:val="single"/>
-              <w:right w:color="bfbfbf" w:space="0" w:sz="4" w:val="single"/>
-            </w:tcBorders>
-            <w:shd w:fill="ffffff" w:val="clear"/>
-          </w:tcPr>
-          <w:p>
-            <w:pPr>
-              <w:spacing w:after="40" w:before="40" w:lineRule="auto"/>
-              <w:rPr/>
-            </w:pPr>
-            <w:r>
-              <w:rPr>
-                <w:rFonts w:ascii="Calibri" w:cs="Calibri" w:eastAsia="Calibri" w:hAnsi="Calibri"/>
-                <w:b w:val="0"/>
-                <w:bCs w:val="0"/>
-                <w:i w:val="0"/>
-                <w:iCs w:val="0"/>
-                <w:color w:val="333333"/>
-                <w:sz w:val="16"/>
-                <w:szCs w:val="16"/>
-                <w:rtl w:val="0"/>
-              </w:rPr>
-              <w:t xml:space="preserve">Process batch and review results</w:t>
-            </w:r>
-            <w:r>
-              <w:rPr>
-                <w:rtl w:val="0"/>
-              </w:rPr>
-            </w:r>
-          </w:p>
-        </w:tc>
-        <w:tc>
-          <w:tcPr>
-            <w:tcBorders>
-              <w:top w:color="bfbfbf" w:space="0" w:sz="4" w:val="single"/>
-              <w:left w:color="bfbfbf" w:space="0" w:sz="4" w:val="single"/>
-              <w:bottom w:color="bfbfbf" w:space="0" w:sz="4" w:val="single"/>
-              <w:right w:color="bfbfbf" w:space="0" w:sz="4" w:val="single"/>
-            </w:tcBorders>
-            <w:shd w:fill="ffffff" w:val="clear"/>
-          </w:tcPr>
-          <w:p>
-            <w:pPr>
-              <w:spacing w:after="40" w:before="40" w:lineRule="auto"/>
-              <w:rPr/>
-            </w:pPr>
-            <w:r>
-              <w:rPr>
-                <w:rFonts w:ascii="Calibri" w:cs="Calibri" w:eastAsia="Calibri" w:hAnsi="Calibri"/>
-                <w:b w:val="0"/>
-                <w:bCs w:val="0"/>
-                <w:i w:val="0"/>
-                <w:iCs w:val="0"/>
-                <w:color w:val="333333"/>
-                <w:sz w:val="16"/>
-                <w:szCs w:val="16"/>
-                <w:rtl w:val="0"/>
-              </w:rPr>
-              <w:t xml:space="preserve">Functionality, Performance</w:t>
-            </w:r>
-            <w:r>
-              <w:rPr>
-                <w:rtl w:val="0"/>
-              </w:rPr>
-            </w:r>
-          </w:p>
-        </w:tc>
-        <w:tc>
-          <w:tcPr>
-            <w:tcBorders>
-              <w:top w:color="bfbfbf" w:space="0" w:sz="4" w:val="single"/>
-              <w:left w:color="bfbfbf" w:space="0" w:sz="4" w:val="single"/>
-              <w:bottom w:color="bfbfbf" w:space="0" w:sz="4" w:val="single"/>
-              <w:right w:color="bfbfbf" w:space="0" w:sz="4" w:val="single"/>
-            </w:tcBorders>
-            <w:shd w:fill="ffffff" w:val="clear"/>
-          </w:tcPr>
-          <w:p>
-            <w:pPr>
-              <w:spacing w:after="40" w:before="40" w:lineRule="auto"/>
-              <w:rPr/>
-            </w:pPr>
-            <w:r>
-              <w:rPr>
-                <w:rFonts w:ascii="Calibri" w:cs="Calibri" w:eastAsia="Calibri" w:hAnsi="Calibri"/>
-                <w:b w:val="0"/>
-                <w:bCs w:val="0"/>
-                <w:i w:val="0"/>
-                <w:iCs w:val="0"/>
-                <w:color w:val="333333"/>
-                <w:sz w:val="16"/>
-                <w:szCs w:val="16"/>
-                <w:rtl w:val="0"/>
-              </w:rPr>
-              <w:t xml:space="preserve">Start batch process</w:t>
-            </w:r>
-            <w:r>
-              <w:rPr>
-                <w:rtl w:val="0"/>
-              </w:rPr>
-            </w:r>
-          </w:p>
-        </w:tc>
-        <w:tc>
-          <w:tcPr>
-            <w:tcBorders>
-              <w:top w:color="bfbfbf" w:space="0" w:sz="4" w:val="single"/>
-              <w:left w:color="bfbfbf" w:space="0" w:sz="4" w:val="single"/>
-              <w:bottom w:color="bfbfbf" w:space="0" w:sz="4" w:val="single"/>
-              <w:right w:color="bfbfbf" w:space="0" w:sz="4" w:val="single"/>
-            </w:tcBorders>
-            <w:shd w:fill="ffffff" w:val="clear"/>
-          </w:tcPr>
-          <w:p>
-            <w:pPr>
-              <w:spacing w:after="40" w:before="40" w:lineRule="auto"/>
-              <w:rPr/>
-            </w:pPr>
-            <w:r>
-              <w:rPr>
-                <w:rFonts w:ascii="Calibri" w:cs="Calibri" w:eastAsia="Calibri" w:hAnsi="Calibri"/>
-                <w:b w:val="0"/>
-                <w:bCs w:val="0"/>
-                <w:i w:val="0"/>
-                <w:iCs w:val="0"/>
-                <w:color w:val="333333"/>
-                <w:sz w:val="16"/>
-                <w:szCs w:val="16"/>
-                <w:rtl w:val="0"/>
-              </w:rPr>
-              <w:t xml:space="preserve">Progress shows; results are available for the selected images</w:t>
-            </w:r>
-            <w:r>
-              <w:rPr>
-                <w:rtl w:val="0"/>
-              </w:rPr>
-            </w:r>
-          </w:p>
-        </w:tc>
-        <w:tc>
-          <w:tcPr>
-            <w:tcBorders>
-              <w:top w:color="bfbfbf" w:space="0" w:sz="4" w:val="single"/>
-              <w:left w:color="bfbfbf" w:space="0" w:sz="4" w:val="single"/>
-              <w:bottom w:color="bfbfbf" w:space="0" w:sz="4" w:val="single"/>
-              <w:right w:color="bfbfbf" w:space="0" w:sz="4" w:val="single"/>
-            </w:tcBorders>
-            <w:shd w:fill="ffffff" w:val="clear"/>
-          </w:tcPr>
-          <w:p>
-            <w:pPr>
+            <w:shd w:fill="FCE4D6" w:val="clear"/>
+            <w:tcBorders>
+              <w:top w:val="single" w:sz="4" w:color="BFBFBF"/>
+              <w:left w:val="single" w:sz="4" w:color="BFBFBF"/>
+              <w:bottom w:val="single" w:sz="4" w:color="BFBFBF"/>
+              <w:right w:val="single" w:sz="4" w:color="BFBFBF"/>
+            </w:tcBorders>
+          </w:tcPr>
+          <w:p>
+            <w:pPr>
+              <w:spacing w:before="40" w:after="40"/>
+            </w:pPr>
+            <w:r/>
+            <w:r>
+              <w:rPr>
+                <w:rFonts w:ascii="Calibri" w:hAnsi="Calibri" w:eastAsia="Calibri"/>
+                <w:b w:val="0"/>
+                <w:i w:val="0"/>
+                <w:color w:val="333333"/>
+                <w:sz w:val="16"/>
+              </w:rPr>
+              <w:t>Batch remove quality matches single-photo / preview matches open</w:t>
+            </w:r>
+          </w:p>
+        </w:tc>
+        <w:tc>
+          <w:tcPr>
+            <w:shd w:fill="FCE4D6" w:val="clear"/>
+            <w:tcBorders>
+              <w:top w:val="single" w:sz="4" w:color="BFBFBF"/>
+              <w:left w:val="single" w:sz="4" w:color="BFBFBF"/>
+              <w:bottom w:val="single" w:sz="4" w:color="BFBFBF"/>
+              <w:right w:val="single" w:sz="4" w:color="BFBFBF"/>
+            </w:tcBorders>
+          </w:tcPr>
+          <w:p>
+            <w:pPr>
+              <w:spacing w:before="40" w:after="40"/>
+            </w:pPr>
+            <w:r/>
+            <w:r>
+              <w:rPr>
+                <w:rFonts w:ascii="Calibri" w:hAnsi="Calibri" w:eastAsia="Calibri"/>
+                <w:b w:val="0"/>
+                <w:i w:val="0"/>
+                <w:color w:val="333333"/>
+                <w:sz w:val="16"/>
+              </w:rPr>
+              <w:t>Functionality, Stability</w:t>
+            </w:r>
+          </w:p>
+        </w:tc>
+        <w:tc>
+          <w:tcPr>
+            <w:shd w:fill="FCE4D6" w:val="clear"/>
+            <w:tcBorders>
+              <w:top w:val="single" w:sz="4" w:color="BFBFBF"/>
+              <w:left w:val="single" w:sz="4" w:color="BFBFBF"/>
+              <w:bottom w:val="single" w:sz="4" w:color="BFBFBF"/>
+              <w:right w:val="single" w:sz="4" w:color="BFBFBF"/>
+            </w:tcBorders>
+          </w:tcPr>
+          <w:p>
+            <w:pPr>
+              <w:spacing w:before="40" w:after="40"/>
+            </w:pPr>
+            <w:r/>
+            <w:r>
+              <w:rPr>
+                <w:rFonts w:ascii="Calibri" w:hAnsi="Calibri" w:eastAsia="Calibri"/>
+                <w:b w:val="0"/>
+                <w:i w:val="0"/>
+                <w:color w:val="333333"/>
+                <w:sz w:val="16"/>
+              </w:rPr>
+              <w:t>Run batch on product photos → check thumbnail → open full image</w:t>
+            </w:r>
+          </w:p>
+        </w:tc>
+        <w:tc>
+          <w:tcPr>
+            <w:shd w:fill="FCE4D6" w:val="clear"/>
+            <w:tcBorders>
+              <w:top w:val="single" w:sz="4" w:color="BFBFBF"/>
+              <w:left w:val="single" w:sz="4" w:color="BFBFBF"/>
+              <w:bottom w:val="single" w:sz="4" w:color="BFBFBF"/>
+              <w:right w:val="single" w:sz="4" w:color="BFBFBF"/>
+            </w:tcBorders>
+          </w:tcPr>
+          <w:p>
+            <w:pPr>
+              <w:spacing w:before="40" w:after="40"/>
+            </w:pPr>
+            <w:r/>
+            <w:r>
+              <w:rPr>
+                <w:rFonts w:ascii="Calibri" w:hAnsi="Calibri" w:eastAsia="Calibri"/>
+                <w:b w:val="0"/>
+                <w:i w:val="0"/>
+                <w:color w:val="333333"/>
+                <w:sz w:val="16"/>
+              </w:rPr>
+              <w:t>Background accurately removed like single-photo; thumbnail and opened image match</w:t>
+            </w:r>
+          </w:p>
+        </w:tc>
+        <w:tc>
+          <w:tcPr>
+            <w:shd w:fill="FCE4D6" w:val="clear"/>
+            <w:tcBorders>
+              <w:top w:val="single" w:sz="4" w:color="BFBFBF"/>
+              <w:left w:val="single" w:sz="4" w:color="BFBFBF"/>
+              <w:bottom w:val="single" w:sz="4" w:color="BFBFBF"/>
+              <w:right w:val="single" w:sz="4" w:color="BFBFBF"/>
+            </w:tcBorders>
+          </w:tcPr>
+          <w:sdt>
+            <w:sdtPr>
+              <w:alias w:val="Result"/>
+              <w:tag w:val="result_status"/>
+              <w:id w:val="20002"/>
+              <w:dropDownList>
+                <w:listItem w:displayText="Not Executed" w:value="Not Executed"/>
+                <w:listItem w:displayText="Pass" w:value="Pass"/>
+                <w:listItem w:displayText="Fail" w:value="Fail"/>
+                <w:listItem w:displayText="Blocked" w:value="Blocked"/>
+              </w:dropDownList>
+            </w:sdtPr>
+            <w:sdtContent>
+              <w:p>
+                <w:pPr>
+                  <w:jc w:val="center"/>
+                </w:pPr>
+                <w:r>
+                  <w:rPr>
+                    <w:sz w:val="16"/>
+                    <w:color w:val="C00000"/>
+                  </w:rPr>
+                  <w:t>Fail</w:t>
+                </w:r>
+              </w:p>
+            </w:sdtContent>
+          </w:sdt>
+        </w:tc>
+        <w:tc>
+          <w:tcPr>
+            <w:shd w:fill="FCE4D6" w:val="clear"/>
+            <w:tcBorders>
+              <w:top w:val="single" w:sz="4" w:color="BFBFBF"/>
+              <w:left w:val="single" w:sz="4" w:color="BFBFBF"/>
+              <w:bottom w:val="single" w:sz="4" w:color="BFBFBF"/>
+              <w:right w:val="single" w:sz="4" w:color="BFBFBF"/>
+            </w:tcBorders>
+          </w:tcPr>
+          <w:p>
+            <w:pPr>
+              <w:spacing w:before="40" w:after="40"/>
               <w:jc w:val="center"/>
-              <w:rPr/>
-            </w:pPr>
-            <w:r>
-              <w:rPr>
-                <w:color w:val="666666"/>
-                <w:sz w:val="16"/>
-                <w:szCs w:val="16"/>
-                <w:rtl w:val="0"/>
-              </w:rPr>
-              <w:t xml:space="preserve">Not Executed</w:t>
-            </w:r>
-            <w:r>
-              <w:rPr>
-                <w:rtl w:val="0"/>
-              </w:rPr>
-            </w:r>
-          </w:p>
-        </w:tc>
-        <w:tc>
-          <w:tcPr>
-            <w:tcBorders>
-              <w:top w:color="bfbfbf" w:space="0" w:sz="4" w:val="single"/>
-              <w:left w:color="bfbfbf" w:space="0" w:sz="4" w:val="single"/>
-              <w:bottom w:color="bfbfbf" w:space="0" w:sz="4" w:val="single"/>
-              <w:right w:color="bfbfbf" w:space="0" w:sz="4" w:val="single"/>
-            </w:tcBorders>
-            <w:shd w:fill="ffffff" w:val="clear"/>
-          </w:tcPr>
-          <w:p>
-            <w:pPr>
-              <w:spacing w:after="40" w:before="40" w:lineRule="auto"/>
-              <w:jc w:val="center"/>
-              <w:rPr/>
-            </w:pPr>
-            <w:r>
-              <w:rPr>
-                <w:rFonts w:ascii="Calibri" w:cs="Calibri" w:eastAsia="Calibri" w:hAnsi="Calibri"/>
-                <w:b w:val="0"/>
-                <w:bCs w:val="0"/>
-                <w:i w:val="0"/>
-                <w:iCs w:val="0"/>
-                <w:color w:val="333333"/>
-                <w:sz w:val="16"/>
-                <w:szCs w:val="16"/>
-                <w:rtl w:val="0"/>
-              </w:rPr>
-              <w:t xml:space="preserve">—</w:t>
-            </w:r>
-            <w:r>
-              <w:rPr>
-                <w:rtl w:val="0"/>
-              </w:rPr>
+            </w:pPr>
+            <w:r/>
+            <w:r>
+              <w:rPr>
+                <w:rFonts w:ascii="Calibri" w:hAnsi="Calibri" w:eastAsia="Calibri"/>
+                <w:b w:val="0"/>
+                <w:i w:val="0"/>
+                <w:color w:val="333333"/>
+                <w:sz w:val="16"/>
+              </w:rPr>
+              <w:t>BUG-001</w:t>
             </w:r>
           </w:p>
         </w:tc>
@@ -11607,13 +12084,13 @@
         </w:tc>
         <w:tc>
           <w:tcPr>
+            <w:shd w:fill="FFFFFF" w:val="clear"/>
             <w:tcBorders>
               <w:top w:val="single" w:sz="4" w:color="BFBFBF"/>
               <w:left w:val="single" w:sz="4" w:color="BFBFBF"/>
               <w:bottom w:val="single" w:sz="4" w:color="BFBFBF"/>
               <w:right w:val="single" w:sz="4" w:color="BFBFBF"/>
             </w:tcBorders>
-            <w:shd w:fill="FFFFFF" w:val="clear"/>
           </w:tcPr>
           <w:p>
             <w:pPr>
@@ -11628,7 +12105,7 @@
                 <w:color w:val="333333"/>
                 <w:sz w:val="18"/>
               </w:rPr>
-              <w:t>0</w:t>
+              <w:t>1 (High: 1) — Batch remove accuracy / preview mismatch</w:t>
             </w:r>
           </w:p>
         </w:tc>
@@ -11697,7 +12174,7 @@
                 <w:color w:val="333333"/>
                 <w:sz w:val="18"/>
               </w:rPr>
-              <w:t>2 (STR-001 Batch advantage, STR-002 clear UI icons)</w:t>
+              <w:t>2 (STR-001 Batch multi-edit advantage, STR-002 clear UI icons)</w:t>
             </w:r>
           </w:p>
         </w:tc>
@@ -11766,7 +12243,7 @@
                 <w:color w:val="333333"/>
                 <w:sz w:val="18"/>
               </w:rPr>
-              <w:t>3 (SUG-001 Shape UX, SUG-002 smart align, SUG-003 stronger Batch)</w:t>
+              <w:t>3 (SUG-001 Shape UX, SUG-002 smart align, SUG-003 Batch quality = single-photo)</w:t>
             </w:r>
           </w:p>
         </w:tc>
@@ -11835,7 +12312,7 @@
                 <w:color w:val="333333"/>
                 <w:sz w:val="18"/>
               </w:rPr>
-              <w:t>13 / 18</w:t>
+              <w:t>16 / 18</w:t>
             </w:r>
           </w:p>
         </w:tc>
@@ -11904,7 +12381,7 @@
                 <w:color w:val="333333"/>
                 <w:sz w:val="18"/>
               </w:rPr>
-              <w:t>Pass: 13 | Fail: 0 | Blocked: 0</w:t>
+              <w:t>Pass: 15 | Fail: 1 | Blocked: 0</w:t>
             </w:r>
           </w:p>
         </w:tc>
@@ -11952,13 +12429,13 @@
         </w:tc>
         <w:tc>
           <w:tcPr>
+            <w:shd w:fill="FFFFFF" w:val="clear"/>
             <w:tcBorders>
               <w:top w:val="single" w:sz="4" w:color="BFBFBF"/>
               <w:left w:val="single" w:sz="4" w:color="BFBFBF"/>
               <w:bottom w:val="single" w:sz="4" w:color="BFBFBF"/>
               <w:right w:val="single" w:sz="4" w:color="BFBFBF"/>
             </w:tcBorders>
-            <w:shd w:fill="FFFFFF" w:val="clear"/>
           </w:tcPr>
           <w:p>
             <w:pPr>
@@ -11973,7 +12450,7 @@
                 <w:color w:val="333333"/>
                 <w:sz w:val="18"/>
               </w:rPr>
-              <w:t>Single-photo flow is solid and UI is easy to understand. Main product advantage vs competitors is Batch Remover (up to 20). Biggest improvement opportunity: make Batch quality match single-photo results and allow shared primary/secondary edits across the batch. Shape restore behavior is tracked as SUG-001.</w:t>
+              <w:t>Batch is the app’s biggest advantage (edit many images / add text or background changes together), and the UI is easy. Main gap: Batch background remove is often weaker than single-photo mode (darkening, preview vs opened image mismatch, inconsistent results). Tracked as BUG-001 / SUG-003.</w:t>
             </w:r>
           </w:p>
         </w:tc>

</xml_diff>

<commit_message>
Expand practical QA test cases across quality dimensions
Add stability, performance, usability, export/product-quality, and
optional cutout-observation cases for Background Remove and Batch
Remover, noting AI cutout perfection is not the primary score.

Co-authored-by: Showravkarmakar <Showrav88@users.noreply.github.com>
</commit_message>
<xml_diff>
--- a/SQA_Intern_Assignment_Test_Report.docx
+++ b/SQA_Intern_Assignment_Test_Report.docx
@@ -6178,11 +6178,11 @@
           <w:i w:val="0"/>
           <w:iCs w:val="0"/>
           <w:color w:val="333333"/>
-          <w:sz w:val="22"/>
+          <w:sz w:val="20"/>
           <w:szCs w:val="22"/>
           <w:rtl w:val="0"/>
         </w:rPr>
-        <w:t xml:space="preserve">Use the Result dropdown in each row (click the cell in Microsoft Word): Pass / Fail / Blocked / Not Executed. Failed cases link to a Bug ID.</w:t>
+        <w:t>Result dropdown values: Pass / Fail / Blocked / Not Executed. Cases follow assignment focus (functionality, workflow, stability, usability, performance, product quality) for Background Remove and Batch Remover. Per assignment scope, AI cutout perfection is not the main judgment. Optional cutout observation checks are listed separately.</w:t>
       </w:r>
       <w:r>
         <w:rPr>
@@ -9060,7 +9060,7 @@
             <w:sdtPr>
               <w:alias w:val="Result"/>
               <w:tag w:val="result_status"/>
-              <w:id w:val="14000"/>
+              <w:id w:val="31000"/>
               <w:dropDownList>
                 <w:listItem w:displayText="Not Executed" w:value="Not Executed"/>
                 <w:listItem w:displayText="Pass" w:value="Pass"/>
@@ -11238,7 +11238,7 @@
             <w:sdtPr>
               <w:alias w:val="Result"/>
               <w:tag w:val="result_status"/>
-              <w:id w:val="20000"/>
+              <w:id w:val="31001"/>
               <w:dropDownList>
                 <w:listItem w:displayText="Not Executed" w:value="Not Executed"/>
                 <w:listItem w:displayText="Pass" w:value="Pass"/>
@@ -11463,7 +11463,7 @@
             <w:sdtPr>
               <w:alias w:val="Result"/>
               <w:tag w:val="result_status"/>
-              <w:id w:val="20001"/>
+              <w:id w:val="31002"/>
               <w:dropDownList>
                 <w:listItem w:displayText="Not Executed" w:value="Not Executed"/>
                 <w:listItem w:displayText="Pass" w:value="Pass"/>
@@ -11679,7 +11679,7 @@
             <w:sdtPr>
               <w:alias w:val="Result"/>
               <w:tag w:val="result_status"/>
-              <w:id w:val="20002"/>
+              <w:id w:val="31003"/>
               <w:dropDownList>
                 <w:listItem w:displayText="Not Executed" w:value="Not Executed"/>
                 <w:listItem w:displayText="Pass" w:value="Pass"/>
@@ -11997,6 +11997,3599 @@
         </w:rPr>
       </w:r>
     </w:p>
+    <w:p>
+      <w:pPr>
+        <w:spacing w:before="240" w:after="80"/>
+      </w:pPr>
+      <w:r>
+        <w:rPr>
+          <w:rFonts w:ascii="Calibri" w:hAnsi="Calibri" w:eastAsia="Calibri"/>
+          <w:b/>
+          <w:i w:val="0"/>
+          <w:color w:val="2E75B6"/>
+          <w:sz w:val="26"/>
+        </w:rPr>
+        <w:t>5.5 Stability &amp; error handling</w:t>
+      </w:r>
+    </w:p>
+    <w:p>
+      <w:pPr>
+        <w:spacing w:before="0" w:after="80"/>
+      </w:pPr>
+      <w:r>
+        <w:rPr>
+          <w:rFonts w:ascii="Calibri" w:hAnsi="Calibri" w:eastAsia="Calibri"/>
+          <w:b w:val="0"/>
+          <w:i/>
+          <w:color w:val="666666"/>
+          <w:sz w:val="18"/>
+        </w:rPr>
+        <w:t>Crash safety, bad input, offline, and resume. Friendly message is better than crash.</w:t>
+      </w:r>
+    </w:p>
+    <w:tbl>
+      <w:tblPr>
+        <w:tblW w:w="5000" w:type="pct"/>
+        <w:tblBorders>
+          <w:top w:val="single" w:sz="4" w:color="BFBFBF"/>
+          <w:left w:val="single" w:sz="4" w:color="BFBFBF"/>
+          <w:bottom w:val="single" w:sz="4" w:color="BFBFBF"/>
+          <w:right w:val="single" w:sz="4" w:color="BFBFBF"/>
+          <w:insideH w:val="single" w:sz="4" w:color="BFBFBF"/>
+          <w:insideV w:val="single" w:sz="4" w:color="BFBFBF"/>
+        </w:tblBorders>
+      </w:tblPr>
+      <w:tblGrid>
+        <w:gridCol w:w="900"/>
+        <w:gridCol w:w="1400"/>
+        <w:gridCol w:w="900"/>
+        <w:gridCol w:w="1200"/>
+        <w:gridCol w:w="1400"/>
+        <w:gridCol w:w="900"/>
+        <w:gridCol w:w="700"/>
+      </w:tblGrid>
+      <w:tr>
+        <w:tc>
+          <w:tcPr>
+            <w:shd w:val="clear" w:fill="1F4E79"/>
+          </w:tcPr>
+          <w:p>
+            <w:r>
+              <w:rPr>
+                <w:b/>
+                <w:color w:val="FFFFFF"/>
+                <w:sz w:val="15"/>
+              </w:rPr>
+              <w:t xml:space="preserve">TC ID</w:t>
+            </w:r>
+          </w:p>
+        </w:tc>
+        <w:tc>
+          <w:tcPr>
+            <w:shd w:val="clear" w:fill="1F4E79"/>
+          </w:tcPr>
+          <w:p>
+            <w:r>
+              <w:rPr>
+                <w:b/>
+                <w:color w:val="FFFFFF"/>
+                <w:sz w:val="15"/>
+              </w:rPr>
+              <w:t xml:space="preserve">Test Case</w:t>
+            </w:r>
+          </w:p>
+        </w:tc>
+        <w:tc>
+          <w:tcPr>
+            <w:shd w:val="clear" w:fill="1F4E79"/>
+          </w:tcPr>
+          <w:p>
+            <w:r>
+              <w:rPr>
+                <w:b/>
+                <w:color w:val="FFFFFF"/>
+                <w:sz w:val="15"/>
+              </w:rPr>
+              <w:t xml:space="preserve">Area</w:t>
+            </w:r>
+          </w:p>
+        </w:tc>
+        <w:tc>
+          <w:tcPr>
+            <w:shd w:val="clear" w:fill="1F4E79"/>
+          </w:tcPr>
+          <w:p>
+            <w:r>
+              <w:rPr>
+                <w:b/>
+                <w:color w:val="FFFFFF"/>
+                <w:sz w:val="15"/>
+              </w:rPr>
+              <w:t xml:space="preserve">Steps</w:t>
+            </w:r>
+          </w:p>
+        </w:tc>
+        <w:tc>
+          <w:tcPr>
+            <w:shd w:val="clear" w:fill="1F4E79"/>
+          </w:tcPr>
+          <w:p>
+            <w:r>
+              <w:rPr>
+                <w:b/>
+                <w:color w:val="FFFFFF"/>
+                <w:sz w:val="15"/>
+              </w:rPr>
+              <w:t xml:space="preserve">Expected Result</w:t>
+            </w:r>
+          </w:p>
+        </w:tc>
+        <w:tc>
+          <w:tcPr>
+            <w:shd w:val="clear" w:fill="1F4E79"/>
+          </w:tcPr>
+          <w:p>
+            <w:r>
+              <w:rPr>
+                <w:b/>
+                <w:color w:val="FFFFFF"/>
+                <w:sz w:val="15"/>
+              </w:rPr>
+              <w:t xml:space="preserve">Result</w:t>
+            </w:r>
+          </w:p>
+        </w:tc>
+        <w:tc>
+          <w:tcPr>
+            <w:shd w:val="clear" w:fill="1F4E79"/>
+          </w:tcPr>
+          <w:p>
+            <w:r>
+              <w:rPr>
+                <w:b/>
+                <w:color w:val="FFFFFF"/>
+                <w:sz w:val="15"/>
+              </w:rPr>
+              <w:t xml:space="preserve">Bug</w:t>
+            </w:r>
+          </w:p>
+        </w:tc>
+      </w:tr>
+      <w:tr>
+        <w:tc>
+          <w:tcPr>
+            <w:shd w:val="clear" w:fill="FFFFFF"/>
+          </w:tcPr>
+          <w:p>
+            <w:r>
+              <w:rPr>
+                <w:sz w:val="15"/>
+              </w:rPr>
+              <w:t xml:space="preserve">TC-ST-001</w:t>
+            </w:r>
+          </w:p>
+        </w:tc>
+        <w:tc>
+          <w:tcPr>
+            <w:shd w:val="clear" w:fill="FFFFFF"/>
+          </w:tcPr>
+          <w:p>
+            <w:r>
+              <w:rPr>
+                <w:sz w:val="15"/>
+              </w:rPr>
+              <w:t xml:space="preserve">App resume from background mid-edit</w:t>
+            </w:r>
+          </w:p>
+        </w:tc>
+        <w:tc>
+          <w:tcPr>
+            <w:shd w:val="clear" w:fill="FFFFFF"/>
+          </w:tcPr>
+          <w:p>
+            <w:r>
+              <w:rPr>
+                <w:sz w:val="15"/>
+              </w:rPr>
+              <w:t xml:space="preserve">Stability</w:t>
+            </w:r>
+          </w:p>
+        </w:tc>
+        <w:tc>
+          <w:tcPr>
+            <w:shd w:val="clear" w:fill="FFFFFF"/>
+          </w:tcPr>
+          <w:p>
+            <w:r>
+              <w:rPr>
+                <w:sz w:val="15"/>
+              </w:rPr>
+              <w:t xml:space="preserve">Start edit → Home/recents → reopen app</w:t>
+            </w:r>
+          </w:p>
+        </w:tc>
+        <w:tc>
+          <w:tcPr>
+            <w:shd w:val="clear" w:fill="FFFFFF"/>
+          </w:tcPr>
+          <w:p>
+            <w:r>
+              <w:rPr>
+                <w:sz w:val="15"/>
+              </w:rPr>
+              <w:t xml:space="preserve">Draft or last safe state remains; no crash</w:t>
+            </w:r>
+          </w:p>
+        </w:tc>
+        <w:tc>
+          <w:tcPr>
+            <w:shd w:fill="FFFFFF" w:val="clear"/>
+            <w:tcBorders>
+              <w:top w:val="single" w:sz="4" w:color="BFBFBF"/>
+              <w:left w:val="single" w:sz="4" w:color="BFBFBF"/>
+              <w:bottom w:val="single" w:sz="4" w:color="BFBFBF"/>
+              <w:right w:val="single" w:sz="4" w:color="BFBFBF"/>
+            </w:tcBorders>
+          </w:tcPr>
+          <w:sdt>
+            <w:sdtPr>
+              <w:alias w:val="Result"/>
+              <w:tag w:val="result_status"/>
+              <w:id w:val="31004"/>
+              <w:dropDownList>
+                <w:listItem w:displayText="Not Executed" w:value="Not Executed"/>
+                <w:listItem w:displayText="Pass" w:value="Pass"/>
+                <w:listItem w:displayText="Fail" w:value="Fail"/>
+                <w:listItem w:displayText="Blocked" w:value="Blocked"/>
+              </w:dropDownList>
+            </w:sdtPr>
+            <w:sdtContent>
+              <w:p>
+                <w:pPr>
+                  <w:jc w:val="center"/>
+                </w:pPr>
+                <w:r>
+                  <w:rPr>
+                    <w:sz w:val="16"/>
+                    <w:color w:val="666666"/>
+                  </w:rPr>
+                  <w:t>Not Executed</w:t>
+                </w:r>
+              </w:p>
+            </w:sdtContent>
+          </w:sdt>
+        </w:tc>
+        <w:tc>
+          <w:tcPr>
+            <w:shd w:fill="FFFFFF" w:val="clear"/>
+            <w:tcBorders>
+              <w:top w:val="single" w:sz="4" w:color="BFBFBF"/>
+              <w:left w:val="single" w:sz="4" w:color="BFBFBF"/>
+              <w:bottom w:val="single" w:sz="4" w:color="BFBFBF"/>
+              <w:right w:val="single" w:sz="4" w:color="BFBFBF"/>
+            </w:tcBorders>
+          </w:tcPr>
+          <w:p>
+            <w:pPr>
+              <w:spacing w:before="40" w:after="40"/>
+              <w:jc w:val="center"/>
+            </w:pPr>
+            <w:r/>
+            <w:r>
+              <w:rPr>
+                <w:rFonts w:ascii="Calibri" w:hAnsi="Calibri" w:eastAsia="Calibri"/>
+                <w:b w:val="0"/>
+                <w:i w:val="0"/>
+                <w:color w:val="333333"/>
+                <w:sz w:val="16"/>
+              </w:rPr>
+              <w:t>—</w:t>
+            </w:r>
+          </w:p>
+        </w:tc>
+      </w:tr>
+      <w:tr>
+        <w:tc>
+          <w:tcPr>
+            <w:shd w:val="clear" w:fill="F2F2F2"/>
+          </w:tcPr>
+          <w:p>
+            <w:r>
+              <w:rPr>
+                <w:sz w:val="15"/>
+              </w:rPr>
+              <w:t xml:space="preserve">TC-ST-002</w:t>
+            </w:r>
+          </w:p>
+        </w:tc>
+        <w:tc>
+          <w:tcPr>
+            <w:shd w:val="clear" w:fill="F2F2F2"/>
+          </w:tcPr>
+          <w:p>
+            <w:r>
+              <w:rPr>
+                <w:sz w:val="15"/>
+              </w:rPr>
+              <w:t xml:space="preserve">No internet during processing</w:t>
+            </w:r>
+          </w:p>
+        </w:tc>
+        <w:tc>
+          <w:tcPr>
+            <w:shd w:val="clear" w:fill="F2F2F2"/>
+          </w:tcPr>
+          <w:p>
+            <w:r>
+              <w:rPr>
+                <w:sz w:val="15"/>
+              </w:rPr>
+              <w:t xml:space="preserve">Stability, Usability</w:t>
+            </w:r>
+          </w:p>
+        </w:tc>
+        <w:tc>
+          <w:tcPr>
+            <w:shd w:val="clear" w:fill="F2F2F2"/>
+          </w:tcPr>
+          <w:p>
+            <w:r>
+              <w:rPr>
+                <w:sz w:val="15"/>
+              </w:rPr>
+              <w:t xml:space="preserve">Airplane mode → try remove/process</w:t>
+            </w:r>
+          </w:p>
+        </w:tc>
+        <w:tc>
+          <w:tcPr>
+            <w:shd w:val="clear" w:fill="F2F2F2"/>
+          </w:tcPr>
+          <w:p>
+            <w:r>
+              <w:rPr>
+                <w:sz w:val="15"/>
+              </w:rPr>
+              <w:t xml:space="preserve">Clear offline/error message; no crash</w:t>
+            </w:r>
+          </w:p>
+        </w:tc>
+        <w:tc>
+          <w:tcPr>
+            <w:shd w:fill="FFFFFF" w:val="clear"/>
+            <w:tcBorders>
+              <w:top w:val="single" w:sz="4" w:color="BFBFBF"/>
+              <w:left w:val="single" w:sz="4" w:color="BFBFBF"/>
+              <w:bottom w:val="single" w:sz="4" w:color="BFBFBF"/>
+              <w:right w:val="single" w:sz="4" w:color="BFBFBF"/>
+            </w:tcBorders>
+          </w:tcPr>
+          <w:sdt>
+            <w:sdtPr>
+              <w:alias w:val="Result"/>
+              <w:tag w:val="result_status"/>
+              <w:id w:val="31005"/>
+              <w:dropDownList>
+                <w:listItem w:displayText="Not Executed" w:value="Not Executed"/>
+                <w:listItem w:displayText="Pass" w:value="Pass"/>
+                <w:listItem w:displayText="Fail" w:value="Fail"/>
+                <w:listItem w:displayText="Blocked" w:value="Blocked"/>
+              </w:dropDownList>
+            </w:sdtPr>
+            <w:sdtContent>
+              <w:p>
+                <w:pPr>
+                  <w:jc w:val="center"/>
+                </w:pPr>
+                <w:r>
+                  <w:rPr>
+                    <w:sz w:val="16"/>
+                    <w:color w:val="666666"/>
+                  </w:rPr>
+                  <w:t>Not Executed</w:t>
+                </w:r>
+              </w:p>
+            </w:sdtContent>
+          </w:sdt>
+        </w:tc>
+        <w:tc>
+          <w:tcPr>
+            <w:shd w:fill="FFFFFF" w:val="clear"/>
+            <w:tcBorders>
+              <w:top w:val="single" w:sz="4" w:color="BFBFBF"/>
+              <w:left w:val="single" w:sz="4" w:color="BFBFBF"/>
+              <w:bottom w:val="single" w:sz="4" w:color="BFBFBF"/>
+              <w:right w:val="single" w:sz="4" w:color="BFBFBF"/>
+            </w:tcBorders>
+          </w:tcPr>
+          <w:p>
+            <w:pPr>
+              <w:spacing w:before="40" w:after="40"/>
+              <w:jc w:val="center"/>
+            </w:pPr>
+            <w:r/>
+            <w:r>
+              <w:rPr>
+                <w:rFonts w:ascii="Calibri" w:hAnsi="Calibri" w:eastAsia="Calibri"/>
+                <w:b w:val="0"/>
+                <w:i w:val="0"/>
+                <w:color w:val="333333"/>
+                <w:sz w:val="16"/>
+              </w:rPr>
+              <w:t>—</w:t>
+            </w:r>
+          </w:p>
+        </w:tc>
+      </w:tr>
+      <w:tr>
+        <w:tc>
+          <w:tcPr>
+            <w:shd w:val="clear" w:fill="FFFFFF"/>
+          </w:tcPr>
+          <w:p>
+            <w:r>
+              <w:rPr>
+                <w:sz w:val="15"/>
+              </w:rPr>
+              <w:t xml:space="preserve">TC-ST-003</w:t>
+            </w:r>
+          </w:p>
+        </w:tc>
+        <w:tc>
+          <w:tcPr>
+            <w:shd w:val="clear" w:fill="FFFFFF"/>
+          </w:tcPr>
+          <w:p>
+            <w:r>
+              <w:rPr>
+                <w:sz w:val="15"/>
+              </w:rPr>
+              <w:t xml:space="preserve">Unsupported or invalid file handling</w:t>
+            </w:r>
+          </w:p>
+        </w:tc>
+        <w:tc>
+          <w:tcPr>
+            <w:shd w:val="clear" w:fill="FFFFFF"/>
+          </w:tcPr>
+          <w:p>
+            <w:r>
+              <w:rPr>
+                <w:sz w:val="15"/>
+              </w:rPr>
+              <w:t xml:space="preserve">Stability</w:t>
+            </w:r>
+          </w:p>
+        </w:tc>
+        <w:tc>
+          <w:tcPr>
+            <w:shd w:val="clear" w:fill="FFFFFF"/>
+          </w:tcPr>
+          <w:p>
+            <w:r>
+              <w:rPr>
+                <w:sz w:val="15"/>
+              </w:rPr>
+              <w:t xml:space="preserve">Try non-image / broken file if selectable</w:t>
+            </w:r>
+          </w:p>
+        </w:tc>
+        <w:tc>
+          <w:tcPr>
+            <w:shd w:val="clear" w:fill="FFFFFF"/>
+          </w:tcPr>
+          <w:p>
+            <w:r>
+              <w:rPr>
+                <w:sz w:val="15"/>
+              </w:rPr>
+              <w:t xml:space="preserve">Clear error; no crash</w:t>
+            </w:r>
+          </w:p>
+        </w:tc>
+        <w:tc>
+          <w:tcPr>
+            <w:shd w:fill="FFFFFF" w:val="clear"/>
+            <w:tcBorders>
+              <w:top w:val="single" w:sz="4" w:color="BFBFBF"/>
+              <w:left w:val="single" w:sz="4" w:color="BFBFBF"/>
+              <w:bottom w:val="single" w:sz="4" w:color="BFBFBF"/>
+              <w:right w:val="single" w:sz="4" w:color="BFBFBF"/>
+            </w:tcBorders>
+          </w:tcPr>
+          <w:sdt>
+            <w:sdtPr>
+              <w:alias w:val="Result"/>
+              <w:tag w:val="result_status"/>
+              <w:id w:val="31006"/>
+              <w:dropDownList>
+                <w:listItem w:displayText="Not Executed" w:value="Not Executed"/>
+                <w:listItem w:displayText="Pass" w:value="Pass"/>
+                <w:listItem w:displayText="Fail" w:value="Fail"/>
+                <w:listItem w:displayText="Blocked" w:value="Blocked"/>
+              </w:dropDownList>
+            </w:sdtPr>
+            <w:sdtContent>
+              <w:p>
+                <w:pPr>
+                  <w:jc w:val="center"/>
+                </w:pPr>
+                <w:r>
+                  <w:rPr>
+                    <w:sz w:val="16"/>
+                    <w:color w:val="666666"/>
+                  </w:rPr>
+                  <w:t>Not Executed</w:t>
+                </w:r>
+              </w:p>
+            </w:sdtContent>
+          </w:sdt>
+        </w:tc>
+        <w:tc>
+          <w:tcPr>
+            <w:shd w:fill="FFFFFF" w:val="clear"/>
+            <w:tcBorders>
+              <w:top w:val="single" w:sz="4" w:color="BFBFBF"/>
+              <w:left w:val="single" w:sz="4" w:color="BFBFBF"/>
+              <w:bottom w:val="single" w:sz="4" w:color="BFBFBF"/>
+              <w:right w:val="single" w:sz="4" w:color="BFBFBF"/>
+            </w:tcBorders>
+          </w:tcPr>
+          <w:p>
+            <w:pPr>
+              <w:spacing w:before="40" w:after="40"/>
+              <w:jc w:val="center"/>
+            </w:pPr>
+            <w:r/>
+            <w:r>
+              <w:rPr>
+                <w:rFonts w:ascii="Calibri" w:hAnsi="Calibri" w:eastAsia="Calibri"/>
+                <w:b w:val="0"/>
+                <w:i w:val="0"/>
+                <w:color w:val="333333"/>
+                <w:sz w:val="16"/>
+              </w:rPr>
+              <w:t>—</w:t>
+            </w:r>
+          </w:p>
+        </w:tc>
+      </w:tr>
+      <w:tr>
+        <w:tc>
+          <w:tcPr>
+            <w:shd w:val="clear" w:fill="F2F2F2"/>
+          </w:tcPr>
+          <w:p>
+            <w:r>
+              <w:rPr>
+                <w:sz w:val="15"/>
+              </w:rPr>
+              <w:t xml:space="preserve">TC-ST-004</w:t>
+            </w:r>
+          </w:p>
+        </w:tc>
+        <w:tc>
+          <w:tcPr>
+            <w:shd w:val="clear" w:fill="F2F2F2"/>
+          </w:tcPr>
+          <w:p>
+            <w:r>
+              <w:rPr>
+                <w:sz w:val="15"/>
+              </w:rPr>
+              <w:t xml:space="preserve">Very large image handling</w:t>
+            </w:r>
+          </w:p>
+        </w:tc>
+        <w:tc>
+          <w:tcPr>
+            <w:shd w:val="clear" w:fill="F2F2F2"/>
+          </w:tcPr>
+          <w:p>
+            <w:r>
+              <w:rPr>
+                <w:sz w:val="15"/>
+              </w:rPr>
+              <w:t xml:space="preserve">Stability, Performance</w:t>
+            </w:r>
+          </w:p>
+        </w:tc>
+        <w:tc>
+          <w:tcPr>
+            <w:shd w:val="clear" w:fill="F2F2F2"/>
+          </w:tcPr>
+          <w:p>
+            <w:r>
+              <w:rPr>
+                <w:sz w:val="15"/>
+              </w:rPr>
+              <w:t xml:space="preserve">Use a very large photo if available</w:t>
+            </w:r>
+          </w:p>
+        </w:tc>
+        <w:tc>
+          <w:tcPr>
+            <w:shd w:val="clear" w:fill="F2F2F2"/>
+          </w:tcPr>
+          <w:p>
+            <w:r>
+              <w:rPr>
+                <w:sz w:val="15"/>
+              </w:rPr>
+              <w:t xml:space="preserve">Processes, compresses, or friendly error; no freeze/crash</w:t>
+            </w:r>
+          </w:p>
+        </w:tc>
+        <w:tc>
+          <w:tcPr>
+            <w:shd w:fill="FFFFFF" w:val="clear"/>
+            <w:tcBorders>
+              <w:top w:val="single" w:sz="4" w:color="BFBFBF"/>
+              <w:left w:val="single" w:sz="4" w:color="BFBFBF"/>
+              <w:bottom w:val="single" w:sz="4" w:color="BFBFBF"/>
+              <w:right w:val="single" w:sz="4" w:color="BFBFBF"/>
+            </w:tcBorders>
+          </w:tcPr>
+          <w:sdt>
+            <w:sdtPr>
+              <w:alias w:val="Result"/>
+              <w:tag w:val="result_status"/>
+              <w:id w:val="31007"/>
+              <w:dropDownList>
+                <w:listItem w:displayText="Not Executed" w:value="Not Executed"/>
+                <w:listItem w:displayText="Pass" w:value="Pass"/>
+                <w:listItem w:displayText="Fail" w:value="Fail"/>
+                <w:listItem w:displayText="Blocked" w:value="Blocked"/>
+              </w:dropDownList>
+            </w:sdtPr>
+            <w:sdtContent>
+              <w:p>
+                <w:pPr>
+                  <w:jc w:val="center"/>
+                </w:pPr>
+                <w:r>
+                  <w:rPr>
+                    <w:sz w:val="16"/>
+                    <w:color w:val="666666"/>
+                  </w:rPr>
+                  <w:t>Not Executed</w:t>
+                </w:r>
+              </w:p>
+            </w:sdtContent>
+          </w:sdt>
+        </w:tc>
+        <w:tc>
+          <w:tcPr>
+            <w:shd w:fill="FFFFFF" w:val="clear"/>
+            <w:tcBorders>
+              <w:top w:val="single" w:sz="4" w:color="BFBFBF"/>
+              <w:left w:val="single" w:sz="4" w:color="BFBFBF"/>
+              <w:bottom w:val="single" w:sz="4" w:color="BFBFBF"/>
+              <w:right w:val="single" w:sz="4" w:color="BFBFBF"/>
+            </w:tcBorders>
+          </w:tcPr>
+          <w:p>
+            <w:pPr>
+              <w:spacing w:before="40" w:after="40"/>
+              <w:jc w:val="center"/>
+            </w:pPr>
+            <w:r/>
+            <w:r>
+              <w:rPr>
+                <w:rFonts w:ascii="Calibri" w:hAnsi="Calibri" w:eastAsia="Calibri"/>
+                <w:b w:val="0"/>
+                <w:i w:val="0"/>
+                <w:color w:val="333333"/>
+                <w:sz w:val="16"/>
+              </w:rPr>
+              <w:t>—</w:t>
+            </w:r>
+          </w:p>
+        </w:tc>
+      </w:tr>
+      <w:tr>
+        <w:tc>
+          <w:tcPr>
+            <w:shd w:val="clear" w:fill="FFFFFF"/>
+          </w:tcPr>
+          <w:p>
+            <w:r>
+              <w:rPr>
+                <w:sz w:val="15"/>
+              </w:rPr>
+              <w:t xml:space="preserve">TC-ST-005</w:t>
+            </w:r>
+          </w:p>
+        </w:tc>
+        <w:tc>
+          <w:tcPr>
+            <w:shd w:val="clear" w:fill="FFFFFF"/>
+          </w:tcPr>
+          <w:p>
+            <w:r>
+              <w:rPr>
+                <w:sz w:val="15"/>
+              </w:rPr>
+              <w:t xml:space="preserve">Repeated process in one session</w:t>
+            </w:r>
+          </w:p>
+        </w:tc>
+        <w:tc>
+          <w:tcPr>
+            <w:shd w:val="clear" w:fill="FFFFFF"/>
+          </w:tcPr>
+          <w:p>
+            <w:r>
+              <w:rPr>
+                <w:sz w:val="15"/>
+              </w:rPr>
+              <w:t xml:space="preserve">Stability</w:t>
+            </w:r>
+          </w:p>
+        </w:tc>
+        <w:tc>
+          <w:tcPr>
+            <w:shd w:val="clear" w:fill="FFFFFF"/>
+          </w:tcPr>
+          <w:p>
+            <w:r>
+              <w:rPr>
+                <w:sz w:val="15"/>
+              </w:rPr>
+              <w:t xml:space="preserve">Process several images one after another</w:t>
+            </w:r>
+          </w:p>
+        </w:tc>
+        <w:tc>
+          <w:tcPr>
+            <w:shd w:val="clear" w:fill="FFFFFF"/>
+          </w:tcPr>
+          <w:p>
+            <w:r>
+              <w:rPr>
+                <w:sz w:val="15"/>
+              </w:rPr>
+              <w:t xml:space="preserve">App stays usable; no progressive freeze/crash</w:t>
+            </w:r>
+          </w:p>
+        </w:tc>
+        <w:tc>
+          <w:tcPr>
+            <w:shd w:fill="FFFFFF" w:val="clear"/>
+            <w:tcBorders>
+              <w:top w:val="single" w:sz="4" w:color="BFBFBF"/>
+              <w:left w:val="single" w:sz="4" w:color="BFBFBF"/>
+              <w:bottom w:val="single" w:sz="4" w:color="BFBFBF"/>
+              <w:right w:val="single" w:sz="4" w:color="BFBFBF"/>
+            </w:tcBorders>
+          </w:tcPr>
+          <w:sdt>
+            <w:sdtPr>
+              <w:alias w:val="Result"/>
+              <w:tag w:val="result_status"/>
+              <w:id w:val="31008"/>
+              <w:dropDownList>
+                <w:listItem w:displayText="Not Executed" w:value="Not Executed"/>
+                <w:listItem w:displayText="Pass" w:value="Pass"/>
+                <w:listItem w:displayText="Fail" w:value="Fail"/>
+                <w:listItem w:displayText="Blocked" w:value="Blocked"/>
+              </w:dropDownList>
+            </w:sdtPr>
+            <w:sdtContent>
+              <w:p>
+                <w:pPr>
+                  <w:jc w:val="center"/>
+                </w:pPr>
+                <w:r>
+                  <w:rPr>
+                    <w:sz w:val="16"/>
+                    <w:color w:val="666666"/>
+                  </w:rPr>
+                  <w:t>Not Executed</w:t>
+                </w:r>
+              </w:p>
+            </w:sdtContent>
+          </w:sdt>
+        </w:tc>
+        <w:tc>
+          <w:tcPr>
+            <w:shd w:fill="FFFFFF" w:val="clear"/>
+            <w:tcBorders>
+              <w:top w:val="single" w:sz="4" w:color="BFBFBF"/>
+              <w:left w:val="single" w:sz="4" w:color="BFBFBF"/>
+              <w:bottom w:val="single" w:sz="4" w:color="BFBFBF"/>
+              <w:right w:val="single" w:sz="4" w:color="BFBFBF"/>
+            </w:tcBorders>
+          </w:tcPr>
+          <w:p>
+            <w:pPr>
+              <w:spacing w:before="40" w:after="40"/>
+              <w:jc w:val="center"/>
+            </w:pPr>
+            <w:r/>
+            <w:r>
+              <w:rPr>
+                <w:rFonts w:ascii="Calibri" w:hAnsi="Calibri" w:eastAsia="Calibri"/>
+                <w:b w:val="0"/>
+                <w:i w:val="0"/>
+                <w:color w:val="333333"/>
+                <w:sz w:val="16"/>
+              </w:rPr>
+              <w:t>—</w:t>
+            </w:r>
+          </w:p>
+        </w:tc>
+      </w:tr>
+    </w:tbl>
+    <w:p/>
+    <w:p>
+      <w:pPr>
+        <w:spacing w:before="240" w:after="80"/>
+      </w:pPr>
+      <w:r>
+        <w:rPr>
+          <w:rFonts w:ascii="Calibri" w:hAnsi="Calibri" w:eastAsia="Calibri"/>
+          <w:b/>
+          <w:i w:val="0"/>
+          <w:color w:val="2E75B6"/>
+          <w:sz w:val="26"/>
+        </w:rPr>
+        <w:t>5.6 Performance checks</w:t>
+      </w:r>
+    </w:p>
+    <w:p>
+      <w:pPr>
+        <w:spacing w:before="0" w:after="80"/>
+      </w:pPr>
+      <w:r>
+        <w:rPr>
+          <w:rFonts w:ascii="Calibri" w:hAnsi="Calibri" w:eastAsia="Calibri"/>
+          <w:b w:val="0"/>
+          <w:i/>
+          <w:color w:val="666666"/>
+          <w:sz w:val="18"/>
+        </w:rPr>
+        <w:t>Simple on-device checks. Note wait time if it feels too slow.</w:t>
+      </w:r>
+    </w:p>
+    <w:tbl>
+      <w:tblPr>
+        <w:tblW w:w="5000" w:type="pct"/>
+        <w:tblBorders>
+          <w:top w:val="single" w:sz="4" w:color="BFBFBF"/>
+          <w:left w:val="single" w:sz="4" w:color="BFBFBF"/>
+          <w:bottom w:val="single" w:sz="4" w:color="BFBFBF"/>
+          <w:right w:val="single" w:sz="4" w:color="BFBFBF"/>
+          <w:insideH w:val="single" w:sz="4" w:color="BFBFBF"/>
+          <w:insideV w:val="single" w:sz="4" w:color="BFBFBF"/>
+        </w:tblBorders>
+      </w:tblPr>
+      <w:tblGrid>
+        <w:gridCol w:w="900"/>
+        <w:gridCol w:w="1400"/>
+        <w:gridCol w:w="900"/>
+        <w:gridCol w:w="1200"/>
+        <w:gridCol w:w="1400"/>
+        <w:gridCol w:w="900"/>
+        <w:gridCol w:w="700"/>
+      </w:tblGrid>
+      <w:tr>
+        <w:tc>
+          <w:tcPr>
+            <w:shd w:val="clear" w:fill="1F4E79"/>
+          </w:tcPr>
+          <w:p>
+            <w:r>
+              <w:rPr>
+                <w:b/>
+                <w:color w:val="FFFFFF"/>
+                <w:sz w:val="15"/>
+              </w:rPr>
+              <w:t xml:space="preserve">TC ID</w:t>
+            </w:r>
+          </w:p>
+        </w:tc>
+        <w:tc>
+          <w:tcPr>
+            <w:shd w:val="clear" w:fill="1F4E79"/>
+          </w:tcPr>
+          <w:p>
+            <w:r>
+              <w:rPr>
+                <w:b/>
+                <w:color w:val="FFFFFF"/>
+                <w:sz w:val="15"/>
+              </w:rPr>
+              <w:t xml:space="preserve">Test Case</w:t>
+            </w:r>
+          </w:p>
+        </w:tc>
+        <w:tc>
+          <w:tcPr>
+            <w:shd w:val="clear" w:fill="1F4E79"/>
+          </w:tcPr>
+          <w:p>
+            <w:r>
+              <w:rPr>
+                <w:b/>
+                <w:color w:val="FFFFFF"/>
+                <w:sz w:val="15"/>
+              </w:rPr>
+              <w:t xml:space="preserve">Area</w:t>
+            </w:r>
+          </w:p>
+        </w:tc>
+        <w:tc>
+          <w:tcPr>
+            <w:shd w:val="clear" w:fill="1F4E79"/>
+          </w:tcPr>
+          <w:p>
+            <w:r>
+              <w:rPr>
+                <w:b/>
+                <w:color w:val="FFFFFF"/>
+                <w:sz w:val="15"/>
+              </w:rPr>
+              <w:t xml:space="preserve">Steps</w:t>
+            </w:r>
+          </w:p>
+        </w:tc>
+        <w:tc>
+          <w:tcPr>
+            <w:shd w:val="clear" w:fill="1F4E79"/>
+          </w:tcPr>
+          <w:p>
+            <w:r>
+              <w:rPr>
+                <w:b/>
+                <w:color w:val="FFFFFF"/>
+                <w:sz w:val="15"/>
+              </w:rPr>
+              <w:t xml:space="preserve">Expected Result</w:t>
+            </w:r>
+          </w:p>
+        </w:tc>
+        <w:tc>
+          <w:tcPr>
+            <w:shd w:val="clear" w:fill="1F4E79"/>
+          </w:tcPr>
+          <w:p>
+            <w:r>
+              <w:rPr>
+                <w:b/>
+                <w:color w:val="FFFFFF"/>
+                <w:sz w:val="15"/>
+              </w:rPr>
+              <w:t xml:space="preserve">Result</w:t>
+            </w:r>
+          </w:p>
+        </w:tc>
+        <w:tc>
+          <w:tcPr>
+            <w:shd w:val="clear" w:fill="1F4E79"/>
+          </w:tcPr>
+          <w:p>
+            <w:r>
+              <w:rPr>
+                <w:b/>
+                <w:color w:val="FFFFFF"/>
+                <w:sz w:val="15"/>
+              </w:rPr>
+              <w:t xml:space="preserve">Bug</w:t>
+            </w:r>
+          </w:p>
+        </w:tc>
+      </w:tr>
+      <w:tr>
+        <w:tc>
+          <w:tcPr>
+            <w:shd w:val="clear" w:fill="FFFFFF"/>
+          </w:tcPr>
+          <w:p>
+            <w:r>
+              <w:rPr>
+                <w:sz w:val="15"/>
+              </w:rPr>
+              <w:t xml:space="preserve">TC-PF-001</w:t>
+            </w:r>
+          </w:p>
+        </w:tc>
+        <w:tc>
+          <w:tcPr>
+            <w:shd w:val="clear" w:fill="FFFFFF"/>
+          </w:tcPr>
+          <w:p>
+            <w:r>
+              <w:rPr>
+                <w:sz w:val="15"/>
+              </w:rPr>
+              <w:t xml:space="preserve">Single-photo remove feels responsive</w:t>
+            </w:r>
+          </w:p>
+        </w:tc>
+        <w:tc>
+          <w:tcPr>
+            <w:shd w:val="clear" w:fill="FFFFFF"/>
+          </w:tcPr>
+          <w:p>
+            <w:r>
+              <w:rPr>
+                <w:sz w:val="15"/>
+              </w:rPr>
+              <w:t xml:space="preserve">Performance</w:t>
+            </w:r>
+          </w:p>
+        </w:tc>
+        <w:tc>
+          <w:tcPr>
+            <w:shd w:val="clear" w:fill="FFFFFF"/>
+          </w:tcPr>
+          <w:p>
+            <w:r>
+              <w:rPr>
+                <w:sz w:val="15"/>
+              </w:rPr>
+              <w:t xml:space="preserve">Background Remove on a normal gallery photo</w:t>
+            </w:r>
+          </w:p>
+        </w:tc>
+        <w:tc>
+          <w:tcPr>
+            <w:shd w:val="clear" w:fill="FFFFFF"/>
+          </w:tcPr>
+          <w:p>
+            <w:r>
+              <w:rPr>
+                <w:sz w:val="15"/>
+              </w:rPr>
+              <w:t xml:space="preserve">Progress shown; result without long hang</w:t>
+            </w:r>
+          </w:p>
+        </w:tc>
+        <w:tc>
+          <w:tcPr>
+            <w:shd w:fill="FFFFFF" w:val="clear"/>
+            <w:tcBorders>
+              <w:top w:val="single" w:sz="4" w:color="BFBFBF"/>
+              <w:left w:val="single" w:sz="4" w:color="BFBFBF"/>
+              <w:bottom w:val="single" w:sz="4" w:color="BFBFBF"/>
+              <w:right w:val="single" w:sz="4" w:color="BFBFBF"/>
+            </w:tcBorders>
+          </w:tcPr>
+          <w:sdt>
+            <w:sdtPr>
+              <w:alias w:val="Result"/>
+              <w:tag w:val="result_status"/>
+              <w:id w:val="31009"/>
+              <w:dropDownList>
+                <w:listItem w:displayText="Not Executed" w:value="Not Executed"/>
+                <w:listItem w:displayText="Pass" w:value="Pass"/>
+                <w:listItem w:displayText="Fail" w:value="Fail"/>
+                <w:listItem w:displayText="Blocked" w:value="Blocked"/>
+              </w:dropDownList>
+            </w:sdtPr>
+            <w:sdtContent>
+              <w:p>
+                <w:pPr>
+                  <w:jc w:val="center"/>
+                </w:pPr>
+                <w:r>
+                  <w:rPr>
+                    <w:sz w:val="16"/>
+                    <w:color w:val="666666"/>
+                  </w:rPr>
+                  <w:t>Not Executed</w:t>
+                </w:r>
+              </w:p>
+            </w:sdtContent>
+          </w:sdt>
+        </w:tc>
+        <w:tc>
+          <w:tcPr>
+            <w:shd w:fill="FFFFFF" w:val="clear"/>
+            <w:tcBorders>
+              <w:top w:val="single" w:sz="4" w:color="BFBFBF"/>
+              <w:left w:val="single" w:sz="4" w:color="BFBFBF"/>
+              <w:bottom w:val="single" w:sz="4" w:color="BFBFBF"/>
+              <w:right w:val="single" w:sz="4" w:color="BFBFBF"/>
+            </w:tcBorders>
+          </w:tcPr>
+          <w:p>
+            <w:pPr>
+              <w:spacing w:before="40" w:after="40"/>
+              <w:jc w:val="center"/>
+            </w:pPr>
+            <w:r/>
+            <w:r>
+              <w:rPr>
+                <w:rFonts w:ascii="Calibri" w:hAnsi="Calibri" w:eastAsia="Calibri"/>
+                <w:b w:val="0"/>
+                <w:i w:val="0"/>
+                <w:color w:val="333333"/>
+                <w:sz w:val="16"/>
+              </w:rPr>
+              <w:t>—</w:t>
+            </w:r>
+          </w:p>
+        </w:tc>
+      </w:tr>
+      <w:tr>
+        <w:tc>
+          <w:tcPr>
+            <w:shd w:val="clear" w:fill="F2F2F2"/>
+          </w:tcPr>
+          <w:p>
+            <w:r>
+              <w:rPr>
+                <w:sz w:val="15"/>
+              </w:rPr>
+              <w:t xml:space="preserve">TC-PF-002</w:t>
+            </w:r>
+          </w:p>
+        </w:tc>
+        <w:tc>
+          <w:tcPr>
+            <w:shd w:val="clear" w:fill="F2F2F2"/>
+          </w:tcPr>
+          <w:p>
+            <w:r>
+              <w:rPr>
+                <w:sz w:val="15"/>
+              </w:rPr>
+              <w:t xml:space="preserve">Batch queue with many images</w:t>
+            </w:r>
+          </w:p>
+        </w:tc>
+        <w:tc>
+          <w:tcPr>
+            <w:shd w:val="clear" w:fill="F2F2F2"/>
+          </w:tcPr>
+          <w:p>
+            <w:r>
+              <w:rPr>
+                <w:sz w:val="15"/>
+              </w:rPr>
+              <w:t xml:space="preserve">Performance</w:t>
+            </w:r>
+          </w:p>
+        </w:tc>
+        <w:tc>
+          <w:tcPr>
+            <w:shd w:val="clear" w:fill="F2F2F2"/>
+          </w:tcPr>
+          <w:p>
+            <w:r>
+              <w:rPr>
+                <w:sz w:val="15"/>
+              </w:rPr>
+              <w:t xml:space="preserve">Batch process close to max (up to 20)</w:t>
+            </w:r>
+          </w:p>
+        </w:tc>
+        <w:tc>
+          <w:tcPr>
+            <w:shd w:val="clear" w:fill="F2F2F2"/>
+          </w:tcPr>
+          <w:p>
+            <w:r>
+              <w:rPr>
+                <w:sz w:val="15"/>
+              </w:rPr>
+              <w:t xml:space="preserve">Progress visible; completes or clear failure; UI usable</w:t>
+            </w:r>
+          </w:p>
+        </w:tc>
+        <w:tc>
+          <w:tcPr>
+            <w:shd w:fill="FFFFFF" w:val="clear"/>
+            <w:tcBorders>
+              <w:top w:val="single" w:sz="4" w:color="BFBFBF"/>
+              <w:left w:val="single" w:sz="4" w:color="BFBFBF"/>
+              <w:bottom w:val="single" w:sz="4" w:color="BFBFBF"/>
+              <w:right w:val="single" w:sz="4" w:color="BFBFBF"/>
+            </w:tcBorders>
+          </w:tcPr>
+          <w:sdt>
+            <w:sdtPr>
+              <w:alias w:val="Result"/>
+              <w:tag w:val="result_status"/>
+              <w:id w:val="31010"/>
+              <w:dropDownList>
+                <w:listItem w:displayText="Not Executed" w:value="Not Executed"/>
+                <w:listItem w:displayText="Pass" w:value="Pass"/>
+                <w:listItem w:displayText="Fail" w:value="Fail"/>
+                <w:listItem w:displayText="Blocked" w:value="Blocked"/>
+              </w:dropDownList>
+            </w:sdtPr>
+            <w:sdtContent>
+              <w:p>
+                <w:pPr>
+                  <w:jc w:val="center"/>
+                </w:pPr>
+                <w:r>
+                  <w:rPr>
+                    <w:sz w:val="16"/>
+                    <w:color w:val="666666"/>
+                  </w:rPr>
+                  <w:t>Not Executed</w:t>
+                </w:r>
+              </w:p>
+            </w:sdtContent>
+          </w:sdt>
+        </w:tc>
+        <w:tc>
+          <w:tcPr>
+            <w:shd w:fill="FFFFFF" w:val="clear"/>
+            <w:tcBorders>
+              <w:top w:val="single" w:sz="4" w:color="BFBFBF"/>
+              <w:left w:val="single" w:sz="4" w:color="BFBFBF"/>
+              <w:bottom w:val="single" w:sz="4" w:color="BFBFBF"/>
+              <w:right w:val="single" w:sz="4" w:color="BFBFBF"/>
+            </w:tcBorders>
+          </w:tcPr>
+          <w:p>
+            <w:pPr>
+              <w:spacing w:before="40" w:after="40"/>
+              <w:jc w:val="center"/>
+            </w:pPr>
+            <w:r/>
+            <w:r>
+              <w:rPr>
+                <w:rFonts w:ascii="Calibri" w:hAnsi="Calibri" w:eastAsia="Calibri"/>
+                <w:b w:val="0"/>
+                <w:i w:val="0"/>
+                <w:color w:val="333333"/>
+                <w:sz w:val="16"/>
+              </w:rPr>
+              <w:t>—</w:t>
+            </w:r>
+          </w:p>
+        </w:tc>
+      </w:tr>
+      <w:tr>
+        <w:tc>
+          <w:tcPr>
+            <w:shd w:val="clear" w:fill="FFFFFF"/>
+          </w:tcPr>
+          <w:p>
+            <w:r>
+              <w:rPr>
+                <w:sz w:val="15"/>
+              </w:rPr>
+              <w:t xml:space="preserve">TC-PF-003</w:t>
+            </w:r>
+          </w:p>
+        </w:tc>
+        <w:tc>
+          <w:tcPr>
+            <w:shd w:val="clear" w:fill="FFFFFF"/>
+          </w:tcPr>
+          <w:p>
+            <w:r>
+              <w:rPr>
+                <w:sz w:val="15"/>
+              </w:rPr>
+              <w:t xml:space="preserve">Weak network behavior</w:t>
+            </w:r>
+          </w:p>
+        </w:tc>
+        <w:tc>
+          <w:tcPr>
+            <w:shd w:val="clear" w:fill="FFFFFF"/>
+          </w:tcPr>
+          <w:p>
+            <w:r>
+              <w:rPr>
+                <w:sz w:val="15"/>
+              </w:rPr>
+              <w:t xml:space="preserve">Performance, Stability</w:t>
+            </w:r>
+          </w:p>
+        </w:tc>
+        <w:tc>
+          <w:tcPr>
+            <w:shd w:val="clear" w:fill="FFFFFF"/>
+          </w:tcPr>
+          <w:p>
+            <w:r>
+              <w:rPr>
+                <w:sz w:val="15"/>
+              </w:rPr>
+              <w:t xml:space="preserve">Poor Wi-Fi / mobile data → process</w:t>
+            </w:r>
+          </w:p>
+        </w:tc>
+        <w:tc>
+          <w:tcPr>
+            <w:shd w:val="clear" w:fill="FFFFFF"/>
+          </w:tcPr>
+          <w:p>
+            <w:r>
+              <w:rPr>
+                <w:sz w:val="15"/>
+              </w:rPr>
+              <w:t xml:space="preserve">Wait/retry or clear error; no silent fail</w:t>
+            </w:r>
+          </w:p>
+        </w:tc>
+        <w:tc>
+          <w:tcPr>
+            <w:shd w:fill="FFFFFF" w:val="clear"/>
+            <w:tcBorders>
+              <w:top w:val="single" w:sz="4" w:color="BFBFBF"/>
+              <w:left w:val="single" w:sz="4" w:color="BFBFBF"/>
+              <w:bottom w:val="single" w:sz="4" w:color="BFBFBF"/>
+              <w:right w:val="single" w:sz="4" w:color="BFBFBF"/>
+            </w:tcBorders>
+          </w:tcPr>
+          <w:sdt>
+            <w:sdtPr>
+              <w:alias w:val="Result"/>
+              <w:tag w:val="result_status"/>
+              <w:id w:val="31011"/>
+              <w:dropDownList>
+                <w:listItem w:displayText="Not Executed" w:value="Not Executed"/>
+                <w:listItem w:displayText="Pass" w:value="Pass"/>
+                <w:listItem w:displayText="Fail" w:value="Fail"/>
+                <w:listItem w:displayText="Blocked" w:value="Blocked"/>
+              </w:dropDownList>
+            </w:sdtPr>
+            <w:sdtContent>
+              <w:p>
+                <w:pPr>
+                  <w:jc w:val="center"/>
+                </w:pPr>
+                <w:r>
+                  <w:rPr>
+                    <w:sz w:val="16"/>
+                    <w:color w:val="666666"/>
+                  </w:rPr>
+                  <w:t>Not Executed</w:t>
+                </w:r>
+              </w:p>
+            </w:sdtContent>
+          </w:sdt>
+        </w:tc>
+        <w:tc>
+          <w:tcPr>
+            <w:shd w:fill="FFFFFF" w:val="clear"/>
+            <w:tcBorders>
+              <w:top w:val="single" w:sz="4" w:color="BFBFBF"/>
+              <w:left w:val="single" w:sz="4" w:color="BFBFBF"/>
+              <w:bottom w:val="single" w:sz="4" w:color="BFBFBF"/>
+              <w:right w:val="single" w:sz="4" w:color="BFBFBF"/>
+            </w:tcBorders>
+          </w:tcPr>
+          <w:p>
+            <w:pPr>
+              <w:spacing w:before="40" w:after="40"/>
+              <w:jc w:val="center"/>
+            </w:pPr>
+            <w:r/>
+            <w:r>
+              <w:rPr>
+                <w:rFonts w:ascii="Calibri" w:hAnsi="Calibri" w:eastAsia="Calibri"/>
+                <w:b w:val="0"/>
+                <w:i w:val="0"/>
+                <w:color w:val="333333"/>
+                <w:sz w:val="16"/>
+              </w:rPr>
+              <w:t>—</w:t>
+            </w:r>
+          </w:p>
+        </w:tc>
+      </w:tr>
+    </w:tbl>
+    <w:p/>
+    <w:p>
+      <w:pPr>
+        <w:spacing w:before="240" w:after="80"/>
+      </w:pPr>
+      <w:r>
+        <w:rPr>
+          <w:rFonts w:ascii="Calibri" w:hAnsi="Calibri" w:eastAsia="Calibri"/>
+          <w:b/>
+          <w:i w:val="0"/>
+          <w:color w:val="2E75B6"/>
+          <w:sz w:val="26"/>
+        </w:rPr>
+        <w:t>5.7 Usability checks</w:t>
+      </w:r>
+    </w:p>
+    <w:p>
+      <w:pPr>
+        <w:spacing w:before="0" w:after="80"/>
+      </w:pPr>
+      <w:r>
+        <w:rPr>
+          <w:rFonts w:ascii="Calibri" w:hAnsi="Calibri" w:eastAsia="Calibri"/>
+          <w:b w:val="0"/>
+          <w:i/>
+          <w:color w:val="666666"/>
+          <w:sz w:val="18"/>
+        </w:rPr>
+        <w:t>Clarity and ease of use on real screens/tools.</w:t>
+      </w:r>
+    </w:p>
+    <w:tbl>
+      <w:tblPr>
+        <w:tblW w:w="5000" w:type="pct"/>
+        <w:tblBorders>
+          <w:top w:val="single" w:sz="4" w:color="BFBFBF"/>
+          <w:left w:val="single" w:sz="4" w:color="BFBFBF"/>
+          <w:bottom w:val="single" w:sz="4" w:color="BFBFBF"/>
+          <w:right w:val="single" w:sz="4" w:color="BFBFBF"/>
+          <w:insideH w:val="single" w:sz="4" w:color="BFBFBF"/>
+          <w:insideV w:val="single" w:sz="4" w:color="BFBFBF"/>
+        </w:tblBorders>
+      </w:tblPr>
+      <w:tblGrid>
+        <w:gridCol w:w="900"/>
+        <w:gridCol w:w="1400"/>
+        <w:gridCol w:w="900"/>
+        <w:gridCol w:w="1200"/>
+        <w:gridCol w:w="1400"/>
+        <w:gridCol w:w="900"/>
+        <w:gridCol w:w="700"/>
+      </w:tblGrid>
+      <w:tr>
+        <w:tc>
+          <w:tcPr>
+            <w:shd w:val="clear" w:fill="1F4E79"/>
+          </w:tcPr>
+          <w:p>
+            <w:r>
+              <w:rPr>
+                <w:b/>
+                <w:color w:val="FFFFFF"/>
+                <w:sz w:val="15"/>
+              </w:rPr>
+              <w:t xml:space="preserve">TC ID</w:t>
+            </w:r>
+          </w:p>
+        </w:tc>
+        <w:tc>
+          <w:tcPr>
+            <w:shd w:val="clear" w:fill="1F4E79"/>
+          </w:tcPr>
+          <w:p>
+            <w:r>
+              <w:rPr>
+                <w:b/>
+                <w:color w:val="FFFFFF"/>
+                <w:sz w:val="15"/>
+              </w:rPr>
+              <w:t xml:space="preserve">Test Case</w:t>
+            </w:r>
+          </w:p>
+        </w:tc>
+        <w:tc>
+          <w:tcPr>
+            <w:shd w:val="clear" w:fill="1F4E79"/>
+          </w:tcPr>
+          <w:p>
+            <w:r>
+              <w:rPr>
+                <w:b/>
+                <w:color w:val="FFFFFF"/>
+                <w:sz w:val="15"/>
+              </w:rPr>
+              <w:t xml:space="preserve">Area</w:t>
+            </w:r>
+          </w:p>
+        </w:tc>
+        <w:tc>
+          <w:tcPr>
+            <w:shd w:val="clear" w:fill="1F4E79"/>
+          </w:tcPr>
+          <w:p>
+            <w:r>
+              <w:rPr>
+                <w:b/>
+                <w:color w:val="FFFFFF"/>
+                <w:sz w:val="15"/>
+              </w:rPr>
+              <w:t xml:space="preserve">Steps</w:t>
+            </w:r>
+          </w:p>
+        </w:tc>
+        <w:tc>
+          <w:tcPr>
+            <w:shd w:val="clear" w:fill="1F4E79"/>
+          </w:tcPr>
+          <w:p>
+            <w:r>
+              <w:rPr>
+                <w:b/>
+                <w:color w:val="FFFFFF"/>
+                <w:sz w:val="15"/>
+              </w:rPr>
+              <w:t xml:space="preserve">Expected Result</w:t>
+            </w:r>
+          </w:p>
+        </w:tc>
+        <w:tc>
+          <w:tcPr>
+            <w:shd w:val="clear" w:fill="1F4E79"/>
+          </w:tcPr>
+          <w:p>
+            <w:r>
+              <w:rPr>
+                <w:b/>
+                <w:color w:val="FFFFFF"/>
+                <w:sz w:val="15"/>
+              </w:rPr>
+              <w:t xml:space="preserve">Result</w:t>
+            </w:r>
+          </w:p>
+        </w:tc>
+        <w:tc>
+          <w:tcPr>
+            <w:shd w:val="clear" w:fill="1F4E79"/>
+          </w:tcPr>
+          <w:p>
+            <w:r>
+              <w:rPr>
+                <w:b/>
+                <w:color w:val="FFFFFF"/>
+                <w:sz w:val="15"/>
+              </w:rPr>
+              <w:t xml:space="preserve">Bug</w:t>
+            </w:r>
+          </w:p>
+        </w:tc>
+      </w:tr>
+      <w:tr>
+        <w:tc>
+          <w:tcPr>
+            <w:shd w:val="clear" w:fill="FFFFFF"/>
+          </w:tcPr>
+          <w:p>
+            <w:r>
+              <w:rPr>
+                <w:sz w:val="15"/>
+              </w:rPr>
+              <w:t xml:space="preserve">TC-UX-001</w:t>
+            </w:r>
+          </w:p>
+        </w:tc>
+        <w:tc>
+          <w:tcPr>
+            <w:shd w:val="clear" w:fill="FFFFFF"/>
+          </w:tcPr>
+          <w:p>
+            <w:r>
+              <w:rPr>
+                <w:sz w:val="15"/>
+              </w:rPr>
+              <w:t xml:space="preserve">Homepage modules easy to find</w:t>
+            </w:r>
+          </w:p>
+        </w:tc>
+        <w:tc>
+          <w:tcPr>
+            <w:shd w:val="clear" w:fill="FFFFFF"/>
+          </w:tcPr>
+          <w:p>
+            <w:r>
+              <w:rPr>
+                <w:sz w:val="15"/>
+              </w:rPr>
+              <w:t xml:space="preserve">Usability</w:t>
+            </w:r>
+          </w:p>
+        </w:tc>
+        <w:tc>
+          <w:tcPr>
+            <w:shd w:val="clear" w:fill="FFFFFF"/>
+          </w:tcPr>
+          <w:p>
+            <w:r>
+              <w:rPr>
+                <w:sz w:val="15"/>
+              </w:rPr>
+              <w:t xml:space="preserve">Open app Homepage</w:t>
+            </w:r>
+          </w:p>
+        </w:tc>
+        <w:tc>
+          <w:tcPr>
+            <w:shd w:val="clear" w:fill="FFFFFF"/>
+          </w:tcPr>
+          <w:p>
+            <w:r>
+              <w:rPr>
+                <w:sz w:val="15"/>
+              </w:rPr>
+              <w:t xml:space="preserve">Background Remove and Batch Remover are clear</w:t>
+            </w:r>
+          </w:p>
+        </w:tc>
+        <w:tc>
+          <w:tcPr>
+            <w:shd w:fill="FFFFFF" w:val="clear"/>
+            <w:tcBorders>
+              <w:top w:val="single" w:sz="4" w:color="BFBFBF"/>
+              <w:left w:val="single" w:sz="4" w:color="BFBFBF"/>
+              <w:bottom w:val="single" w:sz="4" w:color="BFBFBF"/>
+              <w:right w:val="single" w:sz="4" w:color="BFBFBF"/>
+            </w:tcBorders>
+          </w:tcPr>
+          <w:sdt>
+            <w:sdtPr>
+              <w:alias w:val="Result"/>
+              <w:tag w:val="result_status"/>
+              <w:id w:val="31012"/>
+              <w:dropDownList>
+                <w:listItem w:displayText="Not Executed" w:value="Not Executed"/>
+                <w:listItem w:displayText="Pass" w:value="Pass"/>
+                <w:listItem w:displayText="Fail" w:value="Fail"/>
+                <w:listItem w:displayText="Blocked" w:value="Blocked"/>
+              </w:dropDownList>
+            </w:sdtPr>
+            <w:sdtContent>
+              <w:p>
+                <w:pPr>
+                  <w:jc w:val="center"/>
+                </w:pPr>
+                <w:r>
+                  <w:rPr>
+                    <w:sz w:val="16"/>
+                    <w:color w:val="666666"/>
+                  </w:rPr>
+                  <w:t>Not Executed</w:t>
+                </w:r>
+              </w:p>
+            </w:sdtContent>
+          </w:sdt>
+        </w:tc>
+        <w:tc>
+          <w:tcPr>
+            <w:shd w:fill="FFFFFF" w:val="clear"/>
+            <w:tcBorders>
+              <w:top w:val="single" w:sz="4" w:color="BFBFBF"/>
+              <w:left w:val="single" w:sz="4" w:color="BFBFBF"/>
+              <w:bottom w:val="single" w:sz="4" w:color="BFBFBF"/>
+              <w:right w:val="single" w:sz="4" w:color="BFBFBF"/>
+            </w:tcBorders>
+          </w:tcPr>
+          <w:p>
+            <w:pPr>
+              <w:spacing w:before="40" w:after="40"/>
+              <w:jc w:val="center"/>
+            </w:pPr>
+            <w:r/>
+            <w:r>
+              <w:rPr>
+                <w:rFonts w:ascii="Calibri" w:hAnsi="Calibri" w:eastAsia="Calibri"/>
+                <w:b w:val="0"/>
+                <w:i w:val="0"/>
+                <w:color w:val="333333"/>
+                <w:sz w:val="16"/>
+              </w:rPr>
+              <w:t>—</w:t>
+            </w:r>
+          </w:p>
+        </w:tc>
+      </w:tr>
+      <w:tr>
+        <w:tc>
+          <w:tcPr>
+            <w:shd w:val="clear" w:fill="F2F2F2"/>
+          </w:tcPr>
+          <w:p>
+            <w:r>
+              <w:rPr>
+                <w:sz w:val="15"/>
+              </w:rPr>
+              <w:t xml:space="preserve">TC-UX-002</w:t>
+            </w:r>
+          </w:p>
+        </w:tc>
+        <w:tc>
+          <w:tcPr>
+            <w:shd w:val="clear" w:fill="F2F2F2"/>
+          </w:tcPr>
+          <w:p>
+            <w:r>
+              <w:rPr>
+                <w:sz w:val="15"/>
+              </w:rPr>
+              <w:t xml:space="preserve">Checkerboard shows transparency</w:t>
+            </w:r>
+          </w:p>
+        </w:tc>
+        <w:tc>
+          <w:tcPr>
+            <w:shd w:val="clear" w:fill="F2F2F2"/>
+          </w:tcPr>
+          <w:p>
+            <w:r>
+              <w:rPr>
+                <w:sz w:val="15"/>
+              </w:rPr>
+              <w:t xml:space="preserve">Usability</w:t>
+            </w:r>
+          </w:p>
+        </w:tc>
+        <w:tc>
+          <w:tcPr>
+            <w:shd w:val="clear" w:fill="F2F2F2"/>
+          </w:tcPr>
+          <w:p>
+            <w:r>
+              <w:rPr>
+                <w:sz w:val="15"/>
+              </w:rPr>
+              <w:t xml:space="preserve">After successful remove in primary editor</w:t>
+            </w:r>
+          </w:p>
+        </w:tc>
+        <w:tc>
+          <w:tcPr>
+            <w:shd w:val="clear" w:fill="F2F2F2"/>
+          </w:tcPr>
+          <w:p>
+            <w:r>
+              <w:rPr>
+                <w:sz w:val="15"/>
+              </w:rPr>
+              <w:t xml:space="preserve">Cleared area shows checkerboard or clear transparent cue</w:t>
+            </w:r>
+          </w:p>
+        </w:tc>
+        <w:tc>
+          <w:tcPr>
+            <w:shd w:fill="FFFFFF" w:val="clear"/>
+            <w:tcBorders>
+              <w:top w:val="single" w:sz="4" w:color="BFBFBF"/>
+              <w:left w:val="single" w:sz="4" w:color="BFBFBF"/>
+              <w:bottom w:val="single" w:sz="4" w:color="BFBFBF"/>
+              <w:right w:val="single" w:sz="4" w:color="BFBFBF"/>
+            </w:tcBorders>
+          </w:tcPr>
+          <w:sdt>
+            <w:sdtPr>
+              <w:alias w:val="Result"/>
+              <w:tag w:val="result_status"/>
+              <w:id w:val="31013"/>
+              <w:dropDownList>
+                <w:listItem w:displayText="Not Executed" w:value="Not Executed"/>
+                <w:listItem w:displayText="Pass" w:value="Pass"/>
+                <w:listItem w:displayText="Fail" w:value="Fail"/>
+                <w:listItem w:displayText="Blocked" w:value="Blocked"/>
+              </w:dropDownList>
+            </w:sdtPr>
+            <w:sdtContent>
+              <w:p>
+                <w:pPr>
+                  <w:jc w:val="center"/>
+                </w:pPr>
+                <w:r>
+                  <w:rPr>
+                    <w:sz w:val="16"/>
+                    <w:color w:val="666666"/>
+                  </w:rPr>
+                  <w:t>Not Executed</w:t>
+                </w:r>
+              </w:p>
+            </w:sdtContent>
+          </w:sdt>
+        </w:tc>
+        <w:tc>
+          <w:tcPr>
+            <w:shd w:fill="FFFFFF" w:val="clear"/>
+            <w:tcBorders>
+              <w:top w:val="single" w:sz="4" w:color="BFBFBF"/>
+              <w:left w:val="single" w:sz="4" w:color="BFBFBF"/>
+              <w:bottom w:val="single" w:sz="4" w:color="BFBFBF"/>
+              <w:right w:val="single" w:sz="4" w:color="BFBFBF"/>
+            </w:tcBorders>
+          </w:tcPr>
+          <w:p>
+            <w:pPr>
+              <w:spacing w:before="40" w:after="40"/>
+              <w:jc w:val="center"/>
+            </w:pPr>
+            <w:r/>
+            <w:r>
+              <w:rPr>
+                <w:rFonts w:ascii="Calibri" w:hAnsi="Calibri" w:eastAsia="Calibri"/>
+                <w:b w:val="0"/>
+                <w:i w:val="0"/>
+                <w:color w:val="333333"/>
+                <w:sz w:val="16"/>
+              </w:rPr>
+              <w:t>—</w:t>
+            </w:r>
+          </w:p>
+        </w:tc>
+      </w:tr>
+      <w:tr>
+        <w:tc>
+          <w:tcPr>
+            <w:shd w:val="clear" w:fill="FFFFFF"/>
+          </w:tcPr>
+          <w:p>
+            <w:r>
+              <w:rPr>
+                <w:sz w:val="15"/>
+              </w:rPr>
+              <w:t xml:space="preserve">TC-UX-003</w:t>
+            </w:r>
+          </w:p>
+        </w:tc>
+        <w:tc>
+          <w:tcPr>
+            <w:shd w:val="clear" w:fill="FFFFFF"/>
+          </w:tcPr>
+          <w:p>
+            <w:r>
+              <w:rPr>
+                <w:sz w:val="15"/>
+              </w:rPr>
+              <w:t xml:space="preserve">Pinch zoom / move on canvas</w:t>
+            </w:r>
+          </w:p>
+        </w:tc>
+        <w:tc>
+          <w:tcPr>
+            <w:shd w:val="clear" w:fill="FFFFFF"/>
+          </w:tcPr>
+          <w:p>
+            <w:r>
+              <w:rPr>
+                <w:sz w:val="15"/>
+              </w:rPr>
+              <w:t xml:space="preserve">Usability</w:t>
+            </w:r>
+          </w:p>
+        </w:tc>
+        <w:tc>
+          <w:tcPr>
+            <w:shd w:val="clear" w:fill="FFFFFF"/>
+          </w:tcPr>
+          <w:p>
+            <w:r>
+              <w:rPr>
+                <w:sz w:val="15"/>
+              </w:rPr>
+              <w:t xml:space="preserve">Zoom and move subject in editor</w:t>
+            </w:r>
+          </w:p>
+        </w:tc>
+        <w:tc>
+          <w:tcPr>
+            <w:shd w:val="clear" w:fill="FFFFFF"/>
+          </w:tcPr>
+          <w:p>
+            <w:r>
+              <w:rPr>
+                <w:sz w:val="15"/>
+              </w:rPr>
+              <w:t xml:space="preserve">Canvas responds well enough for editing</w:t>
+            </w:r>
+          </w:p>
+        </w:tc>
+        <w:tc>
+          <w:tcPr>
+            <w:shd w:fill="FFFFFF" w:val="clear"/>
+            <w:tcBorders>
+              <w:top w:val="single" w:sz="4" w:color="BFBFBF"/>
+              <w:left w:val="single" w:sz="4" w:color="BFBFBF"/>
+              <w:bottom w:val="single" w:sz="4" w:color="BFBFBF"/>
+              <w:right w:val="single" w:sz="4" w:color="BFBFBF"/>
+            </w:tcBorders>
+          </w:tcPr>
+          <w:sdt>
+            <w:sdtPr>
+              <w:alias w:val="Result"/>
+              <w:tag w:val="result_status"/>
+              <w:id w:val="31014"/>
+              <w:dropDownList>
+                <w:listItem w:displayText="Not Executed" w:value="Not Executed"/>
+                <w:listItem w:displayText="Pass" w:value="Pass"/>
+                <w:listItem w:displayText="Fail" w:value="Fail"/>
+                <w:listItem w:displayText="Blocked" w:value="Blocked"/>
+              </w:dropDownList>
+            </w:sdtPr>
+            <w:sdtContent>
+              <w:p>
+                <w:pPr>
+                  <w:jc w:val="center"/>
+                </w:pPr>
+                <w:r>
+                  <w:rPr>
+                    <w:sz w:val="16"/>
+                    <w:color w:val="666666"/>
+                  </w:rPr>
+                  <w:t>Not Executed</w:t>
+                </w:r>
+              </w:p>
+            </w:sdtContent>
+          </w:sdt>
+        </w:tc>
+        <w:tc>
+          <w:tcPr>
+            <w:shd w:fill="FFFFFF" w:val="clear"/>
+            <w:tcBorders>
+              <w:top w:val="single" w:sz="4" w:color="BFBFBF"/>
+              <w:left w:val="single" w:sz="4" w:color="BFBFBF"/>
+              <w:bottom w:val="single" w:sz="4" w:color="BFBFBF"/>
+              <w:right w:val="single" w:sz="4" w:color="BFBFBF"/>
+            </w:tcBorders>
+          </w:tcPr>
+          <w:p>
+            <w:pPr>
+              <w:spacing w:before="40" w:after="40"/>
+              <w:jc w:val="center"/>
+            </w:pPr>
+            <w:r/>
+            <w:r>
+              <w:rPr>
+                <w:rFonts w:ascii="Calibri" w:hAnsi="Calibri" w:eastAsia="Calibri"/>
+                <w:b w:val="0"/>
+                <w:i w:val="0"/>
+                <w:color w:val="333333"/>
+                <w:sz w:val="16"/>
+              </w:rPr>
+              <w:t>—</w:t>
+            </w:r>
+          </w:p>
+        </w:tc>
+      </w:tr>
+      <w:tr>
+        <w:tc>
+          <w:tcPr>
+            <w:shd w:val="clear" w:fill="E2EFDA"/>
+          </w:tcPr>
+          <w:p>
+            <w:r>
+              <w:rPr>
+                <w:sz w:val="15"/>
+              </w:rPr>
+              <w:t xml:space="preserve">TC-UX-004</w:t>
+            </w:r>
+          </w:p>
+        </w:tc>
+        <w:tc>
+          <w:tcPr>
+            <w:shd w:val="clear" w:fill="E2EFDA"/>
+          </w:tcPr>
+          <w:p>
+            <w:r>
+              <w:rPr>
+                <w:sz w:val="15"/>
+              </w:rPr>
+              <w:t xml:space="preserve">Tool icons/labels understandable</w:t>
+            </w:r>
+          </w:p>
+        </w:tc>
+        <w:tc>
+          <w:tcPr>
+            <w:shd w:val="clear" w:fill="E2EFDA"/>
+          </w:tcPr>
+          <w:p>
+            <w:r>
+              <w:rPr>
+                <w:sz w:val="15"/>
+              </w:rPr>
+              <w:t xml:space="preserve">Usability</w:t>
+            </w:r>
+          </w:p>
+        </w:tc>
+        <w:tc>
+          <w:tcPr>
+            <w:shd w:val="clear" w:fill="E2EFDA"/>
+          </w:tcPr>
+          <w:p>
+            <w:r>
+              <w:rPr>
+                <w:sz w:val="15"/>
+              </w:rPr>
+              <w:t xml:space="preserve">Review primary and secondary toolbars</w:t>
+            </w:r>
+          </w:p>
+        </w:tc>
+        <w:tc>
+          <w:tcPr>
+            <w:shd w:val="clear" w:fill="E2EFDA"/>
+          </w:tcPr>
+          <w:p>
+            <w:r>
+              <w:rPr>
+                <w:sz w:val="15"/>
+              </w:rPr>
+              <w:t xml:space="preserve">Icons/labels match actions without confusion</w:t>
+            </w:r>
+          </w:p>
+        </w:tc>
+        <w:tc>
+          <w:tcPr>
+            <w:shd w:fill="E2EFDA" w:val="clear"/>
+            <w:tcBorders>
+              <w:top w:val="single" w:sz="4" w:color="BFBFBF"/>
+              <w:left w:val="single" w:sz="4" w:color="BFBFBF"/>
+              <w:bottom w:val="single" w:sz="4" w:color="BFBFBF"/>
+              <w:right w:val="single" w:sz="4" w:color="BFBFBF"/>
+            </w:tcBorders>
+          </w:tcPr>
+          <w:sdt>
+            <w:sdtPr>
+              <w:alias w:val="Result"/>
+              <w:tag w:val="result_status"/>
+              <w:id w:val="31015"/>
+              <w:dropDownList>
+                <w:listItem w:displayText="Not Executed" w:value="Not Executed"/>
+                <w:listItem w:displayText="Pass" w:value="Pass"/>
+                <w:listItem w:displayText="Fail" w:value="Fail"/>
+                <w:listItem w:displayText="Blocked" w:value="Blocked"/>
+              </w:dropDownList>
+            </w:sdtPr>
+            <w:sdtContent>
+              <w:p>
+                <w:pPr>
+                  <w:jc w:val="center"/>
+                </w:pPr>
+                <w:r>
+                  <w:rPr>
+                    <w:sz w:val="16"/>
+                    <w:color w:val="548235"/>
+                  </w:rPr>
+                  <w:t>Pass</w:t>
+                </w:r>
+              </w:p>
+            </w:sdtContent>
+          </w:sdt>
+        </w:tc>
+        <w:tc>
+          <w:tcPr>
+            <w:shd w:fill="E2EFDA" w:val="clear"/>
+            <w:tcBorders>
+              <w:top w:val="single" w:sz="4" w:color="BFBFBF"/>
+              <w:left w:val="single" w:sz="4" w:color="BFBFBF"/>
+              <w:bottom w:val="single" w:sz="4" w:color="BFBFBF"/>
+              <w:right w:val="single" w:sz="4" w:color="BFBFBF"/>
+            </w:tcBorders>
+          </w:tcPr>
+          <w:p>
+            <w:pPr>
+              <w:spacing w:before="40" w:after="40"/>
+              <w:jc w:val="center"/>
+            </w:pPr>
+            <w:r/>
+            <w:r>
+              <w:rPr>
+                <w:rFonts w:ascii="Calibri" w:hAnsi="Calibri" w:eastAsia="Calibri"/>
+                <w:b w:val="0"/>
+                <w:i w:val="0"/>
+                <w:color w:val="333333"/>
+                <w:sz w:val="16"/>
+              </w:rPr>
+              <w:t>—</w:t>
+            </w:r>
+          </w:p>
+        </w:tc>
+      </w:tr>
+      <w:tr>
+        <w:tc>
+          <w:tcPr>
+            <w:shd w:val="clear" w:fill="FFFFFF"/>
+          </w:tcPr>
+          <w:p>
+            <w:r>
+              <w:rPr>
+                <w:sz w:val="15"/>
+              </w:rPr>
+              <w:t xml:space="preserve">TC-UX-005</w:t>
+            </w:r>
+          </w:p>
+        </w:tc>
+        <w:tc>
+          <w:tcPr>
+            <w:shd w:val="clear" w:fill="FFFFFF"/>
+          </w:tcPr>
+          <w:p>
+            <w:r>
+              <w:rPr>
+                <w:sz w:val="15"/>
+              </w:rPr>
+              <w:t xml:space="preserve">Loading / progress feedback</w:t>
+            </w:r>
+          </w:p>
+        </w:tc>
+        <w:tc>
+          <w:tcPr>
+            <w:shd w:val="clear" w:fill="FFFFFF"/>
+          </w:tcPr>
+          <w:p>
+            <w:r>
+              <w:rPr>
+                <w:sz w:val="15"/>
+              </w:rPr>
+              <w:t xml:space="preserve">Usability, Performance</w:t>
+            </w:r>
+          </w:p>
+        </w:tc>
+        <w:tc>
+          <w:tcPr>
+            <w:shd w:val="clear" w:fill="FFFFFF"/>
+          </w:tcPr>
+          <w:p>
+            <w:r>
+              <w:rPr>
+                <w:sz w:val="15"/>
+              </w:rPr>
+              <w:t xml:space="preserve">Start auto remove or batch process</w:t>
+            </w:r>
+          </w:p>
+        </w:tc>
+        <w:tc>
+          <w:tcPr>
+            <w:shd w:val="clear" w:fill="FFFFFF"/>
+          </w:tcPr>
+          <w:p>
+            <w:r>
+              <w:rPr>
+                <w:sz w:val="15"/>
+              </w:rPr>
+              <w:t xml:space="preserve">User can tell processing is running</w:t>
+            </w:r>
+          </w:p>
+        </w:tc>
+        <w:tc>
+          <w:tcPr>
+            <w:shd w:fill="FFFFFF" w:val="clear"/>
+            <w:tcBorders>
+              <w:top w:val="single" w:sz="4" w:color="BFBFBF"/>
+              <w:left w:val="single" w:sz="4" w:color="BFBFBF"/>
+              <w:bottom w:val="single" w:sz="4" w:color="BFBFBF"/>
+              <w:right w:val="single" w:sz="4" w:color="BFBFBF"/>
+            </w:tcBorders>
+          </w:tcPr>
+          <w:sdt>
+            <w:sdtPr>
+              <w:alias w:val="Result"/>
+              <w:tag w:val="result_status"/>
+              <w:id w:val="31016"/>
+              <w:dropDownList>
+                <w:listItem w:displayText="Not Executed" w:value="Not Executed"/>
+                <w:listItem w:displayText="Pass" w:value="Pass"/>
+                <w:listItem w:displayText="Fail" w:value="Fail"/>
+                <w:listItem w:displayText="Blocked" w:value="Blocked"/>
+              </w:dropDownList>
+            </w:sdtPr>
+            <w:sdtContent>
+              <w:p>
+                <w:pPr>
+                  <w:jc w:val="center"/>
+                </w:pPr>
+                <w:r>
+                  <w:rPr>
+                    <w:sz w:val="16"/>
+                    <w:color w:val="666666"/>
+                  </w:rPr>
+                  <w:t>Not Executed</w:t>
+                </w:r>
+              </w:p>
+            </w:sdtContent>
+          </w:sdt>
+        </w:tc>
+        <w:tc>
+          <w:tcPr>
+            <w:shd w:fill="FFFFFF" w:val="clear"/>
+            <w:tcBorders>
+              <w:top w:val="single" w:sz="4" w:color="BFBFBF"/>
+              <w:left w:val="single" w:sz="4" w:color="BFBFBF"/>
+              <w:bottom w:val="single" w:sz="4" w:color="BFBFBF"/>
+              <w:right w:val="single" w:sz="4" w:color="BFBFBF"/>
+            </w:tcBorders>
+          </w:tcPr>
+          <w:p>
+            <w:pPr>
+              <w:spacing w:before="40" w:after="40"/>
+              <w:jc w:val="center"/>
+            </w:pPr>
+            <w:r/>
+            <w:r>
+              <w:rPr>
+                <w:rFonts w:ascii="Calibri" w:hAnsi="Calibri" w:eastAsia="Calibri"/>
+                <w:b w:val="0"/>
+                <w:i w:val="0"/>
+                <w:color w:val="333333"/>
+                <w:sz w:val="16"/>
+              </w:rPr>
+              <w:t>—</w:t>
+            </w:r>
+          </w:p>
+        </w:tc>
+      </w:tr>
+      <w:tr>
+        <w:tc>
+          <w:tcPr>
+            <w:shd w:val="clear" w:fill="E2EFDA"/>
+          </w:tcPr>
+          <w:p>
+            <w:r>
+              <w:rPr>
+                <w:sz w:val="15"/>
+              </w:rPr>
+              <w:t xml:space="preserve">TC-UX-006</w:t>
+            </w:r>
+          </w:p>
+        </w:tc>
+        <w:tc>
+          <w:tcPr>
+            <w:shd w:val="clear" w:fill="E2EFDA"/>
+          </w:tcPr>
+          <w:p>
+            <w:r>
+              <w:rPr>
+                <w:sz w:val="15"/>
+              </w:rPr>
+              <w:t xml:space="preserve">Discard / Cancel alert wording clear</w:t>
+            </w:r>
+          </w:p>
+        </w:tc>
+        <w:tc>
+          <w:tcPr>
+            <w:shd w:val="clear" w:fill="E2EFDA"/>
+          </w:tcPr>
+          <w:p>
+            <w:r>
+              <w:rPr>
+                <w:sz w:val="15"/>
+              </w:rPr>
+              <w:t xml:space="preserve">Usability</w:t>
+            </w:r>
+          </w:p>
+        </w:tc>
+        <w:tc>
+          <w:tcPr>
+            <w:shd w:val="clear" w:fill="E2EFDA"/>
+          </w:tcPr>
+          <w:p>
+            <w:r>
+              <w:rPr>
+                <w:sz w:val="15"/>
+              </w:rPr>
+              <w:t xml:space="preserve">Tap X in primary editor</w:t>
+            </w:r>
+          </w:p>
+        </w:tc>
+        <w:tc>
+          <w:tcPr>
+            <w:shd w:val="clear" w:fill="E2EFDA"/>
+          </w:tcPr>
+          <w:p>
+            <w:r>
+              <w:rPr>
+                <w:sz w:val="15"/>
+              </w:rPr>
+              <w:t xml:space="preserve">Alert choices are understandable</w:t>
+            </w:r>
+          </w:p>
+        </w:tc>
+        <w:tc>
+          <w:tcPr>
+            <w:shd w:fill="E2EFDA" w:val="clear"/>
+            <w:tcBorders>
+              <w:top w:val="single" w:sz="4" w:color="BFBFBF"/>
+              <w:left w:val="single" w:sz="4" w:color="BFBFBF"/>
+              <w:bottom w:val="single" w:sz="4" w:color="BFBFBF"/>
+              <w:right w:val="single" w:sz="4" w:color="BFBFBF"/>
+            </w:tcBorders>
+          </w:tcPr>
+          <w:sdt>
+            <w:sdtPr>
+              <w:alias w:val="Result"/>
+              <w:tag w:val="result_status"/>
+              <w:id w:val="31017"/>
+              <w:dropDownList>
+                <w:listItem w:displayText="Not Executed" w:value="Not Executed"/>
+                <w:listItem w:displayText="Pass" w:value="Pass"/>
+                <w:listItem w:displayText="Fail" w:value="Fail"/>
+                <w:listItem w:displayText="Blocked" w:value="Blocked"/>
+              </w:dropDownList>
+            </w:sdtPr>
+            <w:sdtContent>
+              <w:p>
+                <w:pPr>
+                  <w:jc w:val="center"/>
+                </w:pPr>
+                <w:r>
+                  <w:rPr>
+                    <w:sz w:val="16"/>
+                    <w:color w:val="548235"/>
+                  </w:rPr>
+                  <w:t>Pass</w:t>
+                </w:r>
+              </w:p>
+            </w:sdtContent>
+          </w:sdt>
+        </w:tc>
+        <w:tc>
+          <w:tcPr>
+            <w:shd w:fill="E2EFDA" w:val="clear"/>
+            <w:tcBorders>
+              <w:top w:val="single" w:sz="4" w:color="BFBFBF"/>
+              <w:left w:val="single" w:sz="4" w:color="BFBFBF"/>
+              <w:bottom w:val="single" w:sz="4" w:color="BFBFBF"/>
+              <w:right w:val="single" w:sz="4" w:color="BFBFBF"/>
+            </w:tcBorders>
+          </w:tcPr>
+          <w:p>
+            <w:pPr>
+              <w:spacing w:before="40" w:after="40"/>
+              <w:jc w:val="center"/>
+            </w:pPr>
+            <w:r/>
+            <w:r>
+              <w:rPr>
+                <w:rFonts w:ascii="Calibri" w:hAnsi="Calibri" w:eastAsia="Calibri"/>
+                <w:b w:val="0"/>
+                <w:i w:val="0"/>
+                <w:color w:val="333333"/>
+                <w:sz w:val="16"/>
+              </w:rPr>
+              <w:t>—</w:t>
+            </w:r>
+          </w:p>
+        </w:tc>
+      </w:tr>
+    </w:tbl>
+    <w:p/>
+    <w:p>
+      <w:pPr>
+        <w:spacing w:before="240" w:after="80"/>
+      </w:pPr>
+      <w:r>
+        <w:rPr>
+          <w:rFonts w:ascii="Calibri" w:hAnsi="Calibri" w:eastAsia="Calibri"/>
+          <w:b/>
+          <w:i w:val="0"/>
+          <w:color w:val="2E75B6"/>
+          <w:sz w:val="26"/>
+        </w:rPr>
+        <w:t>5.8 Export / save &amp; product quality</w:t>
+      </w:r>
+    </w:p>
+    <w:p>
+      <w:pPr>
+        <w:spacing w:before="0" w:after="80"/>
+      </w:pPr>
+      <w:r>
+        <w:rPr>
+          <w:rFonts w:ascii="Calibri" w:hAnsi="Calibri" w:eastAsia="Calibri"/>
+          <w:b w:val="0"/>
+          <w:i/>
+          <w:color w:val="666666"/>
+          <w:sz w:val="18"/>
+        </w:rPr>
+        <w:t>Save/share and output checks available in this app.</w:t>
+      </w:r>
+    </w:p>
+    <w:tbl>
+      <w:tblPr>
+        <w:tblW w:w="5000" w:type="pct"/>
+        <w:tblBorders>
+          <w:top w:val="single" w:sz="4" w:color="BFBFBF"/>
+          <w:left w:val="single" w:sz="4" w:color="BFBFBF"/>
+          <w:bottom w:val="single" w:sz="4" w:color="BFBFBF"/>
+          <w:right w:val="single" w:sz="4" w:color="BFBFBF"/>
+          <w:insideH w:val="single" w:sz="4" w:color="BFBFBF"/>
+          <w:insideV w:val="single" w:sz="4" w:color="BFBFBF"/>
+        </w:tblBorders>
+      </w:tblPr>
+      <w:tblGrid>
+        <w:gridCol w:w="900"/>
+        <w:gridCol w:w="1400"/>
+        <w:gridCol w:w="900"/>
+        <w:gridCol w:w="1200"/>
+        <w:gridCol w:w="1400"/>
+        <w:gridCol w:w="900"/>
+        <w:gridCol w:w="700"/>
+      </w:tblGrid>
+      <w:tr>
+        <w:tc>
+          <w:tcPr>
+            <w:shd w:val="clear" w:fill="1F4E79"/>
+          </w:tcPr>
+          <w:p>
+            <w:r>
+              <w:rPr>
+                <w:b/>
+                <w:color w:val="FFFFFF"/>
+                <w:sz w:val="15"/>
+              </w:rPr>
+              <w:t xml:space="preserve">TC ID</w:t>
+            </w:r>
+          </w:p>
+        </w:tc>
+        <w:tc>
+          <w:tcPr>
+            <w:shd w:val="clear" w:fill="1F4E79"/>
+          </w:tcPr>
+          <w:p>
+            <w:r>
+              <w:rPr>
+                <w:b/>
+                <w:color w:val="FFFFFF"/>
+                <w:sz w:val="15"/>
+              </w:rPr>
+              <w:t xml:space="preserve">Test Case</w:t>
+            </w:r>
+          </w:p>
+        </w:tc>
+        <w:tc>
+          <w:tcPr>
+            <w:shd w:val="clear" w:fill="1F4E79"/>
+          </w:tcPr>
+          <w:p>
+            <w:r>
+              <w:rPr>
+                <w:b/>
+                <w:color w:val="FFFFFF"/>
+                <w:sz w:val="15"/>
+              </w:rPr>
+              <w:t xml:space="preserve">Area</w:t>
+            </w:r>
+          </w:p>
+        </w:tc>
+        <w:tc>
+          <w:tcPr>
+            <w:shd w:val="clear" w:fill="1F4E79"/>
+          </w:tcPr>
+          <w:p>
+            <w:r>
+              <w:rPr>
+                <w:b/>
+                <w:color w:val="FFFFFF"/>
+                <w:sz w:val="15"/>
+              </w:rPr>
+              <w:t xml:space="preserve">Steps</w:t>
+            </w:r>
+          </w:p>
+        </w:tc>
+        <w:tc>
+          <w:tcPr>
+            <w:shd w:val="clear" w:fill="1F4E79"/>
+          </w:tcPr>
+          <w:p>
+            <w:r>
+              <w:rPr>
+                <w:b/>
+                <w:color w:val="FFFFFF"/>
+                <w:sz w:val="15"/>
+              </w:rPr>
+              <w:t xml:space="preserve">Expected Result</w:t>
+            </w:r>
+          </w:p>
+        </w:tc>
+        <w:tc>
+          <w:tcPr>
+            <w:shd w:val="clear" w:fill="1F4E79"/>
+          </w:tcPr>
+          <w:p>
+            <w:r>
+              <w:rPr>
+                <w:b/>
+                <w:color w:val="FFFFFF"/>
+                <w:sz w:val="15"/>
+              </w:rPr>
+              <w:t xml:space="preserve">Result</w:t>
+            </w:r>
+          </w:p>
+        </w:tc>
+        <w:tc>
+          <w:tcPr>
+            <w:shd w:val="clear" w:fill="1F4E79"/>
+          </w:tcPr>
+          <w:p>
+            <w:r>
+              <w:rPr>
+                <w:b/>
+                <w:color w:val="FFFFFF"/>
+                <w:sz w:val="15"/>
+              </w:rPr>
+              <w:t xml:space="preserve">Bug</w:t>
+            </w:r>
+          </w:p>
+        </w:tc>
+      </w:tr>
+      <w:tr>
+        <w:tc>
+          <w:tcPr>
+            <w:shd w:val="clear" w:fill="FFFFFF"/>
+          </w:tcPr>
+          <w:p>
+            <w:r>
+              <w:rPr>
+                <w:sz w:val="15"/>
+              </w:rPr>
+              <w:t xml:space="preserve">TC-PQ-001</w:t>
+            </w:r>
+          </w:p>
+        </w:tc>
+        <w:tc>
+          <w:tcPr>
+            <w:shd w:val="clear" w:fill="FFFFFF"/>
+          </w:tcPr>
+          <w:p>
+            <w:r>
+              <w:rPr>
+                <w:sz w:val="15"/>
+              </w:rPr>
+              <w:t xml:space="preserve">Save / download completed image</w:t>
+            </w:r>
+          </w:p>
+        </w:tc>
+        <w:tc>
+          <w:tcPr>
+            <w:shd w:val="clear" w:fill="FFFFFF"/>
+          </w:tcPr>
+          <w:p>
+            <w:r>
+              <w:rPr>
+                <w:sz w:val="15"/>
+              </w:rPr>
+              <w:t xml:space="preserve">Functionality, Workflow</w:t>
+            </w:r>
+          </w:p>
+        </w:tc>
+        <w:tc>
+          <w:tcPr>
+            <w:shd w:val="clear" w:fill="FFFFFF"/>
+          </w:tcPr>
+          <w:p>
+            <w:r>
+              <w:rPr>
+                <w:sz w:val="15"/>
+              </w:rPr>
+              <w:t xml:space="preserve">Finish edit → Save</w:t>
+            </w:r>
+          </w:p>
+        </w:tc>
+        <w:tc>
+          <w:tcPr>
+            <w:shd w:val="clear" w:fill="FFFFFF"/>
+          </w:tcPr>
+          <w:p>
+            <w:r>
+              <w:rPr>
+                <w:sz w:val="15"/>
+              </w:rPr>
+              <w:t xml:space="preserve">Image saved; confirmation or visible success</w:t>
+            </w:r>
+          </w:p>
+        </w:tc>
+        <w:tc>
+          <w:tcPr>
+            <w:shd w:fill="FFFFFF" w:val="clear"/>
+            <w:tcBorders>
+              <w:top w:val="single" w:sz="4" w:color="BFBFBF"/>
+              <w:left w:val="single" w:sz="4" w:color="BFBFBF"/>
+              <w:bottom w:val="single" w:sz="4" w:color="BFBFBF"/>
+              <w:right w:val="single" w:sz="4" w:color="BFBFBF"/>
+            </w:tcBorders>
+          </w:tcPr>
+          <w:sdt>
+            <w:sdtPr>
+              <w:alias w:val="Result"/>
+              <w:tag w:val="result_status"/>
+              <w:id w:val="31018"/>
+              <w:dropDownList>
+                <w:listItem w:displayText="Not Executed" w:value="Not Executed"/>
+                <w:listItem w:displayText="Pass" w:value="Pass"/>
+                <w:listItem w:displayText="Fail" w:value="Fail"/>
+                <w:listItem w:displayText="Blocked" w:value="Blocked"/>
+              </w:dropDownList>
+            </w:sdtPr>
+            <w:sdtContent>
+              <w:p>
+                <w:pPr>
+                  <w:jc w:val="center"/>
+                </w:pPr>
+                <w:r>
+                  <w:rPr>
+                    <w:sz w:val="16"/>
+                    <w:color w:val="666666"/>
+                  </w:rPr>
+                  <w:t>Not Executed</w:t>
+                </w:r>
+              </w:p>
+            </w:sdtContent>
+          </w:sdt>
+        </w:tc>
+        <w:tc>
+          <w:tcPr>
+            <w:shd w:fill="FFFFFF" w:val="clear"/>
+            <w:tcBorders>
+              <w:top w:val="single" w:sz="4" w:color="BFBFBF"/>
+              <w:left w:val="single" w:sz="4" w:color="BFBFBF"/>
+              <w:bottom w:val="single" w:sz="4" w:color="BFBFBF"/>
+              <w:right w:val="single" w:sz="4" w:color="BFBFBF"/>
+            </w:tcBorders>
+          </w:tcPr>
+          <w:p>
+            <w:pPr>
+              <w:spacing w:before="40" w:after="40"/>
+              <w:jc w:val="center"/>
+            </w:pPr>
+            <w:r/>
+            <w:r>
+              <w:rPr>
+                <w:rFonts w:ascii="Calibri" w:hAnsi="Calibri" w:eastAsia="Calibri"/>
+                <w:b w:val="0"/>
+                <w:i w:val="0"/>
+                <w:color w:val="333333"/>
+                <w:sz w:val="16"/>
+              </w:rPr>
+              <w:t>—</w:t>
+            </w:r>
+          </w:p>
+        </w:tc>
+      </w:tr>
+      <w:tr>
+        <w:tc>
+          <w:tcPr>
+            <w:shd w:val="clear" w:fill="F2F2F2"/>
+          </w:tcPr>
+          <w:p>
+            <w:r>
+              <w:rPr>
+                <w:sz w:val="15"/>
+              </w:rPr>
+              <w:t xml:space="preserve">TC-PQ-002</w:t>
+            </w:r>
+          </w:p>
+        </w:tc>
+        <w:tc>
+          <w:tcPr>
+            <w:shd w:val="clear" w:fill="F2F2F2"/>
+          </w:tcPr>
+          <w:p>
+            <w:r>
+              <w:rPr>
+                <w:sz w:val="15"/>
+              </w:rPr>
+              <w:t xml:space="preserve">Share completed image</w:t>
+            </w:r>
+          </w:p>
+        </w:tc>
+        <w:tc>
+          <w:tcPr>
+            <w:shd w:val="clear" w:fill="F2F2F2"/>
+          </w:tcPr>
+          <w:p>
+            <w:r>
+              <w:rPr>
+                <w:sz w:val="15"/>
+              </w:rPr>
+              <w:t xml:space="preserve">Functionality</w:t>
+            </w:r>
+          </w:p>
+        </w:tc>
+        <w:tc>
+          <w:tcPr>
+            <w:shd w:val="clear" w:fill="F2F2F2"/>
+          </w:tcPr>
+          <w:p>
+            <w:r>
+              <w:rPr>
+                <w:sz w:val="15"/>
+              </w:rPr>
+              <w:t xml:space="preserve">Tap Share if available</w:t>
+            </w:r>
+          </w:p>
+        </w:tc>
+        <w:tc>
+          <w:tcPr>
+            <w:shd w:val="clear" w:fill="F2F2F2"/>
+          </w:tcPr>
+          <w:p>
+            <w:r>
+              <w:rPr>
+                <w:sz w:val="15"/>
+              </w:rPr>
+              <w:t xml:space="preserve">System share sheet opens with image</w:t>
+            </w:r>
+          </w:p>
+        </w:tc>
+        <w:tc>
+          <w:tcPr>
+            <w:shd w:fill="FFFFFF" w:val="clear"/>
+            <w:tcBorders>
+              <w:top w:val="single" w:sz="4" w:color="BFBFBF"/>
+              <w:left w:val="single" w:sz="4" w:color="BFBFBF"/>
+              <w:bottom w:val="single" w:sz="4" w:color="BFBFBF"/>
+              <w:right w:val="single" w:sz="4" w:color="BFBFBF"/>
+            </w:tcBorders>
+          </w:tcPr>
+          <w:sdt>
+            <w:sdtPr>
+              <w:alias w:val="Result"/>
+              <w:tag w:val="result_status"/>
+              <w:id w:val="31019"/>
+              <w:dropDownList>
+                <w:listItem w:displayText="Not Executed" w:value="Not Executed"/>
+                <w:listItem w:displayText="Pass" w:value="Pass"/>
+                <w:listItem w:displayText="Fail" w:value="Fail"/>
+                <w:listItem w:displayText="Blocked" w:value="Blocked"/>
+              </w:dropDownList>
+            </w:sdtPr>
+            <w:sdtContent>
+              <w:p>
+                <w:pPr>
+                  <w:jc w:val="center"/>
+                </w:pPr>
+                <w:r>
+                  <w:rPr>
+                    <w:sz w:val="16"/>
+                    <w:color w:val="666666"/>
+                  </w:rPr>
+                  <w:t>Not Executed</w:t>
+                </w:r>
+              </w:p>
+            </w:sdtContent>
+          </w:sdt>
+        </w:tc>
+        <w:tc>
+          <w:tcPr>
+            <w:shd w:fill="FFFFFF" w:val="clear"/>
+            <w:tcBorders>
+              <w:top w:val="single" w:sz="4" w:color="BFBFBF"/>
+              <w:left w:val="single" w:sz="4" w:color="BFBFBF"/>
+              <w:bottom w:val="single" w:sz="4" w:color="BFBFBF"/>
+              <w:right w:val="single" w:sz="4" w:color="BFBFBF"/>
+            </w:tcBorders>
+          </w:tcPr>
+          <w:p>
+            <w:pPr>
+              <w:spacing w:before="40" w:after="40"/>
+              <w:jc w:val="center"/>
+            </w:pPr>
+            <w:r/>
+            <w:r>
+              <w:rPr>
+                <w:rFonts w:ascii="Calibri" w:hAnsi="Calibri" w:eastAsia="Calibri"/>
+                <w:b w:val="0"/>
+                <w:i w:val="0"/>
+                <w:color w:val="333333"/>
+                <w:sz w:val="16"/>
+              </w:rPr>
+              <w:t>—</w:t>
+            </w:r>
+          </w:p>
+        </w:tc>
+      </w:tr>
+      <w:tr>
+        <w:tc>
+          <w:tcPr>
+            <w:shd w:val="clear" w:fill="FFFFFF"/>
+          </w:tcPr>
+          <w:p>
+            <w:r>
+              <w:rPr>
+                <w:sz w:val="15"/>
+              </w:rPr>
+              <w:t xml:space="preserve">TC-PQ-003</w:t>
+            </w:r>
+          </w:p>
+        </w:tc>
+        <w:tc>
+          <w:tcPr>
+            <w:shd w:val="clear" w:fill="FFFFFF"/>
+          </w:tcPr>
+          <w:p>
+            <w:r>
+              <w:rPr>
+                <w:sz w:val="15"/>
+              </w:rPr>
+              <w:t xml:space="preserve">Saved cleared image looks correct</w:t>
+            </w:r>
+          </w:p>
+        </w:tc>
+        <w:tc>
+          <w:tcPr>
+            <w:shd w:val="clear" w:fill="FFFFFF"/>
+          </w:tcPr>
+          <w:p>
+            <w:r>
+              <w:rPr>
+                <w:sz w:val="15"/>
+              </w:rPr>
+              <w:t xml:space="preserve">Functionality</w:t>
+            </w:r>
+          </w:p>
+        </w:tc>
+        <w:tc>
+          <w:tcPr>
+            <w:shd w:val="clear" w:fill="FFFFFF"/>
+          </w:tcPr>
+          <w:p>
+            <w:r>
+              <w:rPr>
+                <w:sz w:val="15"/>
+              </w:rPr>
+              <w:t xml:space="preserve">Save cleared image and reopen from gallery/files</w:t>
+            </w:r>
+          </w:p>
+        </w:tc>
+        <w:tc>
+          <w:tcPr>
+            <w:shd w:val="clear" w:fill="FFFFFF"/>
+          </w:tcPr>
+          <w:p>
+            <w:r>
+              <w:rPr>
+                <w:sz w:val="15"/>
+              </w:rPr>
+              <w:t xml:space="preserve">Result matches what editor showed</w:t>
+            </w:r>
+          </w:p>
+        </w:tc>
+        <w:tc>
+          <w:tcPr>
+            <w:shd w:fill="FFFFFF" w:val="clear"/>
+            <w:tcBorders>
+              <w:top w:val="single" w:sz="4" w:color="BFBFBF"/>
+              <w:left w:val="single" w:sz="4" w:color="BFBFBF"/>
+              <w:bottom w:val="single" w:sz="4" w:color="BFBFBF"/>
+              <w:right w:val="single" w:sz="4" w:color="BFBFBF"/>
+            </w:tcBorders>
+          </w:tcPr>
+          <w:sdt>
+            <w:sdtPr>
+              <w:alias w:val="Result"/>
+              <w:tag w:val="result_status"/>
+              <w:id w:val="31020"/>
+              <w:dropDownList>
+                <w:listItem w:displayText="Not Executed" w:value="Not Executed"/>
+                <w:listItem w:displayText="Pass" w:value="Pass"/>
+                <w:listItem w:displayText="Fail" w:value="Fail"/>
+                <w:listItem w:displayText="Blocked" w:value="Blocked"/>
+              </w:dropDownList>
+            </w:sdtPr>
+            <w:sdtContent>
+              <w:p>
+                <w:pPr>
+                  <w:jc w:val="center"/>
+                </w:pPr>
+                <w:r>
+                  <w:rPr>
+                    <w:sz w:val="16"/>
+                    <w:color w:val="666666"/>
+                  </w:rPr>
+                  <w:t>Not Executed</w:t>
+                </w:r>
+              </w:p>
+            </w:sdtContent>
+          </w:sdt>
+        </w:tc>
+        <w:tc>
+          <w:tcPr>
+            <w:shd w:fill="FFFFFF" w:val="clear"/>
+            <w:tcBorders>
+              <w:top w:val="single" w:sz="4" w:color="BFBFBF"/>
+              <w:left w:val="single" w:sz="4" w:color="BFBFBF"/>
+              <w:bottom w:val="single" w:sz="4" w:color="BFBFBF"/>
+              <w:right w:val="single" w:sz="4" w:color="BFBFBF"/>
+            </w:tcBorders>
+          </w:tcPr>
+          <w:p>
+            <w:pPr>
+              <w:spacing w:before="40" w:after="40"/>
+              <w:jc w:val="center"/>
+            </w:pPr>
+            <w:r/>
+            <w:r>
+              <w:rPr>
+                <w:rFonts w:ascii="Calibri" w:hAnsi="Calibri" w:eastAsia="Calibri"/>
+                <w:b w:val="0"/>
+                <w:i w:val="0"/>
+                <w:color w:val="333333"/>
+                <w:sz w:val="16"/>
+              </w:rPr>
+              <w:t>—</w:t>
+            </w:r>
+          </w:p>
+        </w:tc>
+      </w:tr>
+      <w:tr>
+        <w:tc>
+          <w:tcPr>
+            <w:shd w:val="clear" w:fill="F2F2F2"/>
+          </w:tcPr>
+          <w:p>
+            <w:r>
+              <w:rPr>
+                <w:sz w:val="15"/>
+              </w:rPr>
+              <w:t xml:space="preserve">TC-PQ-004</w:t>
+            </w:r>
+          </w:p>
+        </w:tc>
+        <w:tc>
+          <w:tcPr>
+            <w:shd w:val="clear" w:fill="F2F2F2"/>
+          </w:tcPr>
+          <w:p>
+            <w:r>
+              <w:rPr>
+                <w:sz w:val="15"/>
+              </w:rPr>
+              <w:t xml:space="preserve">Batch save does not mix images</w:t>
+            </w:r>
+          </w:p>
+        </w:tc>
+        <w:tc>
+          <w:tcPr>
+            <w:shd w:val="clear" w:fill="F2F2F2"/>
+          </w:tcPr>
+          <w:p>
+            <w:r>
+              <w:rPr>
+                <w:sz w:val="15"/>
+              </w:rPr>
+              <w:t xml:space="preserve">Functionality</w:t>
+            </w:r>
+          </w:p>
+        </w:tc>
+        <w:tc>
+          <w:tcPr>
+            <w:shd w:val="clear" w:fill="F2F2F2"/>
+          </w:tcPr>
+          <w:p>
+            <w:r>
+              <w:rPr>
+                <w:sz w:val="15"/>
+              </w:rPr>
+              <w:t xml:space="preserve">Save multiple batch results</w:t>
+            </w:r>
+          </w:p>
+        </w:tc>
+        <w:tc>
+          <w:tcPr>
+            <w:shd w:val="clear" w:fill="F2F2F2"/>
+          </w:tcPr>
+          <w:p>
+            <w:r>
+              <w:rPr>
+                <w:sz w:val="15"/>
+              </w:rPr>
+              <w:t xml:space="preserve">Each saved file matches its source image</w:t>
+            </w:r>
+          </w:p>
+        </w:tc>
+        <w:tc>
+          <w:tcPr>
+            <w:shd w:fill="FFFFFF" w:val="clear"/>
+            <w:tcBorders>
+              <w:top w:val="single" w:sz="4" w:color="BFBFBF"/>
+              <w:left w:val="single" w:sz="4" w:color="BFBFBF"/>
+              <w:bottom w:val="single" w:sz="4" w:color="BFBFBF"/>
+              <w:right w:val="single" w:sz="4" w:color="BFBFBF"/>
+            </w:tcBorders>
+          </w:tcPr>
+          <w:sdt>
+            <w:sdtPr>
+              <w:alias w:val="Result"/>
+              <w:tag w:val="result_status"/>
+              <w:id w:val="31021"/>
+              <w:dropDownList>
+                <w:listItem w:displayText="Not Executed" w:value="Not Executed"/>
+                <w:listItem w:displayText="Pass" w:value="Pass"/>
+                <w:listItem w:displayText="Fail" w:value="Fail"/>
+                <w:listItem w:displayText="Blocked" w:value="Blocked"/>
+              </w:dropDownList>
+            </w:sdtPr>
+            <w:sdtContent>
+              <w:p>
+                <w:pPr>
+                  <w:jc w:val="center"/>
+                </w:pPr>
+                <w:r>
+                  <w:rPr>
+                    <w:sz w:val="16"/>
+                    <w:color w:val="666666"/>
+                  </w:rPr>
+                  <w:t>Not Executed</w:t>
+                </w:r>
+              </w:p>
+            </w:sdtContent>
+          </w:sdt>
+        </w:tc>
+        <w:tc>
+          <w:tcPr>
+            <w:shd w:fill="FFFFFF" w:val="clear"/>
+            <w:tcBorders>
+              <w:top w:val="single" w:sz="4" w:color="BFBFBF"/>
+              <w:left w:val="single" w:sz="4" w:color="BFBFBF"/>
+              <w:bottom w:val="single" w:sz="4" w:color="BFBFBF"/>
+              <w:right w:val="single" w:sz="4" w:color="BFBFBF"/>
+            </w:tcBorders>
+          </w:tcPr>
+          <w:p>
+            <w:pPr>
+              <w:spacing w:before="40" w:after="40"/>
+              <w:jc w:val="center"/>
+            </w:pPr>
+            <w:r/>
+            <w:r>
+              <w:rPr>
+                <w:rFonts w:ascii="Calibri" w:hAnsi="Calibri" w:eastAsia="Calibri"/>
+                <w:b w:val="0"/>
+                <w:i w:val="0"/>
+                <w:color w:val="333333"/>
+                <w:sz w:val="16"/>
+              </w:rPr>
+              <w:t>—</w:t>
+            </w:r>
+          </w:p>
+        </w:tc>
+      </w:tr>
+    </w:tbl>
+    <w:p/>
+    <w:p>
+      <w:pPr>
+        <w:spacing w:before="240" w:after="80"/>
+      </w:pPr>
+      <w:r>
+        <w:rPr>
+          <w:rFonts w:ascii="Calibri" w:hAnsi="Calibri" w:eastAsia="Calibri"/>
+          <w:b/>
+          <w:i w:val="0"/>
+          <w:color w:val="2E75B6"/>
+          <w:sz w:val="26"/>
+        </w:rPr>
+        <w:t>5.9 Optional cutout observation (not main score)</w:t>
+      </w:r>
+    </w:p>
+    <w:p>
+      <w:pPr>
+        <w:spacing w:before="0" w:after="80"/>
+      </w:pPr>
+      <w:r>
+        <w:rPr>
+          <w:rFonts w:ascii="Calibri" w:hAnsi="Calibri" w:eastAsia="Calibri"/>
+          <w:b w:val="0"/>
+          <w:i/>
+          <w:color w:val="666666"/>
+          <w:sz w:val="18"/>
+        </w:rPr>
+        <w:t>Optional only. Assignment says not to judge third-party AI cutout perfection as the main result.</w:t>
+      </w:r>
+    </w:p>
+    <w:tbl>
+      <w:tblPr>
+        <w:tblW w:w="5000" w:type="pct"/>
+        <w:tblBorders>
+          <w:top w:val="single" w:sz="4" w:color="BFBFBF"/>
+          <w:left w:val="single" w:sz="4" w:color="BFBFBF"/>
+          <w:bottom w:val="single" w:sz="4" w:color="BFBFBF"/>
+          <w:right w:val="single" w:sz="4" w:color="BFBFBF"/>
+          <w:insideH w:val="single" w:sz="4" w:color="BFBFBF"/>
+          <w:insideV w:val="single" w:sz="4" w:color="BFBFBF"/>
+        </w:tblBorders>
+      </w:tblPr>
+      <w:tblGrid>
+        <w:gridCol w:w="900"/>
+        <w:gridCol w:w="1400"/>
+        <w:gridCol w:w="900"/>
+        <w:gridCol w:w="1200"/>
+        <w:gridCol w:w="1400"/>
+        <w:gridCol w:w="900"/>
+        <w:gridCol w:w="700"/>
+      </w:tblGrid>
+      <w:tr>
+        <w:tc>
+          <w:tcPr>
+            <w:shd w:val="clear" w:fill="1F4E79"/>
+          </w:tcPr>
+          <w:p>
+            <w:r>
+              <w:rPr>
+                <w:b/>
+                <w:color w:val="FFFFFF"/>
+                <w:sz w:val="15"/>
+              </w:rPr>
+              <w:t xml:space="preserve">TC ID</w:t>
+            </w:r>
+          </w:p>
+        </w:tc>
+        <w:tc>
+          <w:tcPr>
+            <w:shd w:val="clear" w:fill="1F4E79"/>
+          </w:tcPr>
+          <w:p>
+            <w:r>
+              <w:rPr>
+                <w:b/>
+                <w:color w:val="FFFFFF"/>
+                <w:sz w:val="15"/>
+              </w:rPr>
+              <w:t xml:space="preserve">Test Case</w:t>
+            </w:r>
+          </w:p>
+        </w:tc>
+        <w:tc>
+          <w:tcPr>
+            <w:shd w:val="clear" w:fill="1F4E79"/>
+          </w:tcPr>
+          <w:p>
+            <w:r>
+              <w:rPr>
+                <w:b/>
+                <w:color w:val="FFFFFF"/>
+                <w:sz w:val="15"/>
+              </w:rPr>
+              <w:t xml:space="preserve">Area</w:t>
+            </w:r>
+          </w:p>
+        </w:tc>
+        <w:tc>
+          <w:tcPr>
+            <w:shd w:val="clear" w:fill="1F4E79"/>
+          </w:tcPr>
+          <w:p>
+            <w:r>
+              <w:rPr>
+                <w:b/>
+                <w:color w:val="FFFFFF"/>
+                <w:sz w:val="15"/>
+              </w:rPr>
+              <w:t xml:space="preserve">Steps</w:t>
+            </w:r>
+          </w:p>
+        </w:tc>
+        <w:tc>
+          <w:tcPr>
+            <w:shd w:val="clear" w:fill="1F4E79"/>
+          </w:tcPr>
+          <w:p>
+            <w:r>
+              <w:rPr>
+                <w:b/>
+                <w:color w:val="FFFFFF"/>
+                <w:sz w:val="15"/>
+              </w:rPr>
+              <w:t xml:space="preserve">Expected Result</w:t>
+            </w:r>
+          </w:p>
+        </w:tc>
+        <w:tc>
+          <w:tcPr>
+            <w:shd w:val="clear" w:fill="1F4E79"/>
+          </w:tcPr>
+          <w:p>
+            <w:r>
+              <w:rPr>
+                <w:b/>
+                <w:color w:val="FFFFFF"/>
+                <w:sz w:val="15"/>
+              </w:rPr>
+              <w:t xml:space="preserve">Result</w:t>
+            </w:r>
+          </w:p>
+        </w:tc>
+        <w:tc>
+          <w:tcPr>
+            <w:shd w:val="clear" w:fill="1F4E79"/>
+          </w:tcPr>
+          <w:p>
+            <w:r>
+              <w:rPr>
+                <w:b/>
+                <w:color w:val="FFFFFF"/>
+                <w:sz w:val="15"/>
+              </w:rPr>
+              <w:t xml:space="preserve">Bug</w:t>
+            </w:r>
+          </w:p>
+        </w:tc>
+      </w:tr>
+      <w:tr>
+        <w:tc>
+          <w:tcPr>
+            <w:shd w:val="clear" w:fill="FFFFFF"/>
+          </w:tcPr>
+          <w:p>
+            <w:r>
+              <w:rPr>
+                <w:sz w:val="15"/>
+              </w:rPr>
+              <w:t xml:space="preserve">TC-AI-001</w:t>
+            </w:r>
+          </w:p>
+        </w:tc>
+        <w:tc>
+          <w:tcPr>
+            <w:shd w:val="clear" w:fill="FFFFFF"/>
+          </w:tcPr>
+          <w:p>
+            <w:r>
+              <w:rPr>
+                <w:sz w:val="15"/>
+              </w:rPr>
+              <w:t xml:space="preserve">Low-contrast subject vs background</w:t>
+            </w:r>
+          </w:p>
+        </w:tc>
+        <w:tc>
+          <w:tcPr>
+            <w:shd w:val="clear" w:fill="FFFFFF"/>
+          </w:tcPr>
+          <w:p>
+            <w:r>
+              <w:rPr>
+                <w:sz w:val="15"/>
+              </w:rPr>
+              <w:t xml:space="preserve">Observation</w:t>
+            </w:r>
+          </w:p>
+        </w:tc>
+        <w:tc>
+          <w:tcPr>
+            <w:shd w:val="clear" w:fill="FFFFFF"/>
+          </w:tcPr>
+          <w:p>
+            <w:r>
+              <w:rPr>
+                <w:sz w:val="15"/>
+              </w:rPr>
+              <w:t xml:space="preserve">Single remove on similar colors</w:t>
+            </w:r>
+          </w:p>
+        </w:tc>
+        <w:tc>
+          <w:tcPr>
+            <w:shd w:val="clear" w:fill="FFFFFF"/>
+          </w:tcPr>
+          <w:p>
+            <w:r>
+              <w:rPr>
+                <w:sz w:val="15"/>
+              </w:rPr>
+              <w:t xml:space="preserve">App completes; note edge quality if useful</w:t>
+            </w:r>
+          </w:p>
+        </w:tc>
+        <w:tc>
+          <w:tcPr>
+            <w:shd w:fill="FFFFFF" w:val="clear"/>
+            <w:tcBorders>
+              <w:top w:val="single" w:sz="4" w:color="BFBFBF"/>
+              <w:left w:val="single" w:sz="4" w:color="BFBFBF"/>
+              <w:bottom w:val="single" w:sz="4" w:color="BFBFBF"/>
+              <w:right w:val="single" w:sz="4" w:color="BFBFBF"/>
+            </w:tcBorders>
+          </w:tcPr>
+          <w:sdt>
+            <w:sdtPr>
+              <w:alias w:val="Result"/>
+              <w:tag w:val="result_status"/>
+              <w:id w:val="31022"/>
+              <w:dropDownList>
+                <w:listItem w:displayText="Not Executed" w:value="Not Executed"/>
+                <w:listItem w:displayText="Pass" w:value="Pass"/>
+                <w:listItem w:displayText="Fail" w:value="Fail"/>
+                <w:listItem w:displayText="Blocked" w:value="Blocked"/>
+              </w:dropDownList>
+            </w:sdtPr>
+            <w:sdtContent>
+              <w:p>
+                <w:pPr>
+                  <w:jc w:val="center"/>
+                </w:pPr>
+                <w:r>
+                  <w:rPr>
+                    <w:sz w:val="16"/>
+                    <w:color w:val="666666"/>
+                  </w:rPr>
+                  <w:t>Not Executed</w:t>
+                </w:r>
+              </w:p>
+            </w:sdtContent>
+          </w:sdt>
+        </w:tc>
+        <w:tc>
+          <w:tcPr>
+            <w:shd w:fill="FFFFFF" w:val="clear"/>
+            <w:tcBorders>
+              <w:top w:val="single" w:sz="4" w:color="BFBFBF"/>
+              <w:left w:val="single" w:sz="4" w:color="BFBFBF"/>
+              <w:bottom w:val="single" w:sz="4" w:color="BFBFBF"/>
+              <w:right w:val="single" w:sz="4" w:color="BFBFBF"/>
+            </w:tcBorders>
+          </w:tcPr>
+          <w:p>
+            <w:pPr>
+              <w:spacing w:before="40" w:after="40"/>
+              <w:jc w:val="center"/>
+            </w:pPr>
+            <w:r/>
+            <w:r>
+              <w:rPr>
+                <w:rFonts w:ascii="Calibri" w:hAnsi="Calibri" w:eastAsia="Calibri"/>
+                <w:b w:val="0"/>
+                <w:i w:val="0"/>
+                <w:color w:val="333333"/>
+                <w:sz w:val="16"/>
+              </w:rPr>
+              <w:t>—</w:t>
+            </w:r>
+          </w:p>
+        </w:tc>
+      </w:tr>
+      <w:tr>
+        <w:tc>
+          <w:tcPr>
+            <w:shd w:val="clear" w:fill="F2F2F2"/>
+          </w:tcPr>
+          <w:p>
+            <w:r>
+              <w:rPr>
+                <w:sz w:val="15"/>
+              </w:rPr>
+              <w:t xml:space="preserve">TC-AI-002</w:t>
+            </w:r>
+          </w:p>
+        </w:tc>
+        <w:tc>
+          <w:tcPr>
+            <w:shd w:val="clear" w:fill="F2F2F2"/>
+          </w:tcPr>
+          <w:p>
+            <w:r>
+              <w:rPr>
+                <w:sz w:val="15"/>
+              </w:rPr>
+              <w:t xml:space="preserve">Subject with gaps/holes</w:t>
+            </w:r>
+          </w:p>
+        </w:tc>
+        <w:tc>
+          <w:tcPr>
+            <w:shd w:val="clear" w:fill="F2F2F2"/>
+          </w:tcPr>
+          <w:p>
+            <w:r>
+              <w:rPr>
+                <w:sz w:val="15"/>
+              </w:rPr>
+              <w:t xml:space="preserve">Observation</w:t>
+            </w:r>
+          </w:p>
+        </w:tc>
+        <w:tc>
+          <w:tcPr>
+            <w:shd w:val="clear" w:fill="F2F2F2"/>
+          </w:tcPr>
+          <w:p>
+            <w:r>
+              <w:rPr>
+                <w:sz w:val="15"/>
+              </w:rPr>
+              <w:t xml:space="preserve">Single remove on object with holes if available</w:t>
+            </w:r>
+          </w:p>
+        </w:tc>
+        <w:tc>
+          <w:tcPr>
+            <w:shd w:val="clear" w:fill="F2F2F2"/>
+          </w:tcPr>
+          <w:p>
+            <w:r>
+              <w:rPr>
+                <w:sz w:val="15"/>
+              </w:rPr>
+              <w:t xml:space="preserve">App completes; note inner-gap behavior</w:t>
+            </w:r>
+          </w:p>
+        </w:tc>
+        <w:tc>
+          <w:tcPr>
+            <w:shd w:fill="FFFFFF" w:val="clear"/>
+            <w:tcBorders>
+              <w:top w:val="single" w:sz="4" w:color="BFBFBF"/>
+              <w:left w:val="single" w:sz="4" w:color="BFBFBF"/>
+              <w:bottom w:val="single" w:sz="4" w:color="BFBFBF"/>
+              <w:right w:val="single" w:sz="4" w:color="BFBFBF"/>
+            </w:tcBorders>
+          </w:tcPr>
+          <w:sdt>
+            <w:sdtPr>
+              <w:alias w:val="Result"/>
+              <w:tag w:val="result_status"/>
+              <w:id w:val="31023"/>
+              <w:dropDownList>
+                <w:listItem w:displayText="Not Executed" w:value="Not Executed"/>
+                <w:listItem w:displayText="Pass" w:value="Pass"/>
+                <w:listItem w:displayText="Fail" w:value="Fail"/>
+                <w:listItem w:displayText="Blocked" w:value="Blocked"/>
+              </w:dropDownList>
+            </w:sdtPr>
+            <w:sdtContent>
+              <w:p>
+                <w:pPr>
+                  <w:jc w:val="center"/>
+                </w:pPr>
+                <w:r>
+                  <w:rPr>
+                    <w:sz w:val="16"/>
+                    <w:color w:val="666666"/>
+                  </w:rPr>
+                  <w:t>Not Executed</w:t>
+                </w:r>
+              </w:p>
+            </w:sdtContent>
+          </w:sdt>
+        </w:tc>
+        <w:tc>
+          <w:tcPr>
+            <w:shd w:fill="FFFFFF" w:val="clear"/>
+            <w:tcBorders>
+              <w:top w:val="single" w:sz="4" w:color="BFBFBF"/>
+              <w:left w:val="single" w:sz="4" w:color="BFBFBF"/>
+              <w:bottom w:val="single" w:sz="4" w:color="BFBFBF"/>
+              <w:right w:val="single" w:sz="4" w:color="BFBFBF"/>
+            </w:tcBorders>
+          </w:tcPr>
+          <w:p>
+            <w:pPr>
+              <w:spacing w:before="40" w:after="40"/>
+              <w:jc w:val="center"/>
+            </w:pPr>
+            <w:r/>
+            <w:r>
+              <w:rPr>
+                <w:rFonts w:ascii="Calibri" w:hAnsi="Calibri" w:eastAsia="Calibri"/>
+                <w:b w:val="0"/>
+                <w:i w:val="0"/>
+                <w:color w:val="333333"/>
+                <w:sz w:val="16"/>
+              </w:rPr>
+              <w:t>—</w:t>
+            </w:r>
+          </w:p>
+        </w:tc>
+      </w:tr>
+      <w:tr>
+        <w:tc>
+          <w:tcPr>
+            <w:shd w:val="clear" w:fill="FFFFFF"/>
+          </w:tcPr>
+          <w:p>
+            <w:r>
+              <w:rPr>
+                <w:sz w:val="15"/>
+              </w:rPr>
+              <w:t xml:space="preserve">TC-AI-003</w:t>
+            </w:r>
+          </w:p>
+        </w:tc>
+        <w:tc>
+          <w:tcPr>
+            <w:shd w:val="clear" w:fill="FFFFFF"/>
+          </w:tcPr>
+          <w:p>
+            <w:r>
+              <w:rPr>
+                <w:sz w:val="15"/>
+              </w:rPr>
+              <w:t xml:space="preserve">Hair / fur fine edges</w:t>
+            </w:r>
+          </w:p>
+        </w:tc>
+        <w:tc>
+          <w:tcPr>
+            <w:shd w:val="clear" w:fill="FFFFFF"/>
+          </w:tcPr>
+          <w:p>
+            <w:r>
+              <w:rPr>
+                <w:sz w:val="15"/>
+              </w:rPr>
+              <w:t xml:space="preserve">Observation</w:t>
+            </w:r>
+          </w:p>
+        </w:tc>
+        <w:tc>
+          <w:tcPr>
+            <w:shd w:val="clear" w:fill="FFFFFF"/>
+          </w:tcPr>
+          <w:p>
+            <w:r>
+              <w:rPr>
+                <w:sz w:val="15"/>
+              </w:rPr>
+              <w:t xml:space="preserve">Single remove on hair/fur photo if available</w:t>
+            </w:r>
+          </w:p>
+        </w:tc>
+        <w:tc>
+          <w:tcPr>
+            <w:shd w:val="clear" w:fill="FFFFFF"/>
+          </w:tcPr>
+          <w:p>
+            <w:r>
+              <w:rPr>
+                <w:sz w:val="15"/>
+              </w:rPr>
+              <w:t xml:space="preserve">App completes; note edge behavior</w:t>
+            </w:r>
+          </w:p>
+        </w:tc>
+        <w:tc>
+          <w:tcPr>
+            <w:shd w:fill="FFFFFF" w:val="clear"/>
+            <w:tcBorders>
+              <w:top w:val="single" w:sz="4" w:color="BFBFBF"/>
+              <w:left w:val="single" w:sz="4" w:color="BFBFBF"/>
+              <w:bottom w:val="single" w:sz="4" w:color="BFBFBF"/>
+              <w:right w:val="single" w:sz="4" w:color="BFBFBF"/>
+            </w:tcBorders>
+          </w:tcPr>
+          <w:sdt>
+            <w:sdtPr>
+              <w:alias w:val="Result"/>
+              <w:tag w:val="result_status"/>
+              <w:id w:val="31024"/>
+              <w:dropDownList>
+                <w:listItem w:displayText="Not Executed" w:value="Not Executed"/>
+                <w:listItem w:displayText="Pass" w:value="Pass"/>
+                <w:listItem w:displayText="Fail" w:value="Fail"/>
+                <w:listItem w:displayText="Blocked" w:value="Blocked"/>
+              </w:dropDownList>
+            </w:sdtPr>
+            <w:sdtContent>
+              <w:p>
+                <w:pPr>
+                  <w:jc w:val="center"/>
+                </w:pPr>
+                <w:r>
+                  <w:rPr>
+                    <w:sz w:val="16"/>
+                    <w:color w:val="666666"/>
+                  </w:rPr>
+                  <w:t>Not Executed</w:t>
+                </w:r>
+              </w:p>
+            </w:sdtContent>
+          </w:sdt>
+        </w:tc>
+        <w:tc>
+          <w:tcPr>
+            <w:shd w:fill="FFFFFF" w:val="clear"/>
+            <w:tcBorders>
+              <w:top w:val="single" w:sz="4" w:color="BFBFBF"/>
+              <w:left w:val="single" w:sz="4" w:color="BFBFBF"/>
+              <w:bottom w:val="single" w:sz="4" w:color="BFBFBF"/>
+              <w:right w:val="single" w:sz="4" w:color="BFBFBF"/>
+            </w:tcBorders>
+          </w:tcPr>
+          <w:p>
+            <w:pPr>
+              <w:spacing w:before="40" w:after="40"/>
+              <w:jc w:val="center"/>
+            </w:pPr>
+            <w:r/>
+            <w:r>
+              <w:rPr>
+                <w:rFonts w:ascii="Calibri" w:hAnsi="Calibri" w:eastAsia="Calibri"/>
+                <w:b w:val="0"/>
+                <w:i w:val="0"/>
+                <w:color w:val="333333"/>
+                <w:sz w:val="16"/>
+              </w:rPr>
+              <w:t>—</w:t>
+            </w:r>
+          </w:p>
+        </w:tc>
+      </w:tr>
+    </w:tbl>
+    <w:p/>
     <w:p>
       <w:pPr>
         <w:spacing w:after="120" w:before="280" w:lineRule="auto"/>
@@ -12312,7 +15905,7 @@
                 <w:color w:val="333333"/>
                 <w:sz w:val="18"/>
               </w:rPr>
-              <w:t>16 / 18</w:t>
+              <w:t>18 / 39</w:t>
             </w:r>
           </w:p>
         </w:tc>
@@ -12381,7 +15974,7 @@
                 <w:color w:val="333333"/>
                 <w:sz w:val="18"/>
               </w:rPr>
-              <w:t>Pass: 15 | Fail: 1 | Blocked: 0</w:t>
+              <w:t>Pass: 17 | Fail: 1 | Blocked: 0</w:t>
             </w:r>
           </w:p>
         </w:tc>

</xml_diff>

<commit_message>
Update executed QA results and remove out-of-scope cutout cases
Remove section 5.9 optional AI cutout observations, mark save/share,
stability, performance, and usability cases Pass from mobile testing,
and add SUG-004 for weak-network retry UX.

Co-authored-by: Showravkarmakar <Showrav88@users.noreply.github.com>
</commit_message>
<xml_diff>
--- a/SQA_Intern_Assignment_Test_Report.docx
+++ b/SQA_Intern_Assignment_Test_Report.docx
@@ -3622,7 +3622,7 @@
                 <w:color w:val="333333"/>
                 <w:sz w:val="16"/>
               </w:rPr>
-              <w:t>SUG-001, SUG-002, SUG-003</w:t>
+              <w:t>SUG-001, SUG-002, SUG-003, SUG-004</w:t>
             </w:r>
           </w:p>
         </w:tc>
@@ -3745,7 +3745,7 @@
                 <w:color w:val="333333"/>
                 <w:sz w:val="16"/>
               </w:rPr>
-              <w:t>SUG-003</w:t>
+              <w:t>SUG-003, SUG-004</w:t>
             </w:r>
           </w:p>
         </w:tc>
@@ -6142,6 +6142,232 @@
     </w:p>
     <w:p>
       <w:pPr>
+        <w:spacing w:before="240" w:after="120"/>
+      </w:pPr>
+      <w:r>
+        <w:rPr>
+          <w:rFonts w:ascii="Calibri" w:hAnsi="Calibri" w:eastAsia="Calibri"/>
+          <w:b/>
+          <w:i w:val="0"/>
+          <w:color w:val="2E75B6"/>
+          <w:sz w:val="26"/>
+        </w:rPr>
+        <w:t>SUG-004: Improve weak-network retry timing and messaging</w:t>
+      </w:r>
+    </w:p>
+    <w:tbl>
+      <w:tblPr>
+        <w:tblW w:w="5000" w:type="pct"/>
+        <w:tblBorders>
+          <w:top w:val="single" w:sz="4" w:color="BFBFBF"/>
+          <w:left w:val="single" w:sz="4" w:color="BFBFBF"/>
+          <w:bottom w:val="single" w:sz="4" w:color="BFBFBF"/>
+          <w:right w:val="single" w:sz="4" w:color="BFBFBF"/>
+          <w:insideH w:val="single" w:sz="4" w:color="BFBFBF"/>
+          <w:insideV w:val="single" w:sz="4" w:color="BFBFBF"/>
+        </w:tblBorders>
+      </w:tblPr>
+      <w:tblGrid>
+        <w:gridCol w:w="2500"/>
+        <w:gridCol w:w="2500"/>
+      </w:tblGrid>
+      <w:tr>
+        <w:tc>
+          <w:tcPr>
+            <w:shd w:val="clear" w:fill="1F4E79"/>
+          </w:tcPr>
+          <w:p>
+            <w:r>
+              <w:rPr>
+                <w:b/>
+                <w:color w:val="FFFFFF"/>
+                <w:sz w:val="16"/>
+              </w:rPr>
+              <w:t xml:space="preserve">Field</w:t>
+            </w:r>
+          </w:p>
+        </w:tc>
+        <w:tc>
+          <w:tcPr>
+            <w:shd w:val="clear" w:fill="1F4E79"/>
+          </w:tcPr>
+          <w:p>
+            <w:r>
+              <w:rPr>
+                <w:b/>
+                <w:color w:val="FFFFFF"/>
+                <w:sz w:val="16"/>
+              </w:rPr>
+              <w:t xml:space="preserve">Detail</w:t>
+            </w:r>
+          </w:p>
+        </w:tc>
+      </w:tr>
+      <w:tr>
+        <w:tc>
+          <w:tcPr>
+            <w:shd w:val="clear" w:fill="FFFFFF"/>
+          </w:tcPr>
+          <w:p>
+            <w:r>
+              <w:rPr>
+                <w:sz w:val="16"/>
+              </w:rPr>
+              <w:t xml:space="preserve">Module / Area</w:t>
+            </w:r>
+          </w:p>
+        </w:tc>
+        <w:tc>
+          <w:tcPr>
+            <w:shd w:val="clear" w:fill="FFFFFF"/>
+          </w:tcPr>
+          <w:p>
+            <w:r>
+              <w:rPr>
+                <w:sz w:val="16"/>
+              </w:rPr>
+              <w:t xml:space="preserve">Background Remove / Batch processing</w:t>
+            </w:r>
+          </w:p>
+        </w:tc>
+      </w:tr>
+      <w:tr>
+        <w:tc>
+          <w:tcPr>
+            <w:shd w:val="clear" w:fill="F2F2F2"/>
+          </w:tcPr>
+          <w:p>
+            <w:r>
+              <w:rPr>
+                <w:sz w:val="16"/>
+              </w:rPr>
+              <w:t xml:space="preserve">Quality Area</w:t>
+            </w:r>
+          </w:p>
+        </w:tc>
+        <w:tc>
+          <w:tcPr>
+            <w:shd w:val="clear" w:fill="F2F2F2"/>
+          </w:tcPr>
+          <w:p>
+            <w:r>
+              <w:rPr>
+                <w:sz w:val="16"/>
+              </w:rPr>
+              <w:t xml:space="preserve">Usability, Performance</w:t>
+            </w:r>
+          </w:p>
+        </w:tc>
+      </w:tr>
+      <w:tr>
+        <w:tc>
+          <w:tcPr>
+            <w:shd w:val="clear" w:fill="FFFFFF"/>
+          </w:tcPr>
+          <w:p>
+            <w:r>
+              <w:rPr>
+                <w:sz w:val="16"/>
+              </w:rPr>
+              <w:t xml:space="preserve">Priority</w:t>
+            </w:r>
+          </w:p>
+        </w:tc>
+        <w:tc>
+          <w:tcPr>
+            <w:shd w:val="clear" w:fill="FFFFFF"/>
+          </w:tcPr>
+          <w:p>
+            <w:r>
+              <w:rPr>
+                <w:sz w:val="16"/>
+              </w:rPr>
+              <w:t xml:space="preserve">Medium</w:t>
+            </w:r>
+          </w:p>
+        </w:tc>
+      </w:tr>
+      <w:tr>
+        <w:tc>
+          <w:tcPr>
+            <w:shd w:val="clear" w:fill="F2F2F2"/>
+          </w:tcPr>
+          <w:p>
+            <w:r>
+              <w:rPr>
+                <w:sz w:val="16"/>
+              </w:rPr>
+              <w:t xml:space="preserve">Current behavior</w:t>
+            </w:r>
+          </w:p>
+        </w:tc>
+        <w:tc>
+          <w:tcPr>
+            <w:shd w:val="clear" w:fill="F2F2F2"/>
+          </w:tcPr>
+          <w:p>
+            <w:r>
+              <w:rPr>
+                <w:sz w:val="16"/>
+              </w:rPr>
+              <w:t xml:space="preserve">On weak network, first try may show “Something went wrong”. Retry can wait about 1 minute per failure, then app falls back to dashboard. Cause may be image size, API, or low data.</w:t>
+            </w:r>
+          </w:p>
+        </w:tc>
+      </w:tr>
+    </w:tbl>
+    <w:p>
+      <w:pPr>
+        <w:spacing w:after="80"/>
+      </w:pPr>
+      <w:r>
+        <w:rPr>
+          <w:rFonts w:ascii="Calibri" w:hAnsi="Calibri" w:eastAsia="Calibri"/>
+          <w:b/>
+          <w:i w:val="0"/>
+          <w:color w:val="333333"/>
+          <w:sz w:val="20"/>
+        </w:rPr>
+        <w:t xml:space="preserve">Proposed improvement: </w:t>
+      </w:r>
+      <w:r>
+        <w:rPr>
+          <w:rFonts w:ascii="Calibri" w:hAnsi="Calibri" w:eastAsia="Calibri"/>
+          <w:b w:val="0"/>
+          <w:i w:val="0"/>
+          <w:color w:val="333333"/>
+          <w:sz w:val="20"/>
+        </w:rPr>
+        <w:t>Show clearer reason when possible (network/API/timeout), shorten long wait before fallback, and keep a visible Retry on the same screen instead of only returning to dashboard after ~1 minute.</w:t>
+      </w:r>
+    </w:p>
+    <w:p>
+      <w:pPr>
+        <w:spacing w:after="160"/>
+      </w:pPr>
+      <w:r>
+        <w:rPr>
+          <w:rFonts w:ascii="Calibri" w:hAnsi="Calibri" w:eastAsia="Calibri"/>
+          <w:b/>
+          <w:i w:val="0"/>
+          <w:color w:val="333333"/>
+          <w:sz w:val="20"/>
+        </w:rPr>
+        <w:t xml:space="preserve">Why this helps: </w:t>
+      </w:r>
+      <w:r>
+        <w:rPr>
+          <w:rFonts w:ascii="Calibri" w:hAnsi="Calibri" w:eastAsia="Calibri"/>
+          <w:b w:val="0"/>
+          <w:i w:val="0"/>
+          <w:color w:val="333333"/>
+          <w:sz w:val="20"/>
+        </w:rPr>
+        <w:t>Users on poor data still understand what failed and can retry faster without feeling stuck.</w:t>
+      </w:r>
+    </w:p>
+    <w:p>
+      <w:pPr>
         <w:spacing w:after="120" w:before="280" w:lineRule="auto"/>
         <w:rPr/>
       </w:pPr>
@@ -6182,7 +6408,7 @@
           <w:szCs w:val="22"/>
           <w:rtl w:val="0"/>
         </w:rPr>
-        <w:t>Result dropdown values: Pass / Fail / Blocked / Not Executed. Cases follow assignment focus (functionality, workflow, stability, usability, performance, product quality) for Background Remove and Batch Remover. Per assignment scope, AI cutout perfection is not the main judgment. Optional cutout observation checks are listed separately.</w:t>
+        <w:t>Result dropdown values: Pass / Fail / Blocked / Not Executed. Cases follow assignment focus (functionality, workflow, stability, usability, performance, product quality) for Background Remove and Batch Remover. Per assignment scope, AI cutout perfection is not judged.</w:t>
       </w:r>
       <w:r>
         <w:rPr>
@@ -11775,6 +12001,33 @@
         </w:tc>
         <w:tc>
           <w:tcPr>
+            <w:shd w:fill="E2EFDA" w:val="clear"/>
+            <w:tcBorders>
+              <w:top w:val="single" w:sz="4" w:color="BFBFBF"/>
+              <w:left w:val="single" w:sz="4" w:color="BFBFBF"/>
+              <w:bottom w:val="single" w:sz="4" w:color="BFBFBF"/>
+              <w:right w:val="single" w:sz="4" w:color="BFBFBF"/>
+            </w:tcBorders>
+          </w:tcPr>
+          <w:p>
+            <w:pPr>
+              <w:spacing w:before="40" w:after="40"/>
+            </w:pPr>
+            <w:r/>
+            <w:r>
+              <w:rPr>
+                <w:rFonts w:ascii="Calibri" w:hAnsi="Calibri" w:eastAsia="Calibri"/>
+                <w:b w:val="0"/>
+                <w:i w:val="0"/>
+                <w:color w:val="333333"/>
+                <w:sz w:val="16"/>
+              </w:rPr>
+              <w:t>Save batch results</w:t>
+            </w:r>
+          </w:p>
+        </w:tc>
+        <w:tc>
+          <w:tcPr>
             <w:tcBorders>
               <w:top w:color="bfbfbf" w:space="0" w:sz="4" w:val="single"/>
               <w:left w:color="bfbfbf" w:space="0" w:sz="4" w:val="single"/>
@@ -11800,42 +12053,6 @@
                 <w:szCs w:val="16"/>
                 <w:rtl w:val="0"/>
               </w:rPr>
-              <w:t xml:space="preserve">Save batch results</w:t>
-            </w:r>
-            <w:r>
-              <w:rPr>
-                <w:rtl w:val="0"/>
-              </w:rPr>
-            </w:r>
-          </w:p>
-        </w:tc>
-        <w:tc>
-          <w:tcPr>
-            <w:tcBorders>
-              <w:top w:color="bfbfbf" w:space="0" w:sz="4" w:val="single"/>
-              <w:left w:color="bfbfbf" w:space="0" w:sz="4" w:val="single"/>
-              <w:bottom w:color="bfbfbf" w:space="0" w:sz="4" w:val="single"/>
-              <w:right w:color="bfbfbf" w:space="0" w:sz="4" w:val="single"/>
-            </w:tcBorders>
-            <w:shd w:fill="f2f2f2" w:val="clear"/>
-          </w:tcPr>
-          <w:p>
-            <w:pPr>
-              <w:spacing w:after="40" w:before="40" w:lineRule="auto"/>
-              <w:rPr/>
-            </w:pPr>
-            <w:r>
-              <w:rPr>
-                <w:rFonts w:ascii="Calibri" w:cs="Calibri" w:eastAsia="Calibri" w:hAnsi="Calibri"/>
-                <w:b w:val="0"/>
-                <w:bCs w:val="0"/>
-                <w:i w:val="0"/>
-                <w:iCs w:val="0"/>
-                <w:color w:val="333333"/>
-                <w:sz w:val="16"/>
-                <w:szCs w:val="16"/>
-                <w:rtl w:val="0"/>
-              </w:rPr>
               <w:t xml:space="preserve">Functionality</w:t>
             </w:r>
             <w:r>
@@ -11847,141 +12064,121 @@
         </w:tc>
         <w:tc>
           <w:tcPr>
-            <w:tcBorders>
-              <w:top w:color="bfbfbf" w:space="0" w:sz="4" w:val="single"/>
-              <w:left w:color="bfbfbf" w:space="0" w:sz="4" w:val="single"/>
-              <w:bottom w:color="bfbfbf" w:space="0" w:sz="4" w:val="single"/>
-              <w:right w:color="bfbfbf" w:space="0" w:sz="4" w:val="single"/>
-            </w:tcBorders>
-            <w:shd w:fill="f2f2f2" w:val="clear"/>
-          </w:tcPr>
-          <w:p>
-            <w:pPr>
-              <w:spacing w:after="40" w:before="40" w:lineRule="auto"/>
-              <w:rPr/>
-            </w:pPr>
-            <w:r>
-              <w:rPr>
-                <w:rFonts w:ascii="Calibri" w:cs="Calibri" w:eastAsia="Calibri" w:hAnsi="Calibri"/>
-                <w:b w:val="0"/>
-                <w:bCs w:val="0"/>
-                <w:i w:val="0"/>
-                <w:iCs w:val="0"/>
-                <w:color w:val="333333"/>
-                <w:sz w:val="16"/>
-                <w:szCs w:val="16"/>
-                <w:rtl w:val="0"/>
-              </w:rPr>
-              <w:t xml:space="preserve">Save processed images</w:t>
-            </w:r>
-            <w:r>
-              <w:rPr>
-                <w:rtl w:val="0"/>
-              </w:rPr>
-            </w:r>
-          </w:p>
-        </w:tc>
-        <w:tc>
-          <w:tcPr>
-            <w:tcBorders>
-              <w:top w:color="bfbfbf" w:space="0" w:sz="4" w:val="single"/>
-              <w:left w:color="bfbfbf" w:space="0" w:sz="4" w:val="single"/>
-              <w:bottom w:color="bfbfbf" w:space="0" w:sz="4" w:val="single"/>
-              <w:right w:color="bfbfbf" w:space="0" w:sz="4" w:val="single"/>
-            </w:tcBorders>
-            <w:shd w:fill="f2f2f2" w:val="clear"/>
-          </w:tcPr>
-          <w:p>
-            <w:pPr>
-              <w:spacing w:after="40" w:before="40" w:lineRule="auto"/>
-              <w:rPr/>
-            </w:pPr>
-            <w:r>
-              <w:rPr>
-                <w:rFonts w:ascii="Calibri" w:cs="Calibri" w:eastAsia="Calibri" w:hAnsi="Calibri"/>
-                <w:b w:val="0"/>
-                <w:bCs w:val="0"/>
-                <w:i w:val="0"/>
-                <w:iCs w:val="0"/>
-                <w:color w:val="333333"/>
-                <w:sz w:val="16"/>
-                <w:szCs w:val="16"/>
-                <w:rtl w:val="0"/>
-              </w:rPr>
-              <w:t xml:space="preserve">Images are saved without crash</w:t>
-            </w:r>
-            <w:r>
-              <w:rPr>
-                <w:rtl w:val="0"/>
-              </w:rPr>
-            </w:r>
-          </w:p>
-        </w:tc>
-        <w:tc>
-          <w:tcPr>
-            <w:tcBorders>
-              <w:top w:color="bfbfbf" w:space="0" w:sz="4" w:val="single"/>
-              <w:left w:color="bfbfbf" w:space="0" w:sz="4" w:val="single"/>
-              <w:bottom w:color="bfbfbf" w:space="0" w:sz="4" w:val="single"/>
-              <w:right w:color="bfbfbf" w:space="0" w:sz="4" w:val="single"/>
-            </w:tcBorders>
-            <w:shd w:fill="f2f2f2" w:val="clear"/>
-          </w:tcPr>
-          <w:p>
-            <w:pPr>
+            <w:shd w:fill="E2EFDA" w:val="clear"/>
+            <w:tcBorders>
+              <w:top w:val="single" w:sz="4" w:color="BFBFBF"/>
+              <w:left w:val="single" w:sz="4" w:color="BFBFBF"/>
+              <w:bottom w:val="single" w:sz="4" w:color="BFBFBF"/>
+              <w:right w:val="single" w:sz="4" w:color="BFBFBF"/>
+            </w:tcBorders>
+          </w:tcPr>
+          <w:p>
+            <w:pPr>
+              <w:spacing w:before="40" w:after="40"/>
+            </w:pPr>
+            <w:r/>
+            <w:r>
+              <w:rPr>
+                <w:rFonts w:ascii="Calibri" w:hAnsi="Calibri" w:eastAsia="Calibri"/>
+                <w:b w:val="0"/>
+                <w:i w:val="0"/>
+                <w:color w:val="333333"/>
+                <w:sz w:val="16"/>
+              </w:rPr>
+              <w:t>Save processed batch images</w:t>
+            </w:r>
+          </w:p>
+        </w:tc>
+        <w:tc>
+          <w:tcPr>
+            <w:shd w:fill="E2EFDA" w:val="clear"/>
+            <w:tcBorders>
+              <w:top w:val="single" w:sz="4" w:color="BFBFBF"/>
+              <w:left w:val="single" w:sz="4" w:color="BFBFBF"/>
+              <w:bottom w:val="single" w:sz="4" w:color="BFBFBF"/>
+              <w:right w:val="single" w:sz="4" w:color="BFBFBF"/>
+            </w:tcBorders>
+          </w:tcPr>
+          <w:p>
+            <w:pPr>
+              <w:spacing w:before="40" w:after="40"/>
+            </w:pPr>
+            <w:r/>
+            <w:r>
+              <w:rPr>
+                <w:rFonts w:ascii="Calibri" w:hAnsi="Calibri" w:eastAsia="Calibri"/>
+                <w:b w:val="0"/>
+                <w:i w:val="0"/>
+                <w:color w:val="333333"/>
+                <w:sz w:val="16"/>
+              </w:rPr>
+              <w:t>Images save correctly and are not mixed</w:t>
+            </w:r>
+          </w:p>
+        </w:tc>
+        <w:tc>
+          <w:tcPr>
+            <w:shd w:fill="E2EFDA" w:val="clear"/>
+            <w:tcBorders>
+              <w:top w:val="single" w:sz="4" w:color="BFBFBF"/>
+              <w:left w:val="single" w:sz="4" w:color="BFBFBF"/>
+              <w:bottom w:val="single" w:sz="4" w:color="BFBFBF"/>
+              <w:right w:val="single" w:sz="4" w:color="BFBFBF"/>
+            </w:tcBorders>
+          </w:tcPr>
+          <w:sdt>
+            <w:sdtPr>
+              <w:alias w:val="Result"/>
+              <w:tag w:val="result_status"/>
+              <w:id w:val="40014"/>
+              <w:dropDownList>
+                <w:listItem w:displayText="Not Executed" w:value="Not Executed"/>
+                <w:listItem w:displayText="Pass" w:value="Pass"/>
+                <w:listItem w:displayText="Fail" w:value="Fail"/>
+                <w:listItem w:displayText="Blocked" w:value="Blocked"/>
+              </w:dropDownList>
+            </w:sdtPr>
+            <w:sdtContent>
+              <w:p>
+                <w:pPr>
+                  <w:jc w:val="center"/>
+                </w:pPr>
+                <w:r>
+                  <w:rPr>
+                    <w:sz w:val="16"/>
+                    <w:color w:val="548235"/>
+                  </w:rPr>
+                  <w:t>Pass</w:t>
+                </w:r>
+              </w:p>
+            </w:sdtContent>
+          </w:sdt>
+        </w:tc>
+        <w:tc>
+          <w:tcPr>
+            <w:shd w:fill="E2EFDA" w:val="clear"/>
+            <w:tcBorders>
+              <w:top w:val="single" w:sz="4" w:color="BFBFBF"/>
+              <w:left w:val="single" w:sz="4" w:color="BFBFBF"/>
+              <w:bottom w:val="single" w:sz="4" w:color="BFBFBF"/>
+              <w:right w:val="single" w:sz="4" w:color="BFBFBF"/>
+            </w:tcBorders>
+          </w:tcPr>
+          <w:p>
+            <w:pPr>
+              <w:spacing w:before="40" w:after="40"/>
               <w:jc w:val="center"/>
-              <w:rPr/>
-            </w:pPr>
-            <w:r>
-              <w:rPr>
-                <w:color w:val="666666"/>
-                <w:sz w:val="16"/>
-                <w:szCs w:val="16"/>
-                <w:rtl w:val="0"/>
-              </w:rPr>
-              <w:t xml:space="preserve">Not Executed</w:t>
-            </w:r>
-            <w:r>
-              <w:rPr>
-                <w:rtl w:val="0"/>
-              </w:rPr>
-            </w:r>
-          </w:p>
-        </w:tc>
-        <w:tc>
-          <w:tcPr>
-            <w:tcBorders>
-              <w:top w:color="bfbfbf" w:space="0" w:sz="4" w:val="single"/>
-              <w:left w:color="bfbfbf" w:space="0" w:sz="4" w:val="single"/>
-              <w:bottom w:color="bfbfbf" w:space="0" w:sz="4" w:val="single"/>
-              <w:right w:color="bfbfbf" w:space="0" w:sz="4" w:val="single"/>
-            </w:tcBorders>
-            <w:shd w:fill="f2f2f2" w:val="clear"/>
-          </w:tcPr>
-          <w:p>
-            <w:pPr>
-              <w:spacing w:after="40" w:before="40" w:lineRule="auto"/>
-              <w:jc w:val="center"/>
-              <w:rPr/>
-            </w:pPr>
-            <w:r>
-              <w:rPr>
-                <w:rFonts w:ascii="Calibri" w:cs="Calibri" w:eastAsia="Calibri" w:hAnsi="Calibri"/>
-                <w:b w:val="0"/>
-                <w:bCs w:val="0"/>
-                <w:i w:val="0"/>
-                <w:iCs w:val="0"/>
-                <w:color w:val="333333"/>
-                <w:sz w:val="16"/>
-                <w:szCs w:val="16"/>
-                <w:rtl w:val="0"/>
-              </w:rPr>
-              <w:t xml:space="preserve">—</w:t>
-            </w:r>
-            <w:r>
-              <w:rPr>
-                <w:rtl w:val="0"/>
-              </w:rPr>
+            </w:pPr>
+            <w:r/>
+            <w:r>
+              <w:rPr>
+                <w:rFonts w:ascii="Calibri" w:hAnsi="Calibri" w:eastAsia="Calibri"/>
+                <w:b w:val="0"/>
+                <w:i w:val="0"/>
+                <w:color w:val="333333"/>
+                <w:sz w:val="16"/>
+              </w:rPr>
+              <w:t>—</w:t>
             </w:r>
           </w:p>
         </w:tc>
@@ -12171,59 +12368,7 @@
         </w:tc>
         <w:tc>
           <w:tcPr>
-            <w:shd w:val="clear" w:fill="FFFFFF"/>
-          </w:tcPr>
-          <w:p>
-            <w:r>
-              <w:rPr>
-                <w:sz w:val="15"/>
-              </w:rPr>
-              <w:t xml:space="preserve">App resume from background mid-edit</w:t>
-            </w:r>
-          </w:p>
-        </w:tc>
-        <w:tc>
-          <w:tcPr>
-            <w:shd w:val="clear" w:fill="FFFFFF"/>
-          </w:tcPr>
-          <w:p>
-            <w:r>
-              <w:rPr>
-                <w:sz w:val="15"/>
-              </w:rPr>
-              <w:t xml:space="preserve">Stability</w:t>
-            </w:r>
-          </w:p>
-        </w:tc>
-        <w:tc>
-          <w:tcPr>
-            <w:shd w:val="clear" w:fill="FFFFFF"/>
-          </w:tcPr>
-          <w:p>
-            <w:r>
-              <w:rPr>
-                <w:sz w:val="15"/>
-              </w:rPr>
-              <w:t xml:space="preserve">Start edit → Home/recents → reopen app</w:t>
-            </w:r>
-          </w:p>
-        </w:tc>
-        <w:tc>
-          <w:tcPr>
-            <w:shd w:val="clear" w:fill="FFFFFF"/>
-          </w:tcPr>
-          <w:p>
-            <w:r>
-              <w:rPr>
-                <w:sz w:val="15"/>
-              </w:rPr>
-              <w:t xml:space="preserve">Draft or last safe state remains; no crash</w:t>
-            </w:r>
-          </w:p>
-        </w:tc>
-        <w:tc>
-          <w:tcPr>
-            <w:shd w:fill="FFFFFF" w:val="clear"/>
+            <w:shd w:fill="E2EFDA" w:val="clear"/>
             <w:tcBorders>
               <w:top w:val="single" w:sz="4" w:color="BFBFBF"/>
               <w:left w:val="single" w:sz="4" w:color="BFBFBF"/>
@@ -12231,11 +12376,105 @@
               <w:right w:val="single" w:sz="4" w:color="BFBFBF"/>
             </w:tcBorders>
           </w:tcPr>
+          <w:p>
+            <w:pPr>
+              <w:spacing w:before="40" w:after="40"/>
+            </w:pPr>
+            <w:r/>
+            <w:r>
+              <w:rPr>
+                <w:rFonts w:ascii="Calibri" w:hAnsi="Calibri" w:eastAsia="Calibri"/>
+                <w:b w:val="0"/>
+                <w:i w:val="0"/>
+                <w:color w:val="333333"/>
+                <w:sz w:val="16"/>
+              </w:rPr>
+              <w:t>App resume from background mid-edit</w:t>
+            </w:r>
+          </w:p>
+        </w:tc>
+        <w:tc>
+          <w:tcPr>
+            <w:shd w:val="clear" w:fill="FFFFFF"/>
+          </w:tcPr>
+          <w:p>
+            <w:r>
+              <w:rPr>
+                <w:sz w:val="15"/>
+              </w:rPr>
+              <w:t xml:space="preserve">Stability</w:t>
+            </w:r>
+          </w:p>
+        </w:tc>
+        <w:tc>
+          <w:tcPr>
+            <w:shd w:fill="E2EFDA" w:val="clear"/>
+            <w:tcBorders>
+              <w:top w:val="single" w:sz="4" w:color="BFBFBF"/>
+              <w:left w:val="single" w:sz="4" w:color="BFBFBF"/>
+              <w:bottom w:val="single" w:sz="4" w:color="BFBFBF"/>
+              <w:right w:val="single" w:sz="4" w:color="BFBFBF"/>
+            </w:tcBorders>
+          </w:tcPr>
+          <w:p>
+            <w:pPr>
+              <w:spacing w:before="40" w:after="40"/>
+            </w:pPr>
+            <w:r/>
+            <w:r>
+              <w:rPr>
+                <w:rFonts w:ascii="Calibri" w:hAnsi="Calibri" w:eastAsia="Calibri"/>
+                <w:b w:val="0"/>
+                <w:i w:val="0"/>
+                <w:color w:val="333333"/>
+                <w:sz w:val="16"/>
+              </w:rPr>
+              <w:t>Start edit → Home/recents → reopen app</w:t>
+            </w:r>
+          </w:p>
+        </w:tc>
+        <w:tc>
+          <w:tcPr>
+            <w:shd w:fill="E2EFDA" w:val="clear"/>
+            <w:tcBorders>
+              <w:top w:val="single" w:sz="4" w:color="BFBFBF"/>
+              <w:left w:val="single" w:sz="4" w:color="BFBFBF"/>
+              <w:bottom w:val="single" w:sz="4" w:color="BFBFBF"/>
+              <w:right w:val="single" w:sz="4" w:color="BFBFBF"/>
+            </w:tcBorders>
+          </w:tcPr>
+          <w:p>
+            <w:pPr>
+              <w:spacing w:before="40" w:after="40"/>
+            </w:pPr>
+            <w:r/>
+            <w:r>
+              <w:rPr>
+                <w:rFonts w:ascii="Calibri" w:hAnsi="Calibri" w:eastAsia="Calibri"/>
+                <w:b w:val="0"/>
+                <w:i w:val="0"/>
+                <w:color w:val="333333"/>
+                <w:sz w:val="16"/>
+              </w:rPr>
+              <w:t>Draft or last safe state remains; no crash</w:t>
+            </w:r>
+          </w:p>
+        </w:tc>
+        <w:tc>
+          <w:tcPr>
+            <w:shd w:fill="E2EFDA" w:val="clear"/>
+            <w:tcBorders>
+              <w:top w:val="single" w:sz="4" w:color="BFBFBF"/>
+              <w:left w:val="single" w:sz="4" w:color="BFBFBF"/>
+              <w:bottom w:val="single" w:sz="4" w:color="BFBFBF"/>
+              <w:right w:val="single" w:sz="4" w:color="BFBFBF"/>
+            </w:tcBorders>
+          </w:tcPr>
           <w:sdt>
             <w:sdtPr>
               <w:alias w:val="Result"/>
               <w:tag w:val="result_status"/>
-              <w:id w:val="31004"/>
+              <w:id w:val="40000"/>
               <w:dropDownList>
                 <w:listItem w:displayText="Not Executed" w:value="Not Executed"/>
                 <w:listItem w:displayText="Pass" w:value="Pass"/>
@@ -12251,9 +12490,9 @@
                 <w:r>
                   <w:rPr>
                     <w:sz w:val="16"/>
-                    <w:color w:val="666666"/>
+                    <w:color w:val="548235"/>
                   </w:rPr>
-                  <w:t>Not Executed</w:t>
+                  <w:t>Pass</w:t>
                 </w:r>
               </w:p>
             </w:sdtContent>
@@ -12261,7 +12500,7 @@
         </w:tc>
         <w:tc>
           <w:tcPr>
-            <w:shd w:fill="FFFFFF" w:val="clear"/>
+            <w:shd w:fill="E2EFDA" w:val="clear"/>
             <w:tcBorders>
               <w:top w:val="single" w:sz="4" w:color="BFBFBF"/>
               <w:left w:val="single" w:sz="4" w:color="BFBFBF"/>
@@ -12304,59 +12543,7 @@
         </w:tc>
         <w:tc>
           <w:tcPr>
-            <w:shd w:val="clear" w:fill="F2F2F2"/>
-          </w:tcPr>
-          <w:p>
-            <w:r>
-              <w:rPr>
-                <w:sz w:val="15"/>
-              </w:rPr>
-              <w:t xml:space="preserve">No internet during processing</w:t>
-            </w:r>
-          </w:p>
-        </w:tc>
-        <w:tc>
-          <w:tcPr>
-            <w:shd w:val="clear" w:fill="F2F2F2"/>
-          </w:tcPr>
-          <w:p>
-            <w:r>
-              <w:rPr>
-                <w:sz w:val="15"/>
-              </w:rPr>
-              <w:t xml:space="preserve">Stability, Usability</w:t>
-            </w:r>
-          </w:p>
-        </w:tc>
-        <w:tc>
-          <w:tcPr>
-            <w:shd w:val="clear" w:fill="F2F2F2"/>
-          </w:tcPr>
-          <w:p>
-            <w:r>
-              <w:rPr>
-                <w:sz w:val="15"/>
-              </w:rPr>
-              <w:t xml:space="preserve">Airplane mode → try remove/process</w:t>
-            </w:r>
-          </w:p>
-        </w:tc>
-        <w:tc>
-          <w:tcPr>
-            <w:shd w:val="clear" w:fill="F2F2F2"/>
-          </w:tcPr>
-          <w:p>
-            <w:r>
-              <w:rPr>
-                <w:sz w:val="15"/>
-              </w:rPr>
-              <w:t xml:space="preserve">Clear offline/error message; no crash</w:t>
-            </w:r>
-          </w:p>
-        </w:tc>
-        <w:tc>
-          <w:tcPr>
-            <w:shd w:fill="FFFFFF" w:val="clear"/>
+            <w:shd w:fill="E2EFDA" w:val="clear"/>
             <w:tcBorders>
               <w:top w:val="single" w:sz="4" w:color="BFBFBF"/>
               <w:left w:val="single" w:sz="4" w:color="BFBFBF"/>
@@ -12364,11 +12551,105 @@
               <w:right w:val="single" w:sz="4" w:color="BFBFBF"/>
             </w:tcBorders>
           </w:tcPr>
+          <w:p>
+            <w:pPr>
+              <w:spacing w:before="40" w:after="40"/>
+            </w:pPr>
+            <w:r/>
+            <w:r>
+              <w:rPr>
+                <w:rFonts w:ascii="Calibri" w:hAnsi="Calibri" w:eastAsia="Calibri"/>
+                <w:b w:val="0"/>
+                <w:i w:val="0"/>
+                <w:color w:val="333333"/>
+                <w:sz w:val="16"/>
+              </w:rPr>
+              <w:t>No internet during processing</w:t>
+            </w:r>
+          </w:p>
+        </w:tc>
+        <w:tc>
+          <w:tcPr>
+            <w:shd w:val="clear" w:fill="F2F2F2"/>
+          </w:tcPr>
+          <w:p>
+            <w:r>
+              <w:rPr>
+                <w:sz w:val="15"/>
+              </w:rPr>
+              <w:t xml:space="preserve">Stability, Usability</w:t>
+            </w:r>
+          </w:p>
+        </w:tc>
+        <w:tc>
+          <w:tcPr>
+            <w:shd w:fill="E2EFDA" w:val="clear"/>
+            <w:tcBorders>
+              <w:top w:val="single" w:sz="4" w:color="BFBFBF"/>
+              <w:left w:val="single" w:sz="4" w:color="BFBFBF"/>
+              <w:bottom w:val="single" w:sz="4" w:color="BFBFBF"/>
+              <w:right w:val="single" w:sz="4" w:color="BFBFBF"/>
+            </w:tcBorders>
+          </w:tcPr>
+          <w:p>
+            <w:pPr>
+              <w:spacing w:before="40" w:after="40"/>
+            </w:pPr>
+            <w:r/>
+            <w:r>
+              <w:rPr>
+                <w:rFonts w:ascii="Calibri" w:hAnsi="Calibri" w:eastAsia="Calibri"/>
+                <w:b w:val="0"/>
+                <w:i w:val="0"/>
+                <w:color w:val="333333"/>
+                <w:sz w:val="16"/>
+              </w:rPr>
+              <w:t>Airplane mode / no network → try remove/process</w:t>
+            </w:r>
+          </w:p>
+        </w:tc>
+        <w:tc>
+          <w:tcPr>
+            <w:shd w:fill="E2EFDA" w:val="clear"/>
+            <w:tcBorders>
+              <w:top w:val="single" w:sz="4" w:color="BFBFBF"/>
+              <w:left w:val="single" w:sz="4" w:color="BFBFBF"/>
+              <w:bottom w:val="single" w:sz="4" w:color="BFBFBF"/>
+              <w:right w:val="single" w:sz="4" w:color="BFBFBF"/>
+            </w:tcBorders>
+          </w:tcPr>
+          <w:p>
+            <w:pPr>
+              <w:spacing w:before="40" w:after="40"/>
+            </w:pPr>
+            <w:r/>
+            <w:r>
+              <w:rPr>
+                <w:rFonts w:ascii="Calibri" w:hAnsi="Calibri" w:eastAsia="Calibri"/>
+                <w:b w:val="0"/>
+                <w:i w:val="0"/>
+                <w:color w:val="333333"/>
+                <w:sz w:val="16"/>
+              </w:rPr>
+              <w:t>Clear “No internet connection” message; no crash</w:t>
+            </w:r>
+          </w:p>
+        </w:tc>
+        <w:tc>
+          <w:tcPr>
+            <w:shd w:fill="E2EFDA" w:val="clear"/>
+            <w:tcBorders>
+              <w:top w:val="single" w:sz="4" w:color="BFBFBF"/>
+              <w:left w:val="single" w:sz="4" w:color="BFBFBF"/>
+              <w:bottom w:val="single" w:sz="4" w:color="BFBFBF"/>
+              <w:right w:val="single" w:sz="4" w:color="BFBFBF"/>
+            </w:tcBorders>
+          </w:tcPr>
           <w:sdt>
             <w:sdtPr>
               <w:alias w:val="Result"/>
               <w:tag w:val="result_status"/>
-              <w:id w:val="31005"/>
+              <w:id w:val="40001"/>
               <w:dropDownList>
                 <w:listItem w:displayText="Not Executed" w:value="Not Executed"/>
                 <w:listItem w:displayText="Pass" w:value="Pass"/>
@@ -12384,9 +12665,9 @@
                 <w:r>
                   <w:rPr>
                     <w:sz w:val="16"/>
-                    <w:color w:val="666666"/>
+                    <w:color w:val="548235"/>
                   </w:rPr>
-                  <w:t>Not Executed</w:t>
+                  <w:t>Pass</w:t>
                 </w:r>
               </w:p>
             </w:sdtContent>
@@ -12394,7 +12675,7 @@
         </w:tc>
         <w:tc>
           <w:tcPr>
-            <w:shd w:fill="FFFFFF" w:val="clear"/>
+            <w:shd w:fill="E2EFDA" w:val="clear"/>
             <w:tcBorders>
               <w:top w:val="single" w:sz="4" w:color="BFBFBF"/>
               <w:left w:val="single" w:sz="4" w:color="BFBFBF"/>
@@ -12570,59 +12851,7 @@
         </w:tc>
         <w:tc>
           <w:tcPr>
-            <w:shd w:val="clear" w:fill="F2F2F2"/>
-          </w:tcPr>
-          <w:p>
-            <w:r>
-              <w:rPr>
-                <w:sz w:val="15"/>
-              </w:rPr>
-              <w:t xml:space="preserve">Very large image handling</w:t>
-            </w:r>
-          </w:p>
-        </w:tc>
-        <w:tc>
-          <w:tcPr>
-            <w:shd w:val="clear" w:fill="F2F2F2"/>
-          </w:tcPr>
-          <w:p>
-            <w:r>
-              <w:rPr>
-                <w:sz w:val="15"/>
-              </w:rPr>
-              <w:t xml:space="preserve">Stability, Performance</w:t>
-            </w:r>
-          </w:p>
-        </w:tc>
-        <w:tc>
-          <w:tcPr>
-            <w:shd w:val="clear" w:fill="F2F2F2"/>
-          </w:tcPr>
-          <w:p>
-            <w:r>
-              <w:rPr>
-                <w:sz w:val="15"/>
-              </w:rPr>
-              <w:t xml:space="preserve">Use a very large photo if available</w:t>
-            </w:r>
-          </w:p>
-        </w:tc>
-        <w:tc>
-          <w:tcPr>
-            <w:shd w:val="clear" w:fill="F2F2F2"/>
-          </w:tcPr>
-          <w:p>
-            <w:r>
-              <w:rPr>
-                <w:sz w:val="15"/>
-              </w:rPr>
-              <w:t xml:space="preserve">Processes, compresses, or friendly error; no freeze/crash</w:t>
-            </w:r>
-          </w:p>
-        </w:tc>
-        <w:tc>
-          <w:tcPr>
-            <w:shd w:fill="FFFFFF" w:val="clear"/>
+            <w:shd w:fill="E2EFDA" w:val="clear"/>
             <w:tcBorders>
               <w:top w:val="single" w:sz="4" w:color="BFBFBF"/>
               <w:left w:val="single" w:sz="4" w:color="BFBFBF"/>
@@ -12630,11 +12859,119 @@
               <w:right w:val="single" w:sz="4" w:color="BFBFBF"/>
             </w:tcBorders>
           </w:tcPr>
+          <w:p>
+            <w:pPr>
+              <w:spacing w:before="40" w:after="40"/>
+            </w:pPr>
+            <w:r/>
+            <w:r>
+              <w:rPr>
+                <w:rFonts w:ascii="Calibri" w:hAnsi="Calibri" w:eastAsia="Calibri"/>
+                <w:b w:val="0"/>
+                <w:i w:val="0"/>
+                <w:color w:val="333333"/>
+                <w:sz w:val="16"/>
+              </w:rPr>
+              <w:t>Very large image handling</w:t>
+            </w:r>
+          </w:p>
+        </w:tc>
+        <w:tc>
+          <w:tcPr>
+            <w:shd w:fill="E2EFDA" w:val="clear"/>
+            <w:tcBorders>
+              <w:top w:val="single" w:sz="4" w:color="BFBFBF"/>
+              <w:left w:val="single" w:sz="4" w:color="BFBFBF"/>
+              <w:bottom w:val="single" w:sz="4" w:color="BFBFBF"/>
+              <w:right w:val="single" w:sz="4" w:color="BFBFBF"/>
+            </w:tcBorders>
+          </w:tcPr>
+          <w:p>
+            <w:pPr>
+              <w:spacing w:before="40" w:after="40"/>
+            </w:pPr>
+            <w:r/>
+            <w:r>
+              <w:rPr>
+                <w:rFonts w:ascii="Calibri" w:hAnsi="Calibri" w:eastAsia="Calibri"/>
+                <w:b w:val="0"/>
+                <w:i w:val="0"/>
+                <w:color w:val="333333"/>
+                <w:sz w:val="16"/>
+              </w:rPr>
+              <w:t>Stability, Performance</w:t>
+            </w:r>
+          </w:p>
+        </w:tc>
+        <w:tc>
+          <w:tcPr>
+            <w:shd w:fill="E2EFDA" w:val="clear"/>
+            <w:tcBorders>
+              <w:top w:val="single" w:sz="4" w:color="BFBFBF"/>
+              <w:left w:val="single" w:sz="4" w:color="BFBFBF"/>
+              <w:bottom w:val="single" w:sz="4" w:color="BFBFBF"/>
+              <w:right w:val="single" w:sz="4" w:color="BFBFBF"/>
+            </w:tcBorders>
+          </w:tcPr>
+          <w:p>
+            <w:pPr>
+              <w:spacing w:before="40" w:after="40"/>
+            </w:pPr>
+            <w:r/>
+            <w:r>
+              <w:rPr>
+                <w:rFonts w:ascii="Calibri" w:hAnsi="Calibri" w:eastAsia="Calibri"/>
+                <w:b w:val="0"/>
+                <w:i w:val="0"/>
+                <w:color w:val="333333"/>
+                <w:sz w:val="16"/>
+              </w:rPr>
+              <w:t>Process a large photo (~7 MB)</w:t>
+            </w:r>
+          </w:p>
+        </w:tc>
+        <w:tc>
+          <w:tcPr>
+            <w:shd w:fill="E2EFDA" w:val="clear"/>
+            <w:tcBorders>
+              <w:top w:val="single" w:sz="4" w:color="BFBFBF"/>
+              <w:left w:val="single" w:sz="4" w:color="BFBFBF"/>
+              <w:bottom w:val="single" w:sz="4" w:color="BFBFBF"/>
+              <w:right w:val="single" w:sz="4" w:color="BFBFBF"/>
+            </w:tcBorders>
+          </w:tcPr>
+          <w:p>
+            <w:pPr>
+              <w:spacing w:before="40" w:after="40"/>
+            </w:pPr>
+            <w:r/>
+            <w:r>
+              <w:rPr>
+                <w:rFonts w:ascii="Calibri" w:hAnsi="Calibri" w:eastAsia="Calibri"/>
+                <w:b w:val="0"/>
+                <w:i w:val="0"/>
+                <w:color w:val="333333"/>
+                <w:sz w:val="16"/>
+              </w:rPr>
+              <w:t>Completes successfully without freeze/crash (observed ~37 seconds for 7 MB)</w:t>
+            </w:r>
+          </w:p>
+        </w:tc>
+        <w:tc>
+          <w:tcPr>
+            <w:shd w:fill="E2EFDA" w:val="clear"/>
+            <w:tcBorders>
+              <w:top w:val="single" w:sz="4" w:color="BFBFBF"/>
+              <w:left w:val="single" w:sz="4" w:color="BFBFBF"/>
+              <w:bottom w:val="single" w:sz="4" w:color="BFBFBF"/>
+              <w:right w:val="single" w:sz="4" w:color="BFBFBF"/>
+            </w:tcBorders>
+          </w:tcPr>
           <w:sdt>
             <w:sdtPr>
               <w:alias w:val="Result"/>
               <w:tag w:val="result_status"/>
-              <w:id w:val="31007"/>
+              <w:id w:val="40002"/>
               <w:dropDownList>
                 <w:listItem w:displayText="Not Executed" w:value="Not Executed"/>
                 <w:listItem w:displayText="Pass" w:value="Pass"/>
@@ -12650,9 +12987,9 @@
                 <w:r>
                   <w:rPr>
                     <w:sz w:val="16"/>
-                    <w:color w:val="666666"/>
+                    <w:color w:val="548235"/>
                   </w:rPr>
-                  <w:t>Not Executed</w:t>
+                  <w:t>Pass</w:t>
                 </w:r>
               </w:p>
             </w:sdtContent>
@@ -12660,7 +12997,7 @@
         </w:tc>
         <w:tc>
           <w:tcPr>
-            <w:shd w:fill="FFFFFF" w:val="clear"/>
+            <w:shd w:fill="E2EFDA" w:val="clear"/>
             <w:tcBorders>
               <w:top w:val="single" w:sz="4" w:color="BFBFBF"/>
               <w:left w:val="single" w:sz="4" w:color="BFBFBF"/>
@@ -12703,59 +13040,7 @@
         </w:tc>
         <w:tc>
           <w:tcPr>
-            <w:shd w:val="clear" w:fill="FFFFFF"/>
-          </w:tcPr>
-          <w:p>
-            <w:r>
-              <w:rPr>
-                <w:sz w:val="15"/>
-              </w:rPr>
-              <w:t xml:space="preserve">Repeated process in one session</w:t>
-            </w:r>
-          </w:p>
-        </w:tc>
-        <w:tc>
-          <w:tcPr>
-            <w:shd w:val="clear" w:fill="FFFFFF"/>
-          </w:tcPr>
-          <w:p>
-            <w:r>
-              <w:rPr>
-                <w:sz w:val="15"/>
-              </w:rPr>
-              <w:t xml:space="preserve">Stability</w:t>
-            </w:r>
-          </w:p>
-        </w:tc>
-        <w:tc>
-          <w:tcPr>
-            <w:shd w:val="clear" w:fill="FFFFFF"/>
-          </w:tcPr>
-          <w:p>
-            <w:r>
-              <w:rPr>
-                <w:sz w:val="15"/>
-              </w:rPr>
-              <w:t xml:space="preserve">Process several images one after another</w:t>
-            </w:r>
-          </w:p>
-        </w:tc>
-        <w:tc>
-          <w:tcPr>
-            <w:shd w:val="clear" w:fill="FFFFFF"/>
-          </w:tcPr>
-          <w:p>
-            <w:r>
-              <w:rPr>
-                <w:sz w:val="15"/>
-              </w:rPr>
-              <w:t xml:space="preserve">App stays usable; no progressive freeze/crash</w:t>
-            </w:r>
-          </w:p>
-        </w:tc>
-        <w:tc>
-          <w:tcPr>
-            <w:shd w:fill="FFFFFF" w:val="clear"/>
+            <w:shd w:fill="E2EFDA" w:val="clear"/>
             <w:tcBorders>
               <w:top w:val="single" w:sz="4" w:color="BFBFBF"/>
               <w:left w:val="single" w:sz="4" w:color="BFBFBF"/>
@@ -12763,11 +13048,105 @@
               <w:right w:val="single" w:sz="4" w:color="BFBFBF"/>
             </w:tcBorders>
           </w:tcPr>
+          <w:p>
+            <w:pPr>
+              <w:spacing w:before="40" w:after="40"/>
+            </w:pPr>
+            <w:r/>
+            <w:r>
+              <w:rPr>
+                <w:rFonts w:ascii="Calibri" w:hAnsi="Calibri" w:eastAsia="Calibri"/>
+                <w:b w:val="0"/>
+                <w:i w:val="0"/>
+                <w:color w:val="333333"/>
+                <w:sz w:val="16"/>
+              </w:rPr>
+              <w:t>Repeated process in one session</w:t>
+            </w:r>
+          </w:p>
+        </w:tc>
+        <w:tc>
+          <w:tcPr>
+            <w:shd w:val="clear" w:fill="FFFFFF"/>
+          </w:tcPr>
+          <w:p>
+            <w:r>
+              <w:rPr>
+                <w:sz w:val="15"/>
+              </w:rPr>
+              <w:t xml:space="preserve">Stability</w:t>
+            </w:r>
+          </w:p>
+        </w:tc>
+        <w:tc>
+          <w:tcPr>
+            <w:shd w:fill="E2EFDA" w:val="clear"/>
+            <w:tcBorders>
+              <w:top w:val="single" w:sz="4" w:color="BFBFBF"/>
+              <w:left w:val="single" w:sz="4" w:color="BFBFBF"/>
+              <w:bottom w:val="single" w:sz="4" w:color="BFBFBF"/>
+              <w:right w:val="single" w:sz="4" w:color="BFBFBF"/>
+            </w:tcBorders>
+          </w:tcPr>
+          <w:p>
+            <w:pPr>
+              <w:spacing w:before="40" w:after="40"/>
+            </w:pPr>
+            <w:r/>
+            <w:r>
+              <w:rPr>
+                <w:rFonts w:ascii="Calibri" w:hAnsi="Calibri" w:eastAsia="Calibri"/>
+                <w:b w:val="0"/>
+                <w:i w:val="0"/>
+                <w:color w:val="333333"/>
+                <w:sz w:val="16"/>
+              </w:rPr>
+              <w:t>Process several images one after another</w:t>
+            </w:r>
+          </w:p>
+        </w:tc>
+        <w:tc>
+          <w:tcPr>
+            <w:shd w:fill="E2EFDA" w:val="clear"/>
+            <w:tcBorders>
+              <w:top w:val="single" w:sz="4" w:color="BFBFBF"/>
+              <w:left w:val="single" w:sz="4" w:color="BFBFBF"/>
+              <w:bottom w:val="single" w:sz="4" w:color="BFBFBF"/>
+              <w:right w:val="single" w:sz="4" w:color="BFBFBF"/>
+            </w:tcBorders>
+          </w:tcPr>
+          <w:p>
+            <w:pPr>
+              <w:spacing w:before="40" w:after="40"/>
+            </w:pPr>
+            <w:r/>
+            <w:r>
+              <w:rPr>
+                <w:rFonts w:ascii="Calibri" w:hAnsi="Calibri" w:eastAsia="Calibri"/>
+                <w:b w:val="0"/>
+                <w:i w:val="0"/>
+                <w:color w:val="333333"/>
+                <w:sz w:val="16"/>
+              </w:rPr>
+              <w:t>App stays usable; no progressive freeze/crash</w:t>
+            </w:r>
+          </w:p>
+        </w:tc>
+        <w:tc>
+          <w:tcPr>
+            <w:shd w:fill="E2EFDA" w:val="clear"/>
+            <w:tcBorders>
+              <w:top w:val="single" w:sz="4" w:color="BFBFBF"/>
+              <w:left w:val="single" w:sz="4" w:color="BFBFBF"/>
+              <w:bottom w:val="single" w:sz="4" w:color="BFBFBF"/>
+              <w:right w:val="single" w:sz="4" w:color="BFBFBF"/>
+            </w:tcBorders>
+          </w:tcPr>
           <w:sdt>
             <w:sdtPr>
               <w:alias w:val="Result"/>
               <w:tag w:val="result_status"/>
-              <w:id w:val="31008"/>
+              <w:id w:val="40003"/>
               <w:dropDownList>
                 <w:listItem w:displayText="Not Executed" w:value="Not Executed"/>
                 <w:listItem w:displayText="Pass" w:value="Pass"/>
@@ -12783,9 +13162,9 @@
                 <w:r>
                   <w:rPr>
                     <w:sz w:val="16"/>
-                    <w:color w:val="666666"/>
+                    <w:color w:val="548235"/>
                   </w:rPr>
-                  <w:t>Not Executed</w:t>
+                  <w:t>Pass</w:t>
                 </w:r>
               </w:p>
             </w:sdtContent>
@@ -12793,7 +13172,7 @@
         </w:tc>
         <w:tc>
           <w:tcPr>
-            <w:shd w:fill="FFFFFF" w:val="clear"/>
+            <w:shd w:fill="E2EFDA" w:val="clear"/>
             <w:tcBorders>
               <w:top w:val="single" w:sz="4" w:color="BFBFBF"/>
               <w:left w:val="single" w:sz="4" w:color="BFBFBF"/>
@@ -12996,59 +13375,7 @@
         </w:tc>
         <w:tc>
           <w:tcPr>
-            <w:shd w:val="clear" w:fill="FFFFFF"/>
-          </w:tcPr>
-          <w:p>
-            <w:r>
-              <w:rPr>
-                <w:sz w:val="15"/>
-              </w:rPr>
-              <w:t xml:space="preserve">Single-photo remove feels responsive</w:t>
-            </w:r>
-          </w:p>
-        </w:tc>
-        <w:tc>
-          <w:tcPr>
-            <w:shd w:val="clear" w:fill="FFFFFF"/>
-          </w:tcPr>
-          <w:p>
-            <w:r>
-              <w:rPr>
-                <w:sz w:val="15"/>
-              </w:rPr>
-              <w:t xml:space="preserve">Performance</w:t>
-            </w:r>
-          </w:p>
-        </w:tc>
-        <w:tc>
-          <w:tcPr>
-            <w:shd w:val="clear" w:fill="FFFFFF"/>
-          </w:tcPr>
-          <w:p>
-            <w:r>
-              <w:rPr>
-                <w:sz w:val="15"/>
-              </w:rPr>
-              <w:t xml:space="preserve">Background Remove on a normal gallery photo</w:t>
-            </w:r>
-          </w:p>
-        </w:tc>
-        <w:tc>
-          <w:tcPr>
-            <w:shd w:val="clear" w:fill="FFFFFF"/>
-          </w:tcPr>
-          <w:p>
-            <w:r>
-              <w:rPr>
-                <w:sz w:val="15"/>
-              </w:rPr>
-              <w:t xml:space="preserve">Progress shown; result without long hang</w:t>
-            </w:r>
-          </w:p>
-        </w:tc>
-        <w:tc>
-          <w:tcPr>
-            <w:shd w:fill="FFFFFF" w:val="clear"/>
+            <w:shd w:fill="E2EFDA" w:val="clear"/>
             <w:tcBorders>
               <w:top w:val="single" w:sz="4" w:color="BFBFBF"/>
               <w:left w:val="single" w:sz="4" w:color="BFBFBF"/>
@@ -13056,11 +13383,105 @@
               <w:right w:val="single" w:sz="4" w:color="BFBFBF"/>
             </w:tcBorders>
           </w:tcPr>
+          <w:p>
+            <w:pPr>
+              <w:spacing w:before="40" w:after="40"/>
+            </w:pPr>
+            <w:r/>
+            <w:r>
+              <w:rPr>
+                <w:rFonts w:ascii="Calibri" w:hAnsi="Calibri" w:eastAsia="Calibri"/>
+                <w:b w:val="0"/>
+                <w:i w:val="0"/>
+                <w:color w:val="333333"/>
+                <w:sz w:val="16"/>
+              </w:rPr>
+              <w:t>Single-photo remove feels responsive</w:t>
+            </w:r>
+          </w:p>
+        </w:tc>
+        <w:tc>
+          <w:tcPr>
+            <w:shd w:val="clear" w:fill="FFFFFF"/>
+          </w:tcPr>
+          <w:p>
+            <w:r>
+              <w:rPr>
+                <w:sz w:val="15"/>
+              </w:rPr>
+              <w:t xml:space="preserve">Performance</w:t>
+            </w:r>
+          </w:p>
+        </w:tc>
+        <w:tc>
+          <w:tcPr>
+            <w:shd w:fill="E2EFDA" w:val="clear"/>
+            <w:tcBorders>
+              <w:top w:val="single" w:sz="4" w:color="BFBFBF"/>
+              <w:left w:val="single" w:sz="4" w:color="BFBFBF"/>
+              <w:bottom w:val="single" w:sz="4" w:color="BFBFBF"/>
+              <w:right w:val="single" w:sz="4" w:color="BFBFBF"/>
+            </w:tcBorders>
+          </w:tcPr>
+          <w:p>
+            <w:pPr>
+              <w:spacing w:before="40" w:after="40"/>
+            </w:pPr>
+            <w:r/>
+            <w:r>
+              <w:rPr>
+                <w:rFonts w:ascii="Calibri" w:hAnsi="Calibri" w:eastAsia="Calibri"/>
+                <w:b w:val="0"/>
+                <w:i w:val="0"/>
+                <w:color w:val="333333"/>
+                <w:sz w:val="16"/>
+              </w:rPr>
+              <w:t>Background Remove on a normal gallery photo</w:t>
+            </w:r>
+          </w:p>
+        </w:tc>
+        <w:tc>
+          <w:tcPr>
+            <w:shd w:fill="E2EFDA" w:val="clear"/>
+            <w:tcBorders>
+              <w:top w:val="single" w:sz="4" w:color="BFBFBF"/>
+              <w:left w:val="single" w:sz="4" w:color="BFBFBF"/>
+              <w:bottom w:val="single" w:sz="4" w:color="BFBFBF"/>
+              <w:right w:val="single" w:sz="4" w:color="BFBFBF"/>
+            </w:tcBorders>
+          </w:tcPr>
+          <w:p>
+            <w:pPr>
+              <w:spacing w:before="40" w:after="40"/>
+            </w:pPr>
+            <w:r/>
+            <w:r>
+              <w:rPr>
+                <w:rFonts w:ascii="Calibri" w:hAnsi="Calibri" w:eastAsia="Calibri"/>
+                <w:b w:val="0"/>
+                <w:i w:val="0"/>
+                <w:color w:val="333333"/>
+                <w:sz w:val="16"/>
+              </w:rPr>
+              <w:t>Progress shown; result without long hang</w:t>
+            </w:r>
+          </w:p>
+        </w:tc>
+        <w:tc>
+          <w:tcPr>
+            <w:shd w:fill="E2EFDA" w:val="clear"/>
+            <w:tcBorders>
+              <w:top w:val="single" w:sz="4" w:color="BFBFBF"/>
+              <w:left w:val="single" w:sz="4" w:color="BFBFBF"/>
+              <w:bottom w:val="single" w:sz="4" w:color="BFBFBF"/>
+              <w:right w:val="single" w:sz="4" w:color="BFBFBF"/>
+            </w:tcBorders>
+          </w:tcPr>
           <w:sdt>
             <w:sdtPr>
               <w:alias w:val="Result"/>
               <w:tag w:val="result_status"/>
-              <w:id w:val="31009"/>
+              <w:id w:val="40004"/>
               <w:dropDownList>
                 <w:listItem w:displayText="Not Executed" w:value="Not Executed"/>
                 <w:listItem w:displayText="Pass" w:value="Pass"/>
@@ -13076,9 +13497,9 @@
                 <w:r>
                   <w:rPr>
                     <w:sz w:val="16"/>
-                    <w:color w:val="666666"/>
+                    <w:color w:val="548235"/>
                   </w:rPr>
-                  <w:t>Not Executed</w:t>
+                  <w:t>Pass</w:t>
                 </w:r>
               </w:p>
             </w:sdtContent>
@@ -13086,7 +13507,7 @@
         </w:tc>
         <w:tc>
           <w:tcPr>
-            <w:shd w:fill="FFFFFF" w:val="clear"/>
+            <w:shd w:fill="E2EFDA" w:val="clear"/>
             <w:tcBorders>
               <w:top w:val="single" w:sz="4" w:color="BFBFBF"/>
               <w:left w:val="single" w:sz="4" w:color="BFBFBF"/>
@@ -13262,59 +13683,7 @@
         </w:tc>
         <w:tc>
           <w:tcPr>
-            <w:shd w:val="clear" w:fill="FFFFFF"/>
-          </w:tcPr>
-          <w:p>
-            <w:r>
-              <w:rPr>
-                <w:sz w:val="15"/>
-              </w:rPr>
-              <w:t xml:space="preserve">Weak network behavior</w:t>
-            </w:r>
-          </w:p>
-        </w:tc>
-        <w:tc>
-          <w:tcPr>
-            <w:shd w:val="clear" w:fill="FFFFFF"/>
-          </w:tcPr>
-          <w:p>
-            <w:r>
-              <w:rPr>
-                <w:sz w:val="15"/>
-              </w:rPr>
-              <w:t xml:space="preserve">Performance, Stability</w:t>
-            </w:r>
-          </w:p>
-        </w:tc>
-        <w:tc>
-          <w:tcPr>
-            <w:shd w:val="clear" w:fill="FFFFFF"/>
-          </w:tcPr>
-          <w:p>
-            <w:r>
-              <w:rPr>
-                <w:sz w:val="15"/>
-              </w:rPr>
-              <w:t xml:space="preserve">Poor Wi-Fi / mobile data → process</w:t>
-            </w:r>
-          </w:p>
-        </w:tc>
-        <w:tc>
-          <w:tcPr>
-            <w:shd w:val="clear" w:fill="FFFFFF"/>
-          </w:tcPr>
-          <w:p>
-            <w:r>
-              <w:rPr>
-                <w:sz w:val="15"/>
-              </w:rPr>
-              <w:t xml:space="preserve">Wait/retry or clear error; no silent fail</w:t>
-            </w:r>
-          </w:p>
-        </w:tc>
-        <w:tc>
-          <w:tcPr>
-            <w:shd w:fill="FFFFFF" w:val="clear"/>
+            <w:shd w:fill="E2EFDA" w:val="clear"/>
             <w:tcBorders>
               <w:top w:val="single" w:sz="4" w:color="BFBFBF"/>
               <w:left w:val="single" w:sz="4" w:color="BFBFBF"/>
@@ -13322,11 +13691,119 @@
               <w:right w:val="single" w:sz="4" w:color="BFBFBF"/>
             </w:tcBorders>
           </w:tcPr>
+          <w:p>
+            <w:pPr>
+              <w:spacing w:before="40" w:after="40"/>
+            </w:pPr>
+            <w:r/>
+            <w:r>
+              <w:rPr>
+                <w:rFonts w:ascii="Calibri" w:hAnsi="Calibri" w:eastAsia="Calibri"/>
+                <w:b w:val="0"/>
+                <w:i w:val="0"/>
+                <w:color w:val="333333"/>
+                <w:sz w:val="16"/>
+              </w:rPr>
+              <w:t>Weak network behavior</w:t>
+            </w:r>
+          </w:p>
+        </w:tc>
+        <w:tc>
+          <w:tcPr>
+            <w:shd w:fill="E2EFDA" w:val="clear"/>
+            <w:tcBorders>
+              <w:top w:val="single" w:sz="4" w:color="BFBFBF"/>
+              <w:left w:val="single" w:sz="4" w:color="BFBFBF"/>
+              <w:bottom w:val="single" w:sz="4" w:color="BFBFBF"/>
+              <w:right w:val="single" w:sz="4" w:color="BFBFBF"/>
+            </w:tcBorders>
+          </w:tcPr>
+          <w:p>
+            <w:pPr>
+              <w:spacing w:before="40" w:after="40"/>
+            </w:pPr>
+            <w:r/>
+            <w:r>
+              <w:rPr>
+                <w:rFonts w:ascii="Calibri" w:hAnsi="Calibri" w:eastAsia="Calibri"/>
+                <w:b w:val="0"/>
+                <w:i w:val="0"/>
+                <w:color w:val="333333"/>
+                <w:sz w:val="16"/>
+              </w:rPr>
+              <w:t>Performance, Stability, Usability</w:t>
+            </w:r>
+          </w:p>
+        </w:tc>
+        <w:tc>
+          <w:tcPr>
+            <w:shd w:fill="E2EFDA" w:val="clear"/>
+            <w:tcBorders>
+              <w:top w:val="single" w:sz="4" w:color="BFBFBF"/>
+              <w:left w:val="single" w:sz="4" w:color="BFBFBF"/>
+              <w:bottom w:val="single" w:sz="4" w:color="BFBFBF"/>
+              <w:right w:val="single" w:sz="4" w:color="BFBFBF"/>
+            </w:tcBorders>
+          </w:tcPr>
+          <w:p>
+            <w:pPr>
+              <w:spacing w:before="40" w:after="40"/>
+            </w:pPr>
+            <w:r/>
+            <w:r>
+              <w:rPr>
+                <w:rFonts w:ascii="Calibri" w:hAnsi="Calibri" w:eastAsia="Calibri"/>
+                <w:b w:val="0"/>
+                <w:i w:val="0"/>
+                <w:color w:val="333333"/>
+                <w:sz w:val="16"/>
+              </w:rPr>
+              <w:t>Poor network → process → if fail, confirm retry</w:t>
+            </w:r>
+          </w:p>
+        </w:tc>
+        <w:tc>
+          <w:tcPr>
+            <w:shd w:fill="E2EFDA" w:val="clear"/>
+            <w:tcBorders>
+              <w:top w:val="single" w:sz="4" w:color="BFBFBF"/>
+              <w:left w:val="single" w:sz="4" w:color="BFBFBF"/>
+              <w:bottom w:val="single" w:sz="4" w:color="BFBFBF"/>
+              <w:right w:val="single" w:sz="4" w:color="BFBFBF"/>
+            </w:tcBorders>
+          </w:tcPr>
+          <w:p>
+            <w:pPr>
+              <w:spacing w:before="40" w:after="40"/>
+            </w:pPr>
+            <w:r/>
+            <w:r>
+              <w:rPr>
+                <w:rFonts w:ascii="Calibri" w:hAnsi="Calibri" w:eastAsia="Calibri"/>
+                <w:b w:val="0"/>
+                <w:i w:val="0"/>
+                <w:color w:val="333333"/>
+                <w:sz w:val="16"/>
+              </w:rPr>
+              <w:t>Shows error (e.g. something went wrong), allows retry; after repeated failure (~1 min window) falls back to dashboard</w:t>
+            </w:r>
+          </w:p>
+        </w:tc>
+        <w:tc>
+          <w:tcPr>
+            <w:shd w:fill="E2EFDA" w:val="clear"/>
+            <w:tcBorders>
+              <w:top w:val="single" w:sz="4" w:color="BFBFBF"/>
+              <w:left w:val="single" w:sz="4" w:color="BFBFBF"/>
+              <w:bottom w:val="single" w:sz="4" w:color="BFBFBF"/>
+              <w:right w:val="single" w:sz="4" w:color="BFBFBF"/>
+            </w:tcBorders>
+          </w:tcPr>
           <w:sdt>
             <w:sdtPr>
               <w:alias w:val="Result"/>
               <w:tag w:val="result_status"/>
-              <w:id w:val="31011"/>
+              <w:id w:val="40005"/>
               <w:dropDownList>
                 <w:listItem w:displayText="Not Executed" w:value="Not Executed"/>
                 <w:listItem w:displayText="Pass" w:value="Pass"/>
@@ -13342,9 +13819,9 @@
                 <w:r>
                   <w:rPr>
                     <w:sz w:val="16"/>
-                    <w:color w:val="666666"/>
+                    <w:color w:val="548235"/>
                   </w:rPr>
-                  <w:t>Not Executed</w:t>
+                  <w:t>Pass</w:t>
                 </w:r>
               </w:p>
             </w:sdtContent>
@@ -13352,7 +13829,7 @@
         </w:tc>
         <w:tc>
           <w:tcPr>
-            <w:shd w:fill="FFFFFF" w:val="clear"/>
+            <w:shd w:fill="E2EFDA" w:val="clear"/>
             <w:tcBorders>
               <w:top w:val="single" w:sz="4" w:color="BFBFBF"/>
               <w:left w:val="single" w:sz="4" w:color="BFBFBF"/>
@@ -13555,59 +14032,7 @@
         </w:tc>
         <w:tc>
           <w:tcPr>
-            <w:shd w:val="clear" w:fill="FFFFFF"/>
-          </w:tcPr>
-          <w:p>
-            <w:r>
-              <w:rPr>
-                <w:sz w:val="15"/>
-              </w:rPr>
-              <w:t xml:space="preserve">Homepage modules easy to find</w:t>
-            </w:r>
-          </w:p>
-        </w:tc>
-        <w:tc>
-          <w:tcPr>
-            <w:shd w:val="clear" w:fill="FFFFFF"/>
-          </w:tcPr>
-          <w:p>
-            <w:r>
-              <w:rPr>
-                <w:sz w:val="15"/>
-              </w:rPr>
-              <w:t xml:space="preserve">Usability</w:t>
-            </w:r>
-          </w:p>
-        </w:tc>
-        <w:tc>
-          <w:tcPr>
-            <w:shd w:val="clear" w:fill="FFFFFF"/>
-          </w:tcPr>
-          <w:p>
-            <w:r>
-              <w:rPr>
-                <w:sz w:val="15"/>
-              </w:rPr>
-              <w:t xml:space="preserve">Open app Homepage</w:t>
-            </w:r>
-          </w:p>
-        </w:tc>
-        <w:tc>
-          <w:tcPr>
-            <w:shd w:val="clear" w:fill="FFFFFF"/>
-          </w:tcPr>
-          <w:p>
-            <w:r>
-              <w:rPr>
-                <w:sz w:val="15"/>
-              </w:rPr>
-              <w:t xml:space="preserve">Background Remove and Batch Remover are clear</w:t>
-            </w:r>
-          </w:p>
-        </w:tc>
-        <w:tc>
-          <w:tcPr>
-            <w:shd w:fill="FFFFFF" w:val="clear"/>
+            <w:shd w:fill="E2EFDA" w:val="clear"/>
             <w:tcBorders>
               <w:top w:val="single" w:sz="4" w:color="BFBFBF"/>
               <w:left w:val="single" w:sz="4" w:color="BFBFBF"/>
@@ -13615,11 +14040,105 @@
               <w:right w:val="single" w:sz="4" w:color="BFBFBF"/>
             </w:tcBorders>
           </w:tcPr>
+          <w:p>
+            <w:pPr>
+              <w:spacing w:before="40" w:after="40"/>
+            </w:pPr>
+            <w:r/>
+            <w:r>
+              <w:rPr>
+                <w:rFonts w:ascii="Calibri" w:hAnsi="Calibri" w:eastAsia="Calibri"/>
+                <w:b w:val="0"/>
+                <w:i w:val="0"/>
+                <w:color w:val="333333"/>
+                <w:sz w:val="16"/>
+              </w:rPr>
+              <w:t>Homepage modules easy to find</w:t>
+            </w:r>
+          </w:p>
+        </w:tc>
+        <w:tc>
+          <w:tcPr>
+            <w:shd w:val="clear" w:fill="FFFFFF"/>
+          </w:tcPr>
+          <w:p>
+            <w:r>
+              <w:rPr>
+                <w:sz w:val="15"/>
+              </w:rPr>
+              <w:t xml:space="preserve">Usability</w:t>
+            </w:r>
+          </w:p>
+        </w:tc>
+        <w:tc>
+          <w:tcPr>
+            <w:shd w:fill="E2EFDA" w:val="clear"/>
+            <w:tcBorders>
+              <w:top w:val="single" w:sz="4" w:color="BFBFBF"/>
+              <w:left w:val="single" w:sz="4" w:color="BFBFBF"/>
+              <w:bottom w:val="single" w:sz="4" w:color="BFBFBF"/>
+              <w:right w:val="single" w:sz="4" w:color="BFBFBF"/>
+            </w:tcBorders>
+          </w:tcPr>
+          <w:p>
+            <w:pPr>
+              <w:spacing w:before="40" w:after="40"/>
+            </w:pPr>
+            <w:r/>
+            <w:r>
+              <w:rPr>
+                <w:rFonts w:ascii="Calibri" w:hAnsi="Calibri" w:eastAsia="Calibri"/>
+                <w:b w:val="0"/>
+                <w:i w:val="0"/>
+                <w:color w:val="333333"/>
+                <w:sz w:val="16"/>
+              </w:rPr>
+              <w:t>Open app Homepage</w:t>
+            </w:r>
+          </w:p>
+        </w:tc>
+        <w:tc>
+          <w:tcPr>
+            <w:shd w:fill="E2EFDA" w:val="clear"/>
+            <w:tcBorders>
+              <w:top w:val="single" w:sz="4" w:color="BFBFBF"/>
+              <w:left w:val="single" w:sz="4" w:color="BFBFBF"/>
+              <w:bottom w:val="single" w:sz="4" w:color="BFBFBF"/>
+              <w:right w:val="single" w:sz="4" w:color="BFBFBF"/>
+            </w:tcBorders>
+          </w:tcPr>
+          <w:p>
+            <w:pPr>
+              <w:spacing w:before="40" w:after="40"/>
+            </w:pPr>
+            <w:r/>
+            <w:r>
+              <w:rPr>
+                <w:rFonts w:ascii="Calibri" w:hAnsi="Calibri" w:eastAsia="Calibri"/>
+                <w:b w:val="0"/>
+                <w:i w:val="0"/>
+                <w:color w:val="333333"/>
+                <w:sz w:val="16"/>
+              </w:rPr>
+              <w:t>Background Remove and Batch Remover are clear entry points</w:t>
+            </w:r>
+          </w:p>
+        </w:tc>
+        <w:tc>
+          <w:tcPr>
+            <w:shd w:fill="E2EFDA" w:val="clear"/>
+            <w:tcBorders>
+              <w:top w:val="single" w:sz="4" w:color="BFBFBF"/>
+              <w:left w:val="single" w:sz="4" w:color="BFBFBF"/>
+              <w:bottom w:val="single" w:sz="4" w:color="BFBFBF"/>
+              <w:right w:val="single" w:sz="4" w:color="BFBFBF"/>
+            </w:tcBorders>
+          </w:tcPr>
           <w:sdt>
             <w:sdtPr>
               <w:alias w:val="Result"/>
               <w:tag w:val="result_status"/>
-              <w:id w:val="31012"/>
+              <w:id w:val="40006"/>
               <w:dropDownList>
                 <w:listItem w:displayText="Not Executed" w:value="Not Executed"/>
                 <w:listItem w:displayText="Pass" w:value="Pass"/>
@@ -13635,9 +14154,9 @@
                 <w:r>
                   <w:rPr>
                     <w:sz w:val="16"/>
-                    <w:color w:val="666666"/>
+                    <w:color w:val="548235"/>
                   </w:rPr>
-                  <w:t>Not Executed</w:t>
+                  <w:t>Pass</w:t>
                 </w:r>
               </w:p>
             </w:sdtContent>
@@ -13645,7 +14164,7 @@
         </w:tc>
         <w:tc>
           <w:tcPr>
-            <w:shd w:fill="FFFFFF" w:val="clear"/>
+            <w:shd w:fill="E2EFDA" w:val="clear"/>
             <w:tcBorders>
               <w:top w:val="single" w:sz="4" w:color="BFBFBF"/>
               <w:left w:val="single" w:sz="4" w:color="BFBFBF"/>
@@ -13688,59 +14207,7 @@
         </w:tc>
         <w:tc>
           <w:tcPr>
-            <w:shd w:val="clear" w:fill="F2F2F2"/>
-          </w:tcPr>
-          <w:p>
-            <w:r>
-              <w:rPr>
-                <w:sz w:val="15"/>
-              </w:rPr>
-              <w:t xml:space="preserve">Checkerboard shows transparency</w:t>
-            </w:r>
-          </w:p>
-        </w:tc>
-        <w:tc>
-          <w:tcPr>
-            <w:shd w:val="clear" w:fill="F2F2F2"/>
-          </w:tcPr>
-          <w:p>
-            <w:r>
-              <w:rPr>
-                <w:sz w:val="15"/>
-              </w:rPr>
-              <w:t xml:space="preserve">Usability</w:t>
-            </w:r>
-          </w:p>
-        </w:tc>
-        <w:tc>
-          <w:tcPr>
-            <w:shd w:val="clear" w:fill="F2F2F2"/>
-          </w:tcPr>
-          <w:p>
-            <w:r>
-              <w:rPr>
-                <w:sz w:val="15"/>
-              </w:rPr>
-              <w:t xml:space="preserve">After successful remove in primary editor</w:t>
-            </w:r>
-          </w:p>
-        </w:tc>
-        <w:tc>
-          <w:tcPr>
-            <w:shd w:val="clear" w:fill="F2F2F2"/>
-          </w:tcPr>
-          <w:p>
-            <w:r>
-              <w:rPr>
-                <w:sz w:val="15"/>
-              </w:rPr>
-              <w:t xml:space="preserve">Cleared area shows checkerboard or clear transparent cue</w:t>
-            </w:r>
-          </w:p>
-        </w:tc>
-        <w:tc>
-          <w:tcPr>
-            <w:shd w:fill="FFFFFF" w:val="clear"/>
+            <w:shd w:fill="E2EFDA" w:val="clear"/>
             <w:tcBorders>
               <w:top w:val="single" w:sz="4" w:color="BFBFBF"/>
               <w:left w:val="single" w:sz="4" w:color="BFBFBF"/>
@@ -13748,11 +14215,105 @@
               <w:right w:val="single" w:sz="4" w:color="BFBFBF"/>
             </w:tcBorders>
           </w:tcPr>
+          <w:p>
+            <w:pPr>
+              <w:spacing w:before="40" w:after="40"/>
+            </w:pPr>
+            <w:r/>
+            <w:r>
+              <w:rPr>
+                <w:rFonts w:ascii="Calibri" w:hAnsi="Calibri" w:eastAsia="Calibri"/>
+                <w:b w:val="0"/>
+                <w:i w:val="0"/>
+                <w:color w:val="333333"/>
+                <w:sz w:val="16"/>
+              </w:rPr>
+              <w:t>Checkerboard shows transparency</w:t>
+            </w:r>
+          </w:p>
+        </w:tc>
+        <w:tc>
+          <w:tcPr>
+            <w:shd w:val="clear" w:fill="F2F2F2"/>
+          </w:tcPr>
+          <w:p>
+            <w:r>
+              <w:rPr>
+                <w:sz w:val="15"/>
+              </w:rPr>
+              <w:t xml:space="preserve">Usability</w:t>
+            </w:r>
+          </w:p>
+        </w:tc>
+        <w:tc>
+          <w:tcPr>
+            <w:shd w:fill="E2EFDA" w:val="clear"/>
+            <w:tcBorders>
+              <w:top w:val="single" w:sz="4" w:color="BFBFBF"/>
+              <w:left w:val="single" w:sz="4" w:color="BFBFBF"/>
+              <w:bottom w:val="single" w:sz="4" w:color="BFBFBF"/>
+              <w:right w:val="single" w:sz="4" w:color="BFBFBF"/>
+            </w:tcBorders>
+          </w:tcPr>
+          <w:p>
+            <w:pPr>
+              <w:spacing w:before="40" w:after="40"/>
+            </w:pPr>
+            <w:r/>
+            <w:r>
+              <w:rPr>
+                <w:rFonts w:ascii="Calibri" w:hAnsi="Calibri" w:eastAsia="Calibri"/>
+                <w:b w:val="0"/>
+                <w:i w:val="0"/>
+                <w:color w:val="333333"/>
+                <w:sz w:val="16"/>
+              </w:rPr>
+              <w:t>After successful remove in primary editor</w:t>
+            </w:r>
+          </w:p>
+        </w:tc>
+        <w:tc>
+          <w:tcPr>
+            <w:shd w:fill="E2EFDA" w:val="clear"/>
+            <w:tcBorders>
+              <w:top w:val="single" w:sz="4" w:color="BFBFBF"/>
+              <w:left w:val="single" w:sz="4" w:color="BFBFBF"/>
+              <w:bottom w:val="single" w:sz="4" w:color="BFBFBF"/>
+              <w:right w:val="single" w:sz="4" w:color="BFBFBF"/>
+            </w:tcBorders>
+          </w:tcPr>
+          <w:p>
+            <w:pPr>
+              <w:spacing w:before="40" w:after="40"/>
+            </w:pPr>
+            <w:r/>
+            <w:r>
+              <w:rPr>
+                <w:rFonts w:ascii="Calibri" w:hAnsi="Calibri" w:eastAsia="Calibri"/>
+                <w:b w:val="0"/>
+                <w:i w:val="0"/>
+                <w:color w:val="333333"/>
+                <w:sz w:val="16"/>
+              </w:rPr>
+              <w:t>Cleared area shows checkerboard / clear transparent cue</w:t>
+            </w:r>
+          </w:p>
+        </w:tc>
+        <w:tc>
+          <w:tcPr>
+            <w:shd w:fill="E2EFDA" w:val="clear"/>
+            <w:tcBorders>
+              <w:top w:val="single" w:sz="4" w:color="BFBFBF"/>
+              <w:left w:val="single" w:sz="4" w:color="BFBFBF"/>
+              <w:bottom w:val="single" w:sz="4" w:color="BFBFBF"/>
+              <w:right w:val="single" w:sz="4" w:color="BFBFBF"/>
+            </w:tcBorders>
+          </w:tcPr>
           <w:sdt>
             <w:sdtPr>
               <w:alias w:val="Result"/>
               <w:tag w:val="result_status"/>
-              <w:id w:val="31013"/>
+              <w:id w:val="40007"/>
               <w:dropDownList>
                 <w:listItem w:displayText="Not Executed" w:value="Not Executed"/>
                 <w:listItem w:displayText="Pass" w:value="Pass"/>
@@ -13768,9 +14329,9 @@
                 <w:r>
                   <w:rPr>
                     <w:sz w:val="16"/>
-                    <w:color w:val="666666"/>
+                    <w:color w:val="548235"/>
                   </w:rPr>
-                  <w:t>Not Executed</w:t>
+                  <w:t>Pass</w:t>
                 </w:r>
               </w:p>
             </w:sdtContent>
@@ -13778,7 +14339,7 @@
         </w:tc>
         <w:tc>
           <w:tcPr>
-            <w:shd w:fill="FFFFFF" w:val="clear"/>
+            <w:shd w:fill="E2EFDA" w:val="clear"/>
             <w:tcBorders>
               <w:top w:val="single" w:sz="4" w:color="BFBFBF"/>
               <w:left w:val="single" w:sz="4" w:color="BFBFBF"/>
@@ -13821,59 +14382,7 @@
         </w:tc>
         <w:tc>
           <w:tcPr>
-            <w:shd w:val="clear" w:fill="FFFFFF"/>
-          </w:tcPr>
-          <w:p>
-            <w:r>
-              <w:rPr>
-                <w:sz w:val="15"/>
-              </w:rPr>
-              <w:t xml:space="preserve">Pinch zoom / move on canvas</w:t>
-            </w:r>
-          </w:p>
-        </w:tc>
-        <w:tc>
-          <w:tcPr>
-            <w:shd w:val="clear" w:fill="FFFFFF"/>
-          </w:tcPr>
-          <w:p>
-            <w:r>
-              <w:rPr>
-                <w:sz w:val="15"/>
-              </w:rPr>
-              <w:t xml:space="preserve">Usability</w:t>
-            </w:r>
-          </w:p>
-        </w:tc>
-        <w:tc>
-          <w:tcPr>
-            <w:shd w:val="clear" w:fill="FFFFFF"/>
-          </w:tcPr>
-          <w:p>
-            <w:r>
-              <w:rPr>
-                <w:sz w:val="15"/>
-              </w:rPr>
-              <w:t xml:space="preserve">Zoom and move subject in editor</w:t>
-            </w:r>
-          </w:p>
-        </w:tc>
-        <w:tc>
-          <w:tcPr>
-            <w:shd w:val="clear" w:fill="FFFFFF"/>
-          </w:tcPr>
-          <w:p>
-            <w:r>
-              <w:rPr>
-                <w:sz w:val="15"/>
-              </w:rPr>
-              <w:t xml:space="preserve">Canvas responds well enough for editing</w:t>
-            </w:r>
-          </w:p>
-        </w:tc>
-        <w:tc>
-          <w:tcPr>
-            <w:shd w:fill="FFFFFF" w:val="clear"/>
+            <w:shd w:fill="E2EFDA" w:val="clear"/>
             <w:tcBorders>
               <w:top w:val="single" w:sz="4" w:color="BFBFBF"/>
               <w:left w:val="single" w:sz="4" w:color="BFBFBF"/>
@@ -13881,11 +14390,105 @@
               <w:right w:val="single" w:sz="4" w:color="BFBFBF"/>
             </w:tcBorders>
           </w:tcPr>
+          <w:p>
+            <w:pPr>
+              <w:spacing w:before="40" w:after="40"/>
+            </w:pPr>
+            <w:r/>
+            <w:r>
+              <w:rPr>
+                <w:rFonts w:ascii="Calibri" w:hAnsi="Calibri" w:eastAsia="Calibri"/>
+                <w:b w:val="0"/>
+                <w:i w:val="0"/>
+                <w:color w:val="333333"/>
+                <w:sz w:val="16"/>
+              </w:rPr>
+              <w:t>Pinch zoom / move on canvas</w:t>
+            </w:r>
+          </w:p>
+        </w:tc>
+        <w:tc>
+          <w:tcPr>
+            <w:shd w:val="clear" w:fill="FFFFFF"/>
+          </w:tcPr>
+          <w:p>
+            <w:r>
+              <w:rPr>
+                <w:sz w:val="15"/>
+              </w:rPr>
+              <w:t xml:space="preserve">Usability</w:t>
+            </w:r>
+          </w:p>
+        </w:tc>
+        <w:tc>
+          <w:tcPr>
+            <w:shd w:fill="E2EFDA" w:val="clear"/>
+            <w:tcBorders>
+              <w:top w:val="single" w:sz="4" w:color="BFBFBF"/>
+              <w:left w:val="single" w:sz="4" w:color="BFBFBF"/>
+              <w:bottom w:val="single" w:sz="4" w:color="BFBFBF"/>
+              <w:right w:val="single" w:sz="4" w:color="BFBFBF"/>
+            </w:tcBorders>
+          </w:tcPr>
+          <w:p>
+            <w:pPr>
+              <w:spacing w:before="40" w:after="40"/>
+            </w:pPr>
+            <w:r/>
+            <w:r>
+              <w:rPr>
+                <w:rFonts w:ascii="Calibri" w:hAnsi="Calibri" w:eastAsia="Calibri"/>
+                <w:b w:val="0"/>
+                <w:i w:val="0"/>
+                <w:color w:val="333333"/>
+                <w:sz w:val="16"/>
+              </w:rPr>
+              <w:t>Zoom and move subject in editor</w:t>
+            </w:r>
+          </w:p>
+        </w:tc>
+        <w:tc>
+          <w:tcPr>
+            <w:shd w:fill="E2EFDA" w:val="clear"/>
+            <w:tcBorders>
+              <w:top w:val="single" w:sz="4" w:color="BFBFBF"/>
+              <w:left w:val="single" w:sz="4" w:color="BFBFBF"/>
+              <w:bottom w:val="single" w:sz="4" w:color="BFBFBF"/>
+              <w:right w:val="single" w:sz="4" w:color="BFBFBF"/>
+            </w:tcBorders>
+          </w:tcPr>
+          <w:p>
+            <w:pPr>
+              <w:spacing w:before="40" w:after="40"/>
+            </w:pPr>
+            <w:r/>
+            <w:r>
+              <w:rPr>
+                <w:rFonts w:ascii="Calibri" w:hAnsi="Calibri" w:eastAsia="Calibri"/>
+                <w:b w:val="0"/>
+                <w:i w:val="0"/>
+                <w:color w:val="333333"/>
+                <w:sz w:val="16"/>
+              </w:rPr>
+              <w:t>Canvas responds well enough for editing</w:t>
+            </w:r>
+          </w:p>
+        </w:tc>
+        <w:tc>
+          <w:tcPr>
+            <w:shd w:fill="E2EFDA" w:val="clear"/>
+            <w:tcBorders>
+              <w:top w:val="single" w:sz="4" w:color="BFBFBF"/>
+              <w:left w:val="single" w:sz="4" w:color="BFBFBF"/>
+              <w:bottom w:val="single" w:sz="4" w:color="BFBFBF"/>
+              <w:right w:val="single" w:sz="4" w:color="BFBFBF"/>
+            </w:tcBorders>
+          </w:tcPr>
           <w:sdt>
             <w:sdtPr>
               <w:alias w:val="Result"/>
               <w:tag w:val="result_status"/>
-              <w:id w:val="31014"/>
+              <w:id w:val="40008"/>
               <w:dropDownList>
                 <w:listItem w:displayText="Not Executed" w:value="Not Executed"/>
                 <w:listItem w:displayText="Pass" w:value="Pass"/>
@@ -13901,9 +14504,9 @@
                 <w:r>
                   <w:rPr>
                     <w:sz w:val="16"/>
-                    <w:color w:val="666666"/>
+                    <w:color w:val="548235"/>
                   </w:rPr>
-                  <w:t>Not Executed</w:t>
+                  <w:t>Pass</w:t>
                 </w:r>
               </w:p>
             </w:sdtContent>
@@ -13911,7 +14514,7 @@
         </w:tc>
         <w:tc>
           <w:tcPr>
-            <w:shd w:fill="FFFFFF" w:val="clear"/>
+            <w:shd w:fill="E2EFDA" w:val="clear"/>
             <w:tcBorders>
               <w:top w:val="single" w:sz="4" w:color="BFBFBF"/>
               <w:left w:val="single" w:sz="4" w:color="BFBFBF"/>
@@ -14087,59 +14690,7 @@
         </w:tc>
         <w:tc>
           <w:tcPr>
-            <w:shd w:val="clear" w:fill="FFFFFF"/>
-          </w:tcPr>
-          <w:p>
-            <w:r>
-              <w:rPr>
-                <w:sz w:val="15"/>
-              </w:rPr>
-              <w:t xml:space="preserve">Loading / progress feedback</w:t>
-            </w:r>
-          </w:p>
-        </w:tc>
-        <w:tc>
-          <w:tcPr>
-            <w:shd w:val="clear" w:fill="FFFFFF"/>
-          </w:tcPr>
-          <w:p>
-            <w:r>
-              <w:rPr>
-                <w:sz w:val="15"/>
-              </w:rPr>
-              <w:t xml:space="preserve">Usability, Performance</w:t>
-            </w:r>
-          </w:p>
-        </w:tc>
-        <w:tc>
-          <w:tcPr>
-            <w:shd w:val="clear" w:fill="FFFFFF"/>
-          </w:tcPr>
-          <w:p>
-            <w:r>
-              <w:rPr>
-                <w:sz w:val="15"/>
-              </w:rPr>
-              <w:t xml:space="preserve">Start auto remove or batch process</w:t>
-            </w:r>
-          </w:p>
-        </w:tc>
-        <w:tc>
-          <w:tcPr>
-            <w:shd w:val="clear" w:fill="FFFFFF"/>
-          </w:tcPr>
-          <w:p>
-            <w:r>
-              <w:rPr>
-                <w:sz w:val="15"/>
-              </w:rPr>
-              <w:t xml:space="preserve">User can tell processing is running</w:t>
-            </w:r>
-          </w:p>
-        </w:tc>
-        <w:tc>
-          <w:tcPr>
-            <w:shd w:fill="FFFFFF" w:val="clear"/>
+            <w:shd w:fill="E2EFDA" w:val="clear"/>
             <w:tcBorders>
               <w:top w:val="single" w:sz="4" w:color="BFBFBF"/>
               <w:left w:val="single" w:sz="4" w:color="BFBFBF"/>
@@ -14147,11 +14698,105 @@
               <w:right w:val="single" w:sz="4" w:color="BFBFBF"/>
             </w:tcBorders>
           </w:tcPr>
+          <w:p>
+            <w:pPr>
+              <w:spacing w:before="40" w:after="40"/>
+            </w:pPr>
+            <w:r/>
+            <w:r>
+              <w:rPr>
+                <w:rFonts w:ascii="Calibri" w:hAnsi="Calibri" w:eastAsia="Calibri"/>
+                <w:b w:val="0"/>
+                <w:i w:val="0"/>
+                <w:color w:val="333333"/>
+                <w:sz w:val="16"/>
+              </w:rPr>
+              <w:t>Loading / progress feedback</w:t>
+            </w:r>
+          </w:p>
+        </w:tc>
+        <w:tc>
+          <w:tcPr>
+            <w:shd w:val="clear" w:fill="FFFFFF"/>
+          </w:tcPr>
+          <w:p>
+            <w:r>
+              <w:rPr>
+                <w:sz w:val="15"/>
+              </w:rPr>
+              <w:t xml:space="preserve">Usability, Performance</w:t>
+            </w:r>
+          </w:p>
+        </w:tc>
+        <w:tc>
+          <w:tcPr>
+            <w:shd w:fill="E2EFDA" w:val="clear"/>
+            <w:tcBorders>
+              <w:top w:val="single" w:sz="4" w:color="BFBFBF"/>
+              <w:left w:val="single" w:sz="4" w:color="BFBFBF"/>
+              <w:bottom w:val="single" w:sz="4" w:color="BFBFBF"/>
+              <w:right w:val="single" w:sz="4" w:color="BFBFBF"/>
+            </w:tcBorders>
+          </w:tcPr>
+          <w:p>
+            <w:pPr>
+              <w:spacing w:before="40" w:after="40"/>
+            </w:pPr>
+            <w:r/>
+            <w:r>
+              <w:rPr>
+                <w:rFonts w:ascii="Calibri" w:hAnsi="Calibri" w:eastAsia="Calibri"/>
+                <w:b w:val="0"/>
+                <w:i w:val="0"/>
+                <w:color w:val="333333"/>
+                <w:sz w:val="16"/>
+              </w:rPr>
+              <w:t>Start auto remove or batch process</w:t>
+            </w:r>
+          </w:p>
+        </w:tc>
+        <w:tc>
+          <w:tcPr>
+            <w:shd w:fill="E2EFDA" w:val="clear"/>
+            <w:tcBorders>
+              <w:top w:val="single" w:sz="4" w:color="BFBFBF"/>
+              <w:left w:val="single" w:sz="4" w:color="BFBFBF"/>
+              <w:bottom w:val="single" w:sz="4" w:color="BFBFBF"/>
+              <w:right w:val="single" w:sz="4" w:color="BFBFBF"/>
+            </w:tcBorders>
+          </w:tcPr>
+          <w:p>
+            <w:pPr>
+              <w:spacing w:before="40" w:after="40"/>
+            </w:pPr>
+            <w:r/>
+            <w:r>
+              <w:rPr>
+                <w:rFonts w:ascii="Calibri" w:hAnsi="Calibri" w:eastAsia="Calibri"/>
+                <w:b w:val="0"/>
+                <w:i w:val="0"/>
+                <w:color w:val="333333"/>
+                <w:sz w:val="16"/>
+              </w:rPr>
+              <w:t>Loading feedback is clear (sparkle/logo style animation is understandable)</w:t>
+            </w:r>
+          </w:p>
+        </w:tc>
+        <w:tc>
+          <w:tcPr>
+            <w:shd w:fill="E2EFDA" w:val="clear"/>
+            <w:tcBorders>
+              <w:top w:val="single" w:sz="4" w:color="BFBFBF"/>
+              <w:left w:val="single" w:sz="4" w:color="BFBFBF"/>
+              <w:bottom w:val="single" w:sz="4" w:color="BFBFBF"/>
+              <w:right w:val="single" w:sz="4" w:color="BFBFBF"/>
+            </w:tcBorders>
+          </w:tcPr>
           <w:sdt>
             <w:sdtPr>
               <w:alias w:val="Result"/>
               <w:tag w:val="result_status"/>
-              <w:id w:val="31016"/>
+              <w:id w:val="40009"/>
               <w:dropDownList>
                 <w:listItem w:displayText="Not Executed" w:value="Not Executed"/>
                 <w:listItem w:displayText="Pass" w:value="Pass"/>
@@ -14167,9 +14812,9 @@
                 <w:r>
                   <w:rPr>
                     <w:sz w:val="16"/>
-                    <w:color w:val="666666"/>
+                    <w:color w:val="548235"/>
                   </w:rPr>
-                  <w:t>Not Executed</w:t>
+                  <w:t>Pass</w:t>
                 </w:r>
               </w:p>
             </w:sdtContent>
@@ -14177,7 +14822,7 @@
         </w:tc>
         <w:tc>
           <w:tcPr>
-            <w:shd w:fill="FFFFFF" w:val="clear"/>
+            <w:shd w:fill="E2EFDA" w:val="clear"/>
             <w:tcBorders>
               <w:top w:val="single" w:sz="4" w:color="BFBFBF"/>
               <w:left w:val="single" w:sz="4" w:color="BFBFBF"/>
@@ -14513,59 +15158,7 @@
         </w:tc>
         <w:tc>
           <w:tcPr>
-            <w:shd w:val="clear" w:fill="FFFFFF"/>
-          </w:tcPr>
-          <w:p>
-            <w:r>
-              <w:rPr>
-                <w:sz w:val="15"/>
-              </w:rPr>
-              <w:t xml:space="preserve">Save / download completed image</w:t>
-            </w:r>
-          </w:p>
-        </w:tc>
-        <w:tc>
-          <w:tcPr>
-            <w:shd w:val="clear" w:fill="FFFFFF"/>
-          </w:tcPr>
-          <w:p>
-            <w:r>
-              <w:rPr>
-                <w:sz w:val="15"/>
-              </w:rPr>
-              <w:t xml:space="preserve">Functionality, Workflow</w:t>
-            </w:r>
-          </w:p>
-        </w:tc>
-        <w:tc>
-          <w:tcPr>
-            <w:shd w:val="clear" w:fill="FFFFFF"/>
-          </w:tcPr>
-          <w:p>
-            <w:r>
-              <w:rPr>
-                <w:sz w:val="15"/>
-              </w:rPr>
-              <w:t xml:space="preserve">Finish edit → Save</w:t>
-            </w:r>
-          </w:p>
-        </w:tc>
-        <w:tc>
-          <w:tcPr>
-            <w:shd w:val="clear" w:fill="FFFFFF"/>
-          </w:tcPr>
-          <w:p>
-            <w:r>
-              <w:rPr>
-                <w:sz w:val="15"/>
-              </w:rPr>
-              <w:t xml:space="preserve">Image saved; confirmation or visible success</w:t>
-            </w:r>
-          </w:p>
-        </w:tc>
-        <w:tc>
-          <w:tcPr>
-            <w:shd w:fill="FFFFFF" w:val="clear"/>
+            <w:shd w:fill="E2EFDA" w:val="clear"/>
             <w:tcBorders>
               <w:top w:val="single" w:sz="4" w:color="BFBFBF"/>
               <w:left w:val="single" w:sz="4" w:color="BFBFBF"/>
@@ -14573,11 +15166,105 @@
               <w:right w:val="single" w:sz="4" w:color="BFBFBF"/>
             </w:tcBorders>
           </w:tcPr>
+          <w:p>
+            <w:pPr>
+              <w:spacing w:before="40" w:after="40"/>
+            </w:pPr>
+            <w:r/>
+            <w:r>
+              <w:rPr>
+                <w:rFonts w:ascii="Calibri" w:hAnsi="Calibri" w:eastAsia="Calibri"/>
+                <w:b w:val="0"/>
+                <w:i w:val="0"/>
+                <w:color w:val="333333"/>
+                <w:sz w:val="16"/>
+              </w:rPr>
+              <w:t>Save / download completed image</w:t>
+            </w:r>
+          </w:p>
+        </w:tc>
+        <w:tc>
+          <w:tcPr>
+            <w:shd w:val="clear" w:fill="FFFFFF"/>
+          </w:tcPr>
+          <w:p>
+            <w:r>
+              <w:rPr>
+                <w:sz w:val="15"/>
+              </w:rPr>
+              <w:t xml:space="preserve">Functionality, Workflow</w:t>
+            </w:r>
+          </w:p>
+        </w:tc>
+        <w:tc>
+          <w:tcPr>
+            <w:shd w:fill="E2EFDA" w:val="clear"/>
+            <w:tcBorders>
+              <w:top w:val="single" w:sz="4" w:color="BFBFBF"/>
+              <w:left w:val="single" w:sz="4" w:color="BFBFBF"/>
+              <w:bottom w:val="single" w:sz="4" w:color="BFBFBF"/>
+              <w:right w:val="single" w:sz="4" w:color="BFBFBF"/>
+            </w:tcBorders>
+          </w:tcPr>
+          <w:p>
+            <w:pPr>
+              <w:spacing w:before="40" w:after="40"/>
+            </w:pPr>
+            <w:r/>
+            <w:r>
+              <w:rPr>
+                <w:rFonts w:ascii="Calibri" w:hAnsi="Calibri" w:eastAsia="Calibri"/>
+                <w:b w:val="0"/>
+                <w:i w:val="0"/>
+                <w:color w:val="333333"/>
+                <w:sz w:val="16"/>
+              </w:rPr>
+              <w:t>Finish edit → Save / download</w:t>
+            </w:r>
+          </w:p>
+        </w:tc>
+        <w:tc>
+          <w:tcPr>
+            <w:shd w:fill="E2EFDA" w:val="clear"/>
+            <w:tcBorders>
+              <w:top w:val="single" w:sz="4" w:color="BFBFBF"/>
+              <w:left w:val="single" w:sz="4" w:color="BFBFBF"/>
+              <w:bottom w:val="single" w:sz="4" w:color="BFBFBF"/>
+              <w:right w:val="single" w:sz="4" w:color="BFBFBF"/>
+            </w:tcBorders>
+          </w:tcPr>
+          <w:p>
+            <w:pPr>
+              <w:spacing w:before="40" w:after="40"/>
+            </w:pPr>
+            <w:r/>
+            <w:r>
+              <w:rPr>
+                <w:rFonts w:ascii="Calibri" w:hAnsi="Calibri" w:eastAsia="Calibri"/>
+                <w:b w:val="0"/>
+                <w:i w:val="0"/>
+                <w:color w:val="333333"/>
+                <w:sz w:val="16"/>
+              </w:rPr>
+              <w:t>Image is saved; confirmation or visible success</w:t>
+            </w:r>
+          </w:p>
+        </w:tc>
+        <w:tc>
+          <w:tcPr>
+            <w:shd w:fill="E2EFDA" w:val="clear"/>
+            <w:tcBorders>
+              <w:top w:val="single" w:sz="4" w:color="BFBFBF"/>
+              <w:left w:val="single" w:sz="4" w:color="BFBFBF"/>
+              <w:bottom w:val="single" w:sz="4" w:color="BFBFBF"/>
+              <w:right w:val="single" w:sz="4" w:color="BFBFBF"/>
+            </w:tcBorders>
+          </w:tcPr>
           <w:sdt>
             <w:sdtPr>
               <w:alias w:val="Result"/>
               <w:tag w:val="result_status"/>
-              <w:id w:val="31018"/>
+              <w:id w:val="40010"/>
               <w:dropDownList>
                 <w:listItem w:displayText="Not Executed" w:value="Not Executed"/>
                 <w:listItem w:displayText="Pass" w:value="Pass"/>
@@ -14593,9 +15280,9 @@
                 <w:r>
                   <w:rPr>
                     <w:sz w:val="16"/>
-                    <w:color w:val="666666"/>
+                    <w:color w:val="548235"/>
                   </w:rPr>
-                  <w:t>Not Executed</w:t>
+                  <w:t>Pass</w:t>
                 </w:r>
               </w:p>
             </w:sdtContent>
@@ -14603,7 +15290,7 @@
         </w:tc>
         <w:tc>
           <w:tcPr>
-            <w:shd w:fill="FFFFFF" w:val="clear"/>
+            <w:shd w:fill="E2EFDA" w:val="clear"/>
             <w:tcBorders>
               <w:top w:val="single" w:sz="4" w:color="BFBFBF"/>
               <w:left w:val="single" w:sz="4" w:color="BFBFBF"/>
@@ -14646,59 +15333,7 @@
         </w:tc>
         <w:tc>
           <w:tcPr>
-            <w:shd w:val="clear" w:fill="F2F2F2"/>
-          </w:tcPr>
-          <w:p>
-            <w:r>
-              <w:rPr>
-                <w:sz w:val="15"/>
-              </w:rPr>
-              <w:t xml:space="preserve">Share completed image</w:t>
-            </w:r>
-          </w:p>
-        </w:tc>
-        <w:tc>
-          <w:tcPr>
-            <w:shd w:val="clear" w:fill="F2F2F2"/>
-          </w:tcPr>
-          <w:p>
-            <w:r>
-              <w:rPr>
-                <w:sz w:val="15"/>
-              </w:rPr>
-              <w:t xml:space="preserve">Functionality</w:t>
-            </w:r>
-          </w:p>
-        </w:tc>
-        <w:tc>
-          <w:tcPr>
-            <w:shd w:val="clear" w:fill="F2F2F2"/>
-          </w:tcPr>
-          <w:p>
-            <w:r>
-              <w:rPr>
-                <w:sz w:val="15"/>
-              </w:rPr>
-              <w:t xml:space="preserve">Tap Share if available</w:t>
-            </w:r>
-          </w:p>
-        </w:tc>
-        <w:tc>
-          <w:tcPr>
-            <w:shd w:val="clear" w:fill="F2F2F2"/>
-          </w:tcPr>
-          <w:p>
-            <w:r>
-              <w:rPr>
-                <w:sz w:val="15"/>
-              </w:rPr>
-              <w:t xml:space="preserve">System share sheet opens with image</w:t>
-            </w:r>
-          </w:p>
-        </w:tc>
-        <w:tc>
-          <w:tcPr>
-            <w:shd w:fill="FFFFFF" w:val="clear"/>
+            <w:shd w:fill="E2EFDA" w:val="clear"/>
             <w:tcBorders>
               <w:top w:val="single" w:sz="4" w:color="BFBFBF"/>
               <w:left w:val="single" w:sz="4" w:color="BFBFBF"/>
@@ -14706,11 +15341,119 @@
               <w:right w:val="single" w:sz="4" w:color="BFBFBF"/>
             </w:tcBorders>
           </w:tcPr>
+          <w:p>
+            <w:pPr>
+              <w:spacing w:before="40" w:after="40"/>
+            </w:pPr>
+            <w:r/>
+            <w:r>
+              <w:rPr>
+                <w:rFonts w:ascii="Calibri" w:hAnsi="Calibri" w:eastAsia="Calibri"/>
+                <w:b w:val="0"/>
+                <w:i w:val="0"/>
+                <w:color w:val="333333"/>
+                <w:sz w:val="16"/>
+              </w:rPr>
+              <w:t>Share completed image</w:t>
+            </w:r>
+          </w:p>
+        </w:tc>
+        <w:tc>
+          <w:tcPr>
+            <w:shd w:fill="E2EFDA" w:val="clear"/>
+            <w:tcBorders>
+              <w:top w:val="single" w:sz="4" w:color="BFBFBF"/>
+              <w:left w:val="single" w:sz="4" w:color="BFBFBF"/>
+              <w:bottom w:val="single" w:sz="4" w:color="BFBFBF"/>
+              <w:right w:val="single" w:sz="4" w:color="BFBFBF"/>
+            </w:tcBorders>
+          </w:tcPr>
+          <w:p>
+            <w:pPr>
+              <w:spacing w:before="40" w:after="40"/>
+            </w:pPr>
+            <w:r/>
+            <w:r>
+              <w:rPr>
+                <w:rFonts w:ascii="Calibri" w:hAnsi="Calibri" w:eastAsia="Calibri"/>
+                <w:b w:val="0"/>
+                <w:i w:val="0"/>
+                <w:color w:val="333333"/>
+                <w:sz w:val="16"/>
+              </w:rPr>
+              <w:t>Functionality, Usability</w:t>
+            </w:r>
+          </w:p>
+        </w:tc>
+        <w:tc>
+          <w:tcPr>
+            <w:shd w:fill="E2EFDA" w:val="clear"/>
+            <w:tcBorders>
+              <w:top w:val="single" w:sz="4" w:color="BFBFBF"/>
+              <w:left w:val="single" w:sz="4" w:color="BFBFBF"/>
+              <w:bottom w:val="single" w:sz="4" w:color="BFBFBF"/>
+              <w:right w:val="single" w:sz="4" w:color="BFBFBF"/>
+            </w:tcBorders>
+          </w:tcPr>
+          <w:p>
+            <w:pPr>
+              <w:spacing w:before="40" w:after="40"/>
+            </w:pPr>
+            <w:r/>
+            <w:r>
+              <w:rPr>
+                <w:rFonts w:ascii="Calibri" w:hAnsi="Calibri" w:eastAsia="Calibri"/>
+                <w:b w:val="0"/>
+                <w:i w:val="0"/>
+                <w:color w:val="333333"/>
+                <w:sz w:val="16"/>
+              </w:rPr>
+              <w:t>Tap Share → choose target app</w:t>
+            </w:r>
+          </w:p>
+        </w:tc>
+        <w:tc>
+          <w:tcPr>
+            <w:shd w:fill="E2EFDA" w:val="clear"/>
+            <w:tcBorders>
+              <w:top w:val="single" w:sz="4" w:color="BFBFBF"/>
+              <w:left w:val="single" w:sz="4" w:color="BFBFBF"/>
+              <w:bottom w:val="single" w:sz="4" w:color="BFBFBF"/>
+              <w:right w:val="single" w:sz="4" w:color="BFBFBF"/>
+            </w:tcBorders>
+          </w:tcPr>
+          <w:p>
+            <w:pPr>
+              <w:spacing w:before="40" w:after="40"/>
+            </w:pPr>
+            <w:r/>
+            <w:r>
+              <w:rPr>
+                <w:rFonts w:ascii="Calibri" w:hAnsi="Calibri" w:eastAsia="Calibri"/>
+                <w:b w:val="0"/>
+                <w:i w:val="0"/>
+                <w:color w:val="333333"/>
+                <w:sz w:val="16"/>
+              </w:rPr>
+              <w:t>Share sheet opens; if target app is not installed, system/app handles it clearly</w:t>
+            </w:r>
+          </w:p>
+        </w:tc>
+        <w:tc>
+          <w:tcPr>
+            <w:shd w:fill="E2EFDA" w:val="clear"/>
+            <w:tcBorders>
+              <w:top w:val="single" w:sz="4" w:color="BFBFBF"/>
+              <w:left w:val="single" w:sz="4" w:color="BFBFBF"/>
+              <w:bottom w:val="single" w:sz="4" w:color="BFBFBF"/>
+              <w:right w:val="single" w:sz="4" w:color="BFBFBF"/>
+            </w:tcBorders>
+          </w:tcPr>
           <w:sdt>
             <w:sdtPr>
               <w:alias w:val="Result"/>
               <w:tag w:val="result_status"/>
-              <w:id w:val="31019"/>
+              <w:id w:val="40011"/>
               <w:dropDownList>
                 <w:listItem w:displayText="Not Executed" w:value="Not Executed"/>
                 <w:listItem w:displayText="Pass" w:value="Pass"/>
@@ -14726,9 +15469,9 @@
                 <w:r>
                   <w:rPr>
                     <w:sz w:val="16"/>
-                    <w:color w:val="666666"/>
+                    <w:color w:val="548235"/>
                   </w:rPr>
-                  <w:t>Not Executed</w:t>
+                  <w:t>Pass</w:t>
                 </w:r>
               </w:p>
             </w:sdtContent>
@@ -14736,7 +15479,7 @@
         </w:tc>
         <w:tc>
           <w:tcPr>
-            <w:shd w:fill="FFFFFF" w:val="clear"/>
+            <w:shd w:fill="E2EFDA" w:val="clear"/>
             <w:tcBorders>
               <w:top w:val="single" w:sz="4" w:color="BFBFBF"/>
               <w:left w:val="single" w:sz="4" w:color="BFBFBF"/>
@@ -14779,59 +15522,7 @@
         </w:tc>
         <w:tc>
           <w:tcPr>
-            <w:shd w:val="clear" w:fill="FFFFFF"/>
-          </w:tcPr>
-          <w:p>
-            <w:r>
-              <w:rPr>
-                <w:sz w:val="15"/>
-              </w:rPr>
-              <w:t xml:space="preserve">Saved cleared image looks correct</w:t>
-            </w:r>
-          </w:p>
-        </w:tc>
-        <w:tc>
-          <w:tcPr>
-            <w:shd w:val="clear" w:fill="FFFFFF"/>
-          </w:tcPr>
-          <w:p>
-            <w:r>
-              <w:rPr>
-                <w:sz w:val="15"/>
-              </w:rPr>
-              <w:t xml:space="preserve">Functionality</w:t>
-            </w:r>
-          </w:p>
-        </w:tc>
-        <w:tc>
-          <w:tcPr>
-            <w:shd w:val="clear" w:fill="FFFFFF"/>
-          </w:tcPr>
-          <w:p>
-            <w:r>
-              <w:rPr>
-                <w:sz w:val="15"/>
-              </w:rPr>
-              <w:t xml:space="preserve">Save cleared image and reopen from gallery/files</w:t>
-            </w:r>
-          </w:p>
-        </w:tc>
-        <w:tc>
-          <w:tcPr>
-            <w:shd w:val="clear" w:fill="FFFFFF"/>
-          </w:tcPr>
-          <w:p>
-            <w:r>
-              <w:rPr>
-                <w:sz w:val="15"/>
-              </w:rPr>
-              <w:t xml:space="preserve">Result matches what editor showed</w:t>
-            </w:r>
-          </w:p>
-        </w:tc>
-        <w:tc>
-          <w:tcPr>
-            <w:shd w:fill="FFFFFF" w:val="clear"/>
+            <w:shd w:fill="E2EFDA" w:val="clear"/>
             <w:tcBorders>
               <w:top w:val="single" w:sz="4" w:color="BFBFBF"/>
               <w:left w:val="single" w:sz="4" w:color="BFBFBF"/>
@@ -14839,11 +15530,105 @@
               <w:right w:val="single" w:sz="4" w:color="BFBFBF"/>
             </w:tcBorders>
           </w:tcPr>
+          <w:p>
+            <w:pPr>
+              <w:spacing w:before="40" w:after="40"/>
+            </w:pPr>
+            <w:r/>
+            <w:r>
+              <w:rPr>
+                <w:rFonts w:ascii="Calibri" w:hAnsi="Calibri" w:eastAsia="Calibri"/>
+                <w:b w:val="0"/>
+                <w:i w:val="0"/>
+                <w:color w:val="333333"/>
+                <w:sz w:val="16"/>
+              </w:rPr>
+              <w:t>Saved cleared image looks correct</w:t>
+            </w:r>
+          </w:p>
+        </w:tc>
+        <w:tc>
+          <w:tcPr>
+            <w:shd w:val="clear" w:fill="FFFFFF"/>
+          </w:tcPr>
+          <w:p>
+            <w:r>
+              <w:rPr>
+                <w:sz w:val="15"/>
+              </w:rPr>
+              <w:t xml:space="preserve">Functionality</w:t>
+            </w:r>
+          </w:p>
+        </w:tc>
+        <w:tc>
+          <w:tcPr>
+            <w:shd w:fill="E2EFDA" w:val="clear"/>
+            <w:tcBorders>
+              <w:top w:val="single" w:sz="4" w:color="BFBFBF"/>
+              <w:left w:val="single" w:sz="4" w:color="BFBFBF"/>
+              <w:bottom w:val="single" w:sz="4" w:color="BFBFBF"/>
+              <w:right w:val="single" w:sz="4" w:color="BFBFBF"/>
+            </w:tcBorders>
+          </w:tcPr>
+          <w:p>
+            <w:pPr>
+              <w:spacing w:before="40" w:after="40"/>
+            </w:pPr>
+            <w:r/>
+            <w:r>
+              <w:rPr>
+                <w:rFonts w:ascii="Calibri" w:hAnsi="Calibri" w:eastAsia="Calibri"/>
+                <w:b w:val="0"/>
+                <w:i w:val="0"/>
+                <w:color w:val="333333"/>
+                <w:sz w:val="16"/>
+              </w:rPr>
+              <w:t>Save cleared image → reopen from gallery/files</w:t>
+            </w:r>
+          </w:p>
+        </w:tc>
+        <w:tc>
+          <w:tcPr>
+            <w:shd w:fill="E2EFDA" w:val="clear"/>
+            <w:tcBorders>
+              <w:top w:val="single" w:sz="4" w:color="BFBFBF"/>
+              <w:left w:val="single" w:sz="4" w:color="BFBFBF"/>
+              <w:bottom w:val="single" w:sz="4" w:color="BFBFBF"/>
+              <w:right w:val="single" w:sz="4" w:color="BFBFBF"/>
+            </w:tcBorders>
+          </w:tcPr>
+          <w:p>
+            <w:pPr>
+              <w:spacing w:before="40" w:after="40"/>
+            </w:pPr>
+            <w:r/>
+            <w:r>
+              <w:rPr>
+                <w:rFonts w:ascii="Calibri" w:hAnsi="Calibri" w:eastAsia="Calibri"/>
+                <w:b w:val="0"/>
+                <w:i w:val="0"/>
+                <w:color w:val="333333"/>
+                <w:sz w:val="16"/>
+              </w:rPr>
+              <w:t>Saved result matches what the editor showed</w:t>
+            </w:r>
+          </w:p>
+        </w:tc>
+        <w:tc>
+          <w:tcPr>
+            <w:shd w:fill="E2EFDA" w:val="clear"/>
+            <w:tcBorders>
+              <w:top w:val="single" w:sz="4" w:color="BFBFBF"/>
+              <w:left w:val="single" w:sz="4" w:color="BFBFBF"/>
+              <w:bottom w:val="single" w:sz="4" w:color="BFBFBF"/>
+              <w:right w:val="single" w:sz="4" w:color="BFBFBF"/>
+            </w:tcBorders>
+          </w:tcPr>
           <w:sdt>
             <w:sdtPr>
               <w:alias w:val="Result"/>
               <w:tag w:val="result_status"/>
-              <w:id w:val="31020"/>
+              <w:id w:val="40012"/>
               <w:dropDownList>
                 <w:listItem w:displayText="Not Executed" w:value="Not Executed"/>
                 <w:listItem w:displayText="Pass" w:value="Pass"/>
@@ -14859,9 +15644,9 @@
                 <w:r>
                   <w:rPr>
                     <w:sz w:val="16"/>
-                    <w:color w:val="666666"/>
+                    <w:color w:val="548235"/>
                   </w:rPr>
-                  <w:t>Not Executed</w:t>
+                  <w:t>Pass</w:t>
                 </w:r>
               </w:p>
             </w:sdtContent>
@@ -14869,7 +15654,7 @@
         </w:tc>
         <w:tc>
           <w:tcPr>
-            <w:shd w:fill="FFFFFF" w:val="clear"/>
+            <w:shd w:fill="E2EFDA" w:val="clear"/>
             <w:tcBorders>
               <w:top w:val="single" w:sz="4" w:color="BFBFBF"/>
               <w:left w:val="single" w:sz="4" w:color="BFBFBF"/>
@@ -14912,59 +15697,7 @@
         </w:tc>
         <w:tc>
           <w:tcPr>
-            <w:shd w:val="clear" w:fill="F2F2F2"/>
-          </w:tcPr>
-          <w:p>
-            <w:r>
-              <w:rPr>
-                <w:sz w:val="15"/>
-              </w:rPr>
-              <w:t xml:space="preserve">Batch save does not mix images</w:t>
-            </w:r>
-          </w:p>
-        </w:tc>
-        <w:tc>
-          <w:tcPr>
-            <w:shd w:val="clear" w:fill="F2F2F2"/>
-          </w:tcPr>
-          <w:p>
-            <w:r>
-              <w:rPr>
-                <w:sz w:val="15"/>
-              </w:rPr>
-              <w:t xml:space="preserve">Functionality</w:t>
-            </w:r>
-          </w:p>
-        </w:tc>
-        <w:tc>
-          <w:tcPr>
-            <w:shd w:val="clear" w:fill="F2F2F2"/>
-          </w:tcPr>
-          <w:p>
-            <w:r>
-              <w:rPr>
-                <w:sz w:val="15"/>
-              </w:rPr>
-              <w:t xml:space="preserve">Save multiple batch results</w:t>
-            </w:r>
-          </w:p>
-        </w:tc>
-        <w:tc>
-          <w:tcPr>
-            <w:shd w:val="clear" w:fill="F2F2F2"/>
-          </w:tcPr>
-          <w:p>
-            <w:r>
-              <w:rPr>
-                <w:sz w:val="15"/>
-              </w:rPr>
-              <w:t xml:space="preserve">Each saved file matches its source image</w:t>
-            </w:r>
-          </w:p>
-        </w:tc>
-        <w:tc>
-          <w:tcPr>
-            <w:shd w:fill="FFFFFF" w:val="clear"/>
+            <w:shd w:fill="E2EFDA" w:val="clear"/>
             <w:tcBorders>
               <w:top w:val="single" w:sz="4" w:color="BFBFBF"/>
               <w:left w:val="single" w:sz="4" w:color="BFBFBF"/>
@@ -14972,11 +15705,105 @@
               <w:right w:val="single" w:sz="4" w:color="BFBFBF"/>
             </w:tcBorders>
           </w:tcPr>
+          <w:p>
+            <w:pPr>
+              <w:spacing w:before="40" w:after="40"/>
+            </w:pPr>
+            <w:r/>
+            <w:r>
+              <w:rPr>
+                <w:rFonts w:ascii="Calibri" w:hAnsi="Calibri" w:eastAsia="Calibri"/>
+                <w:b w:val="0"/>
+                <w:i w:val="0"/>
+                <w:color w:val="333333"/>
+                <w:sz w:val="16"/>
+              </w:rPr>
+              <w:t>Batch save does not mix images</w:t>
+            </w:r>
+          </w:p>
+        </w:tc>
+        <w:tc>
+          <w:tcPr>
+            <w:shd w:val="clear" w:fill="F2F2F2"/>
+          </w:tcPr>
+          <w:p>
+            <w:r>
+              <w:rPr>
+                <w:sz w:val="15"/>
+              </w:rPr>
+              <w:t xml:space="preserve">Functionality</w:t>
+            </w:r>
+          </w:p>
+        </w:tc>
+        <w:tc>
+          <w:tcPr>
+            <w:shd w:fill="E2EFDA" w:val="clear"/>
+            <w:tcBorders>
+              <w:top w:val="single" w:sz="4" w:color="BFBFBF"/>
+              <w:left w:val="single" w:sz="4" w:color="BFBFBF"/>
+              <w:bottom w:val="single" w:sz="4" w:color="BFBFBF"/>
+              <w:right w:val="single" w:sz="4" w:color="BFBFBF"/>
+            </w:tcBorders>
+          </w:tcPr>
+          <w:p>
+            <w:pPr>
+              <w:spacing w:before="40" w:after="40"/>
+            </w:pPr>
+            <w:r/>
+            <w:r>
+              <w:rPr>
+                <w:rFonts w:ascii="Calibri" w:hAnsi="Calibri" w:eastAsia="Calibri"/>
+                <w:b w:val="0"/>
+                <w:i w:val="0"/>
+                <w:color w:val="333333"/>
+                <w:sz w:val="16"/>
+              </w:rPr>
+              <w:t>Save multiple batch results</w:t>
+            </w:r>
+          </w:p>
+        </w:tc>
+        <w:tc>
+          <w:tcPr>
+            <w:shd w:fill="E2EFDA" w:val="clear"/>
+            <w:tcBorders>
+              <w:top w:val="single" w:sz="4" w:color="BFBFBF"/>
+              <w:left w:val="single" w:sz="4" w:color="BFBFBF"/>
+              <w:bottom w:val="single" w:sz="4" w:color="BFBFBF"/>
+              <w:right w:val="single" w:sz="4" w:color="BFBFBF"/>
+            </w:tcBorders>
+          </w:tcPr>
+          <w:p>
+            <w:pPr>
+              <w:spacing w:before="40" w:after="40"/>
+            </w:pPr>
+            <w:r/>
+            <w:r>
+              <w:rPr>
+                <w:rFonts w:ascii="Calibri" w:hAnsi="Calibri" w:eastAsia="Calibri"/>
+                <w:b w:val="0"/>
+                <w:i w:val="0"/>
+                <w:color w:val="333333"/>
+                <w:sz w:val="16"/>
+              </w:rPr>
+              <w:t>Each saved file matches its source image</w:t>
+            </w:r>
+          </w:p>
+        </w:tc>
+        <w:tc>
+          <w:tcPr>
+            <w:shd w:fill="E2EFDA" w:val="clear"/>
+            <w:tcBorders>
+              <w:top w:val="single" w:sz="4" w:color="BFBFBF"/>
+              <w:left w:val="single" w:sz="4" w:color="BFBFBF"/>
+              <w:bottom w:val="single" w:sz="4" w:color="BFBFBF"/>
+              <w:right w:val="single" w:sz="4" w:color="BFBFBF"/>
+            </w:tcBorders>
+          </w:tcPr>
           <w:sdt>
             <w:sdtPr>
               <w:alias w:val="Result"/>
               <w:tag w:val="result_status"/>
-              <w:id w:val="31021"/>
+              <w:id w:val="40013"/>
               <w:dropDownList>
                 <w:listItem w:displayText="Not Executed" w:value="Not Executed"/>
                 <w:listItem w:displayText="Pass" w:value="Pass"/>
@@ -14992,9 +15819,9 @@
                 <w:r>
                   <w:rPr>
                     <w:sz w:val="16"/>
-                    <w:color w:val="666666"/>
+                    <w:color w:val="548235"/>
                   </w:rPr>
-                  <w:t>Not Executed</w:t>
+                  <w:t>Pass</w:t>
                 </w:r>
               </w:p>
             </w:sdtContent>
@@ -15002,566 +15829,7 @@
         </w:tc>
         <w:tc>
           <w:tcPr>
-            <w:shd w:fill="FFFFFF" w:val="clear"/>
-            <w:tcBorders>
-              <w:top w:val="single" w:sz="4" w:color="BFBFBF"/>
-              <w:left w:val="single" w:sz="4" w:color="BFBFBF"/>
-              <w:bottom w:val="single" w:sz="4" w:color="BFBFBF"/>
-              <w:right w:val="single" w:sz="4" w:color="BFBFBF"/>
-            </w:tcBorders>
-          </w:tcPr>
-          <w:p>
-            <w:pPr>
-              <w:spacing w:before="40" w:after="40"/>
-              <w:jc w:val="center"/>
-            </w:pPr>
-            <w:r/>
-            <w:r>
-              <w:rPr>
-                <w:rFonts w:ascii="Calibri" w:hAnsi="Calibri" w:eastAsia="Calibri"/>
-                <w:b w:val="0"/>
-                <w:i w:val="0"/>
-                <w:color w:val="333333"/>
-                <w:sz w:val="16"/>
-              </w:rPr>
-              <w:t>—</w:t>
-            </w:r>
-          </w:p>
-        </w:tc>
-      </w:tr>
-    </w:tbl>
-    <w:p/>
-    <w:p>
-      <w:pPr>
-        <w:spacing w:before="240" w:after="80"/>
-      </w:pPr>
-      <w:r>
-        <w:rPr>
-          <w:rFonts w:ascii="Calibri" w:hAnsi="Calibri" w:eastAsia="Calibri"/>
-          <w:b/>
-          <w:i w:val="0"/>
-          <w:color w:val="2E75B6"/>
-          <w:sz w:val="26"/>
-        </w:rPr>
-        <w:t>5.9 Optional cutout observation (not main score)</w:t>
-      </w:r>
-    </w:p>
-    <w:p>
-      <w:pPr>
-        <w:spacing w:before="0" w:after="80"/>
-      </w:pPr>
-      <w:r>
-        <w:rPr>
-          <w:rFonts w:ascii="Calibri" w:hAnsi="Calibri" w:eastAsia="Calibri"/>
-          <w:b w:val="0"/>
-          <w:i/>
-          <w:color w:val="666666"/>
-          <w:sz w:val="18"/>
-        </w:rPr>
-        <w:t>Optional only. Assignment says not to judge third-party AI cutout perfection as the main result.</w:t>
-      </w:r>
-    </w:p>
-    <w:tbl>
-      <w:tblPr>
-        <w:tblW w:w="5000" w:type="pct"/>
-        <w:tblBorders>
-          <w:top w:val="single" w:sz="4" w:color="BFBFBF"/>
-          <w:left w:val="single" w:sz="4" w:color="BFBFBF"/>
-          <w:bottom w:val="single" w:sz="4" w:color="BFBFBF"/>
-          <w:right w:val="single" w:sz="4" w:color="BFBFBF"/>
-          <w:insideH w:val="single" w:sz="4" w:color="BFBFBF"/>
-          <w:insideV w:val="single" w:sz="4" w:color="BFBFBF"/>
-        </w:tblBorders>
-      </w:tblPr>
-      <w:tblGrid>
-        <w:gridCol w:w="900"/>
-        <w:gridCol w:w="1400"/>
-        <w:gridCol w:w="900"/>
-        <w:gridCol w:w="1200"/>
-        <w:gridCol w:w="1400"/>
-        <w:gridCol w:w="900"/>
-        <w:gridCol w:w="700"/>
-      </w:tblGrid>
-      <w:tr>
-        <w:tc>
-          <w:tcPr>
-            <w:shd w:val="clear" w:fill="1F4E79"/>
-          </w:tcPr>
-          <w:p>
-            <w:r>
-              <w:rPr>
-                <w:b/>
-                <w:color w:val="FFFFFF"/>
-                <w:sz w:val="15"/>
-              </w:rPr>
-              <w:t xml:space="preserve">TC ID</w:t>
-            </w:r>
-          </w:p>
-        </w:tc>
-        <w:tc>
-          <w:tcPr>
-            <w:shd w:val="clear" w:fill="1F4E79"/>
-          </w:tcPr>
-          <w:p>
-            <w:r>
-              <w:rPr>
-                <w:b/>
-                <w:color w:val="FFFFFF"/>
-                <w:sz w:val="15"/>
-              </w:rPr>
-              <w:t xml:space="preserve">Test Case</w:t>
-            </w:r>
-          </w:p>
-        </w:tc>
-        <w:tc>
-          <w:tcPr>
-            <w:shd w:val="clear" w:fill="1F4E79"/>
-          </w:tcPr>
-          <w:p>
-            <w:r>
-              <w:rPr>
-                <w:b/>
-                <w:color w:val="FFFFFF"/>
-                <w:sz w:val="15"/>
-              </w:rPr>
-              <w:t xml:space="preserve">Area</w:t>
-            </w:r>
-          </w:p>
-        </w:tc>
-        <w:tc>
-          <w:tcPr>
-            <w:shd w:val="clear" w:fill="1F4E79"/>
-          </w:tcPr>
-          <w:p>
-            <w:r>
-              <w:rPr>
-                <w:b/>
-                <w:color w:val="FFFFFF"/>
-                <w:sz w:val="15"/>
-              </w:rPr>
-              <w:t xml:space="preserve">Steps</w:t>
-            </w:r>
-          </w:p>
-        </w:tc>
-        <w:tc>
-          <w:tcPr>
-            <w:shd w:val="clear" w:fill="1F4E79"/>
-          </w:tcPr>
-          <w:p>
-            <w:r>
-              <w:rPr>
-                <w:b/>
-                <w:color w:val="FFFFFF"/>
-                <w:sz w:val="15"/>
-              </w:rPr>
-              <w:t xml:space="preserve">Expected Result</w:t>
-            </w:r>
-          </w:p>
-        </w:tc>
-        <w:tc>
-          <w:tcPr>
-            <w:shd w:val="clear" w:fill="1F4E79"/>
-          </w:tcPr>
-          <w:p>
-            <w:r>
-              <w:rPr>
-                <w:b/>
-                <w:color w:val="FFFFFF"/>
-                <w:sz w:val="15"/>
-              </w:rPr>
-              <w:t xml:space="preserve">Result</w:t>
-            </w:r>
-          </w:p>
-        </w:tc>
-        <w:tc>
-          <w:tcPr>
-            <w:shd w:val="clear" w:fill="1F4E79"/>
-          </w:tcPr>
-          <w:p>
-            <w:r>
-              <w:rPr>
-                <w:b/>
-                <w:color w:val="FFFFFF"/>
-                <w:sz w:val="15"/>
-              </w:rPr>
-              <w:t xml:space="preserve">Bug</w:t>
-            </w:r>
-          </w:p>
-        </w:tc>
-      </w:tr>
-      <w:tr>
-        <w:tc>
-          <w:tcPr>
-            <w:shd w:val="clear" w:fill="FFFFFF"/>
-          </w:tcPr>
-          <w:p>
-            <w:r>
-              <w:rPr>
-                <w:sz w:val="15"/>
-              </w:rPr>
-              <w:t xml:space="preserve">TC-AI-001</w:t>
-            </w:r>
-          </w:p>
-        </w:tc>
-        <w:tc>
-          <w:tcPr>
-            <w:shd w:val="clear" w:fill="FFFFFF"/>
-          </w:tcPr>
-          <w:p>
-            <w:r>
-              <w:rPr>
-                <w:sz w:val="15"/>
-              </w:rPr>
-              <w:t xml:space="preserve">Low-contrast subject vs background</w:t>
-            </w:r>
-          </w:p>
-        </w:tc>
-        <w:tc>
-          <w:tcPr>
-            <w:shd w:val="clear" w:fill="FFFFFF"/>
-          </w:tcPr>
-          <w:p>
-            <w:r>
-              <w:rPr>
-                <w:sz w:val="15"/>
-              </w:rPr>
-              <w:t xml:space="preserve">Observation</w:t>
-            </w:r>
-          </w:p>
-        </w:tc>
-        <w:tc>
-          <w:tcPr>
-            <w:shd w:val="clear" w:fill="FFFFFF"/>
-          </w:tcPr>
-          <w:p>
-            <w:r>
-              <w:rPr>
-                <w:sz w:val="15"/>
-              </w:rPr>
-              <w:t xml:space="preserve">Single remove on similar colors</w:t>
-            </w:r>
-          </w:p>
-        </w:tc>
-        <w:tc>
-          <w:tcPr>
-            <w:shd w:val="clear" w:fill="FFFFFF"/>
-          </w:tcPr>
-          <w:p>
-            <w:r>
-              <w:rPr>
-                <w:sz w:val="15"/>
-              </w:rPr>
-              <w:t xml:space="preserve">App completes; note edge quality if useful</w:t>
-            </w:r>
-          </w:p>
-        </w:tc>
-        <w:tc>
-          <w:tcPr>
-            <w:shd w:fill="FFFFFF" w:val="clear"/>
-            <w:tcBorders>
-              <w:top w:val="single" w:sz="4" w:color="BFBFBF"/>
-              <w:left w:val="single" w:sz="4" w:color="BFBFBF"/>
-              <w:bottom w:val="single" w:sz="4" w:color="BFBFBF"/>
-              <w:right w:val="single" w:sz="4" w:color="BFBFBF"/>
-            </w:tcBorders>
-          </w:tcPr>
-          <w:sdt>
-            <w:sdtPr>
-              <w:alias w:val="Result"/>
-              <w:tag w:val="result_status"/>
-              <w:id w:val="31022"/>
-              <w:dropDownList>
-                <w:listItem w:displayText="Not Executed" w:value="Not Executed"/>
-                <w:listItem w:displayText="Pass" w:value="Pass"/>
-                <w:listItem w:displayText="Fail" w:value="Fail"/>
-                <w:listItem w:displayText="Blocked" w:value="Blocked"/>
-              </w:dropDownList>
-            </w:sdtPr>
-            <w:sdtContent>
-              <w:p>
-                <w:pPr>
-                  <w:jc w:val="center"/>
-                </w:pPr>
-                <w:r>
-                  <w:rPr>
-                    <w:sz w:val="16"/>
-                    <w:color w:val="666666"/>
-                  </w:rPr>
-                  <w:t>Not Executed</w:t>
-                </w:r>
-              </w:p>
-            </w:sdtContent>
-          </w:sdt>
-        </w:tc>
-        <w:tc>
-          <w:tcPr>
-            <w:shd w:fill="FFFFFF" w:val="clear"/>
-            <w:tcBorders>
-              <w:top w:val="single" w:sz="4" w:color="BFBFBF"/>
-              <w:left w:val="single" w:sz="4" w:color="BFBFBF"/>
-              <w:bottom w:val="single" w:sz="4" w:color="BFBFBF"/>
-              <w:right w:val="single" w:sz="4" w:color="BFBFBF"/>
-            </w:tcBorders>
-          </w:tcPr>
-          <w:p>
-            <w:pPr>
-              <w:spacing w:before="40" w:after="40"/>
-              <w:jc w:val="center"/>
-            </w:pPr>
-            <w:r/>
-            <w:r>
-              <w:rPr>
-                <w:rFonts w:ascii="Calibri" w:hAnsi="Calibri" w:eastAsia="Calibri"/>
-                <w:b w:val="0"/>
-                <w:i w:val="0"/>
-                <w:color w:val="333333"/>
-                <w:sz w:val="16"/>
-              </w:rPr>
-              <w:t>—</w:t>
-            </w:r>
-          </w:p>
-        </w:tc>
-      </w:tr>
-      <w:tr>
-        <w:tc>
-          <w:tcPr>
-            <w:shd w:val="clear" w:fill="F2F2F2"/>
-          </w:tcPr>
-          <w:p>
-            <w:r>
-              <w:rPr>
-                <w:sz w:val="15"/>
-              </w:rPr>
-              <w:t xml:space="preserve">TC-AI-002</w:t>
-            </w:r>
-          </w:p>
-        </w:tc>
-        <w:tc>
-          <w:tcPr>
-            <w:shd w:val="clear" w:fill="F2F2F2"/>
-          </w:tcPr>
-          <w:p>
-            <w:r>
-              <w:rPr>
-                <w:sz w:val="15"/>
-              </w:rPr>
-              <w:t xml:space="preserve">Subject with gaps/holes</w:t>
-            </w:r>
-          </w:p>
-        </w:tc>
-        <w:tc>
-          <w:tcPr>
-            <w:shd w:val="clear" w:fill="F2F2F2"/>
-          </w:tcPr>
-          <w:p>
-            <w:r>
-              <w:rPr>
-                <w:sz w:val="15"/>
-              </w:rPr>
-              <w:t xml:space="preserve">Observation</w:t>
-            </w:r>
-          </w:p>
-        </w:tc>
-        <w:tc>
-          <w:tcPr>
-            <w:shd w:val="clear" w:fill="F2F2F2"/>
-          </w:tcPr>
-          <w:p>
-            <w:r>
-              <w:rPr>
-                <w:sz w:val="15"/>
-              </w:rPr>
-              <w:t xml:space="preserve">Single remove on object with holes if available</w:t>
-            </w:r>
-          </w:p>
-        </w:tc>
-        <w:tc>
-          <w:tcPr>
-            <w:shd w:val="clear" w:fill="F2F2F2"/>
-          </w:tcPr>
-          <w:p>
-            <w:r>
-              <w:rPr>
-                <w:sz w:val="15"/>
-              </w:rPr>
-              <w:t xml:space="preserve">App completes; note inner-gap behavior</w:t>
-            </w:r>
-          </w:p>
-        </w:tc>
-        <w:tc>
-          <w:tcPr>
-            <w:shd w:fill="FFFFFF" w:val="clear"/>
-            <w:tcBorders>
-              <w:top w:val="single" w:sz="4" w:color="BFBFBF"/>
-              <w:left w:val="single" w:sz="4" w:color="BFBFBF"/>
-              <w:bottom w:val="single" w:sz="4" w:color="BFBFBF"/>
-              <w:right w:val="single" w:sz="4" w:color="BFBFBF"/>
-            </w:tcBorders>
-          </w:tcPr>
-          <w:sdt>
-            <w:sdtPr>
-              <w:alias w:val="Result"/>
-              <w:tag w:val="result_status"/>
-              <w:id w:val="31023"/>
-              <w:dropDownList>
-                <w:listItem w:displayText="Not Executed" w:value="Not Executed"/>
-                <w:listItem w:displayText="Pass" w:value="Pass"/>
-                <w:listItem w:displayText="Fail" w:value="Fail"/>
-                <w:listItem w:displayText="Blocked" w:value="Blocked"/>
-              </w:dropDownList>
-            </w:sdtPr>
-            <w:sdtContent>
-              <w:p>
-                <w:pPr>
-                  <w:jc w:val="center"/>
-                </w:pPr>
-                <w:r>
-                  <w:rPr>
-                    <w:sz w:val="16"/>
-                    <w:color w:val="666666"/>
-                  </w:rPr>
-                  <w:t>Not Executed</w:t>
-                </w:r>
-              </w:p>
-            </w:sdtContent>
-          </w:sdt>
-        </w:tc>
-        <w:tc>
-          <w:tcPr>
-            <w:shd w:fill="FFFFFF" w:val="clear"/>
-            <w:tcBorders>
-              <w:top w:val="single" w:sz="4" w:color="BFBFBF"/>
-              <w:left w:val="single" w:sz="4" w:color="BFBFBF"/>
-              <w:bottom w:val="single" w:sz="4" w:color="BFBFBF"/>
-              <w:right w:val="single" w:sz="4" w:color="BFBFBF"/>
-            </w:tcBorders>
-          </w:tcPr>
-          <w:p>
-            <w:pPr>
-              <w:spacing w:before="40" w:after="40"/>
-              <w:jc w:val="center"/>
-            </w:pPr>
-            <w:r/>
-            <w:r>
-              <w:rPr>
-                <w:rFonts w:ascii="Calibri" w:hAnsi="Calibri" w:eastAsia="Calibri"/>
-                <w:b w:val="0"/>
-                <w:i w:val="0"/>
-                <w:color w:val="333333"/>
-                <w:sz w:val="16"/>
-              </w:rPr>
-              <w:t>—</w:t>
-            </w:r>
-          </w:p>
-        </w:tc>
-      </w:tr>
-      <w:tr>
-        <w:tc>
-          <w:tcPr>
-            <w:shd w:val="clear" w:fill="FFFFFF"/>
-          </w:tcPr>
-          <w:p>
-            <w:r>
-              <w:rPr>
-                <w:sz w:val="15"/>
-              </w:rPr>
-              <w:t xml:space="preserve">TC-AI-003</w:t>
-            </w:r>
-          </w:p>
-        </w:tc>
-        <w:tc>
-          <w:tcPr>
-            <w:shd w:val="clear" w:fill="FFFFFF"/>
-          </w:tcPr>
-          <w:p>
-            <w:r>
-              <w:rPr>
-                <w:sz w:val="15"/>
-              </w:rPr>
-              <w:t xml:space="preserve">Hair / fur fine edges</w:t>
-            </w:r>
-          </w:p>
-        </w:tc>
-        <w:tc>
-          <w:tcPr>
-            <w:shd w:val="clear" w:fill="FFFFFF"/>
-          </w:tcPr>
-          <w:p>
-            <w:r>
-              <w:rPr>
-                <w:sz w:val="15"/>
-              </w:rPr>
-              <w:t xml:space="preserve">Observation</w:t>
-            </w:r>
-          </w:p>
-        </w:tc>
-        <w:tc>
-          <w:tcPr>
-            <w:shd w:val="clear" w:fill="FFFFFF"/>
-          </w:tcPr>
-          <w:p>
-            <w:r>
-              <w:rPr>
-                <w:sz w:val="15"/>
-              </w:rPr>
-              <w:t xml:space="preserve">Single remove on hair/fur photo if available</w:t>
-            </w:r>
-          </w:p>
-        </w:tc>
-        <w:tc>
-          <w:tcPr>
-            <w:shd w:val="clear" w:fill="FFFFFF"/>
-          </w:tcPr>
-          <w:p>
-            <w:r>
-              <w:rPr>
-                <w:sz w:val="15"/>
-              </w:rPr>
-              <w:t xml:space="preserve">App completes; note edge behavior</w:t>
-            </w:r>
-          </w:p>
-        </w:tc>
-        <w:tc>
-          <w:tcPr>
-            <w:shd w:fill="FFFFFF" w:val="clear"/>
-            <w:tcBorders>
-              <w:top w:val="single" w:sz="4" w:color="BFBFBF"/>
-              <w:left w:val="single" w:sz="4" w:color="BFBFBF"/>
-              <w:bottom w:val="single" w:sz="4" w:color="BFBFBF"/>
-              <w:right w:val="single" w:sz="4" w:color="BFBFBF"/>
-            </w:tcBorders>
-          </w:tcPr>
-          <w:sdt>
-            <w:sdtPr>
-              <w:alias w:val="Result"/>
-              <w:tag w:val="result_status"/>
-              <w:id w:val="31024"/>
-              <w:dropDownList>
-                <w:listItem w:displayText="Not Executed" w:value="Not Executed"/>
-                <w:listItem w:displayText="Pass" w:value="Pass"/>
-                <w:listItem w:displayText="Fail" w:value="Fail"/>
-                <w:listItem w:displayText="Blocked" w:value="Blocked"/>
-              </w:dropDownList>
-            </w:sdtPr>
-            <w:sdtContent>
-              <w:p>
-                <w:pPr>
-                  <w:jc w:val="center"/>
-                </w:pPr>
-                <w:r>
-                  <w:rPr>
-                    <w:sz w:val="16"/>
-                    <w:color w:val="666666"/>
-                  </w:rPr>
-                  <w:t>Not Executed</w:t>
-                </w:r>
-              </w:p>
-            </w:sdtContent>
-          </w:sdt>
-        </w:tc>
-        <w:tc>
-          <w:tcPr>
-            <w:shd w:fill="FFFFFF" w:val="clear"/>
+            <w:shd w:fill="E2EFDA" w:val="clear"/>
             <w:tcBorders>
               <w:top w:val="single" w:sz="4" w:color="BFBFBF"/>
               <w:left w:val="single" w:sz="4" w:color="BFBFBF"/>
@@ -15836,7 +16104,7 @@
                 <w:color w:val="333333"/>
                 <w:sz w:val="18"/>
               </w:rPr>
-              <w:t>3 (SUG-001 Shape UX, SUG-002 smart align, SUG-003 Batch quality = single-photo)</w:t>
+              <w:t>4 (SUG-001 Shape UX, SUG-002 smart align, SUG-003 Batch quality, SUG-004 weak-network retry UX)</w:t>
             </w:r>
           </w:p>
         </w:tc>
@@ -15905,7 +16173,7 @@
                 <w:color w:val="333333"/>
                 <w:sz w:val="18"/>
               </w:rPr>
-              <w:t>18 / 39</w:t>
+              <w:t>33 / 36</w:t>
             </w:r>
           </w:p>
         </w:tc>
@@ -15974,7 +16242,7 @@
                 <w:color w:val="333333"/>
                 <w:sz w:val="18"/>
               </w:rPr>
-              <w:t>Pass: 17 | Fail: 1 | Blocked: 0</w:t>
+              <w:t>Pass: 32 | Fail: 1 | Blocked: 0</w:t>
             </w:r>
           </w:p>
         </w:tc>
@@ -16043,7 +16311,7 @@
                 <w:color w:val="333333"/>
                 <w:sz w:val="18"/>
               </w:rPr>
-              <w:t>Batch is the app’s biggest advantage (edit many images / add text or background changes together), and the UI is easy. Main gap: Batch background remove is often weaker than single-photo mode (darkening, preview vs opened image mismatch, inconsistent results). Tracked as BUG-001 / SUG-003.</w:t>
+              <w:t>Single-photo flow, save/share, offline messaging, resume, and usability checks are strong. Main defect remains Batch background-remove accuracy/preview mismatch (BUG-001). Weak network shows retry/fallback, but wait time can feel long (SUG-004).</w:t>
             </w:r>
           </w:p>
         </w:tc>

</xml_diff>

<commit_message>
Add Batch secondary-tool cases and expand BUG-001 findings
Capture inconsistent batch processing, black preview vs checkerboard,
failed Background replace mapping, Pass results for Resize/Adjust/Blur,
and 20-image timing with a Drive video evidence placeholder.

Co-authored-by: Showravkarmakar <Showrav88@users.noreply.github.com>
</commit_message>
<xml_diff>
--- a/SQA_Intern_Assignment_Test_Report.docx
+++ b/SQA_Intern_Assignment_Test_Report.docx
@@ -4205,7 +4205,7 @@
           <w:color w:val="333333"/>
           <w:sz w:val="20"/>
         </w:rPr>
-        <w:t>For many product photos, Batch does not remove the background accurately like single-photo mode. Backgrounds often only become darker instead of being removed. In minimized view the result can look like a dark/cleared background, but when the image is opened the original full background is still there. Result quality is inconsistent — sometimes acceptable, but not regularly reliable.</w:t>
+        <w:t>Batch auto-remove can look about 90% accurate on some runs, but results are inconsistent. In a 5-image run, sometimes only 2–3 images are cleared and 1–2 are left out of processing. When all images process, cleared results usually show a black background instead of the single-photo checkerboard transparency view, so quality/feedback is not equal to single mode. Also, Batch Background change applied to all images at once often lands outside the cleared/black area instead of filling only the removed background. Observed on a 20-image run: about 3 min 30 sec total, 14 processed, 6 left out; failed items show a cross and only processed images remain after completion.</w:t>
       </w:r>
     </w:p>
     <w:p>
@@ -4340,7 +4340,22 @@
           <w:color w:val="333333"/>
           <w:sz w:val="20"/>
         </w:rPr>
-        <w:t>This is a Batch module defect, not a competitor-parity item. Single-photo remove works better. Batch remains valuable for multi-image editing, but background-remove quality and preview/open consistency must improve.</w:t>
+        <w:t>This is a Batch module defect. Failed items correctly show a cross and are excluded after processing, which is acceptable feedback. Main gaps: inconsistent remove success, black preview instead of checkerboard like single mode, and Background replace not mapping to the cleared area.</w:t>
+      </w:r>
+    </w:p>
+    <w:p>
+      <w:pPr>
+        <w:spacing w:before="40" w:after="120"/>
+      </w:pPr>
+      <w:r>
+        <w:rPr>
+          <w:rFonts w:ascii="Calibri" w:hAnsi="Calibri" w:eastAsia="Calibri"/>
+          <w:b w:val="0"/>
+          <w:i/>
+          <w:color w:val="666666"/>
+          <w:sz w:val="20"/>
+        </w:rPr>
+        <w:t>Video evidence (Batch Background replace): [Paste Google Drive link here]</w:t>
       </w:r>
     </w:p>
     <w:p>
@@ -5886,7 +5901,7 @@
           <w:color w:val="2E75B6"/>
           <w:sz w:val="26"/>
         </w:rPr>
-        <w:t>SUG-003: Make Batch background remove as accurate and reliable as single-photo mode</w:t>
+        <w:t>SUG-003: Make Batch background remove and Background replace match single-photo quality</w:t>
       </w:r>
     </w:p>
     <w:tbl>
@@ -6086,7 +6101,7 @@
                 <w:color w:val="333333"/>
                 <w:sz w:val="16"/>
               </w:rPr>
-              <w:t>Batch often only darkens backgrounds; thumbnail can look cleared while opened image still has full background; quality is inconsistent vs single-photo mode.</w:t>
+              <w:t>Batch remove is inconsistent (some images left out). Cleared preview is often black, not checkerboard like single mode. Batch Background replace frequently applies outside the cleared area. Resize/Adjust/Blur work better.</w:t>
             </w:r>
           </w:p>
         </w:tc>
@@ -6104,7 +6119,7 @@
           <w:color w:val="333333"/>
           <w:sz w:val="20"/>
         </w:rPr>
-        <w:t>Proposed improvement: Process every Batch photo with the same background-remove quality as single Background Remove. Make thumbnail preview and opened full image show the same result. Keep Batch’s strength: after remove, let users apply shared edits (new background, color, company text, etc.) to many images in one run.</w:t>
+        <w:t>Proposed improvement: 1) Process every selected Batch photo with single-photo remove quality and keep failed items clearly marked. 2) Show checkerboard/transparency feedback like single mode where possible. 3) Apply Background replace strictly inside the cleared/black area for all selected images at once.</w:t>
       </w:r>
       <w:r>
         <w:rPr>
@@ -11644,7 +11659,7 @@
                 <w:color w:val="333333"/>
                 <w:sz w:val="16"/>
               </w:rPr>
-              <w:t>Select several product photos → Continue</w:t>
+              <w:t>Select 5 gallery photos → Continue</w:t>
             </w:r>
           </w:p>
         </w:tc>
@@ -11671,7 +11686,7 @@
                 <w:color w:val="333333"/>
                 <w:sz w:val="16"/>
               </w:rPr>
-              <w:t>Selected images enter batch process flow</w:t>
+              <w:t>Selected images enter batch flow and auto processing starts</w:t>
             </w:r>
           </w:p>
         </w:tc>
@@ -11689,7 +11704,7 @@
             <w:sdtPr>
               <w:alias w:val="Result"/>
               <w:tag w:val="result_status"/>
-              <w:id w:val="31002"/>
+              <w:id w:val="51000"/>
               <w:dropDownList>
                 <w:listItem w:displayText="Not Executed" w:value="Not Executed"/>
                 <w:listItem w:displayText="Pass" w:value="Pass"/>
@@ -11806,7 +11821,7 @@
                 <w:color w:val="333333"/>
                 <w:sz w:val="16"/>
               </w:rPr>
-              <w:t>Batch remove quality matches single-photo / preview matches open</w:t>
+              <w:t>Batch remove quality and completeness</w:t>
             </w:r>
           </w:p>
         </w:tc>
@@ -11860,7 +11875,7 @@
                 <w:color w:val="333333"/>
                 <w:sz w:val="16"/>
               </w:rPr>
-              <w:t>Run batch on product photos → check thumbnail → open full image</w:t>
+              <w:t>Run batch on 5–20 photos → review all results</w:t>
             </w:r>
           </w:p>
         </w:tc>
@@ -11887,7 +11902,7 @@
                 <w:color w:val="333333"/>
                 <w:sz w:val="16"/>
               </w:rPr>
-              <w:t>Background accurately removed like single-photo; thumbnail and opened image match</w:t>
+              <w:t>All selected images process; remove quality close to single mode; preview matches opened result</w:t>
             </w:r>
           </w:p>
         </w:tc>
@@ -11905,7 +11920,7 @@
             <w:sdtPr>
               <w:alias w:val="Result"/>
               <w:tag w:val="result_status"/>
-              <w:id w:val="31003"/>
+              <w:id w:val="51001"/>
               <w:dropDownList>
                 <w:listItem w:displayText="Not Executed" w:value="Not Executed"/>
                 <w:listItem w:displayText="Pass" w:value="Pass"/>
@@ -12194,6 +12209,1230 @@
         </w:rPr>
       </w:r>
     </w:p>
+    <w:p>
+      <w:pPr>
+        <w:spacing w:before="240" w:after="80"/>
+      </w:pPr>
+      <w:r>
+        <w:rPr>
+          <w:rFonts w:ascii="Calibri" w:hAnsi="Calibri" w:eastAsia="Calibri"/>
+          <w:b/>
+          <w:i w:val="0"/>
+          <w:color w:val="2E75B6"/>
+          <w:sz w:val="26"/>
+        </w:rPr>
+        <w:t>5.4b Batch editing tools &amp; processing behavior</w:t>
+      </w:r>
+    </w:p>
+    <w:p>
+      <w:pPr>
+        <w:spacing w:before="0" w:after="80"/>
+      </w:pPr>
+      <w:r>
+        <w:rPr>
+          <w:rFonts w:ascii="Calibri" w:hAnsi="Calibri" w:eastAsia="Calibri"/>
+          <w:b w:val="0"/>
+          <w:i/>
+          <w:color w:val="666666"/>
+          <w:sz w:val="18"/>
+        </w:rPr>
+        <w:t>From 5-image and 20-image Batch runs. Secondary tools Pass; Background replace Fail (BUG-001).</w:t>
+      </w:r>
+    </w:p>
+    <w:tbl>
+      <w:tblPr>
+        <w:tblW w:w="5000" w:type="pct"/>
+        <w:tblBorders>
+          <w:top w:val="single" w:sz="4" w:color="BFBFBF"/>
+          <w:left w:val="single" w:sz="4" w:color="BFBFBF"/>
+          <w:bottom w:val="single" w:sz="4" w:color="BFBFBF"/>
+          <w:right w:val="single" w:sz="4" w:color="BFBFBF"/>
+          <w:insideH w:val="single" w:sz="4" w:color="BFBFBF"/>
+          <w:insideV w:val="single" w:sz="4" w:color="BFBFBF"/>
+        </w:tblBorders>
+      </w:tblPr>
+      <w:tblGrid>
+        <w:gridCol w:w="900"/>
+        <w:gridCol w:w="1400"/>
+        <w:gridCol w:w="900"/>
+        <w:gridCol w:w="1200"/>
+        <w:gridCol w:w="1400"/>
+        <w:gridCol w:w="900"/>
+        <w:gridCol w:w="700"/>
+      </w:tblGrid>
+      <w:tr>
+        <w:tc>
+          <w:tcPr>
+            <w:shd w:val="clear" w:fill="1F4E79"/>
+          </w:tcPr>
+          <w:p>
+            <w:r>
+              <w:rPr>
+                <w:b/>
+                <w:color w:val="FFFFFF"/>
+                <w:sz w:val="15"/>
+              </w:rPr>
+              <w:t xml:space="preserve">TC ID</w:t>
+            </w:r>
+          </w:p>
+        </w:tc>
+        <w:tc>
+          <w:tcPr>
+            <w:shd w:val="clear" w:fill="1F4E79"/>
+          </w:tcPr>
+          <w:p>
+            <w:r>
+              <w:rPr>
+                <w:b/>
+                <w:color w:val="FFFFFF"/>
+                <w:sz w:val="15"/>
+              </w:rPr>
+              <w:t xml:space="preserve">Test Case</w:t>
+            </w:r>
+          </w:p>
+        </w:tc>
+        <w:tc>
+          <w:tcPr>
+            <w:shd w:val="clear" w:fill="1F4E79"/>
+          </w:tcPr>
+          <w:p>
+            <w:r>
+              <w:rPr>
+                <w:b/>
+                <w:color w:val="FFFFFF"/>
+                <w:sz w:val="15"/>
+              </w:rPr>
+              <w:t xml:space="preserve">Area</w:t>
+            </w:r>
+          </w:p>
+        </w:tc>
+        <w:tc>
+          <w:tcPr>
+            <w:shd w:val="clear" w:fill="1F4E79"/>
+          </w:tcPr>
+          <w:p>
+            <w:r>
+              <w:rPr>
+                <w:b/>
+                <w:color w:val="FFFFFF"/>
+                <w:sz w:val="15"/>
+              </w:rPr>
+              <w:t xml:space="preserve">Steps</w:t>
+            </w:r>
+          </w:p>
+        </w:tc>
+        <w:tc>
+          <w:tcPr>
+            <w:shd w:val="clear" w:fill="1F4E79"/>
+          </w:tcPr>
+          <w:p>
+            <w:r>
+              <w:rPr>
+                <w:b/>
+                <w:color w:val="FFFFFF"/>
+                <w:sz w:val="15"/>
+              </w:rPr>
+              <w:t xml:space="preserve">Expected Result</w:t>
+            </w:r>
+          </w:p>
+        </w:tc>
+        <w:tc>
+          <w:tcPr>
+            <w:shd w:val="clear" w:fill="1F4E79"/>
+          </w:tcPr>
+          <w:p>
+            <w:r>
+              <w:rPr>
+                <w:b/>
+                <w:color w:val="FFFFFF"/>
+                <w:sz w:val="15"/>
+              </w:rPr>
+              <w:t xml:space="preserve">Result</w:t>
+            </w:r>
+          </w:p>
+        </w:tc>
+        <w:tc>
+          <w:tcPr>
+            <w:shd w:val="clear" w:fill="1F4E79"/>
+          </w:tcPr>
+          <w:p>
+            <w:r>
+              <w:rPr>
+                <w:b/>
+                <w:color w:val="FFFFFF"/>
+                <w:sz w:val="15"/>
+              </w:rPr>
+              <w:t xml:space="preserve">Bug</w:t>
+            </w:r>
+          </w:p>
+        </w:tc>
+      </w:tr>
+      <w:tr>
+        <w:tc>
+          <w:tcPr>
+            <w:shd w:val="clear" w:fill="E2EFDA"/>
+          </w:tcPr>
+          <w:p>
+            <w:r>
+              <w:rPr>
+                <w:sz w:val="15"/>
+              </w:rPr>
+              <w:t xml:space="preserve">TC-BT-005</w:t>
+            </w:r>
+          </w:p>
+        </w:tc>
+        <w:tc>
+          <w:tcPr>
+            <w:shd w:val="clear" w:fill="E2EFDA"/>
+          </w:tcPr>
+          <w:p>
+            <w:r>
+              <w:rPr>
+                <w:sz w:val="15"/>
+              </w:rPr>
+              <w:t xml:space="preserve">Failed batch item shows cross and is left out</w:t>
+            </w:r>
+          </w:p>
+        </w:tc>
+        <w:tc>
+          <w:tcPr>
+            <w:shd w:val="clear" w:fill="E2EFDA"/>
+          </w:tcPr>
+          <w:p>
+            <w:r>
+              <w:rPr>
+                <w:sz w:val="15"/>
+              </w:rPr>
+              <w:t xml:space="preserve">Functionality, Usability</w:t>
+            </w:r>
+          </w:p>
+        </w:tc>
+        <w:tc>
+          <w:tcPr>
+            <w:shd w:val="clear" w:fill="E2EFDA"/>
+          </w:tcPr>
+          <w:p>
+            <w:r>
+              <w:rPr>
+                <w:sz w:val="15"/>
+              </w:rPr>
+              <w:t xml:space="preserve">Run batch where some images fail</w:t>
+            </w:r>
+          </w:p>
+        </w:tc>
+        <w:tc>
+          <w:tcPr>
+            <w:shd w:val="clear" w:fill="E2EFDA"/>
+          </w:tcPr>
+          <w:p>
+            <w:r>
+              <w:rPr>
+                <w:sz w:val="15"/>
+              </w:rPr>
+              <w:t xml:space="preserve">Failed image shows cross; after completion only processed images remain</w:t>
+            </w:r>
+          </w:p>
+        </w:tc>
+        <w:tc>
+          <w:tcPr>
+            <w:shd w:fill="E2EFDA" w:val="clear"/>
+            <w:tcBorders>
+              <w:top w:val="single" w:sz="4" w:color="BFBFBF"/>
+              <w:left w:val="single" w:sz="4" w:color="BFBFBF"/>
+              <w:bottom w:val="single" w:sz="4" w:color="BFBFBF"/>
+              <w:right w:val="single" w:sz="4" w:color="BFBFBF"/>
+            </w:tcBorders>
+          </w:tcPr>
+          <w:sdt>
+            <w:sdtPr>
+              <w:alias w:val="Result"/>
+              <w:tag w:val="result_status"/>
+              <w:id w:val="51004"/>
+              <w:dropDownList>
+                <w:listItem w:displayText="Not Executed" w:value="Not Executed"/>
+                <w:listItem w:displayText="Pass" w:value="Pass"/>
+                <w:listItem w:displayText="Fail" w:value="Fail"/>
+                <w:listItem w:displayText="Blocked" w:value="Blocked"/>
+              </w:dropDownList>
+            </w:sdtPr>
+            <w:sdtContent>
+              <w:p>
+                <w:pPr>
+                  <w:jc w:val="center"/>
+                </w:pPr>
+                <w:r>
+                  <w:rPr>
+                    <w:sz w:val="16"/>
+                    <w:color w:val="548235"/>
+                  </w:rPr>
+                  <w:t>Pass</w:t>
+                </w:r>
+              </w:p>
+            </w:sdtContent>
+          </w:sdt>
+        </w:tc>
+        <w:tc>
+          <w:tcPr>
+            <w:shd w:fill="E2EFDA" w:val="clear"/>
+            <w:tcBorders>
+              <w:top w:val="single" w:sz="4" w:color="BFBFBF"/>
+              <w:left w:val="single" w:sz="4" w:color="BFBFBF"/>
+              <w:bottom w:val="single" w:sz="4" w:color="BFBFBF"/>
+              <w:right w:val="single" w:sz="4" w:color="BFBFBF"/>
+            </w:tcBorders>
+          </w:tcPr>
+          <w:p>
+            <w:pPr>
+              <w:spacing w:before="40" w:after="40"/>
+              <w:jc w:val="center"/>
+            </w:pPr>
+            <w:r/>
+            <w:r>
+              <w:rPr>
+                <w:rFonts w:ascii="Calibri" w:hAnsi="Calibri" w:eastAsia="Calibri"/>
+                <w:b w:val="0"/>
+                <w:i w:val="0"/>
+                <w:color w:val="333333"/>
+                <w:sz w:val="16"/>
+              </w:rPr>
+              <w:t>—</w:t>
+            </w:r>
+          </w:p>
+        </w:tc>
+      </w:tr>
+      <w:tr>
+        <w:tc>
+          <w:tcPr>
+            <w:shd w:val="clear" w:fill="FCE4D6"/>
+          </w:tcPr>
+          <w:p>
+            <w:r>
+              <w:rPr>
+                <w:sz w:val="15"/>
+              </w:rPr>
+              <w:t xml:space="preserve">TC-BT-006</w:t>
+            </w:r>
+          </w:p>
+        </w:tc>
+        <w:tc>
+          <w:tcPr>
+            <w:shd w:val="clear" w:fill="FCE4D6"/>
+          </w:tcPr>
+          <w:p>
+            <w:r>
+              <w:rPr>
+                <w:sz w:val="15"/>
+              </w:rPr>
+              <w:t xml:space="preserve">Batch cleared preview vs single-photo checkerboard</w:t>
+            </w:r>
+          </w:p>
+        </w:tc>
+        <w:tc>
+          <w:tcPr>
+            <w:shd w:val="clear" w:fill="FCE4D6"/>
+          </w:tcPr>
+          <w:p>
+            <w:r>
+              <w:rPr>
+                <w:sz w:val="15"/>
+              </w:rPr>
+              <w:t xml:space="preserve">Functionality, Usability</w:t>
+            </w:r>
+          </w:p>
+        </w:tc>
+        <w:tc>
+          <w:tcPr>
+            <w:shd w:val="clear" w:fill="FCE4D6"/>
+          </w:tcPr>
+          <w:p>
+            <w:r>
+              <w:rPr>
+                <w:sz w:val="15"/>
+              </w:rPr>
+              <w:t xml:space="preserve">Compare batch result view with single-photo cleared view</w:t>
+            </w:r>
+          </w:p>
+        </w:tc>
+        <w:tc>
+          <w:tcPr>
+            <w:shd w:val="clear" w:fill="FCE4D6"/>
+          </w:tcPr>
+          <w:p>
+            <w:r>
+              <w:rPr>
+                <w:sz w:val="15"/>
+              </w:rPr>
+              <w:t xml:space="preserve">Batch should give clear transparency feedback similar to single mode</w:t>
+            </w:r>
+          </w:p>
+        </w:tc>
+        <w:tc>
+          <w:tcPr>
+            <w:shd w:fill="FCE4D6" w:val="clear"/>
+            <w:tcBorders>
+              <w:top w:val="single" w:sz="4" w:color="BFBFBF"/>
+              <w:left w:val="single" w:sz="4" w:color="BFBFBF"/>
+              <w:bottom w:val="single" w:sz="4" w:color="BFBFBF"/>
+              <w:right w:val="single" w:sz="4" w:color="BFBFBF"/>
+            </w:tcBorders>
+          </w:tcPr>
+          <w:sdt>
+            <w:sdtPr>
+              <w:alias w:val="Result"/>
+              <w:tag w:val="result_status"/>
+              <w:id w:val="51005"/>
+              <w:dropDownList>
+                <w:listItem w:displayText="Not Executed" w:value="Not Executed"/>
+                <w:listItem w:displayText="Pass" w:value="Pass"/>
+                <w:listItem w:displayText="Fail" w:value="Fail"/>
+                <w:listItem w:displayText="Blocked" w:value="Blocked"/>
+              </w:dropDownList>
+            </w:sdtPr>
+            <w:sdtContent>
+              <w:p>
+                <w:pPr>
+                  <w:jc w:val="center"/>
+                </w:pPr>
+                <w:r>
+                  <w:rPr>
+                    <w:sz w:val="16"/>
+                    <w:color w:val="C00000"/>
+                  </w:rPr>
+                  <w:t>Fail</w:t>
+                </w:r>
+              </w:p>
+            </w:sdtContent>
+          </w:sdt>
+        </w:tc>
+        <w:tc>
+          <w:tcPr>
+            <w:shd w:fill="FCE4D6" w:val="clear"/>
+            <w:tcBorders>
+              <w:top w:val="single" w:sz="4" w:color="BFBFBF"/>
+              <w:left w:val="single" w:sz="4" w:color="BFBFBF"/>
+              <w:bottom w:val="single" w:sz="4" w:color="BFBFBF"/>
+              <w:right w:val="single" w:sz="4" w:color="BFBFBF"/>
+            </w:tcBorders>
+          </w:tcPr>
+          <w:p>
+            <w:pPr>
+              <w:spacing w:before="40" w:after="40"/>
+              <w:jc w:val="center"/>
+            </w:pPr>
+            <w:r/>
+            <w:r>
+              <w:rPr>
+                <w:rFonts w:ascii="Calibri" w:hAnsi="Calibri" w:eastAsia="Calibri"/>
+                <w:b w:val="0"/>
+                <w:i w:val="0"/>
+                <w:color w:val="333333"/>
+                <w:sz w:val="16"/>
+              </w:rPr>
+              <w:t>BUG-001</w:t>
+            </w:r>
+          </w:p>
+        </w:tc>
+      </w:tr>
+      <w:tr>
+        <w:tc>
+          <w:tcPr>
+            <w:shd w:val="clear" w:fill="FCE4D6"/>
+          </w:tcPr>
+          <w:p>
+            <w:r>
+              <w:rPr>
+                <w:sz w:val="15"/>
+              </w:rPr>
+              <w:t xml:space="preserve">TC-BT-007</w:t>
+            </w:r>
+          </w:p>
+        </w:tc>
+        <w:tc>
+          <w:tcPr>
+            <w:shd w:val="clear" w:fill="FCE4D6"/>
+          </w:tcPr>
+          <w:p>
+            <w:r>
+              <w:rPr>
+                <w:sz w:val="15"/>
+              </w:rPr>
+              <w:t xml:space="preserve">Batch Background replace on all images</w:t>
+            </w:r>
+          </w:p>
+        </w:tc>
+        <w:tc>
+          <w:tcPr>
+            <w:shd w:val="clear" w:fill="FCE4D6"/>
+          </w:tcPr>
+          <w:p>
+            <w:r>
+              <w:rPr>
+                <w:sz w:val="15"/>
+              </w:rPr>
+              <w:t xml:space="preserve">Functionality</w:t>
+            </w:r>
+          </w:p>
+        </w:tc>
+        <w:tc>
+          <w:tcPr>
+            <w:shd w:val="clear" w:fill="FCE4D6"/>
+          </w:tcPr>
+          <w:p>
+            <w:r>
+              <w:rPr>
+                <w:sz w:val="15"/>
+              </w:rPr>
+              <w:t xml:space="preserve">After batch clear → apply new Background to all</w:t>
+            </w:r>
+          </w:p>
+        </w:tc>
+        <w:tc>
+          <w:tcPr>
+            <w:shd w:val="clear" w:fill="FCE4D6"/>
+          </w:tcPr>
+          <w:p>
+            <w:r>
+              <w:rPr>
+                <w:sz w:val="15"/>
+              </w:rPr>
+              <w:t xml:space="preserve">New BG fills only the cleared/black area on each image</w:t>
+            </w:r>
+          </w:p>
+        </w:tc>
+        <w:tc>
+          <w:tcPr>
+            <w:shd w:fill="FCE4D6" w:val="clear"/>
+            <w:tcBorders>
+              <w:top w:val="single" w:sz="4" w:color="BFBFBF"/>
+              <w:left w:val="single" w:sz="4" w:color="BFBFBF"/>
+              <w:bottom w:val="single" w:sz="4" w:color="BFBFBF"/>
+              <w:right w:val="single" w:sz="4" w:color="BFBFBF"/>
+            </w:tcBorders>
+          </w:tcPr>
+          <w:sdt>
+            <w:sdtPr>
+              <w:alias w:val="Result"/>
+              <w:tag w:val="result_status"/>
+              <w:id w:val="51006"/>
+              <w:dropDownList>
+                <w:listItem w:displayText="Not Executed" w:value="Not Executed"/>
+                <w:listItem w:displayText="Pass" w:value="Pass"/>
+                <w:listItem w:displayText="Fail" w:value="Fail"/>
+                <w:listItem w:displayText="Blocked" w:value="Blocked"/>
+              </w:dropDownList>
+            </w:sdtPr>
+            <w:sdtContent>
+              <w:p>
+                <w:pPr>
+                  <w:jc w:val="center"/>
+                </w:pPr>
+                <w:r>
+                  <w:rPr>
+                    <w:sz w:val="16"/>
+                    <w:color w:val="C00000"/>
+                  </w:rPr>
+                  <w:t>Fail</w:t>
+                </w:r>
+              </w:p>
+            </w:sdtContent>
+          </w:sdt>
+        </w:tc>
+        <w:tc>
+          <w:tcPr>
+            <w:shd w:fill="FCE4D6" w:val="clear"/>
+            <w:tcBorders>
+              <w:top w:val="single" w:sz="4" w:color="BFBFBF"/>
+              <w:left w:val="single" w:sz="4" w:color="BFBFBF"/>
+              <w:bottom w:val="single" w:sz="4" w:color="BFBFBF"/>
+              <w:right w:val="single" w:sz="4" w:color="BFBFBF"/>
+            </w:tcBorders>
+          </w:tcPr>
+          <w:p>
+            <w:pPr>
+              <w:spacing w:before="40" w:after="40"/>
+              <w:jc w:val="center"/>
+            </w:pPr>
+            <w:r/>
+            <w:r>
+              <w:rPr>
+                <w:rFonts w:ascii="Calibri" w:hAnsi="Calibri" w:eastAsia="Calibri"/>
+                <w:b w:val="0"/>
+                <w:i w:val="0"/>
+                <w:color w:val="333333"/>
+                <w:sz w:val="16"/>
+              </w:rPr>
+              <w:t>BUG-001</w:t>
+            </w:r>
+          </w:p>
+        </w:tc>
+      </w:tr>
+      <w:tr>
+        <w:tc>
+          <w:tcPr>
+            <w:shd w:val="clear" w:fill="E2EFDA"/>
+          </w:tcPr>
+          <w:p>
+            <w:r>
+              <w:rPr>
+                <w:sz w:val="15"/>
+              </w:rPr>
+              <w:t xml:space="preserve">TC-BT-008</w:t>
+            </w:r>
+          </w:p>
+        </w:tc>
+        <w:tc>
+          <w:tcPr>
+            <w:shd w:val="clear" w:fill="E2EFDA"/>
+          </w:tcPr>
+          <w:p>
+            <w:r>
+              <w:rPr>
+                <w:sz w:val="15"/>
+              </w:rPr>
+              <w:t xml:space="preserve">Batch Resize tool usability</w:t>
+            </w:r>
+          </w:p>
+        </w:tc>
+        <w:tc>
+          <w:tcPr>
+            <w:shd w:val="clear" w:fill="E2EFDA"/>
+          </w:tcPr>
+          <w:p>
+            <w:r>
+              <w:rPr>
+                <w:sz w:val="15"/>
+              </w:rPr>
+              <w:t xml:space="preserve">Usability, Functionality</w:t>
+            </w:r>
+          </w:p>
+        </w:tc>
+        <w:tc>
+          <w:tcPr>
+            <w:shd w:val="clear" w:fill="E2EFDA"/>
+          </w:tcPr>
+          <w:p>
+            <w:r>
+              <w:rPr>
+                <w:sz w:val="15"/>
+              </w:rPr>
+              <w:t xml:space="preserve">In batch edit, use Resize on processed images</w:t>
+            </w:r>
+          </w:p>
+        </w:tc>
+        <w:tc>
+          <w:tcPr>
+            <w:shd w:val="clear" w:fill="E2EFDA"/>
+          </w:tcPr>
+          <w:p>
+            <w:r>
+              <w:rPr>
+                <w:sz w:val="15"/>
+              </w:rPr>
+              <w:t xml:space="preserve">Resize works and is easy to use</w:t>
+            </w:r>
+          </w:p>
+        </w:tc>
+        <w:tc>
+          <w:tcPr>
+            <w:shd w:fill="E2EFDA" w:val="clear"/>
+            <w:tcBorders>
+              <w:top w:val="single" w:sz="4" w:color="BFBFBF"/>
+              <w:left w:val="single" w:sz="4" w:color="BFBFBF"/>
+              <w:bottom w:val="single" w:sz="4" w:color="BFBFBF"/>
+              <w:right w:val="single" w:sz="4" w:color="BFBFBF"/>
+            </w:tcBorders>
+          </w:tcPr>
+          <w:sdt>
+            <w:sdtPr>
+              <w:alias w:val="Result"/>
+              <w:tag w:val="result_status"/>
+              <w:id w:val="51007"/>
+              <w:dropDownList>
+                <w:listItem w:displayText="Not Executed" w:value="Not Executed"/>
+                <w:listItem w:displayText="Pass" w:value="Pass"/>
+                <w:listItem w:displayText="Fail" w:value="Fail"/>
+                <w:listItem w:displayText="Blocked" w:value="Blocked"/>
+              </w:dropDownList>
+            </w:sdtPr>
+            <w:sdtContent>
+              <w:p>
+                <w:pPr>
+                  <w:jc w:val="center"/>
+                </w:pPr>
+                <w:r>
+                  <w:rPr>
+                    <w:sz w:val="16"/>
+                    <w:color w:val="548235"/>
+                  </w:rPr>
+                  <w:t>Pass</w:t>
+                </w:r>
+              </w:p>
+            </w:sdtContent>
+          </w:sdt>
+        </w:tc>
+        <w:tc>
+          <w:tcPr>
+            <w:shd w:fill="E2EFDA" w:val="clear"/>
+            <w:tcBorders>
+              <w:top w:val="single" w:sz="4" w:color="BFBFBF"/>
+              <w:left w:val="single" w:sz="4" w:color="BFBFBF"/>
+              <w:bottom w:val="single" w:sz="4" w:color="BFBFBF"/>
+              <w:right w:val="single" w:sz="4" w:color="BFBFBF"/>
+            </w:tcBorders>
+          </w:tcPr>
+          <w:p>
+            <w:pPr>
+              <w:spacing w:before="40" w:after="40"/>
+              <w:jc w:val="center"/>
+            </w:pPr>
+            <w:r/>
+            <w:r>
+              <w:rPr>
+                <w:rFonts w:ascii="Calibri" w:hAnsi="Calibri" w:eastAsia="Calibri"/>
+                <w:b w:val="0"/>
+                <w:i w:val="0"/>
+                <w:color w:val="333333"/>
+                <w:sz w:val="16"/>
+              </w:rPr>
+              <w:t>—</w:t>
+            </w:r>
+          </w:p>
+        </w:tc>
+      </w:tr>
+      <w:tr>
+        <w:tc>
+          <w:tcPr>
+            <w:shd w:val="clear" w:fill="E2EFDA"/>
+          </w:tcPr>
+          <w:p>
+            <w:r>
+              <w:rPr>
+                <w:sz w:val="15"/>
+              </w:rPr>
+              <w:t xml:space="preserve">TC-BT-009</w:t>
+            </w:r>
+          </w:p>
+        </w:tc>
+        <w:tc>
+          <w:tcPr>
+            <w:shd w:val="clear" w:fill="E2EFDA"/>
+          </w:tcPr>
+          <w:p>
+            <w:r>
+              <w:rPr>
+                <w:sz w:val="15"/>
+              </w:rPr>
+              <w:t xml:space="preserve">Batch Adjust tools usability</w:t>
+            </w:r>
+          </w:p>
+        </w:tc>
+        <w:tc>
+          <w:tcPr>
+            <w:shd w:val="clear" w:fill="E2EFDA"/>
+          </w:tcPr>
+          <w:p>
+            <w:r>
+              <w:rPr>
+                <w:sz w:val="15"/>
+              </w:rPr>
+              <w:t xml:space="preserve">Usability, Functionality</w:t>
+            </w:r>
+          </w:p>
+        </w:tc>
+        <w:tc>
+          <w:tcPr>
+            <w:shd w:val="clear" w:fill="E2EFDA"/>
+          </w:tcPr>
+          <w:p>
+            <w:r>
+              <w:rPr>
+                <w:sz w:val="15"/>
+              </w:rPr>
+              <w:t xml:space="preserve">Use brightness, contrast, shadow, saturation, hue, warmth, sharpness</w:t>
+            </w:r>
+          </w:p>
+        </w:tc>
+        <w:tc>
+          <w:tcPr>
+            <w:shd w:val="clear" w:fill="E2EFDA"/>
+          </w:tcPr>
+          <w:p>
+            <w:r>
+              <w:rPr>
+                <w:sz w:val="15"/>
+              </w:rPr>
+              <w:t xml:space="preserve">Adjust controls work on batch images</w:t>
+            </w:r>
+          </w:p>
+        </w:tc>
+        <w:tc>
+          <w:tcPr>
+            <w:shd w:fill="E2EFDA" w:val="clear"/>
+            <w:tcBorders>
+              <w:top w:val="single" w:sz="4" w:color="BFBFBF"/>
+              <w:left w:val="single" w:sz="4" w:color="BFBFBF"/>
+              <w:bottom w:val="single" w:sz="4" w:color="BFBFBF"/>
+              <w:right w:val="single" w:sz="4" w:color="BFBFBF"/>
+            </w:tcBorders>
+          </w:tcPr>
+          <w:sdt>
+            <w:sdtPr>
+              <w:alias w:val="Result"/>
+              <w:tag w:val="result_status"/>
+              <w:id w:val="51008"/>
+              <w:dropDownList>
+                <w:listItem w:displayText="Not Executed" w:value="Not Executed"/>
+                <w:listItem w:displayText="Pass" w:value="Pass"/>
+                <w:listItem w:displayText="Fail" w:value="Fail"/>
+                <w:listItem w:displayText="Blocked" w:value="Blocked"/>
+              </w:dropDownList>
+            </w:sdtPr>
+            <w:sdtContent>
+              <w:p>
+                <w:pPr>
+                  <w:jc w:val="center"/>
+                </w:pPr>
+                <w:r>
+                  <w:rPr>
+                    <w:sz w:val="16"/>
+                    <w:color w:val="548235"/>
+                  </w:rPr>
+                  <w:t>Pass</w:t>
+                </w:r>
+              </w:p>
+            </w:sdtContent>
+          </w:sdt>
+        </w:tc>
+        <w:tc>
+          <w:tcPr>
+            <w:shd w:fill="E2EFDA" w:val="clear"/>
+            <w:tcBorders>
+              <w:top w:val="single" w:sz="4" w:color="BFBFBF"/>
+              <w:left w:val="single" w:sz="4" w:color="BFBFBF"/>
+              <w:bottom w:val="single" w:sz="4" w:color="BFBFBF"/>
+              <w:right w:val="single" w:sz="4" w:color="BFBFBF"/>
+            </w:tcBorders>
+          </w:tcPr>
+          <w:p>
+            <w:pPr>
+              <w:spacing w:before="40" w:after="40"/>
+              <w:jc w:val="center"/>
+            </w:pPr>
+            <w:r/>
+            <w:r>
+              <w:rPr>
+                <w:rFonts w:ascii="Calibri" w:hAnsi="Calibri" w:eastAsia="Calibri"/>
+                <w:b w:val="0"/>
+                <w:i w:val="0"/>
+                <w:color w:val="333333"/>
+                <w:sz w:val="16"/>
+              </w:rPr>
+              <w:t>—</w:t>
+            </w:r>
+          </w:p>
+        </w:tc>
+      </w:tr>
+      <w:tr>
+        <w:tc>
+          <w:tcPr>
+            <w:shd w:val="clear" w:fill="E2EFDA"/>
+          </w:tcPr>
+          <w:p>
+            <w:r>
+              <w:rPr>
+                <w:sz w:val="15"/>
+              </w:rPr>
+              <w:t xml:space="preserve">TC-BT-010</w:t>
+            </w:r>
+          </w:p>
+        </w:tc>
+        <w:tc>
+          <w:tcPr>
+            <w:shd w:val="clear" w:fill="E2EFDA"/>
+          </w:tcPr>
+          <w:p>
+            <w:r>
+              <w:rPr>
+                <w:sz w:val="15"/>
+              </w:rPr>
+              <w:t xml:space="preserve">Batch Blur tool usability</w:t>
+            </w:r>
+          </w:p>
+        </w:tc>
+        <w:tc>
+          <w:tcPr>
+            <w:shd w:val="clear" w:fill="E2EFDA"/>
+          </w:tcPr>
+          <w:p>
+            <w:r>
+              <w:rPr>
+                <w:sz w:val="15"/>
+              </w:rPr>
+              <w:t xml:space="preserve">Usability, Functionality</w:t>
+            </w:r>
+          </w:p>
+        </w:tc>
+        <w:tc>
+          <w:tcPr>
+            <w:shd w:val="clear" w:fill="E2EFDA"/>
+          </w:tcPr>
+          <w:p>
+            <w:r>
+              <w:rPr>
+                <w:sz w:val="15"/>
+              </w:rPr>
+              <w:t xml:space="preserve">Use Blur in batch edit</w:t>
+            </w:r>
+          </w:p>
+        </w:tc>
+        <w:tc>
+          <w:tcPr>
+            <w:shd w:val="clear" w:fill="E2EFDA"/>
+          </w:tcPr>
+          <w:p>
+            <w:r>
+              <w:rPr>
+                <w:sz w:val="15"/>
+              </w:rPr>
+              <w:t xml:space="preserve">Blur applies and is usable (may be less precise than single mode)</w:t>
+            </w:r>
+          </w:p>
+        </w:tc>
+        <w:tc>
+          <w:tcPr>
+            <w:shd w:fill="E2EFDA" w:val="clear"/>
+            <w:tcBorders>
+              <w:top w:val="single" w:sz="4" w:color="BFBFBF"/>
+              <w:left w:val="single" w:sz="4" w:color="BFBFBF"/>
+              <w:bottom w:val="single" w:sz="4" w:color="BFBFBF"/>
+              <w:right w:val="single" w:sz="4" w:color="BFBFBF"/>
+            </w:tcBorders>
+          </w:tcPr>
+          <w:sdt>
+            <w:sdtPr>
+              <w:alias w:val="Result"/>
+              <w:tag w:val="result_status"/>
+              <w:id w:val="51009"/>
+              <w:dropDownList>
+                <w:listItem w:displayText="Not Executed" w:value="Not Executed"/>
+                <w:listItem w:displayText="Pass" w:value="Pass"/>
+                <w:listItem w:displayText="Fail" w:value="Fail"/>
+                <w:listItem w:displayText="Blocked" w:value="Blocked"/>
+              </w:dropDownList>
+            </w:sdtPr>
+            <w:sdtContent>
+              <w:p>
+                <w:pPr>
+                  <w:jc w:val="center"/>
+                </w:pPr>
+                <w:r>
+                  <w:rPr>
+                    <w:sz w:val="16"/>
+                    <w:color w:val="548235"/>
+                  </w:rPr>
+                  <w:t>Pass</w:t>
+                </w:r>
+              </w:p>
+            </w:sdtContent>
+          </w:sdt>
+        </w:tc>
+        <w:tc>
+          <w:tcPr>
+            <w:shd w:fill="E2EFDA" w:val="clear"/>
+            <w:tcBorders>
+              <w:top w:val="single" w:sz="4" w:color="BFBFBF"/>
+              <w:left w:val="single" w:sz="4" w:color="BFBFBF"/>
+              <w:bottom w:val="single" w:sz="4" w:color="BFBFBF"/>
+              <w:right w:val="single" w:sz="4" w:color="BFBFBF"/>
+            </w:tcBorders>
+          </w:tcPr>
+          <w:p>
+            <w:pPr>
+              <w:spacing w:before="40" w:after="40"/>
+              <w:jc w:val="center"/>
+            </w:pPr>
+            <w:r/>
+            <w:r>
+              <w:rPr>
+                <w:rFonts w:ascii="Calibri" w:hAnsi="Calibri" w:eastAsia="Calibri"/>
+                <w:b w:val="0"/>
+                <w:i w:val="0"/>
+                <w:color w:val="333333"/>
+                <w:sz w:val="16"/>
+              </w:rPr>
+              <w:t>—</w:t>
+            </w:r>
+          </w:p>
+        </w:tc>
+      </w:tr>
+      <w:tr>
+        <w:tc>
+          <w:tcPr>
+            <w:shd w:val="clear" w:fill="E2EFDA"/>
+          </w:tcPr>
+          <w:p>
+            <w:r>
+              <w:rPr>
+                <w:sz w:val="15"/>
+              </w:rPr>
+              <w:t xml:space="preserve">TC-BT-011</w:t>
+            </w:r>
+          </w:p>
+        </w:tc>
+        <w:tc>
+          <w:tcPr>
+            <w:shd w:val="clear" w:fill="E2EFDA"/>
+          </w:tcPr>
+          <w:p>
+            <w:r>
+              <w:rPr>
+                <w:sz w:val="15"/>
+              </w:rPr>
+              <w:t xml:space="preserve">Leave app during batch processing</w:t>
+            </w:r>
+          </w:p>
+        </w:tc>
+        <w:tc>
+          <w:tcPr>
+            <w:shd w:val="clear" w:fill="E2EFDA"/>
+          </w:tcPr>
+          <w:p>
+            <w:r>
+              <w:rPr>
+                <w:sz w:val="15"/>
+              </w:rPr>
+              <w:t xml:space="preserve">Stability</w:t>
+            </w:r>
+          </w:p>
+        </w:tc>
+        <w:tc>
+          <w:tcPr>
+            <w:shd w:val="clear" w:fill="E2EFDA"/>
+          </w:tcPr>
+          <w:p>
+            <w:r>
+              <w:rPr>
+                <w:sz w:val="15"/>
+              </w:rPr>
+              <w:t xml:space="preserve">Switch to another app while batch is running → return</w:t>
+            </w:r>
+          </w:p>
+        </w:tc>
+        <w:tc>
+          <w:tcPr>
+            <w:shd w:val="clear" w:fill="E2EFDA"/>
+          </w:tcPr>
+          <w:p>
+            <w:r>
+              <w:rPr>
+                <w:sz w:val="15"/>
+              </w:rPr>
+              <w:t xml:space="preserve">Processing continues normally; no crash</w:t>
+            </w:r>
+          </w:p>
+        </w:tc>
+        <w:tc>
+          <w:tcPr>
+            <w:shd w:fill="E2EFDA" w:val="clear"/>
+            <w:tcBorders>
+              <w:top w:val="single" w:sz="4" w:color="BFBFBF"/>
+              <w:left w:val="single" w:sz="4" w:color="BFBFBF"/>
+              <w:bottom w:val="single" w:sz="4" w:color="BFBFBF"/>
+              <w:right w:val="single" w:sz="4" w:color="BFBFBF"/>
+            </w:tcBorders>
+          </w:tcPr>
+          <w:sdt>
+            <w:sdtPr>
+              <w:alias w:val="Result"/>
+              <w:tag w:val="result_status"/>
+              <w:id w:val="51010"/>
+              <w:dropDownList>
+                <w:listItem w:displayText="Not Executed" w:value="Not Executed"/>
+                <w:listItem w:displayText="Pass" w:value="Pass"/>
+                <w:listItem w:displayText="Fail" w:value="Fail"/>
+                <w:listItem w:displayText="Blocked" w:value="Blocked"/>
+              </w:dropDownList>
+            </w:sdtPr>
+            <w:sdtContent>
+              <w:p>
+                <w:pPr>
+                  <w:jc w:val="center"/>
+                </w:pPr>
+                <w:r>
+                  <w:rPr>
+                    <w:sz w:val="16"/>
+                    <w:color w:val="548235"/>
+                  </w:rPr>
+                  <w:t>Pass</w:t>
+                </w:r>
+              </w:p>
+            </w:sdtContent>
+          </w:sdt>
+        </w:tc>
+        <w:tc>
+          <w:tcPr>
+            <w:shd w:fill="E2EFDA" w:val="clear"/>
+            <w:tcBorders>
+              <w:top w:val="single" w:sz="4" w:color="BFBFBF"/>
+              <w:left w:val="single" w:sz="4" w:color="BFBFBF"/>
+              <w:bottom w:val="single" w:sz="4" w:color="BFBFBF"/>
+              <w:right w:val="single" w:sz="4" w:color="BFBFBF"/>
+            </w:tcBorders>
+          </w:tcPr>
+          <w:p>
+            <w:pPr>
+              <w:spacing w:before="40" w:after="40"/>
+              <w:jc w:val="center"/>
+            </w:pPr>
+            <w:r/>
+            <w:r>
+              <w:rPr>
+                <w:rFonts w:ascii="Calibri" w:hAnsi="Calibri" w:eastAsia="Calibri"/>
+                <w:b w:val="0"/>
+                <w:i w:val="0"/>
+                <w:color w:val="333333"/>
+                <w:sz w:val="16"/>
+              </w:rPr>
+              <w:t>—</w:t>
+            </w:r>
+          </w:p>
+        </w:tc>
+      </w:tr>
+      <w:tr>
+        <w:tc>
+          <w:tcPr>
+            <w:shd w:val="clear" w:fill="E2EFDA"/>
+          </w:tcPr>
+          <w:p>
+            <w:r>
+              <w:rPr>
+                <w:sz w:val="15"/>
+              </w:rPr>
+              <w:t xml:space="preserve">TC-BT-012</w:t>
+            </w:r>
+          </w:p>
+        </w:tc>
+        <w:tc>
+          <w:tcPr>
+            <w:shd w:val="clear" w:fill="E2EFDA"/>
+          </w:tcPr>
+          <w:p>
+            <w:r>
+              <w:rPr>
+                <w:sz w:val="15"/>
+              </w:rPr>
+              <w:t xml:space="preserve">Batch 20-image timing and completion</w:t>
+            </w:r>
+          </w:p>
+        </w:tc>
+        <w:tc>
+          <w:tcPr>
+            <w:shd w:val="clear" w:fill="E2EFDA"/>
+          </w:tcPr>
+          <w:p>
+            <w:r>
+              <w:rPr>
+                <w:sz w:val="15"/>
+              </w:rPr>
+              <w:t xml:space="preserve">Performance</w:t>
+            </w:r>
+          </w:p>
+        </w:tc>
+        <w:tc>
+          <w:tcPr>
+            <w:shd w:val="clear" w:fill="E2EFDA"/>
+          </w:tcPr>
+          <w:p>
+            <w:r>
+              <w:rPr>
+                <w:sz w:val="15"/>
+              </w:rPr>
+              <w:t xml:space="preserve">Upload 20 images and run batch</w:t>
+            </w:r>
+          </w:p>
+        </w:tc>
+        <w:tc>
+          <w:tcPr>
+            <w:shd w:val="clear" w:fill="E2EFDA"/>
+          </w:tcPr>
+          <w:p>
+            <w:r>
+              <w:rPr>
+                <w:sz w:val="15"/>
+              </w:rPr>
+              <w:t xml:space="preserve">Completes with progress; record time and processed vs left-out count</w:t>
+            </w:r>
+          </w:p>
+        </w:tc>
+        <w:tc>
+          <w:tcPr>
+            <w:shd w:fill="E2EFDA" w:val="clear"/>
+            <w:tcBorders>
+              <w:top w:val="single" w:sz="4" w:color="BFBFBF"/>
+              <w:left w:val="single" w:sz="4" w:color="BFBFBF"/>
+              <w:bottom w:val="single" w:sz="4" w:color="BFBFBF"/>
+              <w:right w:val="single" w:sz="4" w:color="BFBFBF"/>
+            </w:tcBorders>
+          </w:tcPr>
+          <w:sdt>
+            <w:sdtPr>
+              <w:alias w:val="Result"/>
+              <w:tag w:val="result_status"/>
+              <w:id w:val="51011"/>
+              <w:dropDownList>
+                <w:listItem w:displayText="Not Executed" w:value="Not Executed"/>
+                <w:listItem w:displayText="Pass" w:value="Pass"/>
+                <w:listItem w:displayText="Fail" w:value="Fail"/>
+                <w:listItem w:displayText="Blocked" w:value="Blocked"/>
+              </w:dropDownList>
+            </w:sdtPr>
+            <w:sdtContent>
+              <w:p>
+                <w:pPr>
+                  <w:jc w:val="center"/>
+                </w:pPr>
+                <w:r>
+                  <w:rPr>
+                    <w:sz w:val="16"/>
+                    <w:color w:val="548235"/>
+                  </w:rPr>
+                  <w:t>Pass</w:t>
+                </w:r>
+              </w:p>
+            </w:sdtContent>
+          </w:sdt>
+        </w:tc>
+        <w:tc>
+          <w:tcPr>
+            <w:shd w:fill="E2EFDA" w:val="clear"/>
+            <w:tcBorders>
+              <w:top w:val="single" w:sz="4" w:color="BFBFBF"/>
+              <w:left w:val="single" w:sz="4" w:color="BFBFBF"/>
+              <w:bottom w:val="single" w:sz="4" w:color="BFBFBF"/>
+              <w:right w:val="single" w:sz="4" w:color="BFBFBF"/>
+            </w:tcBorders>
+          </w:tcPr>
+          <w:p>
+            <w:pPr>
+              <w:spacing w:before="40" w:after="40"/>
+              <w:jc w:val="center"/>
+            </w:pPr>
+            <w:r/>
+            <w:r>
+              <w:rPr>
+                <w:rFonts w:ascii="Calibri" w:hAnsi="Calibri" w:eastAsia="Calibri"/>
+                <w:b w:val="0"/>
+                <w:i w:val="0"/>
+                <w:color w:val="333333"/>
+                <w:sz w:val="16"/>
+              </w:rPr>
+              <w:t>—</w:t>
+            </w:r>
+          </w:p>
+        </w:tc>
+      </w:tr>
+    </w:tbl>
+    <w:p/>
     <w:p>
       <w:pPr>
         <w:spacing w:before="240" w:after="80"/>
@@ -12429,7 +13668,7 @@
                 <w:color w:val="333333"/>
                 <w:sz w:val="16"/>
               </w:rPr>
-              <w:t>Start edit → Home/recents → reopen app</w:t>
+              <w:t>Leave app during batch/single processing → return</w:t>
             </w:r>
           </w:p>
         </w:tc>
@@ -12456,7 +13695,7 @@
                 <w:color w:val="333333"/>
                 <w:sz w:val="16"/>
               </w:rPr>
-              <w:t>Draft or last safe state remains; no crash</w:t>
+              <w:t>Processing continues normally; no crash</w:t>
             </w:r>
           </w:p>
         </w:tc>
@@ -12474,7 +13713,7 @@
             <w:sdtPr>
               <w:alias w:val="Result"/>
               <w:tag w:val="result_status"/>
-              <w:id w:val="40000"/>
+              <w:id w:val="51002"/>
               <w:dropDownList>
                 <w:listItem w:displayText="Not Executed" w:value="Not Executed"/>
                 <w:listItem w:displayText="Pass" w:value="Pass"/>
@@ -13550,59 +14789,7 @@
         </w:tc>
         <w:tc>
           <w:tcPr>
-            <w:shd w:val="clear" w:fill="F2F2F2"/>
-          </w:tcPr>
-          <w:p>
-            <w:r>
-              <w:rPr>
-                <w:sz w:val="15"/>
-              </w:rPr>
-              <w:t xml:space="preserve">Batch queue with many images</w:t>
-            </w:r>
-          </w:p>
-        </w:tc>
-        <w:tc>
-          <w:tcPr>
-            <w:shd w:val="clear" w:fill="F2F2F2"/>
-          </w:tcPr>
-          <w:p>
-            <w:r>
-              <w:rPr>
-                <w:sz w:val="15"/>
-              </w:rPr>
-              <w:t xml:space="preserve">Performance</w:t>
-            </w:r>
-          </w:p>
-        </w:tc>
-        <w:tc>
-          <w:tcPr>
-            <w:shd w:val="clear" w:fill="F2F2F2"/>
-          </w:tcPr>
-          <w:p>
-            <w:r>
-              <w:rPr>
-                <w:sz w:val="15"/>
-              </w:rPr>
-              <w:t xml:space="preserve">Batch process close to max (up to 20)</w:t>
-            </w:r>
-          </w:p>
-        </w:tc>
-        <w:tc>
-          <w:tcPr>
-            <w:shd w:val="clear" w:fill="F2F2F2"/>
-          </w:tcPr>
-          <w:p>
-            <w:r>
-              <w:rPr>
-                <w:sz w:val="15"/>
-              </w:rPr>
-              <w:t xml:space="preserve">Progress visible; completes or clear failure; UI usable</w:t>
-            </w:r>
-          </w:p>
-        </w:tc>
-        <w:tc>
-          <w:tcPr>
-            <w:shd w:fill="FFFFFF" w:val="clear"/>
+            <w:shd w:fill="E2EFDA" w:val="clear"/>
             <w:tcBorders>
               <w:top w:val="single" w:sz="4" w:color="BFBFBF"/>
               <w:left w:val="single" w:sz="4" w:color="BFBFBF"/>
@@ -13610,11 +14797,119 @@
               <w:right w:val="single" w:sz="4" w:color="BFBFBF"/>
             </w:tcBorders>
           </w:tcPr>
+          <w:p>
+            <w:pPr>
+              <w:spacing w:before="40" w:after="40"/>
+            </w:pPr>
+            <w:r/>
+            <w:r>
+              <w:rPr>
+                <w:rFonts w:ascii="Calibri" w:hAnsi="Calibri" w:eastAsia="Calibri"/>
+                <w:b w:val="0"/>
+                <w:i w:val="0"/>
+                <w:color w:val="333333"/>
+                <w:sz w:val="16"/>
+              </w:rPr>
+              <w:t>Batch queue with many images</w:t>
+            </w:r>
+          </w:p>
+        </w:tc>
+        <w:tc>
+          <w:tcPr>
+            <w:shd w:fill="E2EFDA" w:val="clear"/>
+            <w:tcBorders>
+              <w:top w:val="single" w:sz="4" w:color="BFBFBF"/>
+              <w:left w:val="single" w:sz="4" w:color="BFBFBF"/>
+              <w:bottom w:val="single" w:sz="4" w:color="BFBFBF"/>
+              <w:right w:val="single" w:sz="4" w:color="BFBFBF"/>
+            </w:tcBorders>
+          </w:tcPr>
+          <w:p>
+            <w:pPr>
+              <w:spacing w:before="40" w:after="40"/>
+            </w:pPr>
+            <w:r/>
+            <w:r>
+              <w:rPr>
+                <w:rFonts w:ascii="Calibri" w:hAnsi="Calibri" w:eastAsia="Calibri"/>
+                <w:b w:val="0"/>
+                <w:i w:val="0"/>
+                <w:color w:val="333333"/>
+                <w:sz w:val="16"/>
+              </w:rPr>
+              <w:t>Performance</w:t>
+            </w:r>
+          </w:p>
+        </w:tc>
+        <w:tc>
+          <w:tcPr>
+            <w:shd w:fill="E2EFDA" w:val="clear"/>
+            <w:tcBorders>
+              <w:top w:val="single" w:sz="4" w:color="BFBFBF"/>
+              <w:left w:val="single" w:sz="4" w:color="BFBFBF"/>
+              <w:bottom w:val="single" w:sz="4" w:color="BFBFBF"/>
+              <w:right w:val="single" w:sz="4" w:color="BFBFBF"/>
+            </w:tcBorders>
+          </w:tcPr>
+          <w:p>
+            <w:pPr>
+              <w:spacing w:before="40" w:after="40"/>
+            </w:pPr>
+            <w:r/>
+            <w:r>
+              <w:rPr>
+                <w:rFonts w:ascii="Calibri" w:hAnsi="Calibri" w:eastAsia="Calibri"/>
+                <w:b w:val="0"/>
+                <w:i w:val="0"/>
+                <w:color w:val="333333"/>
+                <w:sz w:val="16"/>
+              </w:rPr>
+              <w:t>Batch process up to 20 images</w:t>
+            </w:r>
+          </w:p>
+        </w:tc>
+        <w:tc>
+          <w:tcPr>
+            <w:shd w:fill="E2EFDA" w:val="clear"/>
+            <w:tcBorders>
+              <w:top w:val="single" w:sz="4" w:color="BFBFBF"/>
+              <w:left w:val="single" w:sz="4" w:color="BFBFBF"/>
+              <w:bottom w:val="single" w:sz="4" w:color="BFBFBF"/>
+              <w:right w:val="single" w:sz="4" w:color="BFBFBF"/>
+            </w:tcBorders>
+          </w:tcPr>
+          <w:p>
+            <w:pPr>
+              <w:spacing w:before="40" w:after="40"/>
+            </w:pPr>
+            <w:r/>
+            <w:r>
+              <w:rPr>
+                <w:rFonts w:ascii="Calibri" w:hAnsi="Calibri" w:eastAsia="Calibri"/>
+                <w:b w:val="0"/>
+                <w:i w:val="0"/>
+                <w:color w:val="333333"/>
+                <w:sz w:val="16"/>
+              </w:rPr>
+              <w:t>Completes with progress; observed ~3 min 30 sec for 20 images (14 processed, 6 left out)</w:t>
+            </w:r>
+          </w:p>
+        </w:tc>
+        <w:tc>
+          <w:tcPr>
+            <w:shd w:fill="E2EFDA" w:val="clear"/>
+            <w:tcBorders>
+              <w:top w:val="single" w:sz="4" w:color="BFBFBF"/>
+              <w:left w:val="single" w:sz="4" w:color="BFBFBF"/>
+              <w:bottom w:val="single" w:sz="4" w:color="BFBFBF"/>
+              <w:right w:val="single" w:sz="4" w:color="BFBFBF"/>
+            </w:tcBorders>
+          </w:tcPr>
           <w:sdt>
             <w:sdtPr>
               <w:alias w:val="Result"/>
               <w:tag w:val="result_status"/>
-              <w:id w:val="31010"/>
+              <w:id w:val="51003"/>
               <w:dropDownList>
                 <w:listItem w:displayText="Not Executed" w:value="Not Executed"/>
                 <w:listItem w:displayText="Pass" w:value="Pass"/>
@@ -13630,9 +14925,9 @@
                 <w:r>
                   <w:rPr>
                     <w:sz w:val="16"/>
-                    <w:color w:val="666666"/>
+                    <w:color w:val="548235"/>
                   </w:rPr>
-                  <w:t>Not Executed</w:t>
+                  <w:t>Pass</w:t>
                 </w:r>
               </w:p>
             </w:sdtContent>
@@ -13640,7 +14935,7 @@
         </w:tc>
         <w:tc>
           <w:tcPr>
-            <w:shd w:fill="FFFFFF" w:val="clear"/>
+            <w:shd w:fill="E2EFDA" w:val="clear"/>
             <w:tcBorders>
               <w:top w:val="single" w:sz="4" w:color="BFBFBF"/>
               <w:left w:val="single" w:sz="4" w:color="BFBFBF"/>
@@ -15966,7 +17261,7 @@
                 <w:color w:val="333333"/>
                 <w:sz w:val="18"/>
               </w:rPr>
-              <w:t>1 (High: 1) — Batch remove accuracy / preview mismatch</w:t>
+              <w:t>1 (High: 1) — Batch remove inconsistency + Background replace mapping</w:t>
             </w:r>
           </w:p>
         </w:tc>
@@ -16104,7 +17399,7 @@
                 <w:color w:val="333333"/>
                 <w:sz w:val="18"/>
               </w:rPr>
-              <w:t>4 (SUG-001 Shape UX, SUG-002 smart align, SUG-003 Batch quality, SUG-004 weak-network retry UX)</w:t>
+              <w:t>4 (SUG-001 to SUG-004)</w:t>
             </w:r>
           </w:p>
         </w:tc>
@@ -16173,7 +17468,7 @@
                 <w:color w:val="333333"/>
                 <w:sz w:val="18"/>
               </w:rPr>
-              <w:t>33 / 36</w:t>
+              <w:t>42 / 44</w:t>
             </w:r>
           </w:p>
         </w:tc>
@@ -16242,7 +17537,7 @@
                 <w:color w:val="333333"/>
                 <w:sz w:val="18"/>
               </w:rPr>
-              <w:t>Pass: 32 | Fail: 1 | Blocked: 0</w:t>
+              <w:t>Pass: 39 | Fail: 3 | Blocked: 0</w:t>
             </w:r>
           </w:p>
         </w:tc>
@@ -16311,7 +17606,7 @@
                 <w:color w:val="333333"/>
                 <w:sz w:val="18"/>
               </w:rPr>
-              <w:t>Single-photo flow, save/share, offline messaging, resume, and usability checks are strong. Main defect remains Batch background-remove accuracy/preview mismatch (BUG-001). Weak network shows retry/fallback, but wait time can feel long (SUG-004).</w:t>
+              <w:t>Batch is powerful for multi-image editing; Resize/Adjust/Blur are usable. Main issues: some images left out of batch processing, cleared preview is black (not checkerboard like single mode), and Batch Background replace often applies outside the cleared area (BUG-001). 20-image run ~3:30 with 14 processed / 6 left out.</w:t>
             </w:r>
           </w:p>
         </w:tc>

</xml_diff>